<commit_message>
Redesign master template in iOS/macOS style
Komplett neues Layout im Apple-Look: abgerundete Cards (roundRect-Shapes),
viel Weissraum, System-Typografie (Helvetica Neue), iOS-Farbsystem
(Grouped-Grau #F5F5F7, Trennlinien #E5E5EA, System-Blau), Pill-Badge fuer
den Dokumenttyp und Navy-Gesamtbetrag-Card.

Co-Authored-By: Claude Opus 4.8 <noreply@anthropic.com>
Claude-Session: https://claude.ai/code/session_01CZAzMhLTZcbnz9dhhRUTMo
</commit_message>
<xml_diff>
--- a/Kabuu_Engineering_Master_Vorlage.docx
+++ b/Kabuu_Engineering_Master_Vorlage.docx
@@ -4,18 +4,98 @@
   <w:body>
     <w:p>
       <w:pPr>
-        <w:spacing w:before="0" w:after="40" w:line="259" w:lineRule="auto"/>
-        <w:pBdr>
-          <w:bottom w:val="single" w:sz="4" w:space="4" w:color="BFC6E0"/>
-        </w:pBdr>
+        <w:spacing w:after="0" w:before="0"/>
+        <w:spacing w:line="200" w:lineRule="exact"/>
+      </w:pPr>
+    </w:p>
+    <w:p>
+      <w:pPr>
+        <w:spacing w:after="40"/>
+      </w:pPr>
+      <w:r>
+        <w:drawing>
+          <wp:inline distT="0" distB="0" distL="0" distR="0">
+            <wp:extent cx="1224000" cy="273600"/>
+            <wp:effectExtent l="0" t="0" r="0" b="0"/>
+            <wp:docPr id="101" name="Card101"/>
+            <wp:cNvGraphicFramePr/>
+            <a:graphic xmlns:a="http://schemas.openxmlformats.org/drawingml/2006/main">
+              <a:graphicData uri="http://schemas.microsoft.com/office/word/2010/wordprocessingShape">
+                <wps:wsp>
+                  <wps:cNvSpPr txBox="1"/>
+                  <wps:spPr>
+                    <a:xfrm>
+                      <a:off x="0" y="0"/>
+                      <a:ext cx="1224000" cy="273600"/>
+                    </a:xfrm>
+                    <a:prstGeom prst="roundRect">
+                      <a:avLst>
+                        <a:gd name="adj" fmla="val 50000"/>
+                      </a:avLst>
+                    </a:prstGeom>
+                    <a:solidFill>
+                      <a:srgbClr val="000D6E"/>
+                    </a:solidFill>
+                    <a:ln>
+                      <a:noFill/>
+                    </a:ln>
+                  </wps:spPr>
+                  <wps:txbx>
+                    <w:txbxContent>
+                      <w:p>
+                        <w:pPr>
+                          <w:spacing w:before="0" w:after="0"/>
+                          <w:jc w:val="center"/>
+                        </w:pPr>
+                        <w:r>
+                          <w:rPr>
+                            <w:rFonts w:ascii="Helvetica Neue" w:hAnsi="Helvetica Neue" w:cs="Helvetica Neue"/>
+                            <w:sz w:val="20"/>
+                            <w:szCs w:val="20"/>
+                            <w:color w:val="FFFFFF"/>
+                            <w:b/>
+                            <w:caps/>
+                            <w:spacing w:val="30"/>
+                          </w:rPr>
+                          <w:t xml:space="preserve">{{DOKUMENTTYP}}</w:t>
+                        </w:r>
+                      </w:p>
+                    </w:txbxContent>
+                  </wps:txbx>
+                  <wps:bodyPr rot="0" wrap="square" lIns="108000" tIns="50400" rIns="108000" bIns="50400" anchor="t">
+                    <a:spAutoFit/>
+                  </wps:bodyPr>
+                </wps:wsp>
+              </a:graphicData>
+            </a:graphic>
+          </wp:inline>
+        </w:drawing>
+      </w:r>
+    </w:p>
+    <w:p>
+      <w:pPr>
+        <w:spacing w:before="80" w:after="20"/>
       </w:pPr>
       <w:r>
         <w:rPr>
-          <w:rFonts w:ascii="Calibri" w:hAnsi="Calibri"/>
-          <w:b w:val="0"/>
-          <w:i w:val="0"/>
-          <w:color w:val="555555"/>
-          <w:sz w:val="15"/>
+          <w:rFonts w:ascii="Helvetica Neue" w:hAnsi="Helvetica Neue"/>
+          <w:b/>
+          <w:color w:val="1D1D1F"/>
+          <w:sz w:val="48"/>
+          <w:spacing w:val="-10"/>
+        </w:rPr>
+        <w:t>{{BETREFF}}</w:t>
+      </w:r>
+    </w:p>
+    <w:p>
+      <w:pPr>
+        <w:spacing w:after="160"/>
+      </w:pPr>
+      <w:r>
+        <w:rPr>
+          <w:rFonts w:ascii="Helvetica Neue" w:hAnsi="Helvetica Neue"/>
+          <w:color w:val="86868B"/>
+          <w:sz w:val="17"/>
         </w:rPr>
         <w:t>Kabuu Engineering · Im Abt 9A · 8240 Thayngen · Schweiz</w:t>
       </w:r>
@@ -35,85 +115,96 @@
         </w:tblBorders>
       </w:tblPr>
       <w:tblGrid>
-        <w:gridCol w:w="4819"/>
-        <w:gridCol w:w="4819"/>
+        <w:gridCol w:w="4933"/>
+        <w:gridCol w:w="4933"/>
       </w:tblGrid>
       <w:tr>
         <w:tc>
           <w:tcPr>
-            <w:tcW w:type="dxa" w:w="5386"/>
+            <w:tcW w:type="dxa" w:w="4989"/>
           </w:tcPr>
           <w:p>
             <w:pPr>
-              <w:spacing w:after="40"/>
+              <w:spacing w:after="60"/>
             </w:pPr>
             <w:r>
               <w:rPr>
-                <w:rFonts w:ascii="Calibri" w:hAnsi="Calibri"/>
+                <w:rFonts w:ascii="Helvetica Neue" w:hAnsi="Helvetica Neue"/>
                 <w:b/>
-                <w:i w:val="0"/>
-                <w:color w:val="000D6E"/>
-                <w:sz w:val="22"/>
+                <w:caps/>
+                <w:color w:val="86868B"/>
+                <w:sz w:val="15"/>
+                <w:spacing w:val="24"/>
+              </w:rPr>
+              <w:t>Rechnung an</w:t>
+            </w:r>
+          </w:p>
+          <w:p>
+            <w:pPr>
+              <w:spacing w:after="20"/>
+            </w:pPr>
+            <w:r>
+              <w:rPr>
+                <w:rFonts w:ascii="Helvetica Neue" w:hAnsi="Helvetica Neue"/>
+                <w:b/>
+                <w:color w:val="1D1D1F"/>
+                <w:sz w:val="24"/>
               </w:rPr>
               <w:t>{{KUNDE_FIRMA}}</w:t>
             </w:r>
           </w:p>
           <w:p>
             <w:pPr>
-              <w:spacing w:before="0" w:after="20" w:line="259" w:lineRule="auto"/>
+              <w:spacing w:after="20"/>
             </w:pPr>
             <w:r>
               <w:rPr>
-                <w:rFonts w:ascii="Calibri" w:hAnsi="Calibri"/>
+                <w:rFonts w:ascii="Helvetica Neue" w:hAnsi="Helvetica Neue"/>
                 <w:b w:val="0"/>
-                <w:i w:val="0"/>
-                <w:color w:val="3A3A3A"/>
-                <w:sz w:val="20"/>
+                <w:color w:val="1D1D1F"/>
+                <w:sz w:val="21"/>
               </w:rPr>
               <w:t>{{KUNDE_ANSPRECHPARTNER}}</w:t>
             </w:r>
           </w:p>
           <w:p>
             <w:pPr>
-              <w:spacing w:before="0" w:after="20" w:line="259" w:lineRule="auto"/>
+              <w:spacing w:after="20"/>
             </w:pPr>
             <w:r>
               <w:rPr>
-                <w:rFonts w:ascii="Calibri" w:hAnsi="Calibri"/>
+                <w:rFonts w:ascii="Helvetica Neue" w:hAnsi="Helvetica Neue"/>
                 <w:b w:val="0"/>
-                <w:i w:val="0"/>
-                <w:color w:val="3A3A3A"/>
-                <w:sz w:val="20"/>
+                <w:color w:val="1D1D1F"/>
+                <w:sz w:val="21"/>
               </w:rPr>
               <w:t>{{KUNDE_STRASSE}}</w:t>
             </w:r>
           </w:p>
           <w:p>
             <w:pPr>
-              <w:spacing w:before="0" w:after="20" w:line="259" w:lineRule="auto"/>
+              <w:spacing w:after="20"/>
             </w:pPr>
             <w:r>
               <w:rPr>
-                <w:rFonts w:ascii="Calibri" w:hAnsi="Calibri"/>
+                <w:rFonts w:ascii="Helvetica Neue" w:hAnsi="Helvetica Neue"/>
                 <w:b w:val="0"/>
-                <w:i w:val="0"/>
-                <w:color w:val="3A3A3A"/>
-                <w:sz w:val="20"/>
+                <w:color w:val="1D1D1F"/>
+                <w:sz w:val="21"/>
               </w:rPr>
               <w:t>{{KUNDE_PLZ_ORT}}</w:t>
             </w:r>
           </w:p>
           <w:p>
             <w:pPr>
-              <w:spacing w:before="0" w:after="20" w:line="259" w:lineRule="auto"/>
+              <w:spacing w:after="20"/>
             </w:pPr>
             <w:r>
               <w:rPr>
-                <w:rFonts w:ascii="Calibri" w:hAnsi="Calibri"/>
+                <w:rFonts w:ascii="Helvetica Neue" w:hAnsi="Helvetica Neue"/>
                 <w:b w:val="0"/>
-                <w:i w:val="0"/>
-                <w:color w:val="3A3A3A"/>
-                <w:sz w:val="20"/>
+                <w:color w:val="86868B"/>
+                <w:sz w:val="21"/>
               </w:rPr>
               <w:t>{{KUNDE_LAND}}</w:t>
             </w:r>
@@ -121,1327 +212,352 @@
         </w:tc>
         <w:tc>
           <w:tcPr>
-            <w:tcW w:type="dxa" w:w="4252"/>
-          </w:tcPr>
-          <w:p/>
-          <w:tbl>
-            <w:tblPr>
-              <w:tblW w:type="auto" w:w="0"/>
-              <w:tblLook w:firstColumn="1" w:firstRow="1" w:lastColumn="0" w:lastRow="0" w:noHBand="0" w:noVBand="1" w:val="04A0"/>
-              <w:tblBorders>
-                <w:top w:val="none"/>
-                <w:left w:val="none"/>
-                <w:bottom w:val="none"/>
-                <w:right w:val="none"/>
-                <w:insideH w:val="none"/>
-                <w:insideV w:val="none"/>
-              </w:tblBorders>
-            </w:tblPr>
-            <w:tblGrid>
-              <w:gridCol w:w="2126"/>
-              <w:gridCol w:w="2126"/>
-            </w:tblGrid>
-            <w:tr>
-              <w:tc>
-                <w:tcPr>
-                  <w:tcW w:type="dxa" w:w="1984"/>
-                  <w:tcMar>
-                    <w:top w:w="40" w:type="dxa"/>
-                    <w:bottom w:w="40" w:type="dxa"/>
-                    <w:start w:w="80" w:type="dxa"/>
-                    <w:end w:w="80" w:type="dxa"/>
-                    <w:left w:w="80" w:type="dxa"/>
-                    <w:right w:w="80" w:type="dxa"/>
-                  </w:tcMar>
-                  <w:shd w:val="clear" w:color="auto" w:fill="E8EDF7"/>
-                  <w:tcBorders>
-                    <w:left w:val="single" w:sz="18" w:space="0" w:color="000D6E"/>
-                  </w:tcBorders>
-                </w:tcPr>
-                <w:p>
-                  <w:r>
-                    <w:rPr>
-                      <w:rFonts w:ascii="Calibri" w:hAnsi="Calibri"/>
-                      <w:b/>
-                      <w:i w:val="0"/>
-                      <w:color w:val="000D6E"/>
-                      <w:sz w:val="17"/>
-                    </w:rPr>
-                    <w:t>Nr.</w:t>
-                  </w:r>
-                </w:p>
-              </w:tc>
-              <w:tc>
-                <w:tcPr>
-                  <w:tcW w:type="dxa" w:w="2268"/>
-                  <w:tcMar>
-                    <w:top w:w="40" w:type="dxa"/>
-                    <w:bottom w:w="40" w:type="dxa"/>
-                    <w:start w:w="80" w:type="dxa"/>
-                    <w:end w:w="80" w:type="dxa"/>
-                    <w:left w:w="80" w:type="dxa"/>
-                    <w:right w:w="80" w:type="dxa"/>
-                  </w:tcMar>
-                  <w:shd w:val="clear" w:color="auto" w:fill="E8EDF7"/>
-                </w:tcPr>
-                <w:p>
-                  <w:pPr>
-                    <w:jc w:val="right"/>
-                  </w:pPr>
-                  <w:r>
-                    <w:rPr>
-                      <w:rFonts w:ascii="Calibri" w:hAnsi="Calibri"/>
-                      <w:b w:val="0"/>
-                      <w:i w:val="0"/>
-                      <w:color w:val="3A3A3A"/>
-                      <w:sz w:val="17"/>
-                    </w:rPr>
-                    <w:t>{{DOKUMENT_NR}}</w:t>
-                  </w:r>
-                </w:p>
-              </w:tc>
-            </w:tr>
-            <w:tr>
-              <w:tc>
-                <w:tcPr>
-                  <w:tcW w:type="dxa" w:w="1984"/>
-                  <w:tcMar>
-                    <w:top w:w="40" w:type="dxa"/>
-                    <w:bottom w:w="40" w:type="dxa"/>
-                    <w:start w:w="80" w:type="dxa"/>
-                    <w:end w:w="80" w:type="dxa"/>
-                    <w:left w:w="80" w:type="dxa"/>
-                    <w:right w:w="80" w:type="dxa"/>
-                  </w:tcMar>
-                  <w:shd w:val="clear" w:color="auto" w:fill="FFFFFF"/>
-                  <w:tcBorders>
-                    <w:left w:val="single" w:sz="18" w:space="0" w:color="000D6E"/>
-                  </w:tcBorders>
-                </w:tcPr>
-                <w:p>
-                  <w:r>
-                    <w:rPr>
-                      <w:rFonts w:ascii="Calibri" w:hAnsi="Calibri"/>
-                      <w:b/>
-                      <w:i w:val="0"/>
-                      <w:color w:val="000D6E"/>
-                      <w:sz w:val="17"/>
-                    </w:rPr>
-                    <w:t>Datum</w:t>
-                  </w:r>
-                </w:p>
-              </w:tc>
-              <w:tc>
-                <w:tcPr>
-                  <w:tcW w:type="dxa" w:w="2268"/>
-                  <w:tcMar>
-                    <w:top w:w="40" w:type="dxa"/>
-                    <w:bottom w:w="40" w:type="dxa"/>
-                    <w:start w:w="80" w:type="dxa"/>
-                    <w:end w:w="80" w:type="dxa"/>
-                    <w:left w:w="80" w:type="dxa"/>
-                    <w:right w:w="80" w:type="dxa"/>
-                  </w:tcMar>
-                  <w:shd w:val="clear" w:color="auto" w:fill="FFFFFF"/>
-                </w:tcPr>
-                <w:p>
-                  <w:pPr>
-                    <w:jc w:val="right"/>
-                  </w:pPr>
-                  <w:r>
-                    <w:rPr>
-                      <w:rFonts w:ascii="Calibri" w:hAnsi="Calibri"/>
-                      <w:b w:val="0"/>
-                      <w:i w:val="0"/>
-                      <w:color w:val="3A3A3A"/>
-                      <w:sz w:val="17"/>
-                    </w:rPr>
-                    <w:t>{{DATUM}}</w:t>
-                  </w:r>
-                </w:p>
-              </w:tc>
-            </w:tr>
-            <w:tr>
-              <w:tc>
-                <w:tcPr>
-                  <w:tcW w:type="dxa" w:w="1984"/>
-                  <w:tcMar>
-                    <w:top w:w="40" w:type="dxa"/>
-                    <w:bottom w:w="40" w:type="dxa"/>
-                    <w:start w:w="80" w:type="dxa"/>
-                    <w:end w:w="80" w:type="dxa"/>
-                    <w:left w:w="80" w:type="dxa"/>
-                    <w:right w:w="80" w:type="dxa"/>
-                  </w:tcMar>
-                  <w:shd w:val="clear" w:color="auto" w:fill="E8EDF7"/>
-                  <w:tcBorders>
-                    <w:left w:val="single" w:sz="18" w:space="0" w:color="000D6E"/>
-                  </w:tcBorders>
-                </w:tcPr>
-                <w:p>
-                  <w:r>
-                    <w:rPr>
-                      <w:rFonts w:ascii="Calibri" w:hAnsi="Calibri"/>
-                      <w:b/>
-                      <w:i w:val="0"/>
-                      <w:color w:val="000D6E"/>
-                      <w:sz w:val="17"/>
-                    </w:rPr>
-                    <w:t>Kundennummer</w:t>
-                  </w:r>
-                </w:p>
-              </w:tc>
-              <w:tc>
-                <w:tcPr>
-                  <w:tcW w:type="dxa" w:w="2268"/>
-                  <w:tcMar>
-                    <w:top w:w="40" w:type="dxa"/>
-                    <w:bottom w:w="40" w:type="dxa"/>
-                    <w:start w:w="80" w:type="dxa"/>
-                    <w:end w:w="80" w:type="dxa"/>
-                    <w:left w:w="80" w:type="dxa"/>
-                    <w:right w:w="80" w:type="dxa"/>
-                  </w:tcMar>
-                  <w:shd w:val="clear" w:color="auto" w:fill="E8EDF7"/>
-                </w:tcPr>
-                <w:p>
-                  <w:pPr>
-                    <w:jc w:val="right"/>
-                  </w:pPr>
-                  <w:r>
-                    <w:rPr>
-                      <w:rFonts w:ascii="Calibri" w:hAnsi="Calibri"/>
-                      <w:b w:val="0"/>
-                      <w:i w:val="0"/>
-                      <w:color w:val="3A3A3A"/>
-                      <w:sz w:val="17"/>
-                    </w:rPr>
-                    <w:t>{{KUNDENNUMMER}}</w:t>
-                  </w:r>
-                </w:p>
-              </w:tc>
-            </w:tr>
-            <w:tr>
-              <w:tc>
-                <w:tcPr>
-                  <w:tcW w:type="dxa" w:w="1984"/>
-                  <w:tcMar>
-                    <w:top w:w="40" w:type="dxa"/>
-                    <w:bottom w:w="40" w:type="dxa"/>
-                    <w:start w:w="80" w:type="dxa"/>
-                    <w:end w:w="80" w:type="dxa"/>
-                    <w:left w:w="80" w:type="dxa"/>
-                    <w:right w:w="80" w:type="dxa"/>
-                  </w:tcMar>
-                  <w:shd w:val="clear" w:color="auto" w:fill="FFFFFF"/>
-                  <w:tcBorders>
-                    <w:left w:val="single" w:sz="18" w:space="0" w:color="000D6E"/>
-                  </w:tcBorders>
-                </w:tcPr>
-                <w:p>
-                  <w:r>
-                    <w:rPr>
-                      <w:rFonts w:ascii="Calibri" w:hAnsi="Calibri"/>
-                      <w:b/>
-                      <w:i w:val="0"/>
-                      <w:color w:val="000D6E"/>
-                      <w:sz w:val="17"/>
-                    </w:rPr>
-                    <w:t>Ansprechpartner</w:t>
-                  </w:r>
-                </w:p>
-              </w:tc>
-              <w:tc>
-                <w:tcPr>
-                  <w:tcW w:type="dxa" w:w="2268"/>
-                  <w:tcMar>
-                    <w:top w:w="40" w:type="dxa"/>
-                    <w:bottom w:w="40" w:type="dxa"/>
-                    <w:start w:w="80" w:type="dxa"/>
-                    <w:end w:w="80" w:type="dxa"/>
-                    <w:left w:w="80" w:type="dxa"/>
-                    <w:right w:w="80" w:type="dxa"/>
-                  </w:tcMar>
-                  <w:shd w:val="clear" w:color="auto" w:fill="FFFFFF"/>
-                </w:tcPr>
-                <w:p>
-                  <w:pPr>
-                    <w:jc w:val="right"/>
-                  </w:pPr>
-                  <w:r>
-                    <w:rPr>
-                      <w:rFonts w:ascii="Calibri" w:hAnsi="Calibri"/>
-                      <w:b w:val="0"/>
-                      <w:i w:val="0"/>
-                      <w:color w:val="3A3A3A"/>
-                      <w:sz w:val="17"/>
-                    </w:rPr>
-                    <w:t>Burak Ücöz</w:t>
-                  </w:r>
-                </w:p>
-              </w:tc>
-            </w:tr>
-            <w:tr>
-              <w:tc>
-                <w:tcPr>
-                  <w:tcW w:type="dxa" w:w="1984"/>
-                  <w:tcMar>
-                    <w:top w:w="40" w:type="dxa"/>
-                    <w:bottom w:w="40" w:type="dxa"/>
-                    <w:start w:w="80" w:type="dxa"/>
-                    <w:end w:w="80" w:type="dxa"/>
-                    <w:left w:w="80" w:type="dxa"/>
-                    <w:right w:w="80" w:type="dxa"/>
-                  </w:tcMar>
-                  <w:shd w:val="clear" w:color="auto" w:fill="E8EDF7"/>
-                  <w:tcBorders>
-                    <w:left w:val="single" w:sz="18" w:space="0" w:color="000D6E"/>
-                  </w:tcBorders>
-                </w:tcPr>
-                <w:p>
-                  <w:r>
-                    <w:rPr>
-                      <w:rFonts w:ascii="Calibri" w:hAnsi="Calibri"/>
-                      <w:b/>
-                      <w:i w:val="0"/>
-                      <w:color w:val="000D6E"/>
-                      <w:sz w:val="17"/>
-                    </w:rPr>
-                    <w:t>{{FRIST_LABEL}}</w:t>
-                  </w:r>
-                </w:p>
-              </w:tc>
-              <w:tc>
-                <w:tcPr>
-                  <w:tcW w:type="dxa" w:w="2268"/>
-                  <w:tcMar>
-                    <w:top w:w="40" w:type="dxa"/>
-                    <w:bottom w:w="40" w:type="dxa"/>
-                    <w:start w:w="80" w:type="dxa"/>
-                    <w:end w:w="80" w:type="dxa"/>
-                    <w:left w:w="80" w:type="dxa"/>
-                    <w:right w:w="80" w:type="dxa"/>
-                  </w:tcMar>
-                  <w:shd w:val="clear" w:color="auto" w:fill="E8EDF7"/>
-                </w:tcPr>
-                <w:p>
-                  <w:pPr>
-                    <w:jc w:val="right"/>
-                  </w:pPr>
-                  <w:r>
-                    <w:rPr>
-                      <w:rFonts w:ascii="Calibri" w:hAnsi="Calibri"/>
-                      <w:b w:val="0"/>
-                      <w:i w:val="0"/>
-                      <w:color w:val="3A3A3A"/>
-                      <w:sz w:val="17"/>
-                    </w:rPr>
-                    <w:t>{{FRIST_WERT}}</w:t>
-                  </w:r>
-                </w:p>
-              </w:tc>
-            </w:tr>
-          </w:tbl>
-          <w:p/>
-        </w:tc>
-      </w:tr>
-    </w:tbl>
-    <w:p>
-      <w:pPr>
-        <w:spacing w:before="0" w:after="80" w:line="259" w:lineRule="auto"/>
-      </w:pPr>
-    </w:p>
-    <w:p>
-      <w:pPr>
-        <w:spacing w:before="120" w:after="20" w:line="259" w:lineRule="auto"/>
-      </w:pPr>
-      <w:r>
-        <w:rPr>
-          <w:rFonts w:ascii="Calibri" w:hAnsi="Calibri"/>
-          <w:b/>
-          <w:i w:val="0"/>
-          <w:color w:val="000D6E"/>
-          <w:sz w:val="44"/>
-          <w:spacing w:val="20"/>
-        </w:rPr>
-        <w:t>{{DOKUMENTTYP}}</w:t>
-      </w:r>
-    </w:p>
-    <w:p>
-      <w:pPr>
-        <w:spacing w:before="0" w:after="120" w:line="259" w:lineRule="auto"/>
-        <w:pBdr>
-          <w:bottom w:val="single" w:sz="12" w:space="4" w:color="1E63D6"/>
-        </w:pBdr>
-      </w:pPr>
-      <w:r>
-        <w:rPr>
-          <w:rFonts w:ascii="Calibri" w:hAnsi="Calibri"/>
-          <w:b/>
-          <w:i w:val="0"/>
-          <w:color w:val="1E63D6"/>
-          <w:sz w:val="22"/>
-        </w:rPr>
-        <w:t>{{BETREFF}}</w:t>
-      </w:r>
-    </w:p>
-    <w:p>
-      <w:pPr>
-        <w:spacing w:before="120" w:after="120" w:line="259" w:lineRule="auto"/>
-      </w:pPr>
-      <w:r>
-        <w:rPr>
-          <w:rFonts w:ascii="Calibri" w:hAnsi="Calibri"/>
-          <w:b w:val="0"/>
-          <w:i w:val="0"/>
-          <w:color w:val="3A3A3A"/>
-          <w:sz w:val="20"/>
-        </w:rPr>
-        <w:t>Sehr geehrte Damen und Herren</w:t>
-      </w:r>
-    </w:p>
-    <w:p>
-      <w:pPr>
-        <w:spacing w:before="0" w:after="160" w:line="276" w:lineRule="auto"/>
-      </w:pPr>
-      <w:r>
-        <w:rPr>
-          <w:rFonts w:ascii="Calibri" w:hAnsi="Calibri"/>
-          <w:b w:val="0"/>
-          <w:i w:val="0"/>
-          <w:color w:val="3A3A3A"/>
-          <w:sz w:val="20"/>
-        </w:rPr>
-        <w:t>{{EINLEITUNGSTEXT – z. B. „gerne unterbreiten wir Ihnen folgendes Angebot.“ oder „wir erlauben uns, Ihnen folgende Leistungen in Rechnung zu stellen.“}}</w:t>
-      </w:r>
-    </w:p>
-    <w:tbl>
-      <w:tblPr>
-        <w:tblW w:type="auto" w:w="0"/>
-        <w:tblLayout w:type="fixed"/>
-        <w:tblLook w:firstColumn="1" w:firstRow="1" w:lastColumn="0" w:lastRow="0" w:noHBand="0" w:noVBand="1" w:val="04A0"/>
-        <w:jc w:val="center"/>
-        <w:tblBorders>
-          <w:top w:val="none"/>
-          <w:left w:val="none"/>
-          <w:bottom w:val="none"/>
-          <w:right w:val="none"/>
-          <w:insideH w:val="none"/>
-          <w:insideV w:val="none"/>
-        </w:tblBorders>
-      </w:tblPr>
-      <w:tblGrid>
-        <w:gridCol w:w="1606"/>
-        <w:gridCol w:w="1606"/>
-        <w:gridCol w:w="1606"/>
-        <w:gridCol w:w="1606"/>
-        <w:gridCol w:w="1606"/>
-        <w:gridCol w:w="1606"/>
-      </w:tblGrid>
-      <w:tr>
-        <w:tc>
-          <w:tcPr>
-            <w:tcW w:type="dxa" w:w="680"/>
-            <w:shd w:val="clear" w:color="auto" w:fill="000D6E"/>
-            <w:tcMar>
-              <w:top w:w="60" w:type="dxa"/>
-              <w:bottom w:w="60" w:type="dxa"/>
-              <w:start w:w="80" w:type="dxa"/>
-              <w:end w:w="80" w:type="dxa"/>
-              <w:left w:w="80" w:type="dxa"/>
-              <w:right w:w="80" w:type="dxa"/>
-            </w:tcMar>
-            <w:vAlign w:val="center"/>
-          </w:tcPr>
-          <w:p>
-            <w:pPr>
-              <w:jc w:val="center"/>
-            </w:pPr>
-            <w:r>
-              <w:rPr>
-                <w:rFonts w:ascii="Calibri" w:hAnsi="Calibri"/>
-                <w:b/>
-                <w:i w:val="0"/>
-                <w:caps/>
-                <w:color w:val="FFFFFF"/>
-                <w:sz w:val="17"/>
-                <w:spacing w:val="10"/>
-              </w:rPr>
-              <w:t>Pos.</w:t>
-            </w:r>
-          </w:p>
-        </w:tc>
-        <w:tc>
-          <w:tcPr>
-            <w:tcW w:type="dxa" w:w="1587"/>
-            <w:shd w:val="clear" w:color="auto" w:fill="000D6E"/>
-            <w:tcMar>
-              <w:top w:w="60" w:type="dxa"/>
-              <w:bottom w:w="60" w:type="dxa"/>
-              <w:start w:w="80" w:type="dxa"/>
-              <w:end w:w="80" w:type="dxa"/>
-              <w:left w:w="80" w:type="dxa"/>
-              <w:right w:w="80" w:type="dxa"/>
-            </w:tcMar>
-            <w:vAlign w:val="center"/>
-          </w:tcPr>
-          <w:p>
-            <w:pPr>
-              <w:jc w:val="left"/>
-            </w:pPr>
-            <w:r>
-              <w:rPr>
-                <w:rFonts w:ascii="Calibri" w:hAnsi="Calibri"/>
-                <w:b/>
-                <w:i w:val="0"/>
-                <w:caps/>
-                <w:color w:val="FFFFFF"/>
-                <w:sz w:val="17"/>
-                <w:spacing w:val="10"/>
-              </w:rPr>
-              <w:t>Leistung</w:t>
-            </w:r>
-          </w:p>
-        </w:tc>
-        <w:tc>
-          <w:tcPr>
-            <w:tcW w:type="dxa" w:w="3969"/>
-            <w:shd w:val="clear" w:color="auto" w:fill="000D6E"/>
-            <w:tcMar>
-              <w:top w:w="60" w:type="dxa"/>
-              <w:bottom w:w="60" w:type="dxa"/>
-              <w:start w:w="80" w:type="dxa"/>
-              <w:end w:w="80" w:type="dxa"/>
-              <w:left w:w="80" w:type="dxa"/>
-              <w:right w:w="80" w:type="dxa"/>
-            </w:tcMar>
-            <w:vAlign w:val="center"/>
-          </w:tcPr>
-          <w:p>
-            <w:pPr>
-              <w:jc w:val="left"/>
-            </w:pPr>
-            <w:r>
-              <w:rPr>
-                <w:rFonts w:ascii="Calibri" w:hAnsi="Calibri"/>
-                <w:b/>
-                <w:i w:val="0"/>
-                <w:caps/>
-                <w:color w:val="FFFFFF"/>
-                <w:sz w:val="17"/>
-                <w:spacing w:val="10"/>
-              </w:rPr>
-              <w:t>Beschreibung</w:t>
-            </w:r>
-          </w:p>
-        </w:tc>
-        <w:tc>
-          <w:tcPr>
-            <w:tcW w:type="dxa" w:w="1361"/>
-            <w:shd w:val="clear" w:color="auto" w:fill="000D6E"/>
-            <w:tcMar>
-              <w:top w:w="60" w:type="dxa"/>
-              <w:bottom w:w="60" w:type="dxa"/>
-              <w:start w:w="80" w:type="dxa"/>
-              <w:end w:w="80" w:type="dxa"/>
-              <w:left w:w="80" w:type="dxa"/>
-              <w:right w:w="80" w:type="dxa"/>
-            </w:tcMar>
-            <w:vAlign w:val="center"/>
-          </w:tcPr>
-          <w:p>
-            <w:pPr>
-              <w:jc w:val="right"/>
-            </w:pPr>
-            <w:r>
-              <w:rPr>
-                <w:rFonts w:ascii="Calibri" w:hAnsi="Calibri"/>
-                <w:b/>
-                <w:i w:val="0"/>
-                <w:caps/>
-                <w:color w:val="FFFFFF"/>
-                <w:sz w:val="17"/>
-                <w:spacing w:val="10"/>
-              </w:rPr>
-              <w:t>Einzelpreis</w:t>
-              <w:br/>
-              <w:t>CHF</w:t>
-            </w:r>
-          </w:p>
-        </w:tc>
-        <w:tc>
-          <w:tcPr>
-            <w:tcW w:type="dxa" w:w="794"/>
-            <w:shd w:val="clear" w:color="auto" w:fill="000D6E"/>
-            <w:tcMar>
-              <w:top w:w="60" w:type="dxa"/>
-              <w:bottom w:w="60" w:type="dxa"/>
-              <w:start w:w="80" w:type="dxa"/>
-              <w:end w:w="80" w:type="dxa"/>
-              <w:left w:w="80" w:type="dxa"/>
-              <w:right w:w="80" w:type="dxa"/>
-            </w:tcMar>
-            <w:vAlign w:val="center"/>
-          </w:tcPr>
-          <w:p>
-            <w:pPr>
-              <w:jc w:val="right"/>
-            </w:pPr>
-            <w:r>
-              <w:rPr>
-                <w:rFonts w:ascii="Calibri" w:hAnsi="Calibri"/>
-                <w:b/>
-                <w:i w:val="0"/>
-                <w:caps/>
-                <w:color w:val="FFFFFF"/>
-                <w:sz w:val="17"/>
-                <w:spacing w:val="10"/>
-              </w:rPr>
-              <w:t>Menge</w:t>
-            </w:r>
-          </w:p>
-        </w:tc>
-        <w:tc>
-          <w:tcPr>
-            <w:tcW w:type="dxa" w:w="1247"/>
-            <w:shd w:val="clear" w:color="auto" w:fill="000D6E"/>
-            <w:tcMar>
-              <w:top w:w="60" w:type="dxa"/>
-              <w:bottom w:w="60" w:type="dxa"/>
-              <w:start w:w="80" w:type="dxa"/>
-              <w:end w:w="80" w:type="dxa"/>
-              <w:left w:w="80" w:type="dxa"/>
-              <w:right w:w="80" w:type="dxa"/>
-            </w:tcMar>
-            <w:vAlign w:val="center"/>
-          </w:tcPr>
-          <w:p>
-            <w:pPr>
-              <w:jc w:val="right"/>
-            </w:pPr>
-            <w:r>
-              <w:rPr>
-                <w:rFonts w:ascii="Calibri" w:hAnsi="Calibri"/>
-                <w:b/>
-                <w:i w:val="0"/>
-                <w:caps/>
-                <w:color w:val="FFFFFF"/>
-                <w:sz w:val="17"/>
-                <w:spacing w:val="10"/>
-              </w:rPr>
-              <w:t>Summe</w:t>
-              <w:br/>
-              <w:t>CHF</w:t>
-            </w:r>
-          </w:p>
-        </w:tc>
-      </w:tr>
-      <w:tr>
-        <w:tc>
-          <w:tcPr>
-            <w:tcW w:type="dxa" w:w="680"/>
-            <w:shd w:val="clear" w:color="auto" w:fill="FFFFFF"/>
-            <w:tcMar>
-              <w:top w:w="50" w:type="dxa"/>
-              <w:bottom w:w="50" w:type="dxa"/>
-              <w:start w:w="80" w:type="dxa"/>
-              <w:end w:w="80" w:type="dxa"/>
-              <w:left w:w="80" w:type="dxa"/>
-              <w:right w:w="80" w:type="dxa"/>
-            </w:tcMar>
-            <w:vAlign w:val="center"/>
-            <w:tcBorders>
-              <w:bottom w:val="single" w:sz="4" w:space="0" w:color="D9DEEA"/>
-            </w:tcBorders>
-          </w:tcPr>
-          <w:p>
-            <w:pPr>
-              <w:jc w:val="center"/>
-            </w:pPr>
-            <w:r>
-              <w:rPr>
-                <w:rFonts w:ascii="Calibri" w:hAnsi="Calibri"/>
-                <w:b w:val="0"/>
-                <w:i w:val="0"/>
-                <w:color w:val="3A3A3A"/>
-                <w:sz w:val="19"/>
-              </w:rPr>
-              <w:t>001</w:t>
-            </w:r>
-          </w:p>
-        </w:tc>
-        <w:tc>
-          <w:tcPr>
-            <w:tcW w:type="dxa" w:w="1587"/>
-            <w:shd w:val="clear" w:color="auto" w:fill="FFFFFF"/>
-            <w:tcMar>
-              <w:top w:w="50" w:type="dxa"/>
-              <w:bottom w:w="50" w:type="dxa"/>
-              <w:start w:w="80" w:type="dxa"/>
-              <w:end w:w="80" w:type="dxa"/>
-              <w:left w:w="80" w:type="dxa"/>
-              <w:right w:w="80" w:type="dxa"/>
-            </w:tcMar>
-            <w:vAlign w:val="center"/>
-            <w:tcBorders>
-              <w:bottom w:val="single" w:sz="4" w:space="0" w:color="D9DEEA"/>
-            </w:tcBorders>
+            <w:tcW w:type="dxa" w:w="4876"/>
           </w:tcPr>
           <w:p>
             <w:r>
-              <w:rPr>
-                <w:rFonts w:ascii="Calibri" w:hAnsi="Calibri"/>
-                <w:b w:val="0"/>
-                <w:i w:val="0"/>
-                <w:color w:val="3A3A3A"/>
-                <w:sz w:val="19"/>
-              </w:rPr>
-              <w:t>Dienstleistung</w:t>
-            </w:r>
-          </w:p>
-        </w:tc>
-        <w:tc>
-          <w:tcPr>
-            <w:tcW w:type="dxa" w:w="3969"/>
-            <w:shd w:val="clear" w:color="auto" w:fill="FFFFFF"/>
-            <w:tcMar>
-              <w:top w:w="50" w:type="dxa"/>
-              <w:bottom w:w="50" w:type="dxa"/>
-              <w:start w:w="80" w:type="dxa"/>
-              <w:end w:w="80" w:type="dxa"/>
-              <w:left w:w="80" w:type="dxa"/>
-              <w:right w:w="80" w:type="dxa"/>
-            </w:tcMar>
-            <w:vAlign w:val="center"/>
-            <w:tcBorders>
-              <w:bottom w:val="single" w:sz="4" w:space="0" w:color="D9DEEA"/>
-            </w:tcBorders>
-          </w:tcPr>
-          <w:p>
-            <w:r>
-              <w:rPr>
-                <w:rFonts w:ascii="Calibri" w:hAnsi="Calibri"/>
-                <w:b w:val="0"/>
-                <w:i w:val="0"/>
-                <w:color w:val="3A3A3A"/>
-                <w:sz w:val="19"/>
-              </w:rPr>
-              <w:t>{{LEISTUNG 1 – Beschreibung}}</w:t>
-            </w:r>
-          </w:p>
-        </w:tc>
-        <w:tc>
-          <w:tcPr>
-            <w:tcW w:type="dxa" w:w="1361"/>
-            <w:shd w:val="clear" w:color="auto" w:fill="FFFFFF"/>
-            <w:tcMar>
-              <w:top w:w="50" w:type="dxa"/>
-              <w:bottom w:w="50" w:type="dxa"/>
-              <w:start w:w="80" w:type="dxa"/>
-              <w:end w:w="80" w:type="dxa"/>
-              <w:left w:w="80" w:type="dxa"/>
-              <w:right w:w="80" w:type="dxa"/>
-            </w:tcMar>
-            <w:vAlign w:val="center"/>
-            <w:tcBorders>
-              <w:bottom w:val="single" w:sz="4" w:space="0" w:color="D9DEEA"/>
-            </w:tcBorders>
-          </w:tcPr>
-          <w:p>
-            <w:pPr>
-              <w:jc w:val="right"/>
-            </w:pPr>
-            <w:r>
-              <w:rPr>
-                <w:rFonts w:ascii="Calibri" w:hAnsi="Calibri"/>
-                <w:b w:val="0"/>
-                <w:i w:val="0"/>
-                <w:color w:val="3A3A3A"/>
-                <w:sz w:val="19"/>
-              </w:rPr>
-              <w:t>0.00</w:t>
-            </w:r>
-          </w:p>
-        </w:tc>
-        <w:tc>
-          <w:tcPr>
-            <w:tcW w:type="dxa" w:w="794"/>
-            <w:shd w:val="clear" w:color="auto" w:fill="FFFFFF"/>
-            <w:tcMar>
-              <w:top w:w="50" w:type="dxa"/>
-              <w:bottom w:w="50" w:type="dxa"/>
-              <w:start w:w="80" w:type="dxa"/>
-              <w:end w:w="80" w:type="dxa"/>
-              <w:left w:w="80" w:type="dxa"/>
-              <w:right w:w="80" w:type="dxa"/>
-            </w:tcMar>
-            <w:vAlign w:val="center"/>
-            <w:tcBorders>
-              <w:bottom w:val="single" w:sz="4" w:space="0" w:color="D9DEEA"/>
-            </w:tcBorders>
-          </w:tcPr>
-          <w:p>
-            <w:pPr>
-              <w:jc w:val="right"/>
-            </w:pPr>
-            <w:r>
-              <w:rPr>
-                <w:rFonts w:ascii="Calibri" w:hAnsi="Calibri"/>
-                <w:b w:val="0"/>
-                <w:i w:val="0"/>
-                <w:color w:val="3A3A3A"/>
-                <w:sz w:val="19"/>
-              </w:rPr>
-              <w:t>1</w:t>
-            </w:r>
-          </w:p>
-        </w:tc>
-        <w:tc>
-          <w:tcPr>
-            <w:tcW w:type="dxa" w:w="1247"/>
-            <w:shd w:val="clear" w:color="auto" w:fill="FFFFFF"/>
-            <w:tcMar>
-              <w:top w:w="50" w:type="dxa"/>
-              <w:bottom w:w="50" w:type="dxa"/>
-              <w:start w:w="80" w:type="dxa"/>
-              <w:end w:w="80" w:type="dxa"/>
-              <w:left w:w="80" w:type="dxa"/>
-              <w:right w:w="80" w:type="dxa"/>
-            </w:tcMar>
-            <w:vAlign w:val="center"/>
-            <w:tcBorders>
-              <w:bottom w:val="single" w:sz="4" w:space="0" w:color="D9DEEA"/>
-            </w:tcBorders>
-          </w:tcPr>
-          <w:p>
-            <w:pPr>
-              <w:jc w:val="right"/>
-            </w:pPr>
-            <w:r>
-              <w:rPr>
-                <w:rFonts w:ascii="Calibri" w:hAnsi="Calibri"/>
-                <w:b/>
-                <w:i w:val="0"/>
-                <w:color w:val="000D6E"/>
-                <w:sz w:val="19"/>
-              </w:rPr>
-              <w:t>0.00</w:t>
-            </w:r>
-          </w:p>
-        </w:tc>
-      </w:tr>
-      <w:tr>
-        <w:tc>
-          <w:tcPr>
-            <w:tcW w:type="dxa" w:w="680"/>
-            <w:shd w:val="clear" w:color="auto" w:fill="F2F5FB"/>
-            <w:tcMar>
-              <w:top w:w="50" w:type="dxa"/>
-              <w:bottom w:w="50" w:type="dxa"/>
-              <w:start w:w="80" w:type="dxa"/>
-              <w:end w:w="80" w:type="dxa"/>
-              <w:left w:w="80" w:type="dxa"/>
-              <w:right w:w="80" w:type="dxa"/>
-            </w:tcMar>
-            <w:vAlign w:val="center"/>
-            <w:tcBorders>
-              <w:bottom w:val="single" w:sz="4" w:space="0" w:color="D9DEEA"/>
-            </w:tcBorders>
-          </w:tcPr>
-          <w:p>
-            <w:pPr>
-              <w:jc w:val="center"/>
-            </w:pPr>
-            <w:r>
-              <w:rPr>
-                <w:rFonts w:ascii="Calibri" w:hAnsi="Calibri"/>
-                <w:b w:val="0"/>
-                <w:i w:val="0"/>
-                <w:color w:val="3A3A3A"/>
-                <w:sz w:val="19"/>
-              </w:rPr>
-              <w:t>002</w:t>
-            </w:r>
-          </w:p>
-        </w:tc>
-        <w:tc>
-          <w:tcPr>
-            <w:tcW w:type="dxa" w:w="1587"/>
-            <w:shd w:val="clear" w:color="auto" w:fill="F2F5FB"/>
-            <w:tcMar>
-              <w:top w:w="50" w:type="dxa"/>
-              <w:bottom w:w="50" w:type="dxa"/>
-              <w:start w:w="80" w:type="dxa"/>
-              <w:end w:w="80" w:type="dxa"/>
-              <w:left w:w="80" w:type="dxa"/>
-              <w:right w:w="80" w:type="dxa"/>
-            </w:tcMar>
-            <w:vAlign w:val="center"/>
-            <w:tcBorders>
-              <w:bottom w:val="single" w:sz="4" w:space="0" w:color="D9DEEA"/>
-            </w:tcBorders>
-          </w:tcPr>
-          <w:p>
-            <w:r>
-              <w:rPr>
-                <w:rFonts w:ascii="Calibri" w:hAnsi="Calibri"/>
-                <w:b w:val="0"/>
-                <w:i w:val="0"/>
-                <w:color w:val="3A3A3A"/>
-                <w:sz w:val="19"/>
-              </w:rPr>
-              <w:t>Dienstleistung</w:t>
-            </w:r>
-          </w:p>
-        </w:tc>
-        <w:tc>
-          <w:tcPr>
-            <w:tcW w:type="dxa" w:w="3969"/>
-            <w:shd w:val="clear" w:color="auto" w:fill="F2F5FB"/>
-            <w:tcMar>
-              <w:top w:w="50" w:type="dxa"/>
-              <w:bottom w:w="50" w:type="dxa"/>
-              <w:start w:w="80" w:type="dxa"/>
-              <w:end w:w="80" w:type="dxa"/>
-              <w:left w:w="80" w:type="dxa"/>
-              <w:right w:w="80" w:type="dxa"/>
-            </w:tcMar>
-            <w:vAlign w:val="center"/>
-            <w:tcBorders>
-              <w:bottom w:val="single" w:sz="4" w:space="0" w:color="D9DEEA"/>
-            </w:tcBorders>
-          </w:tcPr>
-          <w:p>
-            <w:r>
-              <w:rPr>
-                <w:rFonts w:ascii="Calibri" w:hAnsi="Calibri"/>
-                <w:b w:val="0"/>
-                <w:i w:val="0"/>
-                <w:color w:val="3A3A3A"/>
-                <w:sz w:val="19"/>
-              </w:rPr>
-              <w:t>{{LEISTUNG 2 – Beschreibung}}</w:t>
-            </w:r>
-          </w:p>
-        </w:tc>
-        <w:tc>
-          <w:tcPr>
-            <w:tcW w:type="dxa" w:w="1361"/>
-            <w:shd w:val="clear" w:color="auto" w:fill="F2F5FB"/>
-            <w:tcMar>
-              <w:top w:w="50" w:type="dxa"/>
-              <w:bottom w:w="50" w:type="dxa"/>
-              <w:start w:w="80" w:type="dxa"/>
-              <w:end w:w="80" w:type="dxa"/>
-              <w:left w:w="80" w:type="dxa"/>
-              <w:right w:w="80" w:type="dxa"/>
-            </w:tcMar>
-            <w:vAlign w:val="center"/>
-            <w:tcBorders>
-              <w:bottom w:val="single" w:sz="4" w:space="0" w:color="D9DEEA"/>
-            </w:tcBorders>
-          </w:tcPr>
-          <w:p>
-            <w:pPr>
-              <w:jc w:val="right"/>
-            </w:pPr>
-            <w:r>
-              <w:rPr>
-                <w:rFonts w:ascii="Calibri" w:hAnsi="Calibri"/>
-                <w:b w:val="0"/>
-                <w:i w:val="0"/>
-                <w:color w:val="3A3A3A"/>
-                <w:sz w:val="19"/>
-              </w:rPr>
-              <w:t>0.00</w:t>
-            </w:r>
-          </w:p>
-        </w:tc>
-        <w:tc>
-          <w:tcPr>
-            <w:tcW w:type="dxa" w:w="794"/>
-            <w:shd w:val="clear" w:color="auto" w:fill="F2F5FB"/>
-            <w:tcMar>
-              <w:top w:w="50" w:type="dxa"/>
-              <w:bottom w:w="50" w:type="dxa"/>
-              <w:start w:w="80" w:type="dxa"/>
-              <w:end w:w="80" w:type="dxa"/>
-              <w:left w:w="80" w:type="dxa"/>
-              <w:right w:w="80" w:type="dxa"/>
-            </w:tcMar>
-            <w:vAlign w:val="center"/>
-            <w:tcBorders>
-              <w:bottom w:val="single" w:sz="4" w:space="0" w:color="D9DEEA"/>
-            </w:tcBorders>
-          </w:tcPr>
-          <w:p>
-            <w:pPr>
-              <w:jc w:val="right"/>
-            </w:pPr>
-            <w:r>
-              <w:rPr>
-                <w:rFonts w:ascii="Calibri" w:hAnsi="Calibri"/>
-                <w:b w:val="0"/>
-                <w:i w:val="0"/>
-                <w:color w:val="3A3A3A"/>
-                <w:sz w:val="19"/>
-              </w:rPr>
-              <w:t>1</w:t>
-            </w:r>
-          </w:p>
-        </w:tc>
-        <w:tc>
-          <w:tcPr>
-            <w:tcW w:type="dxa" w:w="1247"/>
-            <w:shd w:val="clear" w:color="auto" w:fill="F2F5FB"/>
-            <w:tcMar>
-              <w:top w:w="50" w:type="dxa"/>
-              <w:bottom w:w="50" w:type="dxa"/>
-              <w:start w:w="80" w:type="dxa"/>
-              <w:end w:w="80" w:type="dxa"/>
-              <w:left w:w="80" w:type="dxa"/>
-              <w:right w:w="80" w:type="dxa"/>
-            </w:tcMar>
-            <w:vAlign w:val="center"/>
-            <w:tcBorders>
-              <w:bottom w:val="single" w:sz="4" w:space="0" w:color="D9DEEA"/>
-            </w:tcBorders>
-          </w:tcPr>
-          <w:p>
-            <w:pPr>
-              <w:jc w:val="right"/>
-            </w:pPr>
-            <w:r>
-              <w:rPr>
-                <w:rFonts w:ascii="Calibri" w:hAnsi="Calibri"/>
-                <w:b/>
-                <w:i w:val="0"/>
-                <w:color w:val="000D6E"/>
-                <w:sz w:val="19"/>
-              </w:rPr>
-              <w:t>0.00</w:t>
-            </w:r>
-          </w:p>
-        </w:tc>
-      </w:tr>
-      <w:tr>
-        <w:tc>
-          <w:tcPr>
-            <w:tcW w:type="dxa" w:w="680"/>
-            <w:shd w:val="clear" w:color="auto" w:fill="FFFFFF"/>
-            <w:tcMar>
-              <w:top w:w="50" w:type="dxa"/>
-              <w:bottom w:w="50" w:type="dxa"/>
-              <w:start w:w="80" w:type="dxa"/>
-              <w:end w:w="80" w:type="dxa"/>
-              <w:left w:w="80" w:type="dxa"/>
-              <w:right w:w="80" w:type="dxa"/>
-            </w:tcMar>
-            <w:vAlign w:val="center"/>
-            <w:tcBorders>
-              <w:bottom w:val="single" w:sz="4" w:space="0" w:color="D9DEEA"/>
-            </w:tcBorders>
-          </w:tcPr>
-          <w:p>
-            <w:pPr>
-              <w:jc w:val="center"/>
-            </w:pPr>
-            <w:r>
-              <w:rPr>
-                <w:rFonts w:ascii="Calibri" w:hAnsi="Calibri"/>
-                <w:b w:val="0"/>
-                <w:i w:val="0"/>
-                <w:color w:val="3A3A3A"/>
-                <w:sz w:val="19"/>
-              </w:rPr>
-              <w:t>003</w:t>
-            </w:r>
-          </w:p>
-        </w:tc>
-        <w:tc>
-          <w:tcPr>
-            <w:tcW w:type="dxa" w:w="1587"/>
-            <w:shd w:val="clear" w:color="auto" w:fill="FFFFFF"/>
-            <w:tcMar>
-              <w:top w:w="50" w:type="dxa"/>
-              <w:bottom w:w="50" w:type="dxa"/>
-              <w:start w:w="80" w:type="dxa"/>
-              <w:end w:w="80" w:type="dxa"/>
-              <w:left w:w="80" w:type="dxa"/>
-              <w:right w:w="80" w:type="dxa"/>
-            </w:tcMar>
-            <w:vAlign w:val="center"/>
-            <w:tcBorders>
-              <w:bottom w:val="single" w:sz="4" w:space="0" w:color="D9DEEA"/>
-            </w:tcBorders>
-          </w:tcPr>
-          <w:p>
-            <w:r>
-              <w:rPr>
-                <w:rFonts w:ascii="Calibri" w:hAnsi="Calibri"/>
-                <w:b w:val="0"/>
-                <w:i w:val="0"/>
-                <w:color w:val="3A3A3A"/>
-                <w:sz w:val="19"/>
-              </w:rPr>
-              <w:t>Dokumentation</w:t>
-            </w:r>
-          </w:p>
-        </w:tc>
-        <w:tc>
-          <w:tcPr>
-            <w:tcW w:type="dxa" w:w="3969"/>
-            <w:shd w:val="clear" w:color="auto" w:fill="FFFFFF"/>
-            <w:tcMar>
-              <w:top w:w="50" w:type="dxa"/>
-              <w:bottom w:w="50" w:type="dxa"/>
-              <w:start w:w="80" w:type="dxa"/>
-              <w:end w:w="80" w:type="dxa"/>
-              <w:left w:w="80" w:type="dxa"/>
-              <w:right w:w="80" w:type="dxa"/>
-            </w:tcMar>
-            <w:vAlign w:val="center"/>
-            <w:tcBorders>
-              <w:bottom w:val="single" w:sz="4" w:space="0" w:color="D9DEEA"/>
-            </w:tcBorders>
-          </w:tcPr>
-          <w:p>
-            <w:r>
-              <w:rPr>
-                <w:rFonts w:ascii="Calibri" w:hAnsi="Calibri"/>
-                <w:b w:val="0"/>
-                <w:i w:val="0"/>
-                <w:color w:val="3A3A3A"/>
-                <w:sz w:val="19"/>
-              </w:rPr>
-              <w:t>{{LEISTUNG 3 – Beschreibung}}</w:t>
-            </w:r>
-          </w:p>
-        </w:tc>
-        <w:tc>
-          <w:tcPr>
-            <w:tcW w:type="dxa" w:w="1361"/>
-            <w:shd w:val="clear" w:color="auto" w:fill="FFFFFF"/>
-            <w:tcMar>
-              <w:top w:w="50" w:type="dxa"/>
-              <w:bottom w:w="50" w:type="dxa"/>
-              <w:start w:w="80" w:type="dxa"/>
-              <w:end w:w="80" w:type="dxa"/>
-              <w:left w:w="80" w:type="dxa"/>
-              <w:right w:w="80" w:type="dxa"/>
-            </w:tcMar>
-            <w:vAlign w:val="center"/>
-            <w:tcBorders>
-              <w:bottom w:val="single" w:sz="4" w:space="0" w:color="D9DEEA"/>
-            </w:tcBorders>
-          </w:tcPr>
-          <w:p>
-            <w:pPr>
-              <w:jc w:val="right"/>
-            </w:pPr>
-            <w:r>
-              <w:rPr>
-                <w:rFonts w:ascii="Calibri" w:hAnsi="Calibri"/>
-                <w:b w:val="0"/>
-                <w:i w:val="0"/>
-                <w:color w:val="3A3A3A"/>
-                <w:sz w:val="19"/>
-              </w:rPr>
-              <w:t>0.00</w:t>
-            </w:r>
-          </w:p>
-        </w:tc>
-        <w:tc>
-          <w:tcPr>
-            <w:tcW w:type="dxa" w:w="794"/>
-            <w:shd w:val="clear" w:color="auto" w:fill="FFFFFF"/>
-            <w:tcMar>
-              <w:top w:w="50" w:type="dxa"/>
-              <w:bottom w:w="50" w:type="dxa"/>
-              <w:start w:w="80" w:type="dxa"/>
-              <w:end w:w="80" w:type="dxa"/>
-              <w:left w:w="80" w:type="dxa"/>
-              <w:right w:w="80" w:type="dxa"/>
-            </w:tcMar>
-            <w:vAlign w:val="center"/>
-            <w:tcBorders>
-              <w:bottom w:val="single" w:sz="4" w:space="0" w:color="D9DEEA"/>
-            </w:tcBorders>
-          </w:tcPr>
-          <w:p>
-            <w:pPr>
-              <w:jc w:val="right"/>
-            </w:pPr>
-            <w:r>
-              <w:rPr>
-                <w:rFonts w:ascii="Calibri" w:hAnsi="Calibri"/>
-                <w:b w:val="0"/>
-                <w:i w:val="0"/>
-                <w:color w:val="3A3A3A"/>
-                <w:sz w:val="19"/>
-              </w:rPr>
-              <w:t>1</w:t>
-            </w:r>
-          </w:p>
-        </w:tc>
-        <w:tc>
-          <w:tcPr>
-            <w:tcW w:type="dxa" w:w="1247"/>
-            <w:shd w:val="clear" w:color="auto" w:fill="FFFFFF"/>
-            <w:tcMar>
-              <w:top w:w="50" w:type="dxa"/>
-              <w:bottom w:w="50" w:type="dxa"/>
-              <w:start w:w="80" w:type="dxa"/>
-              <w:end w:w="80" w:type="dxa"/>
-              <w:left w:w="80" w:type="dxa"/>
-              <w:right w:w="80" w:type="dxa"/>
-            </w:tcMar>
-            <w:vAlign w:val="center"/>
-            <w:tcBorders>
-              <w:bottom w:val="single" w:sz="4" w:space="0" w:color="D9DEEA"/>
-            </w:tcBorders>
-          </w:tcPr>
-          <w:p>
-            <w:pPr>
-              <w:jc w:val="right"/>
-            </w:pPr>
-            <w:r>
-              <w:rPr>
-                <w:rFonts w:ascii="Calibri" w:hAnsi="Calibri"/>
-                <w:b/>
-                <w:i w:val="0"/>
-                <w:color w:val="000D6E"/>
-                <w:sz w:val="19"/>
-              </w:rPr>
-              <w:t>0.00</w:t>
-            </w:r>
-          </w:p>
-        </w:tc>
-      </w:tr>
-      <w:tr>
-        <w:tc>
-          <w:tcPr>
-            <w:tcW w:type="dxa" w:w="8030"/>
-            <w:gridSpan w:val="5"/>
-            <w:tcMar>
-              <w:top w:w="50" w:type="dxa"/>
-              <w:bottom w:w="50" w:type="dxa"/>
-              <w:start w:w="80" w:type="dxa"/>
-              <w:end w:w="80" w:type="dxa"/>
-              <w:left w:w="80" w:type="dxa"/>
-              <w:right w:w="80" w:type="dxa"/>
-            </w:tcMar>
-            <w:vAlign w:val="center"/>
-            <w:shd w:val="clear" w:color="auto" w:fill="E8EDF7"/>
-          </w:tcPr>
-          <w:p>
-            <w:pPr>
-              <w:jc w:val="right"/>
-            </w:pPr>
-            <w:r>
-              <w:rPr>
-                <w:rFonts w:ascii="Calibri" w:hAnsi="Calibri"/>
-                <w:b/>
-                <w:i w:val="0"/>
-                <w:color w:val="000D6E"/>
-                <w:sz w:val="19"/>
-              </w:rPr>
-              <w:t>Zwischensumme</w:t>
-            </w:r>
-          </w:p>
-        </w:tc>
-        <w:tc>
-          <w:tcPr>
-            <w:tcW w:type="dxa" w:w="1247"/>
-            <w:tcMar>
-              <w:top w:w="50" w:type="dxa"/>
-              <w:bottom w:w="50" w:type="dxa"/>
-              <w:start w:w="80" w:type="dxa"/>
-              <w:end w:w="80" w:type="dxa"/>
-              <w:left w:w="80" w:type="dxa"/>
-              <w:right w:w="80" w:type="dxa"/>
-            </w:tcMar>
-            <w:vAlign w:val="center"/>
-            <w:shd w:val="clear" w:color="auto" w:fill="E8EDF7"/>
-          </w:tcPr>
-          <w:p>
-            <w:pPr>
-              <w:jc w:val="right"/>
-            </w:pPr>
-            <w:r>
-              <w:rPr>
-                <w:rFonts w:ascii="Calibri" w:hAnsi="Calibri"/>
-                <w:b/>
-                <w:i w:val="0"/>
-                <w:color w:val="000D6E"/>
-                <w:sz w:val="19"/>
-              </w:rPr>
-              <w:t>{{ZWISCHENSUMME}} CHF</w:t>
-            </w:r>
-          </w:p>
-        </w:tc>
-      </w:tr>
-      <w:tr>
-        <w:tc>
-          <w:tcPr>
-            <w:tcW w:type="dxa" w:w="8030"/>
-            <w:gridSpan w:val="5"/>
-            <w:tcMar>
-              <w:top w:w="50" w:type="dxa"/>
-              <w:bottom w:w="50" w:type="dxa"/>
-              <w:start w:w="80" w:type="dxa"/>
-              <w:end w:w="80" w:type="dxa"/>
-              <w:left w:w="80" w:type="dxa"/>
-              <w:right w:w="80" w:type="dxa"/>
-            </w:tcMar>
-            <w:vAlign w:val="center"/>
-            <w:shd w:val="clear" w:color="auto" w:fill="000D6E"/>
-          </w:tcPr>
-          <w:p>
-            <w:pPr>
-              <w:jc w:val="right"/>
-            </w:pPr>
-            <w:r>
-              <w:rPr>
-                <w:rFonts w:ascii="Calibri" w:hAnsi="Calibri"/>
-                <w:b/>
-                <w:i w:val="0"/>
-                <w:caps/>
-                <w:color w:val="FFFFFF"/>
-                <w:sz w:val="22"/>
-                <w:spacing w:val="10"/>
-              </w:rPr>
-              <w:t>Gesamtbetrag</w:t>
-            </w:r>
-          </w:p>
-        </w:tc>
-        <w:tc>
-          <w:tcPr>
-            <w:tcW w:type="dxa" w:w="1247"/>
-            <w:tcMar>
-              <w:top w:w="50" w:type="dxa"/>
-              <w:bottom w:w="50" w:type="dxa"/>
-              <w:start w:w="80" w:type="dxa"/>
-              <w:end w:w="80" w:type="dxa"/>
-              <w:left w:w="80" w:type="dxa"/>
-              <w:right w:w="80" w:type="dxa"/>
-            </w:tcMar>
-            <w:vAlign w:val="center"/>
-            <w:shd w:val="clear" w:color="auto" w:fill="000D6E"/>
-          </w:tcPr>
-          <w:p>
-            <w:pPr>
-              <w:jc w:val="right"/>
-            </w:pPr>
-            <w:r>
-              <w:rPr>
-                <w:rFonts w:ascii="Calibri" w:hAnsi="Calibri"/>
-                <w:b/>
-                <w:i w:val="0"/>
-                <w:color w:val="FFFFFF"/>
-                <w:sz w:val="22"/>
-              </w:rPr>
-              <w:t>{{GESAMTSUMME}} CHF</w:t>
+              <w:drawing>
+                <wp:inline distT="0" distB="0" distL="0" distR="0">
+                  <wp:extent cx="3096000" cy="1440000"/>
+                  <wp:effectExtent l="0" t="0" r="0" b="0"/>
+                  <wp:docPr id="102" name="Card102"/>
+                  <wp:cNvGraphicFramePr/>
+                  <a:graphic xmlns:a="http://schemas.openxmlformats.org/drawingml/2006/main">
+                    <a:graphicData uri="http://schemas.microsoft.com/office/word/2010/wordprocessingShape">
+                      <wps:wsp>
+                        <wps:cNvSpPr txBox="1"/>
+                        <wps:spPr>
+                          <a:xfrm>
+                            <a:off x="0" y="0"/>
+                            <a:ext cx="3096000" cy="1440000"/>
+                          </a:xfrm>
+                          <a:prstGeom prst="roundRect">
+                            <a:avLst>
+                              <a:gd name="adj" fmla="val 9000"/>
+                            </a:avLst>
+                          </a:prstGeom>
+                          <a:solidFill>
+                            <a:srgbClr val="F5F5F7"/>
+                          </a:solidFill>
+                          <a:ln>
+                            <a:noFill/>
+                          </a:ln>
+                        </wps:spPr>
+                        <wps:txbx>
+                          <w:txbxContent>
+                            <w:tbl>
+                              <w:tblPr>
+                                <w:tblW w:w="5000" w:type="pct"/>
+                                <w:tblBorders>
+                                  <w:top w:val="none"/>
+                                  <w:left w:val="none"/>
+                                  <w:bottom w:val="none"/>
+                                  <w:right w:val="none"/>
+                                  <w:insideH w:val="none"/>
+                                  <w:insideV w:val="none"/>
+                                </w:tblBorders>
+                                <w:tblLayout w:type="autofit"/>
+                              </w:tblPr>
+                              <w:tr>
+                                <w:tc>
+                                  <w:tcPr>
+                                    <w:tcW w:w="2000" w:type="pct"/>
+                                    <w:tcBorders>
+                                      <w:bottom w:val="single" w:sz="4" w:space="0" w:color="E5E5EA"/>
+                                    </w:tcBorders>
+                                    <w:tcMar>
+                                      <w:top w:w="70" w:type="dxa"/>
+                                      <w:bottom w:w="70" w:type="dxa"/>
+                                    </w:tcMar>
+                                  </w:tcPr>
+                                  <w:p>
+                                    <w:pPr>
+                                      <w:spacing w:before="0" w:after="0"/>
+                                    </w:pPr>
+                                    <w:r>
+                                      <w:rPr>
+                                        <w:rFonts w:ascii="Helvetica Neue" w:hAnsi="Helvetica Neue" w:cs="Helvetica Neue"/>
+                                        <w:sz w:val="16"/>
+                                        <w:szCs w:val="16"/>
+                                        <w:color w:val="86868B"/>
+                                        <w:b/>
+                                        <w:caps/>
+                                        <w:spacing w:val="16"/>
+                                      </w:rPr>
+                                      <w:t xml:space="preserve">Nr.</w:t>
+                                    </w:r>
+                                  </w:p>
+                                </w:tc>
+                                <w:tc>
+                                  <w:tcPr>
+                                    <w:tcW w:w="3000" w:type="pct"/>
+                                    <w:tcBorders>
+                                      <w:bottom w:val="single" w:sz="4" w:space="0" w:color="E5E5EA"/>
+                                    </w:tcBorders>
+                                    <w:tcMar>
+                                      <w:top w:w="70" w:type="dxa"/>
+                                      <w:bottom w:w="70" w:type="dxa"/>
+                                    </w:tcMar>
+                                  </w:tcPr>
+                                  <w:p>
+                                    <w:pPr>
+                                      <w:spacing w:before="0" w:after="0"/>
+                                      <w:jc w:val="right"/>
+                                    </w:pPr>
+                                    <w:r>
+                                      <w:rPr>
+                                        <w:rFonts w:ascii="Helvetica Neue" w:hAnsi="Helvetica Neue" w:cs="Helvetica Neue"/>
+                                        <w:sz w:val="19"/>
+                                        <w:szCs w:val="19"/>
+                                        <w:color w:val="1D1D1F"/>
+                                        <w:b/>
+                                      </w:rPr>
+                                      <w:t xml:space="preserve">{{DOKUMENT_NR}}</w:t>
+                                    </w:r>
+                                  </w:p>
+                                </w:tc>
+                              </w:tr>
+                              <w:tr>
+                                <w:tc>
+                                  <w:tcPr>
+                                    <w:tcW w:w="2000" w:type="pct"/>
+                                    <w:tcBorders>
+                                      <w:bottom w:val="single" w:sz="4" w:space="0" w:color="E5E5EA"/>
+                                    </w:tcBorders>
+                                    <w:tcMar>
+                                      <w:top w:w="70" w:type="dxa"/>
+                                      <w:bottom w:w="70" w:type="dxa"/>
+                                    </w:tcMar>
+                                  </w:tcPr>
+                                  <w:p>
+                                    <w:pPr>
+                                      <w:spacing w:before="0" w:after="0"/>
+                                    </w:pPr>
+                                    <w:r>
+                                      <w:rPr>
+                                        <w:rFonts w:ascii="Helvetica Neue" w:hAnsi="Helvetica Neue" w:cs="Helvetica Neue"/>
+                                        <w:sz w:val="16"/>
+                                        <w:szCs w:val="16"/>
+                                        <w:color w:val="86868B"/>
+                                        <w:b/>
+                                        <w:caps/>
+                                        <w:spacing w:val="16"/>
+                                      </w:rPr>
+                                      <w:t xml:space="preserve">Datum</w:t>
+                                    </w:r>
+                                  </w:p>
+                                </w:tc>
+                                <w:tc>
+                                  <w:tcPr>
+                                    <w:tcW w:w="3000" w:type="pct"/>
+                                    <w:tcBorders>
+                                      <w:bottom w:val="single" w:sz="4" w:space="0" w:color="E5E5EA"/>
+                                    </w:tcBorders>
+                                    <w:tcMar>
+                                      <w:top w:w="70" w:type="dxa"/>
+                                      <w:bottom w:w="70" w:type="dxa"/>
+                                    </w:tcMar>
+                                  </w:tcPr>
+                                  <w:p>
+                                    <w:pPr>
+                                      <w:spacing w:before="0" w:after="0"/>
+                                      <w:jc w:val="right"/>
+                                    </w:pPr>
+                                    <w:r>
+                                      <w:rPr>
+                                        <w:rFonts w:ascii="Helvetica Neue" w:hAnsi="Helvetica Neue" w:cs="Helvetica Neue"/>
+                                        <w:sz w:val="19"/>
+                                        <w:szCs w:val="19"/>
+                                        <w:color w:val="1D1D1F"/>
+                                        <w:b/>
+                                      </w:rPr>
+                                      <w:t xml:space="preserve">{{DATUM}}</w:t>
+                                    </w:r>
+                                  </w:p>
+                                </w:tc>
+                              </w:tr>
+                              <w:tr>
+                                <w:tc>
+                                  <w:tcPr>
+                                    <w:tcW w:w="2000" w:type="pct"/>
+                                    <w:tcBorders>
+                                      <w:bottom w:val="single" w:sz="4" w:space="0" w:color="E5E5EA"/>
+                                    </w:tcBorders>
+                                    <w:tcMar>
+                                      <w:top w:w="70" w:type="dxa"/>
+                                      <w:bottom w:w="70" w:type="dxa"/>
+                                    </w:tcMar>
+                                  </w:tcPr>
+                                  <w:p>
+                                    <w:pPr>
+                                      <w:spacing w:before="0" w:after="0"/>
+                                    </w:pPr>
+                                    <w:r>
+                                      <w:rPr>
+                                        <w:rFonts w:ascii="Helvetica Neue" w:hAnsi="Helvetica Neue" w:cs="Helvetica Neue"/>
+                                        <w:sz w:val="16"/>
+                                        <w:szCs w:val="16"/>
+                                        <w:color w:val="86868B"/>
+                                        <w:b/>
+                                        <w:caps/>
+                                        <w:spacing w:val="16"/>
+                                      </w:rPr>
+                                      <w:t xml:space="preserve">Kundennummer</w:t>
+                                    </w:r>
+                                  </w:p>
+                                </w:tc>
+                                <w:tc>
+                                  <w:tcPr>
+                                    <w:tcW w:w="3000" w:type="pct"/>
+                                    <w:tcBorders>
+                                      <w:bottom w:val="single" w:sz="4" w:space="0" w:color="E5E5EA"/>
+                                    </w:tcBorders>
+                                    <w:tcMar>
+                                      <w:top w:w="70" w:type="dxa"/>
+                                      <w:bottom w:w="70" w:type="dxa"/>
+                                    </w:tcMar>
+                                  </w:tcPr>
+                                  <w:p>
+                                    <w:pPr>
+                                      <w:spacing w:before="0" w:after="0"/>
+                                      <w:jc w:val="right"/>
+                                    </w:pPr>
+                                    <w:r>
+                                      <w:rPr>
+                                        <w:rFonts w:ascii="Helvetica Neue" w:hAnsi="Helvetica Neue" w:cs="Helvetica Neue"/>
+                                        <w:sz w:val="19"/>
+                                        <w:szCs w:val="19"/>
+                                        <w:color w:val="1D1D1F"/>
+                                        <w:b/>
+                                      </w:rPr>
+                                      <w:t xml:space="preserve">{{KUNDENNUMMER}}</w:t>
+                                    </w:r>
+                                  </w:p>
+                                </w:tc>
+                              </w:tr>
+                              <w:tr>
+                                <w:tc>
+                                  <w:tcPr>
+                                    <w:tcW w:w="2000" w:type="pct"/>
+                                    <w:tcBorders>
+                                      <w:bottom w:val="single" w:sz="4" w:space="0" w:color="E5E5EA"/>
+                                    </w:tcBorders>
+                                    <w:tcMar>
+                                      <w:top w:w="70" w:type="dxa"/>
+                                      <w:bottom w:w="70" w:type="dxa"/>
+                                    </w:tcMar>
+                                  </w:tcPr>
+                                  <w:p>
+                                    <w:pPr>
+                                      <w:spacing w:before="0" w:after="0"/>
+                                    </w:pPr>
+                                    <w:r>
+                                      <w:rPr>
+                                        <w:rFonts w:ascii="Helvetica Neue" w:hAnsi="Helvetica Neue" w:cs="Helvetica Neue"/>
+                                        <w:sz w:val="16"/>
+                                        <w:szCs w:val="16"/>
+                                        <w:color w:val="86868B"/>
+                                        <w:b/>
+                                        <w:caps/>
+                                        <w:spacing w:val="16"/>
+                                      </w:rPr>
+                                      <w:t xml:space="preserve">Ansprechpartner</w:t>
+                                    </w:r>
+                                  </w:p>
+                                </w:tc>
+                                <w:tc>
+                                  <w:tcPr>
+                                    <w:tcW w:w="3000" w:type="pct"/>
+                                    <w:tcBorders>
+                                      <w:bottom w:val="single" w:sz="4" w:space="0" w:color="E5E5EA"/>
+                                    </w:tcBorders>
+                                    <w:tcMar>
+                                      <w:top w:w="70" w:type="dxa"/>
+                                      <w:bottom w:w="70" w:type="dxa"/>
+                                    </w:tcMar>
+                                  </w:tcPr>
+                                  <w:p>
+                                    <w:pPr>
+                                      <w:spacing w:before="0" w:after="0"/>
+                                      <w:jc w:val="right"/>
+                                    </w:pPr>
+                                    <w:r>
+                                      <w:rPr>
+                                        <w:rFonts w:ascii="Helvetica Neue" w:hAnsi="Helvetica Neue" w:cs="Helvetica Neue"/>
+                                        <w:sz w:val="19"/>
+                                        <w:szCs w:val="19"/>
+                                        <w:color w:val="1D1D1F"/>
+                                        <w:b/>
+                                      </w:rPr>
+                                      <w:t xml:space="preserve">Burak Ücöz</w:t>
+                                    </w:r>
+                                  </w:p>
+                                </w:tc>
+                              </w:tr>
+                              <w:tr>
+                                <w:tc>
+                                  <w:tcPr>
+                                    <w:tcW w:w="2000" w:type="pct"/>
+                                    <w:tcMar>
+                                      <w:top w:w="70" w:type="dxa"/>
+                                      <w:bottom w:w="70" w:type="dxa"/>
+                                    </w:tcMar>
+                                  </w:tcPr>
+                                  <w:p>
+                                    <w:pPr>
+                                      <w:spacing w:before="0" w:after="0"/>
+                                    </w:pPr>
+                                    <w:r>
+                                      <w:rPr>
+                                        <w:rFonts w:ascii="Helvetica Neue" w:hAnsi="Helvetica Neue" w:cs="Helvetica Neue"/>
+                                        <w:sz w:val="16"/>
+                                        <w:szCs w:val="16"/>
+                                        <w:color w:val="86868B"/>
+                                        <w:b/>
+                                        <w:caps/>
+                                        <w:spacing w:val="16"/>
+                                      </w:rPr>
+                                      <w:t xml:space="preserve">{{FRIST_LABEL}}</w:t>
+                                    </w:r>
+                                  </w:p>
+                                </w:tc>
+                                <w:tc>
+                                  <w:tcPr>
+                                    <w:tcW w:w="3000" w:type="pct"/>
+                                    <w:tcMar>
+                                      <w:top w:w="70" w:type="dxa"/>
+                                      <w:bottom w:w="70" w:type="dxa"/>
+                                    </w:tcMar>
+                                  </w:tcPr>
+                                  <w:p>
+                                    <w:pPr>
+                                      <w:spacing w:before="0" w:after="0"/>
+                                      <w:jc w:val="right"/>
+                                    </w:pPr>
+                                    <w:r>
+                                      <w:rPr>
+                                        <w:rFonts w:ascii="Helvetica Neue" w:hAnsi="Helvetica Neue" w:cs="Helvetica Neue"/>
+                                        <w:sz w:val="19"/>
+                                        <w:szCs w:val="19"/>
+                                        <w:color w:val="1D1D1F"/>
+                                        <w:b/>
+                                      </w:rPr>
+                                      <w:t xml:space="preserve">{{FRIST_WERT}}</w:t>
+                                    </w:r>
+                                  </w:p>
+                                </w:tc>
+                              </w:tr>
+                            </w:tbl>
+                          </w:txbxContent>
+                        </wps:txbx>
+                        <wps:bodyPr rot="0" wrap="square" lIns="180000" tIns="144000" rIns="180000" bIns="144000" anchor="t">
+                          <a:spAutoFit/>
+                        </wps:bodyPr>
+                      </wps:wsp>
+                    </a:graphicData>
+                  </a:graphic>
+                </wp:inline>
+              </w:drawing>
             </w:r>
           </w:p>
         </w:tc>
@@ -1449,27 +565,764 @@
     </w:tbl>
     <w:p>
       <w:pPr>
-        <w:spacing w:before="0" w:after="80" w:line="259" w:lineRule="auto"/>
+        <w:spacing w:after="0" w:before="0"/>
+        <w:spacing w:line="200" w:lineRule="exact"/>
       </w:pPr>
     </w:p>
     <w:p>
       <w:pPr>
-        <w:spacing w:before="80" w:after="160" w:line="259" w:lineRule="auto"/>
+        <w:spacing w:after="100"/>
       </w:pPr>
       <w:r>
         <w:rPr>
-          <w:rFonts w:ascii="Calibri" w:hAnsi="Calibri"/>
-          <w:b w:val="0"/>
-          <w:i/>
-          <w:color w:val="555555"/>
-          <w:sz w:val="18"/>
+          <w:rFonts w:ascii="Helvetica Neue" w:hAnsi="Helvetica Neue"/>
+          <w:color w:val="1D1D1F"/>
+          <w:sz w:val="21"/>
         </w:rPr>
-        <w:t>„Als Kleinunternehmer im Sinne von § 19 Abs. 1 UStG wird keine Umsatzsteuer berechnet.“</w:t>
+        <w:t>Sehr geehrte Damen und Herren,</w:t>
       </w:r>
+    </w:p>
+    <w:p>
+      <w:pPr>
+        <w:spacing w:after="200" w:line="300" w:lineRule="auto"/>
+      </w:pPr>
+      <w:r>
+        <w:rPr>
+          <w:rFonts w:ascii="Helvetica Neue" w:hAnsi="Helvetica Neue"/>
+          <w:color w:val="1D1D1F"/>
+          <w:sz w:val="21"/>
+        </w:rPr>
+        <w:t>{{EINLEITUNGSTEXT – z. B. „gerne unterbreiten wir Ihnen folgendes Angebot.“ oder „wir erlauben uns, Ihnen folgende Leistungen in Rechnung zu stellen.“}}</w:t>
+      </w:r>
+    </w:p>
+    <w:p>
+      <w:pPr>
+        <w:spacing w:after="0" w:before="0"/>
+      </w:pPr>
+      <w:r>
+        <w:drawing>
+          <wp:inline distT="0" distB="0" distL="0" distR="0">
+            <wp:extent cx="6264000" cy="2088000"/>
+            <wp:effectExtent l="0" t="0" r="0" b="0"/>
+            <wp:docPr id="103" name="Card103"/>
+            <wp:cNvGraphicFramePr/>
+            <a:graphic xmlns:a="http://schemas.openxmlformats.org/drawingml/2006/main">
+              <a:graphicData uri="http://schemas.microsoft.com/office/word/2010/wordprocessingShape">
+                <wps:wsp>
+                  <wps:cNvSpPr txBox="1"/>
+                  <wps:spPr>
+                    <a:xfrm>
+                      <a:off x="0" y="0"/>
+                      <a:ext cx="6264000" cy="2088000"/>
+                    </a:xfrm>
+                    <a:prstGeom prst="roundRect">
+                      <a:avLst>
+                        <a:gd name="adj" fmla="val 7000"/>
+                      </a:avLst>
+                    </a:prstGeom>
+                    <a:solidFill>
+                      <a:srgbClr val="FFFFFF"/>
+                    </a:solidFill>
+                    <a:ln w="9525">
+                      <a:solidFill>
+                        <a:srgbClr val="E5E5EA"/>
+                      </a:solidFill>
+                    </a:ln>
+                  </wps:spPr>
+                  <wps:txbx>
+                    <w:txbxContent>
+                      <w:tbl>
+                        <w:tblPr>
+                          <w:tblW w:w="5000" w:type="pct"/>
+                          <w:tblBorders>
+                            <w:top w:val="none"/>
+                            <w:left w:val="none"/>
+                            <w:bottom w:val="none"/>
+                            <w:right w:val="none"/>
+                            <w:insideH w:val="none"/>
+                            <w:insideV w:val="none"/>
+                          </w:tblBorders>
+                          <w:tblLayout w:type="autofit"/>
+                        </w:tblPr>
+                        <w:tr>
+                          <w:tc>
+                            <w:tcPr>
+                              <w:tcW w:w="360" w:type="pct"/>
+                              <w:tcBorders>
+                                <w:bottom w:val="single" w:sz="4" w:space="0" w:color="E5E5EA"/>
+                              </w:tcBorders>
+                              <w:vAlign w:val="center"/>
+                              <w:tcMar>
+                                <w:top w:w="90" w:type="dxa"/>
+                                <w:bottom w:w="90" w:type="dxa"/>
+                                <w:left w:w="40" w:type="dxa"/>
+                                <w:right w:w="40" w:type="dxa"/>
+                              </w:tcMar>
+                            </w:tcPr>
+                            <w:p>
+                              <w:pPr>
+                                <w:spacing w:before="0" w:after="0"/>
+                                <w:jc w:val="left"/>
+                              </w:pPr>
+                              <w:r>
+                                <w:rPr>
+                                  <w:rFonts w:ascii="Helvetica Neue" w:hAnsi="Helvetica Neue" w:cs="Helvetica Neue"/>
+                                  <w:sz w:val="15"/>
+                                  <w:szCs w:val="15"/>
+                                  <w:color w:val="86868B"/>
+                                  <w:b/>
+                                  <w:caps/>
+                                  <w:spacing w:val="14"/>
+                                </w:rPr>
+                                <w:t xml:space="preserve">Pos.</w:t>
+                              </w:r>
+                            </w:p>
+                          </w:tc>
+                          <w:tc>
+                            <w:tcPr>
+                              <w:tcW w:w="2350" w:type="pct"/>
+                              <w:tcBorders>
+                                <w:bottom w:val="single" w:sz="4" w:space="0" w:color="E5E5EA"/>
+                              </w:tcBorders>
+                              <w:vAlign w:val="center"/>
+                              <w:tcMar>
+                                <w:top w:w="90" w:type="dxa"/>
+                                <w:bottom w:w="90" w:type="dxa"/>
+                                <w:left w:w="40" w:type="dxa"/>
+                                <w:right w:w="40" w:type="dxa"/>
+                              </w:tcMar>
+                            </w:tcPr>
+                            <w:p>
+                              <w:pPr>
+                                <w:spacing w:before="0" w:after="0"/>
+                                <w:jc w:val="left"/>
+                              </w:pPr>
+                              <w:r>
+                                <w:rPr>
+                                  <w:rFonts w:ascii="Helvetica Neue" w:hAnsi="Helvetica Neue" w:cs="Helvetica Neue"/>
+                                  <w:sz w:val="15"/>
+                                  <w:szCs w:val="15"/>
+                                  <w:color w:val="86868B"/>
+                                  <w:b/>
+                                  <w:caps/>
+                                  <w:spacing w:val="14"/>
+                                </w:rPr>
+                                <w:t xml:space="preserve">Leistung / Beschreibung</w:t>
+                              </w:r>
+                            </w:p>
+                          </w:tc>
+                          <w:tc>
+                            <w:tcPr>
+                              <w:tcW w:w="900" w:type="pct"/>
+                              <w:tcBorders>
+                                <w:bottom w:val="single" w:sz="4" w:space="0" w:color="E5E5EA"/>
+                              </w:tcBorders>
+                              <w:vAlign w:val="center"/>
+                              <w:tcMar>
+                                <w:top w:w="90" w:type="dxa"/>
+                                <w:bottom w:w="90" w:type="dxa"/>
+                                <w:left w:w="40" w:type="dxa"/>
+                                <w:right w:w="40" w:type="dxa"/>
+                              </w:tcMar>
+                            </w:tcPr>
+                            <w:p>
+                              <w:pPr>
+                                <w:spacing w:before="0" w:after="0"/>
+                                <w:jc w:val="right"/>
+                              </w:pPr>
+                              <w:r>
+                                <w:rPr>
+                                  <w:rFonts w:ascii="Helvetica Neue" w:hAnsi="Helvetica Neue" w:cs="Helvetica Neue"/>
+                                  <w:sz w:val="15"/>
+                                  <w:szCs w:val="15"/>
+                                  <w:color w:val="86868B"/>
+                                  <w:b/>
+                                  <w:caps/>
+                                  <w:spacing w:val="14"/>
+                                </w:rPr>
+                                <w:t xml:space="preserve">Einzelpreis</w:t>
+                              </w:r>
+                            </w:p>
+                          </w:tc>
+                          <w:tc>
+                            <w:tcPr>
+                              <w:tcW w:w="480" w:type="pct"/>
+                              <w:tcBorders>
+                                <w:bottom w:val="single" w:sz="4" w:space="0" w:color="E5E5EA"/>
+                              </w:tcBorders>
+                              <w:vAlign w:val="center"/>
+                              <w:tcMar>
+                                <w:top w:w="90" w:type="dxa"/>
+                                <w:bottom w:w="90" w:type="dxa"/>
+                                <w:left w:w="40" w:type="dxa"/>
+                                <w:right w:w="40" w:type="dxa"/>
+                              </w:tcMar>
+                            </w:tcPr>
+                            <w:p>
+                              <w:pPr>
+                                <w:spacing w:before="0" w:after="0"/>
+                                <w:jc w:val="right"/>
+                              </w:pPr>
+                              <w:r>
+                                <w:rPr>
+                                  <w:rFonts w:ascii="Helvetica Neue" w:hAnsi="Helvetica Neue" w:cs="Helvetica Neue"/>
+                                  <w:sz w:val="15"/>
+                                  <w:szCs w:val="15"/>
+                                  <w:color w:val="86868B"/>
+                                  <w:b/>
+                                  <w:caps/>
+                                  <w:spacing w:val="14"/>
+                                </w:rPr>
+                                <w:t xml:space="preserve">Menge</w:t>
+                              </w:r>
+                            </w:p>
+                          </w:tc>
+                          <w:tc>
+                            <w:tcPr>
+                              <w:tcW w:w="910" w:type="pct"/>
+                              <w:tcBorders>
+                                <w:bottom w:val="single" w:sz="4" w:space="0" w:color="E5E5EA"/>
+                              </w:tcBorders>
+                              <w:vAlign w:val="center"/>
+                              <w:tcMar>
+                                <w:top w:w="90" w:type="dxa"/>
+                                <w:bottom w:w="90" w:type="dxa"/>
+                                <w:left w:w="40" w:type="dxa"/>
+                                <w:right w:w="40" w:type="dxa"/>
+                              </w:tcMar>
+                            </w:tcPr>
+                            <w:p>
+                              <w:pPr>
+                                <w:spacing w:before="0" w:after="0"/>
+                                <w:jc w:val="right"/>
+                              </w:pPr>
+                              <w:r>
+                                <w:rPr>
+                                  <w:rFonts w:ascii="Helvetica Neue" w:hAnsi="Helvetica Neue" w:cs="Helvetica Neue"/>
+                                  <w:sz w:val="15"/>
+                                  <w:szCs w:val="15"/>
+                                  <w:color w:val="86868B"/>
+                                  <w:b/>
+                                  <w:caps/>
+                                  <w:spacing w:val="14"/>
+                                </w:rPr>
+                                <w:t xml:space="preserve">Summe CHF</w:t>
+                              </w:r>
+                            </w:p>
+                          </w:tc>
+                        </w:tr>
+                        <w:tr>
+                          <w:tc>
+                            <w:tcPr>
+                              <w:tcW w:w="360" w:type="pct"/>
+                              <w:tcBorders>
+                                <w:bottom w:val="single" w:sz="4" w:space="0" w:color="E5E5EA"/>
+                              </w:tcBorders>
+                              <w:vAlign w:val="center"/>
+                              <w:tcMar>
+                                <w:top w:w="90" w:type="dxa"/>
+                                <w:bottom w:w="90" w:type="dxa"/>
+                                <w:left w:w="40" w:type="dxa"/>
+                                <w:right w:w="40" w:type="dxa"/>
+                              </w:tcMar>
+                            </w:tcPr>
+                            <w:p>
+                              <w:pPr>
+                                <w:spacing w:before="0" w:after="0"/>
+                                <w:jc w:val="left"/>
+                              </w:pPr>
+                              <w:r>
+                                <w:rPr>
+                                  <w:rFonts w:ascii="Helvetica Neue" w:hAnsi="Helvetica Neue" w:cs="Helvetica Neue"/>
+                                  <w:sz w:val="19"/>
+                                  <w:szCs w:val="19"/>
+                                  <w:color w:val="86868B"/>
+                                  <w:b/>
+                                </w:rPr>
+                                <w:t xml:space="preserve">01</w:t>
+                              </w:r>
+                            </w:p>
+                          </w:tc>
+                          <w:tc>
+                            <w:tcPr>
+                              <w:tcW w:w="2350" w:type="pct"/>
+                              <w:tcBorders>
+                                <w:bottom w:val="single" w:sz="4" w:space="0" w:color="E5E5EA"/>
+                              </w:tcBorders>
+                              <w:vAlign w:val="center"/>
+                              <w:tcMar>
+                                <w:top w:w="90" w:type="dxa"/>
+                                <w:bottom w:w="90" w:type="dxa"/>
+                                <w:left w:w="40" w:type="dxa"/>
+                                <w:right w:w="40" w:type="dxa"/>
+                              </w:tcMar>
+                            </w:tcPr>
+                            <w:p>
+                              <w:pPr>
+                                <w:spacing w:before="0" w:after="20"/>
+                              </w:pPr>
+                              <w:r>
+                                <w:rPr>
+                                  <w:rFonts w:ascii="Helvetica Neue" w:hAnsi="Helvetica Neue" w:cs="Helvetica Neue"/>
+                                  <w:sz w:val="20"/>
+                                  <w:szCs w:val="20"/>
+                                  <w:color w:val="1D1D1F"/>
+                                  <w:b/>
+                                </w:rPr>
+                                <w:t xml:space="preserve">{{Leistung 1}}</w:t>
+                              </w:r>
+                            </w:p>
+                            <w:p>
+                              <w:pPr>
+                                <w:spacing w:before="0" w:after="0"/>
+                              </w:pPr>
+                              <w:r>
+                                <w:rPr>
+                                  <w:rFonts w:ascii="Helvetica Neue" w:hAnsi="Helvetica Neue" w:cs="Helvetica Neue"/>
+                                  <w:sz w:val="17"/>
+                                  <w:szCs w:val="17"/>
+                                  <w:color w:val="86868B"/>
+                                </w:rPr>
+                                <w:t xml:space="preserve">{{Detail / Beschreibung}}</w:t>
+                              </w:r>
+                            </w:p>
+                          </w:tc>
+                          <w:tc>
+                            <w:tcPr>
+                              <w:tcW w:w="900" w:type="pct"/>
+                              <w:tcBorders>
+                                <w:bottom w:val="single" w:sz="4" w:space="0" w:color="E5E5EA"/>
+                              </w:tcBorders>
+                              <w:vAlign w:val="center"/>
+                              <w:tcMar>
+                                <w:top w:w="90" w:type="dxa"/>
+                                <w:bottom w:w="90" w:type="dxa"/>
+                                <w:left w:w="40" w:type="dxa"/>
+                                <w:right w:w="40" w:type="dxa"/>
+                              </w:tcMar>
+                            </w:tcPr>
+                            <w:p>
+                              <w:pPr>
+                                <w:spacing w:before="0" w:after="0"/>
+                                <w:jc w:val="right"/>
+                              </w:pPr>
+                              <w:r>
+                                <w:rPr>
+                                  <w:rFonts w:ascii="Helvetica Neue" w:hAnsi="Helvetica Neue" w:cs="Helvetica Neue"/>
+                                  <w:sz w:val="19"/>
+                                  <w:szCs w:val="19"/>
+                                  <w:color w:val="1D1D1F"/>
+                                </w:rPr>
+                                <w:t xml:space="preserve">0.00</w:t>
+                              </w:r>
+                            </w:p>
+                          </w:tc>
+                          <w:tc>
+                            <w:tcPr>
+                              <w:tcW w:w="480" w:type="pct"/>
+                              <w:tcBorders>
+                                <w:bottom w:val="single" w:sz="4" w:space="0" w:color="E5E5EA"/>
+                              </w:tcBorders>
+                              <w:vAlign w:val="center"/>
+                              <w:tcMar>
+                                <w:top w:w="90" w:type="dxa"/>
+                                <w:bottom w:w="90" w:type="dxa"/>
+                                <w:left w:w="40" w:type="dxa"/>
+                                <w:right w:w="40" w:type="dxa"/>
+                              </w:tcMar>
+                            </w:tcPr>
+                            <w:p>
+                              <w:pPr>
+                                <w:spacing w:before="0" w:after="0"/>
+                                <w:jc w:val="right"/>
+                              </w:pPr>
+                              <w:r>
+                                <w:rPr>
+                                  <w:rFonts w:ascii="Helvetica Neue" w:hAnsi="Helvetica Neue" w:cs="Helvetica Neue"/>
+                                  <w:sz w:val="19"/>
+                                  <w:szCs w:val="19"/>
+                                  <w:color w:val="1D1D1F"/>
+                                </w:rPr>
+                                <w:t xml:space="preserve">1</w:t>
+                              </w:r>
+                            </w:p>
+                          </w:tc>
+                          <w:tc>
+                            <w:tcPr>
+                              <w:tcW w:w="910" w:type="pct"/>
+                              <w:tcBorders>
+                                <w:bottom w:val="single" w:sz="4" w:space="0" w:color="E5E5EA"/>
+                              </w:tcBorders>
+                              <w:vAlign w:val="center"/>
+                              <w:tcMar>
+                                <w:top w:w="90" w:type="dxa"/>
+                                <w:bottom w:w="90" w:type="dxa"/>
+                                <w:left w:w="40" w:type="dxa"/>
+                                <w:right w:w="40" w:type="dxa"/>
+                              </w:tcMar>
+                            </w:tcPr>
+                            <w:p>
+                              <w:pPr>
+                                <w:spacing w:before="0" w:after="0"/>
+                                <w:jc w:val="right"/>
+                              </w:pPr>
+                              <w:r>
+                                <w:rPr>
+                                  <w:rFonts w:ascii="Helvetica Neue" w:hAnsi="Helvetica Neue" w:cs="Helvetica Neue"/>
+                                  <w:sz w:val="19"/>
+                                  <w:szCs w:val="19"/>
+                                  <w:color w:val="000D6E"/>
+                                  <w:b/>
+                                </w:rPr>
+                                <w:t xml:space="preserve">0.00</w:t>
+                              </w:r>
+                            </w:p>
+                          </w:tc>
+                        </w:tr>
+                        <w:tr>
+                          <w:tc>
+                            <w:tcPr>
+                              <w:tcW w:w="360" w:type="pct"/>
+                              <w:tcBorders>
+                                <w:bottom w:val="single" w:sz="4" w:space="0" w:color="E5E5EA"/>
+                              </w:tcBorders>
+                              <w:vAlign w:val="center"/>
+                              <w:tcMar>
+                                <w:top w:w="90" w:type="dxa"/>
+                                <w:bottom w:w="90" w:type="dxa"/>
+                                <w:left w:w="40" w:type="dxa"/>
+                                <w:right w:w="40" w:type="dxa"/>
+                              </w:tcMar>
+                            </w:tcPr>
+                            <w:p>
+                              <w:pPr>
+                                <w:spacing w:before="0" w:after="0"/>
+                                <w:jc w:val="left"/>
+                              </w:pPr>
+                              <w:r>
+                                <w:rPr>
+                                  <w:rFonts w:ascii="Helvetica Neue" w:hAnsi="Helvetica Neue" w:cs="Helvetica Neue"/>
+                                  <w:sz w:val="19"/>
+                                  <w:szCs w:val="19"/>
+                                  <w:color w:val="86868B"/>
+                                  <w:b/>
+                                </w:rPr>
+                                <w:t xml:space="preserve">02</w:t>
+                              </w:r>
+                            </w:p>
+                          </w:tc>
+                          <w:tc>
+                            <w:tcPr>
+                              <w:tcW w:w="2350" w:type="pct"/>
+                              <w:tcBorders>
+                                <w:bottom w:val="single" w:sz="4" w:space="0" w:color="E5E5EA"/>
+                              </w:tcBorders>
+                              <w:vAlign w:val="center"/>
+                              <w:tcMar>
+                                <w:top w:w="90" w:type="dxa"/>
+                                <w:bottom w:w="90" w:type="dxa"/>
+                                <w:left w:w="40" w:type="dxa"/>
+                                <w:right w:w="40" w:type="dxa"/>
+                              </w:tcMar>
+                            </w:tcPr>
+                            <w:p>
+                              <w:pPr>
+                                <w:spacing w:before="0" w:after="20"/>
+                              </w:pPr>
+                              <w:r>
+                                <w:rPr>
+                                  <w:rFonts w:ascii="Helvetica Neue" w:hAnsi="Helvetica Neue" w:cs="Helvetica Neue"/>
+                                  <w:sz w:val="20"/>
+                                  <w:szCs w:val="20"/>
+                                  <w:color w:val="1D1D1F"/>
+                                  <w:b/>
+                                </w:rPr>
+                                <w:t xml:space="preserve">{{Leistung 2}}</w:t>
+                              </w:r>
+                            </w:p>
+                            <w:p>
+                              <w:pPr>
+                                <w:spacing w:before="0" w:after="0"/>
+                              </w:pPr>
+                              <w:r>
+                                <w:rPr>
+                                  <w:rFonts w:ascii="Helvetica Neue" w:hAnsi="Helvetica Neue" w:cs="Helvetica Neue"/>
+                                  <w:sz w:val="17"/>
+                                  <w:szCs w:val="17"/>
+                                  <w:color w:val="86868B"/>
+                                </w:rPr>
+                                <w:t xml:space="preserve">{{Detail / Beschreibung}}</w:t>
+                              </w:r>
+                            </w:p>
+                          </w:tc>
+                          <w:tc>
+                            <w:tcPr>
+                              <w:tcW w:w="900" w:type="pct"/>
+                              <w:tcBorders>
+                                <w:bottom w:val="single" w:sz="4" w:space="0" w:color="E5E5EA"/>
+                              </w:tcBorders>
+                              <w:vAlign w:val="center"/>
+                              <w:tcMar>
+                                <w:top w:w="90" w:type="dxa"/>
+                                <w:bottom w:w="90" w:type="dxa"/>
+                                <w:left w:w="40" w:type="dxa"/>
+                                <w:right w:w="40" w:type="dxa"/>
+                              </w:tcMar>
+                            </w:tcPr>
+                            <w:p>
+                              <w:pPr>
+                                <w:spacing w:before="0" w:after="0"/>
+                                <w:jc w:val="right"/>
+                              </w:pPr>
+                              <w:r>
+                                <w:rPr>
+                                  <w:rFonts w:ascii="Helvetica Neue" w:hAnsi="Helvetica Neue" w:cs="Helvetica Neue"/>
+                                  <w:sz w:val="19"/>
+                                  <w:szCs w:val="19"/>
+                                  <w:color w:val="1D1D1F"/>
+                                </w:rPr>
+                                <w:t xml:space="preserve">0.00</w:t>
+                              </w:r>
+                            </w:p>
+                          </w:tc>
+                          <w:tc>
+                            <w:tcPr>
+                              <w:tcW w:w="480" w:type="pct"/>
+                              <w:tcBorders>
+                                <w:bottom w:val="single" w:sz="4" w:space="0" w:color="E5E5EA"/>
+                              </w:tcBorders>
+                              <w:vAlign w:val="center"/>
+                              <w:tcMar>
+                                <w:top w:w="90" w:type="dxa"/>
+                                <w:bottom w:w="90" w:type="dxa"/>
+                                <w:left w:w="40" w:type="dxa"/>
+                                <w:right w:w="40" w:type="dxa"/>
+                              </w:tcMar>
+                            </w:tcPr>
+                            <w:p>
+                              <w:pPr>
+                                <w:spacing w:before="0" w:after="0"/>
+                                <w:jc w:val="right"/>
+                              </w:pPr>
+                              <w:r>
+                                <w:rPr>
+                                  <w:rFonts w:ascii="Helvetica Neue" w:hAnsi="Helvetica Neue" w:cs="Helvetica Neue"/>
+                                  <w:sz w:val="19"/>
+                                  <w:szCs w:val="19"/>
+                                  <w:color w:val="1D1D1F"/>
+                                </w:rPr>
+                                <w:t xml:space="preserve">1</w:t>
+                              </w:r>
+                            </w:p>
+                          </w:tc>
+                          <w:tc>
+                            <w:tcPr>
+                              <w:tcW w:w="910" w:type="pct"/>
+                              <w:tcBorders>
+                                <w:bottom w:val="single" w:sz="4" w:space="0" w:color="E5E5EA"/>
+                              </w:tcBorders>
+                              <w:vAlign w:val="center"/>
+                              <w:tcMar>
+                                <w:top w:w="90" w:type="dxa"/>
+                                <w:bottom w:w="90" w:type="dxa"/>
+                                <w:left w:w="40" w:type="dxa"/>
+                                <w:right w:w="40" w:type="dxa"/>
+                              </w:tcMar>
+                            </w:tcPr>
+                            <w:p>
+                              <w:pPr>
+                                <w:spacing w:before="0" w:after="0"/>
+                                <w:jc w:val="right"/>
+                              </w:pPr>
+                              <w:r>
+                                <w:rPr>
+                                  <w:rFonts w:ascii="Helvetica Neue" w:hAnsi="Helvetica Neue" w:cs="Helvetica Neue"/>
+                                  <w:sz w:val="19"/>
+                                  <w:szCs w:val="19"/>
+                                  <w:color w:val="000D6E"/>
+                                  <w:b/>
+                                </w:rPr>
+                                <w:t xml:space="preserve">0.00</w:t>
+                              </w:r>
+                            </w:p>
+                          </w:tc>
+                        </w:tr>
+                        <w:tr>
+                          <w:tc>
+                            <w:tcPr>
+                              <w:tcW w:w="360" w:type="pct"/>
+                              <w:vAlign w:val="center"/>
+                              <w:tcMar>
+                                <w:top w:w="90" w:type="dxa"/>
+                                <w:bottom w:w="90" w:type="dxa"/>
+                                <w:left w:w="40" w:type="dxa"/>
+                                <w:right w:w="40" w:type="dxa"/>
+                              </w:tcMar>
+                            </w:tcPr>
+                            <w:p>
+                              <w:pPr>
+                                <w:spacing w:before="0" w:after="0"/>
+                                <w:jc w:val="left"/>
+                              </w:pPr>
+                              <w:r>
+                                <w:rPr>
+                                  <w:rFonts w:ascii="Helvetica Neue" w:hAnsi="Helvetica Neue" w:cs="Helvetica Neue"/>
+                                  <w:sz w:val="19"/>
+                                  <w:szCs w:val="19"/>
+                                  <w:color w:val="86868B"/>
+                                  <w:b/>
+                                </w:rPr>
+                                <w:t xml:space="preserve">03</w:t>
+                              </w:r>
+                            </w:p>
+                          </w:tc>
+                          <w:tc>
+                            <w:tcPr>
+                              <w:tcW w:w="2350" w:type="pct"/>
+                              <w:vAlign w:val="center"/>
+                              <w:tcMar>
+                                <w:top w:w="90" w:type="dxa"/>
+                                <w:bottom w:w="90" w:type="dxa"/>
+                                <w:left w:w="40" w:type="dxa"/>
+                                <w:right w:w="40" w:type="dxa"/>
+                              </w:tcMar>
+                            </w:tcPr>
+                            <w:p>
+                              <w:pPr>
+                                <w:spacing w:before="0" w:after="20"/>
+                              </w:pPr>
+                              <w:r>
+                                <w:rPr>
+                                  <w:rFonts w:ascii="Helvetica Neue" w:hAnsi="Helvetica Neue" w:cs="Helvetica Neue"/>
+                                  <w:sz w:val="20"/>
+                                  <w:szCs w:val="20"/>
+                                  <w:color w:val="1D1D1F"/>
+                                  <w:b/>
+                                </w:rPr>
+                                <w:t xml:space="preserve">{{Leistung 3}}</w:t>
+                              </w:r>
+                            </w:p>
+                            <w:p>
+                              <w:pPr>
+                                <w:spacing w:before="0" w:after="0"/>
+                              </w:pPr>
+                              <w:r>
+                                <w:rPr>
+                                  <w:rFonts w:ascii="Helvetica Neue" w:hAnsi="Helvetica Neue" w:cs="Helvetica Neue"/>
+                                  <w:sz w:val="17"/>
+                                  <w:szCs w:val="17"/>
+                                  <w:color w:val="86868B"/>
+                                </w:rPr>
+                                <w:t xml:space="preserve">{{Detail / Beschreibung}}</w:t>
+                              </w:r>
+                            </w:p>
+                          </w:tc>
+                          <w:tc>
+                            <w:tcPr>
+                              <w:tcW w:w="900" w:type="pct"/>
+                              <w:vAlign w:val="center"/>
+                              <w:tcMar>
+                                <w:top w:w="90" w:type="dxa"/>
+                                <w:bottom w:w="90" w:type="dxa"/>
+                                <w:left w:w="40" w:type="dxa"/>
+                                <w:right w:w="40" w:type="dxa"/>
+                              </w:tcMar>
+                            </w:tcPr>
+                            <w:p>
+                              <w:pPr>
+                                <w:spacing w:before="0" w:after="0"/>
+                                <w:jc w:val="right"/>
+                              </w:pPr>
+                              <w:r>
+                                <w:rPr>
+                                  <w:rFonts w:ascii="Helvetica Neue" w:hAnsi="Helvetica Neue" w:cs="Helvetica Neue"/>
+                                  <w:sz w:val="19"/>
+                                  <w:szCs w:val="19"/>
+                                  <w:color w:val="1D1D1F"/>
+                                </w:rPr>
+                                <w:t xml:space="preserve">0.00</w:t>
+                              </w:r>
+                            </w:p>
+                          </w:tc>
+                          <w:tc>
+                            <w:tcPr>
+                              <w:tcW w:w="480" w:type="pct"/>
+                              <w:vAlign w:val="center"/>
+                              <w:tcMar>
+                                <w:top w:w="90" w:type="dxa"/>
+                                <w:bottom w:w="90" w:type="dxa"/>
+                                <w:left w:w="40" w:type="dxa"/>
+                                <w:right w:w="40" w:type="dxa"/>
+                              </w:tcMar>
+                            </w:tcPr>
+                            <w:p>
+                              <w:pPr>
+                                <w:spacing w:before="0" w:after="0"/>
+                                <w:jc w:val="right"/>
+                              </w:pPr>
+                              <w:r>
+                                <w:rPr>
+                                  <w:rFonts w:ascii="Helvetica Neue" w:hAnsi="Helvetica Neue" w:cs="Helvetica Neue"/>
+                                  <w:sz w:val="19"/>
+                                  <w:szCs w:val="19"/>
+                                  <w:color w:val="1D1D1F"/>
+                                </w:rPr>
+                                <w:t xml:space="preserve">1</w:t>
+                              </w:r>
+                            </w:p>
+                          </w:tc>
+                          <w:tc>
+                            <w:tcPr>
+                              <w:tcW w:w="910" w:type="pct"/>
+                              <w:vAlign w:val="center"/>
+                              <w:tcMar>
+                                <w:top w:w="90" w:type="dxa"/>
+                                <w:bottom w:w="90" w:type="dxa"/>
+                                <w:left w:w="40" w:type="dxa"/>
+                                <w:right w:w="40" w:type="dxa"/>
+                              </w:tcMar>
+                            </w:tcPr>
+                            <w:p>
+                              <w:pPr>
+                                <w:spacing w:before="0" w:after="0"/>
+                                <w:jc w:val="right"/>
+                              </w:pPr>
+                              <w:r>
+                                <w:rPr>
+                                  <w:rFonts w:ascii="Helvetica Neue" w:hAnsi="Helvetica Neue" w:cs="Helvetica Neue"/>
+                                  <w:sz w:val="19"/>
+                                  <w:szCs w:val="19"/>
+                                  <w:color w:val="000D6E"/>
+                                  <w:b/>
+                                </w:rPr>
+                                <w:t xml:space="preserve">0.00</w:t>
+                              </w:r>
+                            </w:p>
+                          </w:tc>
+                        </w:tr>
+                      </w:tbl>
+                    </w:txbxContent>
+                  </wps:txbx>
+                  <wps:bodyPr rot="0" wrap="square" lIns="180000" tIns="144000" rIns="180000" bIns="144000" anchor="t">
+                    <a:spAutoFit/>
+                  </wps:bodyPr>
+                </wps:wsp>
+              </a:graphicData>
+            </a:graphic>
+          </wp:inline>
+        </w:drawing>
+      </w:r>
+    </w:p>
+    <w:p>
+      <w:pPr>
+        <w:spacing w:after="0" w:before="0"/>
+        <w:spacing w:line="160" w:lineRule="exact"/>
+      </w:pPr>
     </w:p>
     <w:tbl>
       <w:tblPr>
         <w:tblW w:type="auto" w:w="0"/>
+        <w:tblLayout w:type="fixed"/>
         <w:tblLook w:firstColumn="1" w:firstRow="1" w:lastColumn="0" w:lastRow="0" w:noHBand="0" w:noVBand="1" w:val="04A0"/>
         <w:tblBorders>
           <w:top w:val="none"/>
@@ -1481,67 +1334,297 @@
         </w:tblBorders>
       </w:tblPr>
       <w:tblGrid>
-        <w:gridCol w:w="9638"/>
+        <w:gridCol w:w="4933"/>
+        <w:gridCol w:w="4933"/>
       </w:tblGrid>
       <w:tr>
         <w:tc>
           <w:tcPr>
-            <w:tcW w:type="dxa" w:w="9638"/>
-            <w:shd w:val="clear" w:color="auto" w:fill="E8EDF7"/>
-            <w:tcMar>
-              <w:top w:w="120" w:type="dxa"/>
-              <w:bottom w:w="120" w:type="dxa"/>
-              <w:start w:w="160" w:type="dxa"/>
-              <w:end w:w="160" w:type="dxa"/>
-              <w:left w:w="160" w:type="dxa"/>
-              <w:right w:w="160" w:type="dxa"/>
-            </w:tcMar>
-            <w:tcBorders>
-              <w:left w:val="single" w:sz="24" w:space="0" w:color="000D6E"/>
-            </w:tcBorders>
+            <w:tcW w:type="dxa" w:w="4876"/>
+          </w:tcPr>
+          <w:p/>
+        </w:tc>
+        <w:tc>
+          <w:tcPr>
+            <w:tcW w:type="dxa" w:w="4989"/>
           </w:tcPr>
           <w:p>
             <w:r>
-              <w:rPr>
-                <w:rFonts w:ascii="Calibri" w:hAnsi="Calibri"/>
-                <w:b/>
-                <w:i w:val="0"/>
-                <w:caps/>
-                <w:color w:val="000D6E"/>
-                <w:sz w:val="17"/>
-                <w:spacing w:val="20"/>
-              </w:rPr>
-              <w:t>ZAHLUNGSBEDINGUNGEN</w:t>
+              <w:drawing>
+                <wp:inline distT="0" distB="0" distL="0" distR="0">
+                  <wp:extent cx="3168000" cy="648000"/>
+                  <wp:effectExtent l="0" t="0" r="0" b="0"/>
+                  <wp:docPr id="104" name="Card104"/>
+                  <wp:cNvGraphicFramePr/>
+                  <a:graphic xmlns:a="http://schemas.openxmlformats.org/drawingml/2006/main">
+                    <a:graphicData uri="http://schemas.microsoft.com/office/word/2010/wordprocessingShape">
+                      <wps:wsp>
+                        <wps:cNvSpPr txBox="1"/>
+                        <wps:spPr>
+                          <a:xfrm>
+                            <a:off x="0" y="0"/>
+                            <a:ext cx="3168000" cy="648000"/>
+                          </a:xfrm>
+                          <a:prstGeom prst="roundRect">
+                            <a:avLst>
+                              <a:gd name="adj" fmla="val 12000"/>
+                            </a:avLst>
+                          </a:prstGeom>
+                          <a:solidFill>
+                            <a:srgbClr val="F5F5F7"/>
+                          </a:solidFill>
+                          <a:ln>
+                            <a:noFill/>
+                          </a:ln>
+                        </wps:spPr>
+                        <wps:txbx>
+                          <w:txbxContent>
+                            <w:tbl>
+                              <w:tblPr>
+                                <w:tblW w:w="5000" w:type="pct"/>
+                                <w:tblBorders>
+                                  <w:top w:val="none"/>
+                                  <w:left w:val="none"/>
+                                  <w:bottom w:val="none"/>
+                                  <w:right w:val="none"/>
+                                  <w:insideH w:val="none"/>
+                                  <w:insideV w:val="none"/>
+                                </w:tblBorders>
+                              </w:tblPr>
+                              <w:tr>
+                                <w:tc>
+                                  <w:tcPr>
+                                    <w:tcW w:w="3200" w:type="pct"/>
+                                    <w:vAlign w:val="center"/>
+                                    <w:tcMar>
+                                      <w:top w:w="60" w:type="dxa"/>
+                                      <w:bottom w:w="60" w:type="dxa"/>
+                                    </w:tcMar>
+                                  </w:tcPr>
+                                  <w:p>
+                                    <w:pPr>
+                                      <w:spacing w:before="0" w:after="0"/>
+                                      <w:jc w:val="right"/>
+                                    </w:pPr>
+                                    <w:r>
+                                      <w:rPr>
+                                        <w:rFonts w:ascii="Helvetica Neue" w:hAnsi="Helvetica Neue" w:cs="Helvetica Neue"/>
+                                        <w:sz w:val="19"/>
+                                        <w:szCs w:val="19"/>
+                                        <w:color w:val="86868B"/>
+                                        <w:spacing w:val="0"/>
+                                      </w:rPr>
+                                      <w:t xml:space="preserve">Zwischensumme</w:t>
+                                    </w:r>
+                                  </w:p>
+                                </w:tc>
+                                <w:tc>
+                                  <w:tcPr>
+                                    <w:tcW w:w="1800" w:type="pct"/>
+                                    <w:vAlign w:val="center"/>
+                                    <w:tcMar>
+                                      <w:top w:w="60" w:type="dxa"/>
+                                      <w:bottom w:w="60" w:type="dxa"/>
+                                    </w:tcMar>
+                                  </w:tcPr>
+                                  <w:p>
+                                    <w:pPr>
+                                      <w:spacing w:before="0" w:after="0"/>
+                                      <w:jc w:val="right"/>
+                                    </w:pPr>
+                                    <w:r>
+                                      <w:rPr>
+                                        <w:rFonts w:ascii="Helvetica Neue" w:hAnsi="Helvetica Neue" w:cs="Helvetica Neue"/>
+                                        <w:sz w:val="19"/>
+                                        <w:szCs w:val="19"/>
+                                        <w:color w:val="1D1D1F"/>
+                                        <w:b/>
+                                      </w:rPr>
+                                      <w:t xml:space="preserve">{{ZWISCHENSUMME}} CHF</w:t>
+                                    </w:r>
+                                  </w:p>
+                                </w:tc>
+                              </w:tr>
+                              <w:tr>
+                                <w:tc>
+                                  <w:tcPr>
+                                    <w:tcW w:w="3200" w:type="pct"/>
+                                    <w:vAlign w:val="center"/>
+                                    <w:tcMar>
+                                      <w:top w:w="60" w:type="dxa"/>
+                                      <w:bottom w:w="60" w:type="dxa"/>
+                                    </w:tcMar>
+                                  </w:tcPr>
+                                  <w:p>
+                                    <w:pPr>
+                                      <w:spacing w:before="0" w:after="0"/>
+                                      <w:jc w:val="right"/>
+                                    </w:pPr>
+                                    <w:r>
+                                      <w:rPr>
+                                        <w:rFonts w:ascii="Helvetica Neue" w:hAnsi="Helvetica Neue" w:cs="Helvetica Neue"/>
+                                        <w:sz w:val="19"/>
+                                        <w:szCs w:val="19"/>
+                                        <w:color w:val="86868B"/>
+                                        <w:spacing w:val="0"/>
+                                      </w:rPr>
+                                      <w:t xml:space="preserve">MWST (Kleinunternehmer §19)</w:t>
+                                    </w:r>
+                                  </w:p>
+                                </w:tc>
+                                <w:tc>
+                                  <w:tcPr>
+                                    <w:tcW w:w="1800" w:type="pct"/>
+                                    <w:vAlign w:val="center"/>
+                                    <w:tcMar>
+                                      <w:top w:w="60" w:type="dxa"/>
+                                      <w:bottom w:w="60" w:type="dxa"/>
+                                    </w:tcMar>
+                                  </w:tcPr>
+                                  <w:p>
+                                    <w:pPr>
+                                      <w:spacing w:before="0" w:after="0"/>
+                                      <w:jc w:val="right"/>
+                                    </w:pPr>
+                                    <w:r>
+                                      <w:rPr>
+                                        <w:rFonts w:ascii="Helvetica Neue" w:hAnsi="Helvetica Neue" w:cs="Helvetica Neue"/>
+                                        <w:sz w:val="19"/>
+                                        <w:szCs w:val="19"/>
+                                        <w:color w:val="1D1D1F"/>
+                                        <w:b/>
+                                      </w:rPr>
+                                      <w:t xml:space="preserve">0.00 CHF</w:t>
+                                    </w:r>
+                                  </w:p>
+                                </w:tc>
+                              </w:tr>
+                            </w:tbl>
+                          </w:txbxContent>
+                        </wps:txbx>
+                        <wps:bodyPr rot="0" wrap="square" lIns="180000" tIns="108000" rIns="180000" bIns="108000" anchor="t">
+                          <a:spAutoFit/>
+                        </wps:bodyPr>
+                      </wps:wsp>
+                    </a:graphicData>
+                  </a:graphic>
+                </wp:inline>
+              </w:drawing>
             </w:r>
           </w:p>
           <w:p>
             <w:pPr>
-              <w:spacing w:before="60" w:after="0" w:line="288" w:lineRule="auto"/>
+              <w:spacing w:before="60"/>
             </w:pPr>
             <w:r>
-              <w:rPr>
-                <w:rFonts w:ascii="Calibri" w:hAnsi="Calibri"/>
-                <w:b w:val="0"/>
-                <w:i w:val="0"/>
-                <w:color w:val="3A3A3A"/>
-                <w:sz w:val="19"/>
-              </w:rPr>
-              <w:t xml:space="preserve">Zahlbar innert {{ZAHLUNGSFRIST}} Tagen netto, ohne Abzug, auf das unten genannte Konto bei der Migros Bank AG. </w:t>
-            </w:r>
-          </w:p>
-          <w:p>
-            <w:pPr>
-              <w:spacing w:before="40" w:after="0" w:line="288" w:lineRule="auto"/>
-            </w:pPr>
-            <w:r>
-              <w:rPr>
-                <w:rFonts w:ascii="Calibri" w:hAnsi="Calibri"/>
-                <w:b w:val="0"/>
-                <w:i w:val="0"/>
-                <w:color w:val="3A3A3A"/>
-                <w:sz w:val="19"/>
-              </w:rPr>
-              <w:t>Bitte geben Sie bei der Zahlung die Dokument-Nr. {{DOKUMENT_NR}} an.</w:t>
+              <w:drawing>
+                <wp:inline distT="0" distB="0" distL="0" distR="0">
+                  <wp:extent cx="3168000" cy="432000"/>
+                  <wp:effectExtent l="0" t="0" r="0" b="0"/>
+                  <wp:docPr id="105" name="Card105"/>
+                  <wp:cNvGraphicFramePr/>
+                  <a:graphic xmlns:a="http://schemas.openxmlformats.org/drawingml/2006/main">
+                    <a:graphicData uri="http://schemas.microsoft.com/office/word/2010/wordprocessingShape">
+                      <wps:wsp>
+                        <wps:cNvSpPr txBox="1"/>
+                        <wps:spPr>
+                          <a:xfrm>
+                            <a:off x="0" y="0"/>
+                            <a:ext cx="3168000" cy="432000"/>
+                          </a:xfrm>
+                          <a:prstGeom prst="roundRect">
+                            <a:avLst>
+                              <a:gd name="adj" fmla="val 16000"/>
+                            </a:avLst>
+                          </a:prstGeom>
+                          <a:solidFill>
+                            <a:srgbClr val="000D6E"/>
+                          </a:solidFill>
+                          <a:ln>
+                            <a:noFill/>
+                          </a:ln>
+                        </wps:spPr>
+                        <wps:txbx>
+                          <w:txbxContent>
+                            <w:tbl>
+                              <w:tblPr>
+                                <w:tblW w:w="5000" w:type="pct"/>
+                                <w:tblBorders>
+                                  <w:top w:val="none"/>
+                                  <w:left w:val="none"/>
+                                  <w:bottom w:val="none"/>
+                                  <w:right w:val="none"/>
+                                  <w:insideH w:val="none"/>
+                                  <w:insideV w:val="none"/>
+                                </w:tblBorders>
+                              </w:tblPr>
+                              <w:tr>
+                                <w:tc>
+                                  <w:tcPr>
+                                    <w:tcW w:w="3200" w:type="pct"/>
+                                    <w:vAlign w:val="center"/>
+                                    <w:tcMar>
+                                      <w:top w:w="60" w:type="dxa"/>
+                                      <w:bottom w:w="60" w:type="dxa"/>
+                                    </w:tcMar>
+                                  </w:tcPr>
+                                  <w:p>
+                                    <w:pPr>
+                                      <w:spacing w:before="0" w:after="0"/>
+                                      <w:jc w:val="right"/>
+                                    </w:pPr>
+                                    <w:r>
+                                      <w:rPr>
+                                        <w:rFonts w:ascii="Helvetica Neue" w:hAnsi="Helvetica Neue" w:cs="Helvetica Neue"/>
+                                        <w:sz w:val="22"/>
+                                        <w:szCs w:val="22"/>
+                                        <w:color w:val="FFFFFF"/>
+                                        <w:b/>
+                                        <w:caps/>
+                                        <w:spacing w:val="20"/>
+                                      </w:rPr>
+                                      <w:t xml:space="preserve">Gesamtbetrag</w:t>
+                                    </w:r>
+                                  </w:p>
+                                </w:tc>
+                                <w:tc>
+                                  <w:tcPr>
+                                    <w:tcW w:w="1800" w:type="pct"/>
+                                    <w:vAlign w:val="center"/>
+                                    <w:tcMar>
+                                      <w:top w:w="60" w:type="dxa"/>
+                                      <w:bottom w:w="60" w:type="dxa"/>
+                                    </w:tcMar>
+                                  </w:tcPr>
+                                  <w:p>
+                                    <w:pPr>
+                                      <w:spacing w:before="0" w:after="0"/>
+                                      <w:jc w:val="right"/>
+                                    </w:pPr>
+                                    <w:r>
+                                      <w:rPr>
+                                        <w:rFonts w:ascii="Helvetica Neue" w:hAnsi="Helvetica Neue" w:cs="Helvetica Neue"/>
+                                        <w:sz w:val="26"/>
+                                        <w:szCs w:val="26"/>
+                                        <w:color w:val="FFFFFF"/>
+                                        <w:b/>
+                                      </w:rPr>
+                                      <w:t xml:space="preserve">{{GESAMTSUMME}} CHF</w:t>
+                                    </w:r>
+                                  </w:p>
+                                </w:tc>
+                              </w:tr>
+                            </w:tbl>
+                          </w:txbxContent>
+                        </wps:txbx>
+                        <wps:bodyPr rot="0" wrap="square" lIns="180000" tIns="90000" rIns="180000" bIns="90000" anchor="t">
+                          <a:spAutoFit/>
+                        </wps:bodyPr>
+                      </wps:wsp>
+                    </a:graphicData>
+                  </a:graphic>
+                </wp:inline>
+              </w:drawing>
             </w:r>
           </w:p>
         </w:tc>
@@ -1549,64 +1632,236 @@
     </w:tbl>
     <w:p>
       <w:pPr>
-        <w:spacing w:before="0" w:after="120" w:line="259" w:lineRule="auto"/>
+        <w:spacing w:after="0" w:before="0"/>
+        <w:spacing w:line="160" w:lineRule="exact"/>
       </w:pPr>
     </w:p>
     <w:p>
       <w:pPr>
-        <w:spacing w:before="120" w:after="40" w:line="259" w:lineRule="auto"/>
+        <w:spacing w:after="0" w:before="0"/>
+      </w:pPr>
+      <w:r>
+        <w:drawing>
+          <wp:inline distT="0" distB="0" distL="0" distR="0">
+            <wp:extent cx="6264000" cy="576000"/>
+            <wp:effectExtent l="0" t="0" r="0" b="0"/>
+            <wp:docPr id="106" name="Card106"/>
+            <wp:cNvGraphicFramePr/>
+            <a:graphic xmlns:a="http://schemas.openxmlformats.org/drawingml/2006/main">
+              <a:graphicData uri="http://schemas.microsoft.com/office/word/2010/wordprocessingShape">
+                <wps:wsp>
+                  <wps:cNvSpPr txBox="1"/>
+                  <wps:spPr>
+                    <a:xfrm>
+                      <a:off x="0" y="0"/>
+                      <a:ext cx="6264000" cy="576000"/>
+                    </a:xfrm>
+                    <a:prstGeom prst="roundRect">
+                      <a:avLst>
+                        <a:gd name="adj" fmla="val 11000"/>
+                      </a:avLst>
+                    </a:prstGeom>
+                    <a:solidFill>
+                      <a:srgbClr val="F5F5F7"/>
+                    </a:solidFill>
+                    <a:ln>
+                      <a:noFill/>
+                    </a:ln>
+                  </wps:spPr>
+                  <wps:txbx>
+                    <w:txbxContent>
+                      <w:p>
+                        <w:pPr>
+                          <w:spacing w:before="0" w:after="40"/>
+                        </w:pPr>
+                        <w:r>
+                          <w:rPr>
+                            <w:rFonts w:ascii="Helvetica Neue" w:hAnsi="Helvetica Neue" w:cs="Helvetica Neue"/>
+                            <w:sz w:val="15"/>
+                            <w:szCs w:val="15"/>
+                            <w:color w:val="86868B"/>
+                            <w:b/>
+                            <w:caps/>
+                            <w:spacing w:val="24"/>
+                          </w:rPr>
+                          <w:t xml:space="preserve">Hinweis</w:t>
+                        </w:r>
+                      </w:p>
+                      <w:p>
+                        <w:pPr>
+                          <w:spacing w:before="0" w:after="0" w:line="288" w:lineRule="auto"/>
+                        </w:pPr>
+                        <w:r>
+                          <w:rPr>
+                            <w:rFonts w:ascii="Helvetica Neue" w:hAnsi="Helvetica Neue" w:cs="Helvetica Neue"/>
+                            <w:sz w:val="19"/>
+                            <w:szCs w:val="19"/>
+                            <w:color w:val="1D1D1F"/>
+                            <w:i/>
+                          </w:rPr>
+                          <w:t xml:space="preserve">Als Kleinunternehmer im Sinne von § 19 Abs. 1 UStG wird keine Umsatzsteuer berechnet.</w:t>
+                        </w:r>
+                      </w:p>
+                    </w:txbxContent>
+                  </wps:txbx>
+                  <wps:bodyPr rot="0" wrap="square" lIns="187200" tIns="144000" rIns="187200" bIns="144000" anchor="t">
+                    <a:spAutoFit/>
+                  </wps:bodyPr>
+                </wps:wsp>
+              </a:graphicData>
+            </a:graphic>
+          </wp:inline>
+        </w:drawing>
+      </w:r>
+    </w:p>
+    <w:p>
+      <w:pPr>
+        <w:spacing w:after="0" w:before="0"/>
+        <w:spacing w:line="120" w:lineRule="exact"/>
+      </w:pPr>
+    </w:p>
+    <w:p>
+      <w:pPr>
+        <w:spacing w:after="0" w:before="0"/>
+      </w:pPr>
+      <w:r>
+        <w:drawing>
+          <wp:inline distT="0" distB="0" distL="0" distR="0">
+            <wp:extent cx="6264000" cy="792000"/>
+            <wp:effectExtent l="0" t="0" r="0" b="0"/>
+            <wp:docPr id="107" name="Card107"/>
+            <wp:cNvGraphicFramePr/>
+            <a:graphic xmlns:a="http://schemas.openxmlformats.org/drawingml/2006/main">
+              <a:graphicData uri="http://schemas.microsoft.com/office/word/2010/wordprocessingShape">
+                <wps:wsp>
+                  <wps:cNvSpPr txBox="1"/>
+                  <wps:spPr>
+                    <a:xfrm>
+                      <a:off x="0" y="0"/>
+                      <a:ext cx="6264000" cy="792000"/>
+                    </a:xfrm>
+                    <a:prstGeom prst="roundRect">
+                      <a:avLst>
+                        <a:gd name="adj" fmla="val 10000"/>
+                      </a:avLst>
+                    </a:prstGeom>
+                    <a:solidFill>
+                      <a:srgbClr val="F5F5F7"/>
+                    </a:solidFill>
+                    <a:ln>
+                      <a:noFill/>
+                    </a:ln>
+                  </wps:spPr>
+                  <wps:txbx>
+                    <w:txbxContent>
+                      <w:p>
+                        <w:pPr>
+                          <w:spacing w:before="0" w:after="60"/>
+                        </w:pPr>
+                        <w:r>
+                          <w:rPr>
+                            <w:rFonts w:ascii="Helvetica Neue" w:hAnsi="Helvetica Neue" w:cs="Helvetica Neue"/>
+                            <w:sz w:val="15"/>
+                            <w:szCs w:val="15"/>
+                            <w:color w:val="0A66FF"/>
+                            <w:b/>
+                            <w:caps/>
+                            <w:spacing w:val="24"/>
+                          </w:rPr>
+                          <w:t xml:space="preserve">Zahlungsbedingungen</w:t>
+                        </w:r>
+                      </w:p>
+                      <w:p>
+                        <w:pPr>
+                          <w:spacing w:before="0" w:after="40" w:line="300" w:lineRule="auto"/>
+                        </w:pPr>
+                        <w:r>
+                          <w:rPr>
+                            <w:rFonts w:ascii="Helvetica Neue" w:hAnsi="Helvetica Neue" w:cs="Helvetica Neue"/>
+                            <w:sz w:val="19"/>
+                            <w:szCs w:val="19"/>
+                            <w:color w:val="1D1D1F"/>
+                          </w:rPr>
+                          <w:t xml:space="preserve">Zahlbar innert {{ZAHLUNGSFRIST}} Tagen netto, ohne Abzug, auf das Konto bei der Migros Bank AG.</w:t>
+                        </w:r>
+                      </w:p>
+                      <w:p>
+                        <w:pPr>
+                          <w:spacing w:before="0" w:after="0" w:line="300" w:lineRule="auto"/>
+                        </w:pPr>
+                        <w:r>
+                          <w:rPr>
+                            <w:rFonts w:ascii="Helvetica Neue" w:hAnsi="Helvetica Neue" w:cs="Helvetica Neue"/>
+                            <w:sz w:val="19"/>
+                            <w:szCs w:val="19"/>
+                            <w:color w:val="86868B"/>
+                          </w:rPr>
+                          <w:t xml:space="preserve">Bitte bei der Zahlung die Dokument-Nr. {{DOKUMENT_NR}} angeben.</w:t>
+                        </w:r>
+                      </w:p>
+                    </w:txbxContent>
+                  </wps:txbx>
+                  <wps:bodyPr rot="0" wrap="square" lIns="187200" tIns="158400" rIns="187200" bIns="158400" anchor="t">
+                    <a:spAutoFit/>
+                  </wps:bodyPr>
+                </wps:wsp>
+              </a:graphicData>
+            </a:graphic>
+          </wp:inline>
+        </w:drawing>
+      </w:r>
+    </w:p>
+    <w:p>
+      <w:pPr>
+        <w:spacing w:after="0" w:before="0"/>
+        <w:spacing w:line="200" w:lineRule="exact"/>
+      </w:pPr>
+    </w:p>
+    <w:p>
+      <w:pPr>
+        <w:spacing w:after="160"/>
       </w:pPr>
       <w:r>
         <w:rPr>
-          <w:rFonts w:ascii="Calibri" w:hAnsi="Calibri"/>
-          <w:b w:val="0"/>
-          <w:i w:val="0"/>
-          <w:color w:val="3A3A3A"/>
-          <w:sz w:val="20"/>
+          <w:rFonts w:ascii="Helvetica Neue" w:hAnsi="Helvetica Neue"/>
+          <w:color w:val="1D1D1F"/>
+          <w:sz w:val="21"/>
         </w:rPr>
         <w:t>Mit bestem Dank für den geschätzten Auftrag.</w:t>
       </w:r>
     </w:p>
     <w:p>
       <w:pPr>
-        <w:spacing w:before="200" w:after="0" w:line="259" w:lineRule="auto"/>
+        <w:spacing w:after="40"/>
       </w:pPr>
       <w:r>
         <w:rPr>
-          <w:rFonts w:ascii="Calibri" w:hAnsi="Calibri"/>
-          <w:b w:val="0"/>
-          <w:i w:val="0"/>
-          <w:color w:val="3A3A3A"/>
-          <w:sz w:val="20"/>
+          <w:rFonts w:ascii="Helvetica Neue" w:hAnsi="Helvetica Neue"/>
+          <w:color w:val="1D1D1F"/>
+          <w:sz w:val="21"/>
         </w:rPr>
         <w:t>Freundliche Grüsse</w:t>
       </w:r>
     </w:p>
     <w:p>
       <w:pPr>
-        <w:spacing w:before="40" w:after="0" w:line="259" w:lineRule="auto"/>
+        <w:spacing w:after="0"/>
       </w:pPr>
       <w:r>
         <w:rPr>
-          <w:rFonts w:ascii="Calibri" w:hAnsi="Calibri"/>
+          <w:rFonts w:ascii="Helvetica Neue" w:hAnsi="Helvetica Neue"/>
           <w:b/>
-          <w:i w:val="0"/>
           <w:color w:val="000D6E"/>
-          <w:sz w:val="20"/>
+          <w:sz w:val="22"/>
         </w:rPr>
         <w:t>Burak Ücöz</w:t>
       </w:r>
     </w:p>
     <w:p>
-      <w:pPr>
-        <w:spacing w:before="0" w:after="0" w:line="259" w:lineRule="auto"/>
-      </w:pPr>
       <w:r>
         <w:rPr>
-          <w:rFonts w:ascii="Calibri" w:hAnsi="Calibri"/>
-          <w:b w:val="0"/>
-          <w:i w:val="0"/>
-          <w:color w:val="555555"/>
+          <w:rFonts w:ascii="Helvetica Neue" w:hAnsi="Helvetica Neue"/>
+          <w:color w:val="86868B"/>
           <w:sz w:val="18"/>
         </w:rPr>
         <w:t>Kabuu Engineering</w:t>
@@ -1619,21 +1874,29 @@
     </w:p>
     <w:p>
       <w:pPr>
-        <w:spacing w:before="0" w:after="80" w:line="259" w:lineRule="auto"/>
-        <w:pBdr>
-          <w:bottom w:val="single" w:sz="12" w:space="4" w:color="000D6E"/>
-        </w:pBdr>
+        <w:spacing w:after="40"/>
       </w:pPr>
       <w:r>
         <w:rPr>
-          <w:rFonts w:ascii="Calibri" w:hAnsi="Calibri"/>
+          <w:rFonts w:ascii="Helvetica Neue" w:hAnsi="Helvetica Neue"/>
           <w:b/>
-          <w:i w:val="0"/>
-          <w:color w:val="000D6E"/>
-          <w:sz w:val="26"/>
-          <w:spacing w:val="20"/>
+          <w:color w:val="1D1D1F"/>
+          <w:sz w:val="36"/>
         </w:rPr>
-        <w:t>AUSFÜLLHILFE – PLATZHALTER</w:t>
+        <w:t>Ausfüllhilfe</w:t>
+      </w:r>
+    </w:p>
+    <w:p>
+      <w:pPr>
+        <w:spacing w:after="160"/>
+      </w:pPr>
+      <w:r>
+        <w:rPr>
+          <w:rFonts w:ascii="Helvetica Neue" w:hAnsi="Helvetica Neue"/>
+          <w:color w:val="86868B"/>
+          <w:sz w:val="20"/>
+        </w:rPr>
+        <w:t>Ersetze in Word die {{Platzhalter}} – fertig.</w:t>
       </w:r>
     </w:p>
     <w:tbl>
@@ -1645,25 +1908,21 @@
           <w:left w:val="none"/>
           <w:bottom w:val="none"/>
           <w:right w:val="none"/>
-          <w:insideH w:val="none"/>
+          <w:insideH w:val="single" w:sz="4" w:color="E5E5EA"/>
           <w:insideV w:val="none"/>
         </w:tblBorders>
       </w:tblPr>
       <w:tblGrid>
-        <w:gridCol w:w="4819"/>
-        <w:gridCol w:w="4819"/>
+        <w:gridCol w:w="4933"/>
+        <w:gridCol w:w="4933"/>
       </w:tblGrid>
       <w:tr>
         <w:tc>
           <w:tcPr>
-            <w:tcW w:type="dxa" w:w="3118"/>
+            <w:tcW w:type="dxa" w:w="3288"/>
             <w:tcMar>
-              <w:top w:w="40" w:type="dxa"/>
-              <w:bottom w:w="40" w:type="dxa"/>
-              <w:start w:w="80" w:type="dxa"/>
-              <w:end w:w="80" w:type="dxa"/>
-              <w:left w:w="80" w:type="dxa"/>
-              <w:right w:w="80" w:type="dxa"/>
+              <w:top w:w="60" w:type="dxa"/>
+              <w:bottom w:w="60" w:type="dxa"/>
             </w:tcMar>
           </w:tcPr>
           <w:p>
@@ -1671,8 +1930,7 @@
               <w:rPr>
                 <w:rFonts w:ascii="Consolas" w:hAnsi="Consolas"/>
                 <w:b/>
-                <w:i w:val="0"/>
-                <w:color w:val="1E63D6"/>
+                <w:color w:val="0A66FF"/>
                 <w:sz w:val="18"/>
               </w:rPr>
               <w:t>{{DOKUMENTTYP}}</w:t>
@@ -1681,26 +1939,20 @@
         </w:tc>
         <w:tc>
           <w:tcPr>
-            <w:tcW w:type="dxa" w:w="6520"/>
+            <w:tcW w:type="dxa" w:w="6576"/>
             <w:tcMar>
-              <w:top w:w="40" w:type="dxa"/>
-              <w:bottom w:w="40" w:type="dxa"/>
-              <w:start w:w="80" w:type="dxa"/>
-              <w:end w:w="80" w:type="dxa"/>
-              <w:left w:w="80" w:type="dxa"/>
-              <w:right w:w="80" w:type="dxa"/>
+              <w:top w:w="60" w:type="dxa"/>
+              <w:bottom w:w="60" w:type="dxa"/>
             </w:tcMar>
           </w:tcPr>
           <w:p>
             <w:r>
               <w:rPr>
-                <w:rFonts w:ascii="Calibri" w:hAnsi="Calibri"/>
-                <w:b w:val="0"/>
-                <w:i w:val="0"/>
-                <w:color w:val="3A3A3A"/>
-                <w:sz w:val="18"/>
+                <w:rFonts w:ascii="Helvetica Neue" w:hAnsi="Helvetica Neue"/>
+                <w:color w:val="1D1D1F"/>
+                <w:sz w:val="19"/>
               </w:rPr>
-              <w:t>ANGEBOT oder RECHNUNG</w:t>
+              <w:t>ANGEBOT oder RECHNUNG (Pill-Badge oben)</w:t>
             </w:r>
           </w:p>
         </w:tc>
@@ -1708,14 +1960,10 @@
       <w:tr>
         <w:tc>
           <w:tcPr>
-            <w:tcW w:type="dxa" w:w="3118"/>
+            <w:tcW w:type="dxa" w:w="3288"/>
             <w:tcMar>
-              <w:top w:w="40" w:type="dxa"/>
-              <w:bottom w:w="40" w:type="dxa"/>
-              <w:start w:w="80" w:type="dxa"/>
-              <w:end w:w="80" w:type="dxa"/>
-              <w:left w:w="80" w:type="dxa"/>
-              <w:right w:w="80" w:type="dxa"/>
+              <w:top w:w="60" w:type="dxa"/>
+              <w:bottom w:w="60" w:type="dxa"/>
             </w:tcMar>
           </w:tcPr>
           <w:p>
@@ -1723,8 +1971,7 @@
               <w:rPr>
                 <w:rFonts w:ascii="Consolas" w:hAnsi="Consolas"/>
                 <w:b/>
-                <w:i w:val="0"/>
-                <w:color w:val="1E63D6"/>
+                <w:color w:val="0A66FF"/>
                 <w:sz w:val="18"/>
               </w:rPr>
               <w:t>{{BETREFF}}</w:t>
@@ -1733,26 +1980,20 @@
         </w:tc>
         <w:tc>
           <w:tcPr>
-            <w:tcW w:type="dxa" w:w="6520"/>
+            <w:tcW w:type="dxa" w:w="6576"/>
             <w:tcMar>
-              <w:top w:w="40" w:type="dxa"/>
-              <w:bottom w:w="40" w:type="dxa"/>
-              <w:start w:w="80" w:type="dxa"/>
-              <w:end w:w="80" w:type="dxa"/>
-              <w:left w:w="80" w:type="dxa"/>
-              <w:right w:w="80" w:type="dxa"/>
+              <w:top w:w="60" w:type="dxa"/>
+              <w:bottom w:w="60" w:type="dxa"/>
             </w:tcMar>
           </w:tcPr>
           <w:p>
             <w:r>
               <w:rPr>
-                <w:rFonts w:ascii="Calibri" w:hAnsi="Calibri"/>
-                <w:b w:val="0"/>
-                <w:i w:val="0"/>
-                <w:color w:val="3A3A3A"/>
-                <w:sz w:val="18"/>
+                <w:rFonts w:ascii="Helvetica Neue" w:hAnsi="Helvetica Neue"/>
+                <w:color w:val="1D1D1F"/>
+                <w:sz w:val="19"/>
               </w:rPr>
-              <w:t xml:space="preserve">Kurzbeschreibung, z. B. „Power-Quality-Schulung" </w:t>
+              <w:t>Grosser Titel, z. B. „Power-Quality-Schulung“</w:t>
             </w:r>
           </w:p>
         </w:tc>
@@ -1760,14 +2001,10 @@
       <w:tr>
         <w:tc>
           <w:tcPr>
-            <w:tcW w:type="dxa" w:w="3118"/>
+            <w:tcW w:type="dxa" w:w="3288"/>
             <w:tcMar>
-              <w:top w:w="40" w:type="dxa"/>
-              <w:bottom w:w="40" w:type="dxa"/>
-              <w:start w:w="80" w:type="dxa"/>
-              <w:end w:w="80" w:type="dxa"/>
-              <w:left w:w="80" w:type="dxa"/>
-              <w:right w:w="80" w:type="dxa"/>
+              <w:top w:w="60" w:type="dxa"/>
+              <w:bottom w:w="60" w:type="dxa"/>
             </w:tcMar>
           </w:tcPr>
           <w:p>
@@ -1775,8 +2012,7 @@
               <w:rPr>
                 <w:rFonts w:ascii="Consolas" w:hAnsi="Consolas"/>
                 <w:b/>
-                <w:i w:val="0"/>
-                <w:color w:val="1E63D6"/>
+                <w:color w:val="0A66FF"/>
                 <w:sz w:val="18"/>
               </w:rPr>
               <w:t>{{DOKUMENT_NR}}</w:t>
@@ -1785,24 +2021,18 @@
         </w:tc>
         <w:tc>
           <w:tcPr>
-            <w:tcW w:type="dxa" w:w="6520"/>
+            <w:tcW w:type="dxa" w:w="6576"/>
             <w:tcMar>
-              <w:top w:w="40" w:type="dxa"/>
-              <w:bottom w:w="40" w:type="dxa"/>
-              <w:start w:w="80" w:type="dxa"/>
-              <w:end w:w="80" w:type="dxa"/>
-              <w:left w:w="80" w:type="dxa"/>
-              <w:right w:w="80" w:type="dxa"/>
+              <w:top w:w="60" w:type="dxa"/>
+              <w:bottom w:w="60" w:type="dxa"/>
             </w:tcMar>
           </w:tcPr>
           <w:p>
             <w:r>
               <w:rPr>
-                <w:rFonts w:ascii="Calibri" w:hAnsi="Calibri"/>
-                <w:b w:val="0"/>
-                <w:i w:val="0"/>
-                <w:color w:val="3A3A3A"/>
-                <w:sz w:val="18"/>
+                <w:rFonts w:ascii="Helvetica Neue" w:hAnsi="Helvetica Neue"/>
+                <w:color w:val="1D1D1F"/>
+                <w:sz w:val="19"/>
               </w:rPr>
               <w:t>Fortlaufende Nummer, z. B. 0011</w:t>
             </w:r>
@@ -1812,14 +2042,10 @@
       <w:tr>
         <w:tc>
           <w:tcPr>
-            <w:tcW w:type="dxa" w:w="3118"/>
+            <w:tcW w:type="dxa" w:w="3288"/>
             <w:tcMar>
-              <w:top w:w="40" w:type="dxa"/>
-              <w:bottom w:w="40" w:type="dxa"/>
-              <w:start w:w="80" w:type="dxa"/>
-              <w:end w:w="80" w:type="dxa"/>
-              <w:left w:w="80" w:type="dxa"/>
-              <w:right w:w="80" w:type="dxa"/>
+              <w:top w:w="60" w:type="dxa"/>
+              <w:bottom w:w="60" w:type="dxa"/>
             </w:tcMar>
           </w:tcPr>
           <w:p>
@@ -1827,8 +2053,7 @@
               <w:rPr>
                 <w:rFonts w:ascii="Consolas" w:hAnsi="Consolas"/>
                 <w:b/>
-                <w:i w:val="0"/>
-                <w:color w:val="1E63D6"/>
+                <w:color w:val="0A66FF"/>
                 <w:sz w:val="18"/>
               </w:rPr>
               <w:t>{{DATUM}}</w:t>
@@ -1837,24 +2062,18 @@
         </w:tc>
         <w:tc>
           <w:tcPr>
-            <w:tcW w:type="dxa" w:w="6520"/>
+            <w:tcW w:type="dxa" w:w="6576"/>
             <w:tcMar>
-              <w:top w:w="40" w:type="dxa"/>
-              <w:bottom w:w="40" w:type="dxa"/>
-              <w:start w:w="80" w:type="dxa"/>
-              <w:end w:w="80" w:type="dxa"/>
-              <w:left w:w="80" w:type="dxa"/>
-              <w:right w:w="80" w:type="dxa"/>
+              <w:top w:w="60" w:type="dxa"/>
+              <w:bottom w:w="60" w:type="dxa"/>
             </w:tcMar>
           </w:tcPr>
           <w:p>
             <w:r>
               <w:rPr>
-                <w:rFonts w:ascii="Calibri" w:hAnsi="Calibri"/>
-                <w:b w:val="0"/>
-                <w:i w:val="0"/>
-                <w:color w:val="3A3A3A"/>
-                <w:sz w:val="18"/>
+                <w:rFonts w:ascii="Helvetica Neue" w:hAnsi="Helvetica Neue"/>
+                <w:color w:val="1D1D1F"/>
+                <w:sz w:val="19"/>
               </w:rPr>
               <w:t>Angebots- bzw. Rechnungsdatum</w:t>
             </w:r>
@@ -1864,14 +2083,10 @@
       <w:tr>
         <w:tc>
           <w:tcPr>
-            <w:tcW w:type="dxa" w:w="3118"/>
+            <w:tcW w:type="dxa" w:w="3288"/>
             <w:tcMar>
-              <w:top w:w="40" w:type="dxa"/>
-              <w:bottom w:w="40" w:type="dxa"/>
-              <w:start w:w="80" w:type="dxa"/>
-              <w:end w:w="80" w:type="dxa"/>
-              <w:left w:w="80" w:type="dxa"/>
-              <w:right w:w="80" w:type="dxa"/>
+              <w:top w:w="60" w:type="dxa"/>
+              <w:bottom w:w="60" w:type="dxa"/>
             </w:tcMar>
           </w:tcPr>
           <w:p>
@@ -1879,8 +2094,7 @@
               <w:rPr>
                 <w:rFonts w:ascii="Consolas" w:hAnsi="Consolas"/>
                 <w:b/>
-                <w:i w:val="0"/>
-                <w:color w:val="1E63D6"/>
+                <w:color w:val="0A66FF"/>
                 <w:sz w:val="18"/>
               </w:rPr>
               <w:t>{{FRIST_LABEL}} / {{FRIST_WERT}}</w:t>
@@ -1889,26 +2103,20 @@
         </w:tc>
         <w:tc>
           <w:tcPr>
-            <w:tcW w:type="dxa" w:w="6520"/>
+            <w:tcW w:type="dxa" w:w="6576"/>
             <w:tcMar>
-              <w:top w:w="40" w:type="dxa"/>
-              <w:bottom w:w="40" w:type="dxa"/>
-              <w:start w:w="80" w:type="dxa"/>
-              <w:end w:w="80" w:type="dxa"/>
-              <w:left w:w="80" w:type="dxa"/>
-              <w:right w:w="80" w:type="dxa"/>
+              <w:top w:w="60" w:type="dxa"/>
+              <w:bottom w:w="60" w:type="dxa"/>
             </w:tcMar>
           </w:tcPr>
           <w:p>
             <w:r>
               <w:rPr>
-                <w:rFonts w:ascii="Calibri" w:hAnsi="Calibri"/>
-                <w:b w:val="0"/>
-                <w:i w:val="0"/>
-                <w:color w:val="3A3A3A"/>
-                <w:sz w:val="18"/>
+                <w:rFonts w:ascii="Helvetica Neue" w:hAnsi="Helvetica Neue"/>
+                <w:color w:val="1D1D1F"/>
+                <w:sz w:val="19"/>
               </w:rPr>
-              <w:t>z. B. „Gültig bis" / „Fälligkeitsdatum" + Datum</w:t>
+              <w:t>„Gültig bis“ bzw. „Fälligkeitsdatum“ + Datum</w:t>
             </w:r>
           </w:p>
         </w:tc>
@@ -1916,14 +2124,10 @@
       <w:tr>
         <w:tc>
           <w:tcPr>
-            <w:tcW w:type="dxa" w:w="3118"/>
+            <w:tcW w:type="dxa" w:w="3288"/>
             <w:tcMar>
-              <w:top w:w="40" w:type="dxa"/>
-              <w:bottom w:w="40" w:type="dxa"/>
-              <w:start w:w="80" w:type="dxa"/>
-              <w:end w:w="80" w:type="dxa"/>
-              <w:left w:w="80" w:type="dxa"/>
-              <w:right w:w="80" w:type="dxa"/>
+              <w:top w:w="60" w:type="dxa"/>
+              <w:bottom w:w="60" w:type="dxa"/>
             </w:tcMar>
           </w:tcPr>
           <w:p>
@@ -1931,8 +2135,7 @@
               <w:rPr>
                 <w:rFonts w:ascii="Consolas" w:hAnsi="Consolas"/>
                 <w:b/>
-                <w:i w:val="0"/>
-                <w:color w:val="1E63D6"/>
+                <w:color w:val="0A66FF"/>
                 <w:sz w:val="18"/>
               </w:rPr>
               <w:t>{{KUNDENNUMMER}}</w:t>
@@ -1941,24 +2144,18 @@
         </w:tc>
         <w:tc>
           <w:tcPr>
-            <w:tcW w:type="dxa" w:w="6520"/>
+            <w:tcW w:type="dxa" w:w="6576"/>
             <w:tcMar>
-              <w:top w:w="40" w:type="dxa"/>
-              <w:bottom w:w="40" w:type="dxa"/>
-              <w:start w:w="80" w:type="dxa"/>
-              <w:end w:w="80" w:type="dxa"/>
-              <w:left w:w="80" w:type="dxa"/>
-              <w:right w:w="80" w:type="dxa"/>
+              <w:top w:w="60" w:type="dxa"/>
+              <w:bottom w:w="60" w:type="dxa"/>
             </w:tcMar>
           </w:tcPr>
           <w:p>
             <w:r>
               <w:rPr>
-                <w:rFonts w:ascii="Calibri" w:hAnsi="Calibri"/>
-                <w:b w:val="0"/>
-                <w:i w:val="0"/>
-                <w:color w:val="3A3A3A"/>
-                <w:sz w:val="18"/>
+                <w:rFonts w:ascii="Helvetica Neue" w:hAnsi="Helvetica Neue"/>
+                <w:color w:val="1D1D1F"/>
+                <w:sz w:val="19"/>
               </w:rPr>
               <w:t>Kundennummer</w:t>
             </w:r>
@@ -1968,14 +2165,10 @@
       <w:tr>
         <w:tc>
           <w:tcPr>
-            <w:tcW w:type="dxa" w:w="3118"/>
+            <w:tcW w:type="dxa" w:w="3288"/>
             <w:tcMar>
-              <w:top w:w="40" w:type="dxa"/>
-              <w:bottom w:w="40" w:type="dxa"/>
-              <w:start w:w="80" w:type="dxa"/>
-              <w:end w:w="80" w:type="dxa"/>
-              <w:left w:w="80" w:type="dxa"/>
-              <w:right w:w="80" w:type="dxa"/>
+              <w:top w:w="60" w:type="dxa"/>
+              <w:bottom w:w="60" w:type="dxa"/>
             </w:tcMar>
           </w:tcPr>
           <w:p>
@@ -1983,8 +2176,7 @@
               <w:rPr>
                 <w:rFonts w:ascii="Consolas" w:hAnsi="Consolas"/>
                 <w:b/>
-                <w:i w:val="0"/>
-                <w:color w:val="1E63D6"/>
+                <w:color w:val="0A66FF"/>
                 <w:sz w:val="18"/>
               </w:rPr>
               <w:t>{{KUNDE_*}}</w:t>
@@ -1993,26 +2185,20 @@
         </w:tc>
         <w:tc>
           <w:tcPr>
-            <w:tcW w:type="dxa" w:w="6520"/>
+            <w:tcW w:type="dxa" w:w="6576"/>
             <w:tcMar>
-              <w:top w:w="40" w:type="dxa"/>
-              <w:bottom w:w="40" w:type="dxa"/>
-              <w:start w:w="80" w:type="dxa"/>
-              <w:end w:w="80" w:type="dxa"/>
-              <w:left w:w="80" w:type="dxa"/>
-              <w:right w:w="80" w:type="dxa"/>
+              <w:top w:w="60" w:type="dxa"/>
+              <w:bottom w:w="60" w:type="dxa"/>
             </w:tcMar>
           </w:tcPr>
           <w:p>
             <w:r>
               <w:rPr>
-                <w:rFonts w:ascii="Calibri" w:hAnsi="Calibri"/>
-                <w:b w:val="0"/>
-                <w:i w:val="0"/>
-                <w:color w:val="3A3A3A"/>
-                <w:sz w:val="18"/>
+                <w:rFonts w:ascii="Helvetica Neue" w:hAnsi="Helvetica Neue"/>
+                <w:color w:val="1D1D1F"/>
+                <w:sz w:val="19"/>
               </w:rPr>
-              <w:t>Empfängerangaben (Firma, Ansprechpartner, Adresse)</w:t>
+              <w:t>Empfängerangaben (Firma, Ansprechpartner, Adresse, Land)</w:t>
             </w:r>
           </w:p>
         </w:tc>
@@ -2020,14 +2206,10 @@
       <w:tr>
         <w:tc>
           <w:tcPr>
-            <w:tcW w:type="dxa" w:w="3118"/>
+            <w:tcW w:type="dxa" w:w="3288"/>
             <w:tcMar>
-              <w:top w:w="40" w:type="dxa"/>
-              <w:bottom w:w="40" w:type="dxa"/>
-              <w:start w:w="80" w:type="dxa"/>
-              <w:end w:w="80" w:type="dxa"/>
-              <w:left w:w="80" w:type="dxa"/>
-              <w:right w:w="80" w:type="dxa"/>
+              <w:top w:w="60" w:type="dxa"/>
+              <w:bottom w:w="60" w:type="dxa"/>
             </w:tcMar>
           </w:tcPr>
           <w:p>
@@ -2035,36 +2217,29 @@
               <w:rPr>
                 <w:rFonts w:ascii="Consolas" w:hAnsi="Consolas"/>
                 <w:b/>
-                <w:i w:val="0"/>
-                <w:color w:val="1E63D6"/>
+                <w:color w:val="0A66FF"/>
                 <w:sz w:val="18"/>
               </w:rPr>
-              <w:t>{{LEISTUNG x}}</w:t>
+              <w:t>{{Leistung 1–3}}</w:t>
             </w:r>
           </w:p>
         </w:tc>
         <w:tc>
           <w:tcPr>
-            <w:tcW w:type="dxa" w:w="6520"/>
+            <w:tcW w:type="dxa" w:w="6576"/>
             <w:tcMar>
-              <w:top w:w="40" w:type="dxa"/>
-              <w:bottom w:w="40" w:type="dxa"/>
-              <w:start w:w="80" w:type="dxa"/>
-              <w:end w:w="80" w:type="dxa"/>
-              <w:left w:w="80" w:type="dxa"/>
-              <w:right w:w="80" w:type="dxa"/>
+              <w:top w:w="60" w:type="dxa"/>
+              <w:bottom w:w="60" w:type="dxa"/>
             </w:tcMar>
           </w:tcPr>
           <w:p>
             <w:r>
               <w:rPr>
-                <w:rFonts w:ascii="Calibri" w:hAnsi="Calibri"/>
-                <w:b w:val="0"/>
-                <w:i w:val="0"/>
-                <w:color w:val="3A3A3A"/>
-                <w:sz w:val="18"/>
+                <w:rFonts w:ascii="Helvetica Neue" w:hAnsi="Helvetica Neue"/>
+                <w:color w:val="1D1D1F"/>
+                <w:sz w:val="19"/>
               </w:rPr>
-              <w:t>Positionen: Beschreibung, Einzelpreis, Menge, Summe</w:t>
+              <w:t>Positionen inkl. Detailzeile, Einzelpreis, Menge, Summe</w:t>
             </w:r>
           </w:p>
         </w:tc>
@@ -2072,14 +2247,10 @@
       <w:tr>
         <w:tc>
           <w:tcPr>
-            <w:tcW w:type="dxa" w:w="3118"/>
+            <w:tcW w:type="dxa" w:w="3288"/>
             <w:tcMar>
-              <w:top w:w="40" w:type="dxa"/>
-              <w:bottom w:w="40" w:type="dxa"/>
-              <w:start w:w="80" w:type="dxa"/>
-              <w:end w:w="80" w:type="dxa"/>
-              <w:left w:w="80" w:type="dxa"/>
-              <w:right w:w="80" w:type="dxa"/>
+              <w:top w:w="60" w:type="dxa"/>
+              <w:bottom w:w="60" w:type="dxa"/>
             </w:tcMar>
           </w:tcPr>
           <w:p>
@@ -2087,8 +2258,7 @@
               <w:rPr>
                 <w:rFonts w:ascii="Consolas" w:hAnsi="Consolas"/>
                 <w:b/>
-                <w:i w:val="0"/>
-                <w:color w:val="1E63D6"/>
+                <w:color w:val="0A66FF"/>
                 <w:sz w:val="18"/>
               </w:rPr>
               <w:t>{{ZWISCHENSUMME}} / {{GESAMTSUMME}}</w:t>
@@ -2097,24 +2267,18 @@
         </w:tc>
         <w:tc>
           <w:tcPr>
-            <w:tcW w:type="dxa" w:w="6520"/>
+            <w:tcW w:type="dxa" w:w="6576"/>
             <w:tcMar>
-              <w:top w:w="40" w:type="dxa"/>
-              <w:bottom w:w="40" w:type="dxa"/>
-              <w:start w:w="80" w:type="dxa"/>
-              <w:end w:w="80" w:type="dxa"/>
-              <w:left w:w="80" w:type="dxa"/>
-              <w:right w:w="80" w:type="dxa"/>
+              <w:top w:w="60" w:type="dxa"/>
+              <w:bottom w:w="60" w:type="dxa"/>
             </w:tcMar>
           </w:tcPr>
           <w:p>
             <w:r>
               <w:rPr>
-                <w:rFonts w:ascii="Calibri" w:hAnsi="Calibri"/>
-                <w:b w:val="0"/>
-                <w:i w:val="0"/>
-                <w:color w:val="3A3A3A"/>
-                <w:sz w:val="18"/>
+                <w:rFonts w:ascii="Helvetica Neue" w:hAnsi="Helvetica Neue"/>
+                <w:color w:val="1D1D1F"/>
+                <w:sz w:val="19"/>
               </w:rPr>
               <w:t>Beträge in CHF</w:t>
             </w:r>
@@ -2124,14 +2288,10 @@
       <w:tr>
         <w:tc>
           <w:tcPr>
-            <w:tcW w:type="dxa" w:w="3118"/>
+            <w:tcW w:type="dxa" w:w="3288"/>
             <w:tcMar>
-              <w:top w:w="40" w:type="dxa"/>
-              <w:bottom w:w="40" w:type="dxa"/>
-              <w:start w:w="80" w:type="dxa"/>
-              <w:end w:w="80" w:type="dxa"/>
-              <w:left w:w="80" w:type="dxa"/>
-              <w:right w:w="80" w:type="dxa"/>
+              <w:top w:w="60" w:type="dxa"/>
+              <w:bottom w:w="60" w:type="dxa"/>
             </w:tcMar>
           </w:tcPr>
           <w:p>
@@ -2139,8 +2299,7 @@
               <w:rPr>
                 <w:rFonts w:ascii="Consolas" w:hAnsi="Consolas"/>
                 <w:b/>
-                <w:i w:val="0"/>
-                <w:color w:val="1E63D6"/>
+                <w:color w:val="0A66FF"/>
                 <w:sz w:val="18"/>
               </w:rPr>
               <w:t>{{ZAHLUNGSFRIST}}</w:t>
@@ -2149,24 +2308,18 @@
         </w:tc>
         <w:tc>
           <w:tcPr>
-            <w:tcW w:type="dxa" w:w="6520"/>
+            <w:tcW w:type="dxa" w:w="6576"/>
             <w:tcMar>
-              <w:top w:w="40" w:type="dxa"/>
-              <w:bottom w:w="40" w:type="dxa"/>
-              <w:start w:w="80" w:type="dxa"/>
-              <w:end w:w="80" w:type="dxa"/>
-              <w:left w:w="80" w:type="dxa"/>
-              <w:right w:w="80" w:type="dxa"/>
+              <w:top w:w="60" w:type="dxa"/>
+              <w:bottom w:w="60" w:type="dxa"/>
             </w:tcMar>
           </w:tcPr>
           <w:p>
             <w:r>
               <w:rPr>
-                <w:rFonts w:ascii="Calibri" w:hAnsi="Calibri"/>
-                <w:b w:val="0"/>
-                <w:i w:val="0"/>
-                <w:color w:val="3A3A3A"/>
-                <w:sz w:val="18"/>
+                <w:rFonts w:ascii="Helvetica Neue" w:hAnsi="Helvetica Neue"/>
+                <w:color w:val="1D1D1F"/>
+                <w:sz w:val="19"/>
               </w:rPr>
               <w:t>z. B. 14</w:t>
             </w:r>
@@ -2178,7 +2331,7 @@
       <w:headerReference w:type="default" r:id="rId9"/>
       <w:footerReference w:type="default" r:id="rId10"/>
       <w:pgSz w:w="11906" w:h="16838"/>
-      <w:pgMar w:top="2154" w:right="1134" w:bottom="1474" w:left="1134" w:header="567" w:footer="454" w:gutter="0"/>
+      <w:pgMar w:top="1928" w:right="1020" w:bottom="1361" w:left="1020" w:header="624" w:footer="510" w:gutter="0"/>
       <w:cols w:space="720"/>
       <w:docGrid w:linePitch="360"/>
     </w:sectPr>
@@ -2190,246 +2343,159 @@
 <w:ftr xmlns:m="http://schemas.openxmlformats.org/officeDocument/2006/math" xmlns:mc="http://schemas.openxmlformats.org/markup-compatibility/2006" xmlns:mo="http://schemas.microsoft.com/office/mac/office/2008/main" xmlns:mv="urn:schemas-microsoft-com:mac:vml" xmlns:o="urn:schemas-microsoft-com:office:office" xmlns:r="http://schemas.openxmlformats.org/officeDocument/2006/relationships" xmlns:v="urn:schemas-microsoft-com:vml" xmlns:w10="urn:schemas-microsoft-com:office:word" xmlns:w14="http://schemas.microsoft.com/office/word/2010/wordml" xmlns:w="http://schemas.openxmlformats.org/wordprocessingml/2006/main" xmlns:wne="http://schemas.microsoft.com/office/word/2006/wordml" xmlns:wp14="http://schemas.microsoft.com/office/word/2010/wordprocessingDrawing" xmlns:wp="http://schemas.openxmlformats.org/drawingml/2006/wordprocessingDrawing" xmlns:wpc="http://schemas.microsoft.com/office/word/2010/wordprocessingCanvas" xmlns:wpg="http://schemas.microsoft.com/office/word/2010/wordprocessingGroup" xmlns:wpi="http://schemas.microsoft.com/office/word/2010/wordprocessingInk" xmlns:wps="http://schemas.microsoft.com/office/word/2010/wordprocessingShape" mc:Ignorable="w14 wp14">
   <w:p>
     <w:pPr>
-      <w:spacing w:after="40"/>
-      <w:pBdr>
-        <w:top w:val="single" w:sz="8" w:space="2" w:color="1E63D6"/>
-      </w:pBdr>
-    </w:pPr>
+      <w:spacing w:after="20"/>
+      <w:jc w:val="center"/>
+    </w:pPr>
+    <w:r>
+      <w:rPr>
+        <w:rFonts w:ascii="Helvetica Neue" w:hAnsi="Helvetica Neue"/>
+        <w:b/>
+        <w:color w:val="1D1D1F"/>
+        <w:sz w:val="15"/>
+      </w:rPr>
+      <w:t>Kabuu Engineering</w:t>
+    </w:r>
+    <w:r>
+      <w:rPr>
+        <w:rFonts w:ascii="Helvetica Neue" w:hAnsi="Helvetica Neue"/>
+        <w:b w:val="0"/>
+        <w:color w:val="86868B"/>
+        <w:sz w:val="15"/>
+      </w:rPr>
+      <w:t xml:space="preserve">   ·   Im Abt 9A, 8240 Thayngen (CH)   ·   58095 Hagen (DE)</w:t>
+    </w:r>
   </w:p>
-  <w:tbl>
-    <w:tblPr>
-      <w:tblW w:type="auto" w:w="0"/>
-      <w:tblLook w:firstColumn="1" w:firstRow="1" w:lastColumn="0" w:lastRow="0" w:noHBand="0" w:noVBand="1" w:val="04A0"/>
-      <w:tblBorders>
-        <w:top w:val="none"/>
-        <w:left w:val="none"/>
-        <w:bottom w:val="none"/>
-        <w:right w:val="none"/>
-        <w:insideH w:val="none"/>
-        <w:insideV w:val="none"/>
-      </w:tblBorders>
-    </w:tblPr>
-    <w:tblGrid>
-      <w:gridCol w:w="3213"/>
-      <w:gridCol w:w="3213"/>
-      <w:gridCol w:w="3213"/>
-    </w:tblGrid>
-    <w:tr>
-      <w:tc>
-        <w:tcPr>
-          <w:tcW w:type="dxa" w:w="3515"/>
-        </w:tcPr>
-        <w:p>
-          <w:r>
-            <w:rPr>
-              <w:rFonts w:ascii="Calibri" w:hAnsi="Calibri"/>
-              <w:b/>
-              <w:i w:val="0"/>
-              <w:color w:val="000D6E"/>
-              <w:sz w:val="15"/>
-            </w:rPr>
-            <w:t>Kabuu Engineering</w:t>
-          </w:r>
-        </w:p>
-        <w:p>
-          <w:pPr>
-            <w:spacing w:before="20" w:after="0" w:line="259" w:lineRule="auto"/>
-          </w:pPr>
-          <w:r>
-            <w:rPr>
-              <w:rFonts w:ascii="Calibri" w:hAnsi="Calibri"/>
-              <w:b w:val="0"/>
-              <w:i w:val="0"/>
-              <w:color w:val="555555"/>
-              <w:sz w:val="15"/>
-            </w:rPr>
-            <w:t>Im Abt 9A · 8240 Thayngen (CH)</w:t>
-          </w:r>
-        </w:p>
-        <w:p>
-          <w:pPr>
-            <w:spacing w:before="0" w:after="0" w:line="259" w:lineRule="auto"/>
-          </w:pPr>
-          <w:r>
-            <w:rPr>
-              <w:rFonts w:ascii="Calibri" w:hAnsi="Calibri"/>
-              <w:b w:val="0"/>
-              <w:i w:val="0"/>
-              <w:color w:val="555555"/>
-              <w:sz w:val="15"/>
-            </w:rPr>
-            <w:t>58095 Hagen (DE)</w:t>
-          </w:r>
-        </w:p>
-      </w:tc>
-      <w:tc>
-        <w:tcPr>
-          <w:tcW w:type="dxa" w:w="3515"/>
-        </w:tcPr>
-        <w:p>
-          <w:pPr>
-            <w:jc w:val="center"/>
-          </w:pPr>
-          <w:r>
-            <w:rPr>
-              <w:rFonts w:ascii="Calibri" w:hAnsi="Calibri"/>
-              <w:b/>
-              <w:i w:val="0"/>
-              <w:color w:val="000D6E"/>
-              <w:sz w:val="15"/>
-            </w:rPr>
-            <w:t>Migros Bank AG</w:t>
-          </w:r>
-        </w:p>
-        <w:p>
-          <w:pPr>
-            <w:spacing w:before="20" w:after="0" w:line="259" w:lineRule="auto"/>
-            <w:jc w:val="center"/>
-          </w:pPr>
-          <w:r>
-            <w:rPr>
-              <w:rFonts w:ascii="Calibri" w:hAnsi="Calibri"/>
-              <w:b w:val="0"/>
-              <w:i w:val="0"/>
-              <w:color w:val="555555"/>
-              <w:sz w:val="15"/>
-            </w:rPr>
-            <w:t>IBAN  CH33 0840 1000 0693 4279 2</w:t>
-          </w:r>
-        </w:p>
-        <w:p>
-          <w:pPr>
-            <w:spacing w:before="0" w:after="0" w:line="259" w:lineRule="auto"/>
-            <w:jc w:val="center"/>
-          </w:pPr>
-          <w:r>
-            <w:rPr>
-              <w:rFonts w:ascii="Calibri" w:hAnsi="Calibri"/>
-              <w:b w:val="0"/>
-              <w:i w:val="0"/>
-              <w:color w:val="555555"/>
-              <w:sz w:val="15"/>
-            </w:rPr>
-            <w:t>BIC  MIGRCHZZXXX</w:t>
-          </w:r>
-        </w:p>
-      </w:tc>
-      <w:tc>
-        <w:tcPr>
-          <w:tcW w:type="dxa" w:w="2608"/>
-        </w:tcPr>
-        <w:p>
-          <w:pPr>
-            <w:jc w:val="right"/>
-          </w:pPr>
-          <w:r>
-            <w:rPr>
-              <w:rFonts w:ascii="Calibri" w:hAnsi="Calibri"/>
-              <w:b/>
-              <w:i w:val="0"/>
-              <w:color w:val="000D6E"/>
-              <w:sz w:val="15"/>
-            </w:rPr>
-            <w:t>MWST-Nr. DE68380719452</w:t>
-          </w:r>
-        </w:p>
-        <w:p>
-          <w:pPr>
-            <w:spacing w:before="20" w:after="0" w:line="259" w:lineRule="auto"/>
-            <w:jc w:val="right"/>
-          </w:pPr>
-          <w:r>
-            <w:rPr>
-              <w:rFonts w:ascii="Calibri" w:hAnsi="Calibri"/>
-              <w:b w:val="0"/>
-              <w:i w:val="0"/>
-              <w:color w:val="555555"/>
-              <w:sz w:val="15"/>
-            </w:rPr>
-            <w:t>engineering.kabuu@gmail.com</w:t>
-          </w:r>
-        </w:p>
-        <w:p>
-          <w:pPr>
-            <w:spacing w:before="0" w:after="0" w:line="259" w:lineRule="auto"/>
-            <w:jc w:val="right"/>
-          </w:pPr>
-          <w:r>
-            <w:rPr>
-              <w:rFonts w:ascii="Calibri" w:hAnsi="Calibri"/>
-              <w:b w:val="0"/>
-              <w:i w:val="0"/>
-              <w:color w:val="555555"/>
-              <w:sz w:val="15"/>
-            </w:rPr>
-            <w:t xml:space="preserve">Seite </w:t>
-          </w:r>
-          <w:r>
-            <w:rPr>
-              <w:rFonts w:ascii="Calibri" w:hAnsi="Calibri"/>
-              <w:color w:val="555555"/>
-              <w:sz w:val="15"/>
-            </w:rPr>
-            <w:fldChar w:fldCharType="begin"/>
-            <w:instrText xml:space="preserve"> PAGE </w:instrText>
-            <w:fldChar w:fldCharType="separate"/>
-          </w:r>
-          <w:r>
-            <w:rPr>
-              <w:rFonts w:ascii="Calibri" w:hAnsi="Calibri"/>
-              <w:color w:val="555555"/>
-              <w:sz w:val="15"/>
-            </w:rPr>
-            <w:t>1</w:t>
-          </w:r>
-          <w:r>
-            <w:rPr>
-              <w:rFonts w:ascii="Calibri" w:hAnsi="Calibri"/>
-              <w:color w:val="555555"/>
-              <w:sz w:val="15"/>
-            </w:rPr>
-            <w:fldChar w:fldCharType="end"/>
-          </w:r>
-          <w:r>
-            <w:rPr>
-              <w:rFonts w:ascii="Calibri" w:hAnsi="Calibri"/>
-              <w:b w:val="0"/>
-              <w:i w:val="0"/>
-              <w:color w:val="555555"/>
-              <w:sz w:val="15"/>
-            </w:rPr>
-            <w:t xml:space="preserve"> / </w:t>
-          </w:r>
-          <w:r>
-            <w:rPr>
-              <w:rFonts w:ascii="Calibri" w:hAnsi="Calibri"/>
-              <w:color w:val="555555"/>
-              <w:sz w:val="15"/>
-            </w:rPr>
-            <w:fldChar w:fldCharType="begin"/>
-            <w:instrText xml:space="preserve"> NUMPAGES </w:instrText>
-            <w:fldChar w:fldCharType="separate"/>
-          </w:r>
-          <w:r>
-            <w:rPr>
-              <w:rFonts w:ascii="Calibri" w:hAnsi="Calibri"/>
-              <w:color w:val="555555"/>
-              <w:sz w:val="15"/>
-            </w:rPr>
-            <w:t>1</w:t>
-          </w:r>
-          <w:r>
-            <w:rPr>
-              <w:rFonts w:ascii="Calibri" w:hAnsi="Calibri"/>
-              <w:color w:val="555555"/>
-              <w:sz w:val="15"/>
-            </w:rPr>
-            <w:fldChar w:fldCharType="end"/>
-          </w:r>
-        </w:p>
-      </w:tc>
-    </w:tr>
-  </w:tbl>
+  <w:p>
+    <w:pPr>
+      <w:spacing w:after="20"/>
+      <w:jc w:val="center"/>
+    </w:pPr>
+    <w:r>
+      <w:rPr>
+        <w:rFonts w:ascii="Helvetica Neue" w:hAnsi="Helvetica Neue"/>
+        <w:b w:val="0"/>
+        <w:color w:val="86868B"/>
+        <w:sz w:val="15"/>
+      </w:rPr>
+      <w:t>engineering.kabuu@gmail.com   ·   +41 79 512 98 07   ·   MWST-Nr. DE68380719452</w:t>
+    </w:r>
+  </w:p>
+  <w:p>
+    <w:pPr>
+      <w:jc w:val="center"/>
+    </w:pPr>
+    <w:r>
+      <w:rPr>
+        <w:rFonts w:ascii="Helvetica Neue" w:hAnsi="Helvetica Neue"/>
+        <w:b w:val="0"/>
+        <w:color w:val="1D1D1F"/>
+        <w:sz w:val="15"/>
+      </w:rPr>
+      <w:t>Migros Bank AG   ·   IBAN CH33 0840 1000 0693 4279 2   ·   BIC MIGRCHZZXXX</w:t>
+    </w:r>
+  </w:p>
+  <w:p>
+    <w:pPr>
+      <w:jc w:val="right"/>
+    </w:pPr>
+    <w:r>
+      <w:rPr>
+        <w:rFonts w:ascii="Helvetica Neue" w:hAnsi="Helvetica Neue"/>
+        <w:b w:val="0"/>
+        <w:color w:val="86868B"/>
+        <w:sz w:val="15"/>
+      </w:rPr>
+    </w:r>
+    <w:r>
+      <w:rPr>
+        <w:rFonts w:ascii="Helvetica Neue" w:hAnsi="Helvetica Neue"/>
+        <w:color w:val="86868B"/>
+        <w:sz w:val="15"/>
+      </w:rPr>
+      <w:fldChar w:fldCharType="begin"/>
+    </w:r>
+    <w:r>
+      <w:rPr>
+        <w:rFonts w:ascii="Helvetica Neue" w:hAnsi="Helvetica Neue"/>
+        <w:color w:val="86868B"/>
+        <w:sz w:val="15"/>
+      </w:rPr>
+      <w:instrText xml:space="preserve"> PAGE </w:instrText>
+    </w:r>
+    <w:r>
+      <w:rPr>
+        <w:rFonts w:ascii="Helvetica Neue" w:hAnsi="Helvetica Neue"/>
+        <w:color w:val="86868B"/>
+        <w:sz w:val="15"/>
+      </w:rPr>
+      <w:fldChar w:fldCharType="separate"/>
+    </w:r>
+    <w:r>
+      <w:rPr>
+        <w:rFonts w:ascii="Helvetica Neue" w:hAnsi="Helvetica Neue"/>
+        <w:color w:val="86868B"/>
+        <w:sz w:val="15"/>
+      </w:rPr>
+      <w:t>1</w:t>
+    </w:r>
+    <w:r>
+      <w:rPr>
+        <w:rFonts w:ascii="Helvetica Neue" w:hAnsi="Helvetica Neue"/>
+        <w:color w:val="86868B"/>
+        <w:sz w:val="15"/>
+      </w:rPr>
+      <w:fldChar w:fldCharType="end"/>
+    </w:r>
+    <w:r>
+      <w:rPr>
+        <w:rFonts w:ascii="Helvetica Neue" w:hAnsi="Helvetica Neue"/>
+        <w:b w:val="0"/>
+        <w:color w:val="86868B"/>
+        <w:sz w:val="15"/>
+      </w:rPr>
+      <w:t xml:space="preserve"> / </w:t>
+    </w:r>
+    <w:r>
+      <w:rPr>
+        <w:rFonts w:ascii="Helvetica Neue" w:hAnsi="Helvetica Neue"/>
+        <w:color w:val="86868B"/>
+        <w:sz w:val="15"/>
+      </w:rPr>
+      <w:fldChar w:fldCharType="begin"/>
+    </w:r>
+    <w:r>
+      <w:rPr>
+        <w:rFonts w:ascii="Helvetica Neue" w:hAnsi="Helvetica Neue"/>
+        <w:color w:val="86868B"/>
+        <w:sz w:val="15"/>
+      </w:rPr>
+      <w:instrText xml:space="preserve"> NUMPAGES </w:instrText>
+    </w:r>
+    <w:r>
+      <w:rPr>
+        <w:rFonts w:ascii="Helvetica Neue" w:hAnsi="Helvetica Neue"/>
+        <w:color w:val="86868B"/>
+        <w:sz w:val="15"/>
+      </w:rPr>
+      <w:fldChar w:fldCharType="separate"/>
+    </w:r>
+    <w:r>
+      <w:rPr>
+        <w:rFonts w:ascii="Helvetica Neue" w:hAnsi="Helvetica Neue"/>
+        <w:color w:val="86868B"/>
+        <w:sz w:val="15"/>
+      </w:rPr>
+      <w:t>1</w:t>
+    </w:r>
+    <w:r>
+      <w:rPr>
+        <w:rFonts w:ascii="Helvetica Neue" w:hAnsi="Helvetica Neue"/>
+        <w:color w:val="86868B"/>
+        <w:sz w:val="15"/>
+      </w:rPr>
+      <w:fldChar w:fldCharType="end"/>
+    </w:r>
+  </w:p>
 </w:ftr>
 </file>
 
@@ -2450,22 +2516,19 @@
       </w:tblBorders>
     </w:tblPr>
     <w:tblGrid>
-      <w:gridCol w:w="4819"/>
-      <w:gridCol w:w="4819"/>
+      <w:gridCol w:w="4932"/>
+      <w:gridCol w:w="4932"/>
     </w:tblGrid>
     <w:tr>
       <w:tc>
         <w:tcPr>
-          <w:tcW w:type="dxa" w:w="5386"/>
+          <w:tcW w:type="dxa" w:w="5102"/>
         </w:tcPr>
         <w:p>
-          <w:pPr>
-            <w:jc w:val="left"/>
-          </w:pPr>
           <w:r>
             <w:drawing>
               <wp:inline xmlns:a="http://schemas.openxmlformats.org/drawingml/2006/main" xmlns:pic="http://schemas.openxmlformats.org/drawingml/2006/picture">
-                <wp:extent cx="1224000" cy="1224000"/>
+                <wp:extent cx="1080000" cy="1080000"/>
                 <wp:docPr id="1" name="Picture 1"/>
                 <wp:cNvGraphicFramePr>
                   <a:graphicFrameLocks noChangeAspect="1"/>
@@ -2486,7 +2549,7 @@
                       <pic:spPr>
                         <a:xfrm>
                           <a:off x="0" y="0"/>
-                          <a:ext cx="1224000" cy="1224000"/>
+                          <a:ext cx="1080000" cy="1080000"/>
                         </a:xfrm>
                         <a:prstGeom prst="rect"/>
                       </pic:spPr>
@@ -2500,7 +2563,7 @@
       </w:tc>
       <w:tc>
         <w:tcPr>
-          <w:tcW w:type="dxa" w:w="4252"/>
+          <w:tcW w:type="dxa" w:w="4762"/>
           <w:vAlign w:val="center"/>
         </w:tcPr>
         <w:p>
@@ -2509,55 +2572,40 @@
           </w:pPr>
           <w:r>
             <w:rPr>
-              <w:rFonts w:ascii="Calibri" w:hAnsi="Calibri"/>
+              <w:rFonts w:ascii="Helvetica Neue" w:hAnsi="Helvetica Neue"/>
               <w:b/>
-              <w:i w:val="0"/>
               <w:color w:val="000D6E"/>
-              <w:sz w:val="24"/>
-              <w:spacing w:val="40"/>
+              <w:sz w:val="22"/>
+              <w:spacing w:val="36"/>
             </w:rPr>
             <w:t>KABUU ENGINEERING</w:t>
           </w:r>
         </w:p>
         <w:p>
           <w:pPr>
-            <w:spacing w:before="20" w:after="0" w:line="259" w:lineRule="auto"/>
+            <w:spacing w:before="40"/>
             <w:jc w:val="right"/>
           </w:pPr>
           <w:r>
             <w:rPr>
-              <w:rFonts w:ascii="Calibri" w:hAnsi="Calibri"/>
-              <w:b/>
-              <w:i w:val="0"/>
-              <w:color w:val="1E63D6"/>
-              <w:sz w:val="15"/>
-              <w:spacing w:val="30"/>
-            </w:rPr>
-            <w:t>EMV  ·  POWER QUALITY  ·  ELEKTROPRÜFUNGEN</w:t>
-          </w:r>
-        </w:p>
-        <w:p>
-          <w:pPr>
-            <w:spacing w:before="40" w:after="0" w:line="259" w:lineRule="auto"/>
-            <w:jc w:val="right"/>
-            <w:pBdr>
-              <w:bottom w:val="single" w:sz="18" w:space="4" w:color="000D6E"/>
-            </w:pBdr>
-          </w:pPr>
-          <w:r>
-            <w:rPr>
-              <w:rFonts w:ascii="Calibri" w:hAnsi="Calibri"/>
-              <w:b w:val="0"/>
-              <w:i w:val="0"/>
-              <w:color w:val="555555"/>
+              <w:rFonts w:ascii="Helvetica Neue" w:hAnsi="Helvetica Neue"/>
+              <w:color w:val="86868B"/>
               <w:sz w:val="15"/>
             </w:rPr>
-            <w:t>engineering.kabuu@gmail.com  ·  +41 79 512 98 07</w:t>
+            <w:t>EMV · Power Quality · Elektroprüfungen</w:t>
           </w:r>
         </w:p>
       </w:tc>
     </w:tr>
   </w:tbl>
+  <w:p>
+    <w:pPr>
+      <w:spacing w:before="120"/>
+      <w:pBdr>
+        <w:bottom w:val="single" w:sz="4" w:space="0" w:color="E5E5EA"/>
+      </w:pBdr>
+    </w:pPr>
+  </w:p>
 </w:hdr>
 </file>
 
@@ -2925,11 +2973,11 @@
     <w:qFormat/>
     <w:rsid w:val="00FC693F"/>
     <w:pPr>
-      <w:spacing w:after="0" w:line="259" w:lineRule="auto"/>
+      <w:spacing w:after="0" w:line="269" w:lineRule="auto"/>
     </w:pPr>
     <w:rPr>
-      <w:rFonts w:ascii="Calibri" w:hAnsi="Calibri"/>
-      <w:color w:val="3A3A3A"/>
+      <w:rFonts w:ascii="Helvetica Neue" w:hAnsi="Helvetica Neue"/>
+      <w:color w:val="1D1D1F"/>
       <w:sz w:val="20"/>
     </w:rPr>
   </w:style>

</xml_diff>

<commit_message>
Add 3D logo and linked content-control fields to template
- Neues 3D-Logo (glaenzende Orb mit Schaltkreis-Textur, Verlauf, Schatten)
- Verknuepfte Felder via Content Controls mit XML-Datenbindung: gleichnamige
  Felder (z. B. Dokument-Nr.) bleiben automatisch synchron
- Modernisiertes Card-Layout mit Akzentkanten, Chip-Badge und Anleitungsseite

Co-Authored-By: Claude Opus 4.8 <noreply@anthropic.com>
Claude-Session: https://claude.ai/code/session_01CZAzMhLTZcbnz9dhhRUTMo
</commit_message>
<xml_diff>
--- a/Kabuu_Engineering_Master_Vorlage.docx
+++ b/Kabuu_Engineering_Master_Vorlage.docx
@@ -2,98 +2,127 @@
 <file path=word/document.xml><?xml version="1.0" encoding="utf-8"?>
 <w:document xmlns:wpc="http://schemas.microsoft.com/office/word/2010/wordprocessingCanvas" xmlns:mo="http://schemas.microsoft.com/office/mac/office/2008/main" xmlns:mc="http://schemas.openxmlformats.org/markup-compatibility/2006" xmlns:mv="urn:schemas-microsoft-com:mac:vml" xmlns:o="urn:schemas-microsoft-com:office:office" xmlns:r="http://schemas.openxmlformats.org/officeDocument/2006/relationships" xmlns:m="http://schemas.openxmlformats.org/officeDocument/2006/math" xmlns:v="urn:schemas-microsoft-com:vml" xmlns:wp14="http://schemas.microsoft.com/office/word/2010/wordprocessingDrawing" xmlns:wp="http://schemas.openxmlformats.org/drawingml/2006/wordprocessingDrawing" xmlns:w10="urn:schemas-microsoft-com:office:word" xmlns:w="http://schemas.openxmlformats.org/wordprocessingml/2006/main" xmlns:w14="http://schemas.microsoft.com/office/word/2010/wordml" xmlns:wpg="http://schemas.microsoft.com/office/word/2010/wordprocessingGroup" xmlns:wpi="http://schemas.microsoft.com/office/word/2010/wordprocessingInk" xmlns:wne="http://schemas.microsoft.com/office/word/2006/wordml" xmlns:wps="http://schemas.microsoft.com/office/word/2010/wordprocessingShape" mc:Ignorable="w14 wp14">
   <w:body>
+    <w:tbl>
+      <w:tblPr>
+        <w:tblW w:type="auto" w:w="0"/>
+        <w:jc w:val="left"/>
+        <w:tblLayout w:type="fixed"/>
+        <w:tblLook w:firstColumn="1" w:firstRow="1" w:lastColumn="0" w:lastRow="0" w:noHBand="0" w:noVBand="1" w:val="04A0"/>
+        <w:tblBorders>
+          <w:top w:val="none"/>
+          <w:left w:val="none"/>
+          <w:bottom w:val="none"/>
+          <w:right w:val="none"/>
+          <w:insideH w:val="none"/>
+          <w:insideV w:val="none"/>
+        </w:tblBorders>
+      </w:tblPr>
+      <w:tblGrid>
+        <w:gridCol w:w="9866"/>
+      </w:tblGrid>
+      <w:tr>
+        <w:tc>
+          <w:tcPr>
+            <w:tcW w:type="dxa" w:w="2268"/>
+            <w:shd w:val="clear" w:color="auto" w:fill="000D6E"/>
+            <w:tcMar>
+              <w:top w:w="40" w:type="dxa"/>
+              <w:bottom w:w="40" w:type="dxa"/>
+              <w:left w:w="140" w:type="dxa"/>
+              <w:right w:w="140" w:type="dxa"/>
+            </w:tcMar>
+            <w:vAlign w:val="center"/>
+          </w:tcPr>
+          <w:p>
+            <w:pPr>
+              <w:jc w:val="center"/>
+            </w:pPr>
+            <w:sdt>
+              <w:sdtPr>
+                <w:rPr>
+                  <w:rFonts w:ascii="Helvetica Neue" w:hAnsi="Helvetica Neue" w:cs="Helvetica Neue"/>
+                  <w:sz w:val="19"/>
+                  <w:szCs w:val="19"/>
+                  <w:color w:val="FFFFFF"/>
+                  <w:b/>
+                  <w:caps/>
+                  <w:spacing w:val="30"/>
+                </w:rPr>
+                <w:alias w:val="Dokumenttyp"/>
+                <w:tag w:val="Dokumenttyp"/>
+                <w:id w:val="1001"/>
+                <w:dataBinding w:prefixMappings="xmlns:ns0='http://kabuu/doc'" w:xpath="/ns0:doc[1]/ns0:Dokumenttyp[1]" w:storeItemID="{6F1B2C3D-4E5A-4B6C-8D7E-9A0B1C2D3E4F}"/>
+                <w:text/>
+              </w:sdtPr>
+              <w:sdtContent>
+                <w:r>
+                  <w:rPr>
+                    <w:rFonts w:ascii="Helvetica Neue" w:hAnsi="Helvetica Neue" w:cs="Helvetica Neue"/>
+                    <w:sz w:val="19"/>
+                    <w:szCs w:val="19"/>
+                    <w:color w:val="FFFFFF"/>
+                    <w:b/>
+                    <w:caps/>
+                    <w:spacing w:val="30"/>
+                  </w:rPr>
+                  <w:t xml:space="preserve">RECHNUNG</w:t>
+                </w:r>
+              </w:sdtContent>
+            </w:sdt>
+          </w:p>
+        </w:tc>
+      </w:tr>
+    </w:tbl>
     <w:p>
       <w:pPr>
-        <w:spacing w:after="0" w:before="0"/>
-        <w:spacing w:line="200" w:lineRule="exact"/>
+        <w:spacing w:line="160" w:lineRule="exact"/>
       </w:pPr>
     </w:p>
     <w:p>
       <w:pPr>
-        <w:spacing w:after="40"/>
+        <w:spacing w:after="20"/>
       </w:pPr>
-      <w:r>
-        <w:drawing>
-          <wp:inline distT="0" distB="0" distL="0" distR="0">
-            <wp:extent cx="1224000" cy="273600"/>
-            <wp:effectExtent l="0" t="0" r="0" b="0"/>
-            <wp:docPr id="101" name="Card101"/>
-            <wp:cNvGraphicFramePr/>
-            <a:graphic xmlns:a="http://schemas.openxmlformats.org/drawingml/2006/main">
-              <a:graphicData uri="http://schemas.microsoft.com/office/word/2010/wordprocessingShape">
-                <wps:wsp>
-                  <wps:cNvSpPr txBox="1"/>
-                  <wps:spPr>
-                    <a:xfrm>
-                      <a:off x="0" y="0"/>
-                      <a:ext cx="1224000" cy="273600"/>
-                    </a:xfrm>
-                    <a:prstGeom prst="roundRect">
-                      <a:avLst>
-                        <a:gd name="adj" fmla="val 50000"/>
-                      </a:avLst>
-                    </a:prstGeom>
-                    <a:solidFill>
-                      <a:srgbClr val="000D6E"/>
-                    </a:solidFill>
-                    <a:ln>
-                      <a:noFill/>
-                    </a:ln>
-                  </wps:spPr>
-                  <wps:txbx>
-                    <w:txbxContent>
-                      <w:p>
-                        <w:pPr>
-                          <w:spacing w:before="0" w:after="0"/>
-                          <w:jc w:val="center"/>
-                        </w:pPr>
-                        <w:r>
-                          <w:rPr>
-                            <w:rFonts w:ascii="Helvetica Neue" w:hAnsi="Helvetica Neue" w:cs="Helvetica Neue"/>
-                            <w:sz w:val="20"/>
-                            <w:szCs w:val="20"/>
-                            <w:color w:val="FFFFFF"/>
-                            <w:b/>
-                            <w:caps/>
-                            <w:spacing w:val="30"/>
-                          </w:rPr>
-                          <w:t xml:space="preserve">{{DOKUMENTTYP}}</w:t>
-                        </w:r>
-                      </w:p>
-                    </w:txbxContent>
-                  </wps:txbx>
-                  <wps:bodyPr rot="0" wrap="square" lIns="108000" tIns="50400" rIns="108000" bIns="50400" anchor="t">
-                    <a:spAutoFit/>
-                  </wps:bodyPr>
-                </wps:wsp>
-              </a:graphicData>
-            </a:graphic>
-          </wp:inline>
-        </w:drawing>
-      </w:r>
+      <w:sdt>
+        <w:sdtPr>
+          <w:rPr>
+            <w:rFonts w:ascii="Helvetica Neue" w:hAnsi="Helvetica Neue" w:cs="Helvetica Neue"/>
+            <w:sz w:val="48"/>
+            <w:szCs w:val="48"/>
+            <w:color w:val="1D1D1F"/>
+            <w:b/>
+            <w:spacing w:val="-10"/>
+          </w:rPr>
+          <w:alias w:val="Betreff"/>
+          <w:tag w:val="Betreff"/>
+          <w:id w:val="1002"/>
+          <w:dataBinding w:prefixMappings="xmlns:ns0='http://kabuu/doc'" w:xpath="/ns0:doc[1]/ns0:Betreff[1]" w:storeItemID="{6F1B2C3D-4E5A-4B6C-8D7E-9A0B1C2D3E4F}"/>
+          <w:text/>
+        </w:sdtPr>
+        <w:sdtContent>
+          <w:r>
+            <w:rPr>
+              <w:rFonts w:ascii="Helvetica Neue" w:hAnsi="Helvetica Neue" w:cs="Helvetica Neue"/>
+              <w:sz w:val="48"/>
+              <w:szCs w:val="48"/>
+              <w:color w:val="1D1D1F"/>
+              <w:b/>
+              <w:spacing w:val="-10"/>
+            </w:rPr>
+            <w:t xml:space="preserve">Power-Quality-Schulung</w:t>
+          </w:r>
+        </w:sdtContent>
+      </w:sdt>
     </w:p>
     <w:p>
       <w:pPr>
-        <w:spacing w:before="80" w:after="20"/>
+        <w:spacing w:after="200"/>
       </w:pPr>
       <w:r>
         <w:rPr>
+          <w:rFonts w:ascii="Helvetica Neue" w:hAnsi="Helvetica Neue" w:cs="Helvetica Neue"/>
           <w:rFonts w:ascii="Helvetica Neue" w:hAnsi="Helvetica Neue"/>
-          <w:b/>
-          <w:color w:val="1D1D1F"/>
-          <w:sz w:val="48"/>
-          <w:spacing w:val="-10"/>
-        </w:rPr>
-        <w:t>{{BETREFF}}</w:t>
-      </w:r>
-    </w:p>
-    <w:p>
-      <w:pPr>
-        <w:spacing w:after="160"/>
-      </w:pPr>
-      <w:r>
-        <w:rPr>
-          <w:rFonts w:ascii="Helvetica Neue" w:hAnsi="Helvetica Neue"/>
+          <w:b w:val="0"/>
+          <w:i w:val="0"/>
           <w:color w:val="86868B"/>
           <w:sz w:val="17"/>
         </w:rPr>
@@ -121,7 +150,7 @@
       <w:tr>
         <w:tc>
           <w:tcPr>
-            <w:tcW w:type="dxa" w:w="4989"/>
+            <w:tcW w:type="dxa" w:w="4876"/>
           </w:tcPr>
           <w:p>
             <w:pPr>
@@ -129,8 +158,10 @@
             </w:pPr>
             <w:r>
               <w:rPr>
+                <w:rFonts w:ascii="Helvetica Neue" w:hAnsi="Helvetica Neue" w:cs="Helvetica Neue"/>
                 <w:rFonts w:ascii="Helvetica Neue" w:hAnsi="Helvetica Neue"/>
                 <w:b/>
+                <w:i w:val="0"/>
                 <w:caps/>
                 <w:color w:val="86868B"/>
                 <w:sz w:val="15"/>
@@ -143,430 +174,586 @@
             <w:pPr>
               <w:spacing w:after="20"/>
             </w:pPr>
-            <w:r>
-              <w:rPr>
-                <w:rFonts w:ascii="Helvetica Neue" w:hAnsi="Helvetica Neue"/>
-                <w:b/>
-                <w:color w:val="1D1D1F"/>
-                <w:sz w:val="24"/>
-              </w:rPr>
-              <w:t>{{KUNDE_FIRMA}}</w:t>
-            </w:r>
+            <w:sdt>
+              <w:sdtPr>
+                <w:rPr>
+                  <w:rFonts w:ascii="Helvetica Neue" w:hAnsi="Helvetica Neue" w:cs="Helvetica Neue"/>
+                  <w:sz w:val="24"/>
+                  <w:szCs w:val="24"/>
+                  <w:color w:val="1D1D1F"/>
+                  <w:b/>
+                </w:rPr>
+                <w:alias w:val="KundeFirma"/>
+                <w:tag w:val="KundeFirma"/>
+                <w:id w:val="1003"/>
+                <w:dataBinding w:prefixMappings="xmlns:ns0='http://kabuu/doc'" w:xpath="/ns0:doc[1]/ns0:KundeFirma[1]" w:storeItemID="{6F1B2C3D-4E5A-4B6C-8D7E-9A0B1C2D3E4F}"/>
+                <w:text/>
+              </w:sdtPr>
+              <w:sdtContent>
+                <w:r>
+                  <w:rPr>
+                    <w:rFonts w:ascii="Helvetica Neue" w:hAnsi="Helvetica Neue" w:cs="Helvetica Neue"/>
+                    <w:sz w:val="24"/>
+                    <w:szCs w:val="24"/>
+                    <w:color w:val="1D1D1F"/>
+                    <w:b/>
+                  </w:rPr>
+                  <w:t xml:space="preserve">Musterfirma AG</w:t>
+                </w:r>
+              </w:sdtContent>
+            </w:sdt>
           </w:p>
           <w:p>
             <w:pPr>
               <w:spacing w:after="20"/>
             </w:pPr>
-            <w:r>
-              <w:rPr>
-                <w:rFonts w:ascii="Helvetica Neue" w:hAnsi="Helvetica Neue"/>
-                <w:b w:val="0"/>
-                <w:color w:val="1D1D1F"/>
-                <w:sz w:val="21"/>
-              </w:rPr>
-              <w:t>{{KUNDE_ANSPRECHPARTNER}}</w:t>
-            </w:r>
+            <w:sdt>
+              <w:sdtPr>
+                <w:rPr>
+                  <w:rFonts w:ascii="Helvetica Neue" w:hAnsi="Helvetica Neue" w:cs="Helvetica Neue"/>
+                  <w:sz w:val="21"/>
+                  <w:szCs w:val="21"/>
+                  <w:color w:val="1D1D1F"/>
+                </w:rPr>
+                <w:alias w:val="KundeAnsprech"/>
+                <w:tag w:val="KundeAnsprech"/>
+                <w:id w:val="1004"/>
+                <w:dataBinding w:prefixMappings="xmlns:ns0='http://kabuu/doc'" w:xpath="/ns0:doc[1]/ns0:KundeAnsprech[1]" w:storeItemID="{6F1B2C3D-4E5A-4B6C-8D7E-9A0B1C2D3E4F}"/>
+                <w:text/>
+              </w:sdtPr>
+              <w:sdtContent>
+                <w:r>
+                  <w:rPr>
+                    <w:rFonts w:ascii="Helvetica Neue" w:hAnsi="Helvetica Neue" w:cs="Helvetica Neue"/>
+                    <w:sz w:val="21"/>
+                    <w:szCs w:val="21"/>
+                    <w:color w:val="1D1D1F"/>
+                  </w:rPr>
+                  <w:t xml:space="preserve">Herr Max Muster</w:t>
+                </w:r>
+              </w:sdtContent>
+            </w:sdt>
           </w:p>
           <w:p>
             <w:pPr>
               <w:spacing w:after="20"/>
             </w:pPr>
-            <w:r>
-              <w:rPr>
-                <w:rFonts w:ascii="Helvetica Neue" w:hAnsi="Helvetica Neue"/>
-                <w:b w:val="0"/>
-                <w:color w:val="1D1D1F"/>
-                <w:sz w:val="21"/>
-              </w:rPr>
-              <w:t>{{KUNDE_STRASSE}}</w:t>
-            </w:r>
+            <w:sdt>
+              <w:sdtPr>
+                <w:rPr>
+                  <w:rFonts w:ascii="Helvetica Neue" w:hAnsi="Helvetica Neue" w:cs="Helvetica Neue"/>
+                  <w:sz w:val="21"/>
+                  <w:szCs w:val="21"/>
+                  <w:color w:val="1D1D1F"/>
+                </w:rPr>
+                <w:alias w:val="KundeStrasse"/>
+                <w:tag w:val="KundeStrasse"/>
+                <w:id w:val="1005"/>
+                <w:dataBinding w:prefixMappings="xmlns:ns0='http://kabuu/doc'" w:xpath="/ns0:doc[1]/ns0:KundeStrasse[1]" w:storeItemID="{6F1B2C3D-4E5A-4B6C-8D7E-9A0B1C2D3E4F}"/>
+                <w:text/>
+              </w:sdtPr>
+              <w:sdtContent>
+                <w:r>
+                  <w:rPr>
+                    <w:rFonts w:ascii="Helvetica Neue" w:hAnsi="Helvetica Neue" w:cs="Helvetica Neue"/>
+                    <w:sz w:val="21"/>
+                    <w:szCs w:val="21"/>
+                    <w:color w:val="1D1D1F"/>
+                  </w:rPr>
+                  <w:t xml:space="preserve">Musterstrasse 1</w:t>
+                </w:r>
+              </w:sdtContent>
+            </w:sdt>
           </w:p>
           <w:p>
             <w:pPr>
               <w:spacing w:after="20"/>
             </w:pPr>
-            <w:r>
-              <w:rPr>
-                <w:rFonts w:ascii="Helvetica Neue" w:hAnsi="Helvetica Neue"/>
-                <w:b w:val="0"/>
-                <w:color w:val="1D1D1F"/>
-                <w:sz w:val="21"/>
-              </w:rPr>
-              <w:t>{{KUNDE_PLZ_ORT}}</w:t>
-            </w:r>
+            <w:sdt>
+              <w:sdtPr>
+                <w:rPr>
+                  <w:rFonts w:ascii="Helvetica Neue" w:hAnsi="Helvetica Neue" w:cs="Helvetica Neue"/>
+                  <w:sz w:val="21"/>
+                  <w:szCs w:val="21"/>
+                  <w:color w:val="1D1D1F"/>
+                </w:rPr>
+                <w:alias w:val="KundePlzOrt"/>
+                <w:tag w:val="KundePlzOrt"/>
+                <w:id w:val="1006"/>
+                <w:dataBinding w:prefixMappings="xmlns:ns0='http://kabuu/doc'" w:xpath="/ns0:doc[1]/ns0:KundePlzOrt[1]" w:storeItemID="{6F1B2C3D-4E5A-4B6C-8D7E-9A0B1C2D3E4F}"/>
+                <w:text/>
+              </w:sdtPr>
+              <w:sdtContent>
+                <w:r>
+                  <w:rPr>
+                    <w:rFonts w:ascii="Helvetica Neue" w:hAnsi="Helvetica Neue" w:cs="Helvetica Neue"/>
+                    <w:sz w:val="21"/>
+                    <w:szCs w:val="21"/>
+                    <w:color w:val="1D1D1F"/>
+                  </w:rPr>
+                  <w:t xml:space="preserve">8000 Zürich</w:t>
+                </w:r>
+              </w:sdtContent>
+            </w:sdt>
           </w:p>
           <w:p>
             <w:pPr>
               <w:spacing w:after="20"/>
             </w:pPr>
-            <w:r>
-              <w:rPr>
-                <w:rFonts w:ascii="Helvetica Neue" w:hAnsi="Helvetica Neue"/>
-                <w:b w:val="0"/>
-                <w:color w:val="86868B"/>
-                <w:sz w:val="21"/>
-              </w:rPr>
-              <w:t>{{KUNDE_LAND}}</w:t>
-            </w:r>
+            <w:sdt>
+              <w:sdtPr>
+                <w:rPr>
+                  <w:rFonts w:ascii="Helvetica Neue" w:hAnsi="Helvetica Neue" w:cs="Helvetica Neue"/>
+                  <w:sz w:val="21"/>
+                  <w:szCs w:val="21"/>
+                  <w:color w:val="86868B"/>
+                </w:rPr>
+                <w:alias w:val="KundeLand"/>
+                <w:tag w:val="KundeLand"/>
+                <w:id w:val="1007"/>
+                <w:dataBinding w:prefixMappings="xmlns:ns0='http://kabuu/doc'" w:xpath="/ns0:doc[1]/ns0:KundeLand[1]" w:storeItemID="{6F1B2C3D-4E5A-4B6C-8D7E-9A0B1C2D3E4F}"/>
+                <w:text/>
+              </w:sdtPr>
+              <w:sdtContent>
+                <w:r>
+                  <w:rPr>
+                    <w:rFonts w:ascii="Helvetica Neue" w:hAnsi="Helvetica Neue" w:cs="Helvetica Neue"/>
+                    <w:sz w:val="21"/>
+                    <w:szCs w:val="21"/>
+                    <w:color w:val="86868B"/>
+                  </w:rPr>
+                  <w:t xml:space="preserve">Schweiz</w:t>
+                </w:r>
+              </w:sdtContent>
+            </w:sdt>
           </w:p>
         </w:tc>
         <w:tc>
           <w:tcPr>
-            <w:tcW w:type="dxa" w:w="4876"/>
+            <w:tcW w:type="dxa" w:w="4989"/>
+            <w:vAlign w:val="top"/>
+            <w:shd w:val="clear" w:color="auto" w:fill="F5F5F7"/>
+            <w:tcMar>
+              <w:top w:w="120" w:type="dxa"/>
+              <w:bottom w:w="120" w:type="dxa"/>
+              <w:left w:w="160" w:type="dxa"/>
+              <w:right w:w="160" w:type="dxa"/>
+            </w:tcMar>
+            <w:tcBorders>
+              <w:left w:val="single" w:sz="24" w:space="0" w:color="000D6E"/>
+            </w:tcBorders>
           </w:tcPr>
-          <w:p>
-            <w:r>
-              <w:drawing>
-                <wp:inline distT="0" distB="0" distL="0" distR="0">
-                  <wp:extent cx="3096000" cy="1440000"/>
-                  <wp:effectExtent l="0" t="0" r="0" b="0"/>
-                  <wp:docPr id="102" name="Card102"/>
-                  <wp:cNvGraphicFramePr/>
-                  <a:graphic xmlns:a="http://schemas.openxmlformats.org/drawingml/2006/main">
-                    <a:graphicData uri="http://schemas.microsoft.com/office/word/2010/wordprocessingShape">
-                      <wps:wsp>
-                        <wps:cNvSpPr txBox="1"/>
-                        <wps:spPr>
-                          <a:xfrm>
-                            <a:off x="0" y="0"/>
-                            <a:ext cx="3096000" cy="1440000"/>
-                          </a:xfrm>
-                          <a:prstGeom prst="roundRect">
-                            <a:avLst>
-                              <a:gd name="adj" fmla="val 9000"/>
-                            </a:avLst>
-                          </a:prstGeom>
-                          <a:solidFill>
-                            <a:srgbClr val="F5F5F7"/>
-                          </a:solidFill>
-                          <a:ln>
-                            <a:noFill/>
-                          </a:ln>
-                        </wps:spPr>
-                        <wps:txbx>
-                          <w:txbxContent>
-                            <w:tbl>
-                              <w:tblPr>
-                                <w:tblW w:w="5000" w:type="pct"/>
-                                <w:tblBorders>
-                                  <w:top w:val="none"/>
-                                  <w:left w:val="none"/>
-                                  <w:bottom w:val="none"/>
-                                  <w:right w:val="none"/>
-                                  <w:insideH w:val="none"/>
-                                  <w:insideV w:val="none"/>
-                                </w:tblBorders>
-                                <w:tblLayout w:type="autofit"/>
-                              </w:tblPr>
-                              <w:tr>
-                                <w:tc>
-                                  <w:tcPr>
-                                    <w:tcW w:w="2000" w:type="pct"/>
-                                    <w:tcBorders>
-                                      <w:bottom w:val="single" w:sz="4" w:space="0" w:color="E5E5EA"/>
-                                    </w:tcBorders>
-                                    <w:tcMar>
-                                      <w:top w:w="70" w:type="dxa"/>
-                                      <w:bottom w:w="70" w:type="dxa"/>
-                                    </w:tcMar>
-                                  </w:tcPr>
-                                  <w:p>
-                                    <w:pPr>
-                                      <w:spacing w:before="0" w:after="0"/>
-                                    </w:pPr>
-                                    <w:r>
-                                      <w:rPr>
-                                        <w:rFonts w:ascii="Helvetica Neue" w:hAnsi="Helvetica Neue" w:cs="Helvetica Neue"/>
-                                        <w:sz w:val="16"/>
-                                        <w:szCs w:val="16"/>
-                                        <w:color w:val="86868B"/>
-                                        <w:b/>
-                                        <w:caps/>
-                                        <w:spacing w:val="16"/>
-                                      </w:rPr>
-                                      <w:t xml:space="preserve">Nr.</w:t>
-                                    </w:r>
-                                  </w:p>
-                                </w:tc>
-                                <w:tc>
-                                  <w:tcPr>
-                                    <w:tcW w:w="3000" w:type="pct"/>
-                                    <w:tcBorders>
-                                      <w:bottom w:val="single" w:sz="4" w:space="0" w:color="E5E5EA"/>
-                                    </w:tcBorders>
-                                    <w:tcMar>
-                                      <w:top w:w="70" w:type="dxa"/>
-                                      <w:bottom w:w="70" w:type="dxa"/>
-                                    </w:tcMar>
-                                  </w:tcPr>
-                                  <w:p>
-                                    <w:pPr>
-                                      <w:spacing w:before="0" w:after="0"/>
-                                      <w:jc w:val="right"/>
-                                    </w:pPr>
-                                    <w:r>
-                                      <w:rPr>
-                                        <w:rFonts w:ascii="Helvetica Neue" w:hAnsi="Helvetica Neue" w:cs="Helvetica Neue"/>
-                                        <w:sz w:val="19"/>
-                                        <w:szCs w:val="19"/>
-                                        <w:color w:val="1D1D1F"/>
-                                        <w:b/>
-                                      </w:rPr>
-                                      <w:t xml:space="preserve">{{DOKUMENT_NR}}</w:t>
-                                    </w:r>
-                                  </w:p>
-                                </w:tc>
-                              </w:tr>
-                              <w:tr>
-                                <w:tc>
-                                  <w:tcPr>
-                                    <w:tcW w:w="2000" w:type="pct"/>
-                                    <w:tcBorders>
-                                      <w:bottom w:val="single" w:sz="4" w:space="0" w:color="E5E5EA"/>
-                                    </w:tcBorders>
-                                    <w:tcMar>
-                                      <w:top w:w="70" w:type="dxa"/>
-                                      <w:bottom w:w="70" w:type="dxa"/>
-                                    </w:tcMar>
-                                  </w:tcPr>
-                                  <w:p>
-                                    <w:pPr>
-                                      <w:spacing w:before="0" w:after="0"/>
-                                    </w:pPr>
-                                    <w:r>
-                                      <w:rPr>
-                                        <w:rFonts w:ascii="Helvetica Neue" w:hAnsi="Helvetica Neue" w:cs="Helvetica Neue"/>
-                                        <w:sz w:val="16"/>
-                                        <w:szCs w:val="16"/>
-                                        <w:color w:val="86868B"/>
-                                        <w:b/>
-                                        <w:caps/>
-                                        <w:spacing w:val="16"/>
-                                      </w:rPr>
-                                      <w:t xml:space="preserve">Datum</w:t>
-                                    </w:r>
-                                  </w:p>
-                                </w:tc>
-                                <w:tc>
-                                  <w:tcPr>
-                                    <w:tcW w:w="3000" w:type="pct"/>
-                                    <w:tcBorders>
-                                      <w:bottom w:val="single" w:sz="4" w:space="0" w:color="E5E5EA"/>
-                                    </w:tcBorders>
-                                    <w:tcMar>
-                                      <w:top w:w="70" w:type="dxa"/>
-                                      <w:bottom w:w="70" w:type="dxa"/>
-                                    </w:tcMar>
-                                  </w:tcPr>
-                                  <w:p>
-                                    <w:pPr>
-                                      <w:spacing w:before="0" w:after="0"/>
-                                      <w:jc w:val="right"/>
-                                    </w:pPr>
-                                    <w:r>
-                                      <w:rPr>
-                                        <w:rFonts w:ascii="Helvetica Neue" w:hAnsi="Helvetica Neue" w:cs="Helvetica Neue"/>
-                                        <w:sz w:val="19"/>
-                                        <w:szCs w:val="19"/>
-                                        <w:color w:val="1D1D1F"/>
-                                        <w:b/>
-                                      </w:rPr>
-                                      <w:t xml:space="preserve">{{DATUM}}</w:t>
-                                    </w:r>
-                                  </w:p>
-                                </w:tc>
-                              </w:tr>
-                              <w:tr>
-                                <w:tc>
-                                  <w:tcPr>
-                                    <w:tcW w:w="2000" w:type="pct"/>
-                                    <w:tcBorders>
-                                      <w:bottom w:val="single" w:sz="4" w:space="0" w:color="E5E5EA"/>
-                                    </w:tcBorders>
-                                    <w:tcMar>
-                                      <w:top w:w="70" w:type="dxa"/>
-                                      <w:bottom w:w="70" w:type="dxa"/>
-                                    </w:tcMar>
-                                  </w:tcPr>
-                                  <w:p>
-                                    <w:pPr>
-                                      <w:spacing w:before="0" w:after="0"/>
-                                    </w:pPr>
-                                    <w:r>
-                                      <w:rPr>
-                                        <w:rFonts w:ascii="Helvetica Neue" w:hAnsi="Helvetica Neue" w:cs="Helvetica Neue"/>
-                                        <w:sz w:val="16"/>
-                                        <w:szCs w:val="16"/>
-                                        <w:color w:val="86868B"/>
-                                        <w:b/>
-                                        <w:caps/>
-                                        <w:spacing w:val="16"/>
-                                      </w:rPr>
-                                      <w:t xml:space="preserve">Kundennummer</w:t>
-                                    </w:r>
-                                  </w:p>
-                                </w:tc>
-                                <w:tc>
-                                  <w:tcPr>
-                                    <w:tcW w:w="3000" w:type="pct"/>
-                                    <w:tcBorders>
-                                      <w:bottom w:val="single" w:sz="4" w:space="0" w:color="E5E5EA"/>
-                                    </w:tcBorders>
-                                    <w:tcMar>
-                                      <w:top w:w="70" w:type="dxa"/>
-                                      <w:bottom w:w="70" w:type="dxa"/>
-                                    </w:tcMar>
-                                  </w:tcPr>
-                                  <w:p>
-                                    <w:pPr>
-                                      <w:spacing w:before="0" w:after="0"/>
-                                      <w:jc w:val="right"/>
-                                    </w:pPr>
-                                    <w:r>
-                                      <w:rPr>
-                                        <w:rFonts w:ascii="Helvetica Neue" w:hAnsi="Helvetica Neue" w:cs="Helvetica Neue"/>
-                                        <w:sz w:val="19"/>
-                                        <w:szCs w:val="19"/>
-                                        <w:color w:val="1D1D1F"/>
-                                        <w:b/>
-                                      </w:rPr>
-                                      <w:t xml:space="preserve">{{KUNDENNUMMER}}</w:t>
-                                    </w:r>
-                                  </w:p>
-                                </w:tc>
-                              </w:tr>
-                              <w:tr>
-                                <w:tc>
-                                  <w:tcPr>
-                                    <w:tcW w:w="2000" w:type="pct"/>
-                                    <w:tcBorders>
-                                      <w:bottom w:val="single" w:sz="4" w:space="0" w:color="E5E5EA"/>
-                                    </w:tcBorders>
-                                    <w:tcMar>
-                                      <w:top w:w="70" w:type="dxa"/>
-                                      <w:bottom w:w="70" w:type="dxa"/>
-                                    </w:tcMar>
-                                  </w:tcPr>
-                                  <w:p>
-                                    <w:pPr>
-                                      <w:spacing w:before="0" w:after="0"/>
-                                    </w:pPr>
-                                    <w:r>
-                                      <w:rPr>
-                                        <w:rFonts w:ascii="Helvetica Neue" w:hAnsi="Helvetica Neue" w:cs="Helvetica Neue"/>
-                                        <w:sz w:val="16"/>
-                                        <w:szCs w:val="16"/>
-                                        <w:color w:val="86868B"/>
-                                        <w:b/>
-                                        <w:caps/>
-                                        <w:spacing w:val="16"/>
-                                      </w:rPr>
-                                      <w:t xml:space="preserve">Ansprechpartner</w:t>
-                                    </w:r>
-                                  </w:p>
-                                </w:tc>
-                                <w:tc>
-                                  <w:tcPr>
-                                    <w:tcW w:w="3000" w:type="pct"/>
-                                    <w:tcBorders>
-                                      <w:bottom w:val="single" w:sz="4" w:space="0" w:color="E5E5EA"/>
-                                    </w:tcBorders>
-                                    <w:tcMar>
-                                      <w:top w:w="70" w:type="dxa"/>
-                                      <w:bottom w:w="70" w:type="dxa"/>
-                                    </w:tcMar>
-                                  </w:tcPr>
-                                  <w:p>
-                                    <w:pPr>
-                                      <w:spacing w:before="0" w:after="0"/>
-                                      <w:jc w:val="right"/>
-                                    </w:pPr>
-                                    <w:r>
-                                      <w:rPr>
-                                        <w:rFonts w:ascii="Helvetica Neue" w:hAnsi="Helvetica Neue" w:cs="Helvetica Neue"/>
-                                        <w:sz w:val="19"/>
-                                        <w:szCs w:val="19"/>
-                                        <w:color w:val="1D1D1F"/>
-                                        <w:b/>
-                                      </w:rPr>
-                                      <w:t xml:space="preserve">Burak Ücöz</w:t>
-                                    </w:r>
-                                  </w:p>
-                                </w:tc>
-                              </w:tr>
-                              <w:tr>
-                                <w:tc>
-                                  <w:tcPr>
-                                    <w:tcW w:w="2000" w:type="pct"/>
-                                    <w:tcMar>
-                                      <w:top w:w="70" w:type="dxa"/>
-                                      <w:bottom w:w="70" w:type="dxa"/>
-                                    </w:tcMar>
-                                  </w:tcPr>
-                                  <w:p>
-                                    <w:pPr>
-                                      <w:spacing w:before="0" w:after="0"/>
-                                    </w:pPr>
-                                    <w:r>
-                                      <w:rPr>
-                                        <w:rFonts w:ascii="Helvetica Neue" w:hAnsi="Helvetica Neue" w:cs="Helvetica Neue"/>
-                                        <w:sz w:val="16"/>
-                                        <w:szCs w:val="16"/>
-                                        <w:color w:val="86868B"/>
-                                        <w:b/>
-                                        <w:caps/>
-                                        <w:spacing w:val="16"/>
-                                      </w:rPr>
-                                      <w:t xml:space="preserve">{{FRIST_LABEL}}</w:t>
-                                    </w:r>
-                                  </w:p>
-                                </w:tc>
-                                <w:tc>
-                                  <w:tcPr>
-                                    <w:tcW w:w="3000" w:type="pct"/>
-                                    <w:tcMar>
-                                      <w:top w:w="70" w:type="dxa"/>
-                                      <w:bottom w:w="70" w:type="dxa"/>
-                                    </w:tcMar>
-                                  </w:tcPr>
-                                  <w:p>
-                                    <w:pPr>
-                                      <w:spacing w:before="0" w:after="0"/>
-                                      <w:jc w:val="right"/>
-                                    </w:pPr>
-                                    <w:r>
-                                      <w:rPr>
-                                        <w:rFonts w:ascii="Helvetica Neue" w:hAnsi="Helvetica Neue" w:cs="Helvetica Neue"/>
-                                        <w:sz w:val="19"/>
-                                        <w:szCs w:val="19"/>
-                                        <w:color w:val="1D1D1F"/>
-                                        <w:b/>
-                                      </w:rPr>
-                                      <w:t xml:space="preserve">{{FRIST_WERT}}</w:t>
-                                    </w:r>
-                                  </w:p>
-                                </w:tc>
-                              </w:tr>
-                            </w:tbl>
-                          </w:txbxContent>
-                        </wps:txbx>
-                        <wps:bodyPr rot="0" wrap="square" lIns="180000" tIns="144000" rIns="180000" bIns="144000" anchor="t">
-                          <a:spAutoFit/>
-                        </wps:bodyPr>
-                      </wps:wsp>
-                    </a:graphicData>
-                  </a:graphic>
-                </wp:inline>
-              </w:drawing>
-            </w:r>
-          </w:p>
+          <w:tbl>
+            <w:tblPr>
+              <w:tblW w:type="auto" w:w="0"/>
+              <w:tblLook w:firstColumn="1" w:firstRow="1" w:lastColumn="0" w:lastRow="0" w:noHBand="0" w:noVBand="1" w:val="04A0"/>
+              <w:tblBorders>
+                <w:top w:val="none"/>
+                <w:left w:val="none"/>
+                <w:bottom w:val="none"/>
+                <w:right w:val="none"/>
+                <w:insideH w:val="none"/>
+                <w:insideV w:val="none"/>
+              </w:tblBorders>
+            </w:tblPr>
+            <w:tblGrid>
+              <w:gridCol w:w="2494"/>
+              <w:gridCol w:w="2494"/>
+            </w:tblGrid>
+            <w:tr>
+              <w:tc>
+                <w:tcPr>
+                  <w:tcW w:type="dxa" w:w="1928"/>
+                  <w:tcMar>
+                    <w:top w:w="50" w:type="dxa"/>
+                    <w:bottom w:w="50" w:type="dxa"/>
+                    <w:left w:w="0" w:type="dxa"/>
+                    <w:right w:w="0" w:type="dxa"/>
+                  </w:tcMar>
+                  <w:tcBorders>
+                    <w:bottom w:val="single" w:sz="4" w:space="0" w:color="E5E5EA"/>
+                  </w:tcBorders>
+                </w:tcPr>
+                <w:p>
+                  <w:r>
+                    <w:rPr>
+                      <w:rFonts w:ascii="Helvetica Neue" w:hAnsi="Helvetica Neue" w:cs="Helvetica Neue"/>
+                      <w:rFonts w:ascii="Helvetica Neue" w:hAnsi="Helvetica Neue"/>
+                      <w:b/>
+                      <w:i w:val="0"/>
+                      <w:caps/>
+                      <w:color w:val="86868B"/>
+                      <w:sz w:val="16"/>
+                      <w:spacing w:val="14"/>
+                    </w:rPr>
+                    <w:t>Nr.</w:t>
+                  </w:r>
+                </w:p>
+              </w:tc>
+              <w:tc>
+                <w:tcPr>
+                  <w:tcW w:type="dxa" w:w="2268"/>
+                  <w:tcMar>
+                    <w:top w:w="50" w:type="dxa"/>
+                    <w:bottom w:w="50" w:type="dxa"/>
+                    <w:left w:w="0" w:type="dxa"/>
+                    <w:right w:w="0" w:type="dxa"/>
+                  </w:tcMar>
+                  <w:tcBorders>
+                    <w:bottom w:val="single" w:sz="4" w:space="0" w:color="E5E5EA"/>
+                  </w:tcBorders>
+                </w:tcPr>
+                <w:p>
+                  <w:pPr>
+                    <w:jc w:val="right"/>
+                  </w:pPr>
+                  <w:sdt>
+                    <w:sdtPr>
+                      <w:rPr>
+                        <w:rFonts w:ascii="Helvetica Neue" w:hAnsi="Helvetica Neue" w:cs="Helvetica Neue"/>
+                        <w:sz w:val="19"/>
+                        <w:szCs w:val="19"/>
+                        <w:color w:val="1D1D1F"/>
+                        <w:b/>
+                      </w:rPr>
+                      <w:alias w:val="DokumentNr"/>
+                      <w:tag w:val="DokumentNr"/>
+                      <w:id w:val="1008"/>
+                      <w:dataBinding w:prefixMappings="xmlns:ns0='http://kabuu/doc'" w:xpath="/ns0:doc[1]/ns0:DokumentNr[1]" w:storeItemID="{6F1B2C3D-4E5A-4B6C-8D7E-9A0B1C2D3E4F}"/>
+                      <w:text/>
+                    </w:sdtPr>
+                    <w:sdtContent>
+                      <w:r>
+                        <w:rPr>
+                          <w:rFonts w:ascii="Helvetica Neue" w:hAnsi="Helvetica Neue" w:cs="Helvetica Neue"/>
+                          <w:sz w:val="19"/>
+                          <w:szCs w:val="19"/>
+                          <w:color w:val="1D1D1F"/>
+                          <w:b/>
+                        </w:rPr>
+                        <w:t xml:space="preserve">0011</w:t>
+                      </w:r>
+                    </w:sdtContent>
+                  </w:sdt>
+                </w:p>
+              </w:tc>
+            </w:tr>
+            <w:tr>
+              <w:tc>
+                <w:tcPr>
+                  <w:tcW w:type="dxa" w:w="1928"/>
+                  <w:tcMar>
+                    <w:top w:w="50" w:type="dxa"/>
+                    <w:bottom w:w="50" w:type="dxa"/>
+                    <w:left w:w="0" w:type="dxa"/>
+                    <w:right w:w="0" w:type="dxa"/>
+                  </w:tcMar>
+                  <w:tcBorders>
+                    <w:bottom w:val="single" w:sz="4" w:space="0" w:color="E5E5EA"/>
+                  </w:tcBorders>
+                </w:tcPr>
+                <w:p>
+                  <w:r>
+                    <w:rPr>
+                      <w:rFonts w:ascii="Helvetica Neue" w:hAnsi="Helvetica Neue" w:cs="Helvetica Neue"/>
+                      <w:rFonts w:ascii="Helvetica Neue" w:hAnsi="Helvetica Neue"/>
+                      <w:b/>
+                      <w:i w:val="0"/>
+                      <w:caps/>
+                      <w:color w:val="86868B"/>
+                      <w:sz w:val="16"/>
+                      <w:spacing w:val="14"/>
+                    </w:rPr>
+                    <w:t>Datum</w:t>
+                  </w:r>
+                </w:p>
+              </w:tc>
+              <w:tc>
+                <w:tcPr>
+                  <w:tcW w:type="dxa" w:w="2268"/>
+                  <w:tcMar>
+                    <w:top w:w="50" w:type="dxa"/>
+                    <w:bottom w:w="50" w:type="dxa"/>
+                    <w:left w:w="0" w:type="dxa"/>
+                    <w:right w:w="0" w:type="dxa"/>
+                  </w:tcMar>
+                  <w:tcBorders>
+                    <w:bottom w:val="single" w:sz="4" w:space="0" w:color="E5E5EA"/>
+                  </w:tcBorders>
+                </w:tcPr>
+                <w:p>
+                  <w:pPr>
+                    <w:jc w:val="right"/>
+                  </w:pPr>
+                  <w:sdt>
+                    <w:sdtPr>
+                      <w:rPr>
+                        <w:rFonts w:ascii="Helvetica Neue" w:hAnsi="Helvetica Neue" w:cs="Helvetica Neue"/>
+                        <w:sz w:val="19"/>
+                        <w:szCs w:val="19"/>
+                        <w:color w:val="1D1D1F"/>
+                        <w:b/>
+                      </w:rPr>
+                      <w:alias w:val="Datum"/>
+                      <w:tag w:val="Datum"/>
+                      <w:id w:val="1009"/>
+                      <w:dataBinding w:prefixMappings="xmlns:ns0='http://kabuu/doc'" w:xpath="/ns0:doc[1]/ns0:Datum[1]" w:storeItemID="{6F1B2C3D-4E5A-4B6C-8D7E-9A0B1C2D3E4F}"/>
+                      <w:text/>
+                    </w:sdtPr>
+                    <w:sdtContent>
+                      <w:r>
+                        <w:rPr>
+                          <w:rFonts w:ascii="Helvetica Neue" w:hAnsi="Helvetica Neue" w:cs="Helvetica Neue"/>
+                          <w:sz w:val="19"/>
+                          <w:szCs w:val="19"/>
+                          <w:color w:val="1D1D1F"/>
+                          <w:b/>
+                        </w:rPr>
+                        <w:t xml:space="preserve">24.06.2025</w:t>
+                      </w:r>
+                    </w:sdtContent>
+                  </w:sdt>
+                </w:p>
+              </w:tc>
+            </w:tr>
+            <w:tr>
+              <w:tc>
+                <w:tcPr>
+                  <w:tcW w:type="dxa" w:w="1928"/>
+                  <w:tcMar>
+                    <w:top w:w="50" w:type="dxa"/>
+                    <w:bottom w:w="50" w:type="dxa"/>
+                    <w:left w:w="0" w:type="dxa"/>
+                    <w:right w:w="0" w:type="dxa"/>
+                  </w:tcMar>
+                  <w:tcBorders>
+                    <w:bottom w:val="single" w:sz="4" w:space="0" w:color="E5E5EA"/>
+                  </w:tcBorders>
+                </w:tcPr>
+                <w:p>
+                  <w:r>
+                    <w:rPr>
+                      <w:rFonts w:ascii="Helvetica Neue" w:hAnsi="Helvetica Neue" w:cs="Helvetica Neue"/>
+                      <w:rFonts w:ascii="Helvetica Neue" w:hAnsi="Helvetica Neue"/>
+                      <w:b/>
+                      <w:i w:val="0"/>
+                      <w:caps/>
+                      <w:color w:val="86868B"/>
+                      <w:sz w:val="16"/>
+                      <w:spacing w:val="14"/>
+                    </w:rPr>
+                    <w:t>Kundennummer</w:t>
+                  </w:r>
+                </w:p>
+              </w:tc>
+              <w:tc>
+                <w:tcPr>
+                  <w:tcW w:type="dxa" w:w="2268"/>
+                  <w:tcMar>
+                    <w:top w:w="50" w:type="dxa"/>
+                    <w:bottom w:w="50" w:type="dxa"/>
+                    <w:left w:w="0" w:type="dxa"/>
+                    <w:right w:w="0" w:type="dxa"/>
+                  </w:tcMar>
+                  <w:tcBorders>
+                    <w:bottom w:val="single" w:sz="4" w:space="0" w:color="E5E5EA"/>
+                  </w:tcBorders>
+                </w:tcPr>
+                <w:p>
+                  <w:pPr>
+                    <w:jc w:val="right"/>
+                  </w:pPr>
+                  <w:sdt>
+                    <w:sdtPr>
+                      <w:rPr>
+                        <w:rFonts w:ascii="Helvetica Neue" w:hAnsi="Helvetica Neue" w:cs="Helvetica Neue"/>
+                        <w:sz w:val="19"/>
+                        <w:szCs w:val="19"/>
+                        <w:color w:val="1D1D1F"/>
+                        <w:b/>
+                      </w:rPr>
+                      <w:alias w:val="Kundennummer"/>
+                      <w:tag w:val="Kundennummer"/>
+                      <w:id w:val="1010"/>
+                      <w:dataBinding w:prefixMappings="xmlns:ns0='http://kabuu/doc'" w:xpath="/ns0:doc[1]/ns0:Kundennummer[1]" w:storeItemID="{6F1B2C3D-4E5A-4B6C-8D7E-9A0B1C2D3E4F}"/>
+                      <w:text/>
+                    </w:sdtPr>
+                    <w:sdtContent>
+                      <w:r>
+                        <w:rPr>
+                          <w:rFonts w:ascii="Helvetica Neue" w:hAnsi="Helvetica Neue" w:cs="Helvetica Neue"/>
+                          <w:sz w:val="19"/>
+                          <w:szCs w:val="19"/>
+                          <w:color w:val="1D1D1F"/>
+                          <w:b/>
+                        </w:rPr>
+                        <w:t xml:space="preserve">011</w:t>
+                      </w:r>
+                    </w:sdtContent>
+                  </w:sdt>
+                </w:p>
+              </w:tc>
+            </w:tr>
+            <w:tr>
+              <w:tc>
+                <w:tcPr>
+                  <w:tcW w:type="dxa" w:w="1928"/>
+                  <w:tcMar>
+                    <w:top w:w="50" w:type="dxa"/>
+                    <w:bottom w:w="50" w:type="dxa"/>
+                    <w:left w:w="0" w:type="dxa"/>
+                    <w:right w:w="0" w:type="dxa"/>
+                  </w:tcMar>
+                  <w:tcBorders>
+                    <w:bottom w:val="single" w:sz="4" w:space="0" w:color="E5E5EA"/>
+                  </w:tcBorders>
+                </w:tcPr>
+                <w:p>
+                  <w:r>
+                    <w:rPr>
+                      <w:rFonts w:ascii="Helvetica Neue" w:hAnsi="Helvetica Neue" w:cs="Helvetica Neue"/>
+                      <w:rFonts w:ascii="Helvetica Neue" w:hAnsi="Helvetica Neue"/>
+                      <w:b/>
+                      <w:i w:val="0"/>
+                      <w:caps/>
+                      <w:color w:val="86868B"/>
+                      <w:sz w:val="16"/>
+                      <w:spacing w:val="14"/>
+                    </w:rPr>
+                    <w:t>Ansprechpartner</w:t>
+                  </w:r>
+                </w:p>
+              </w:tc>
+              <w:tc>
+                <w:tcPr>
+                  <w:tcW w:type="dxa" w:w="2268"/>
+                  <w:tcMar>
+                    <w:top w:w="50" w:type="dxa"/>
+                    <w:bottom w:w="50" w:type="dxa"/>
+                    <w:left w:w="0" w:type="dxa"/>
+                    <w:right w:w="0" w:type="dxa"/>
+                  </w:tcMar>
+                  <w:tcBorders>
+                    <w:bottom w:val="single" w:sz="4" w:space="0" w:color="E5E5EA"/>
+                  </w:tcBorders>
+                </w:tcPr>
+                <w:p>
+                  <w:pPr>
+                    <w:jc w:val="right"/>
+                  </w:pPr>
+                  <w:r>
+                    <w:rPr>
+                      <w:rFonts w:ascii="Helvetica Neue" w:hAnsi="Helvetica Neue" w:cs="Helvetica Neue"/>
+                      <w:rFonts w:ascii="Helvetica Neue" w:hAnsi="Helvetica Neue"/>
+                      <w:b/>
+                      <w:i w:val="0"/>
+                      <w:color w:val="1D1D1F"/>
+                      <w:sz w:val="19"/>
+                    </w:rPr>
+                    <w:t>Burak Ücöz</w:t>
+                  </w:r>
+                </w:p>
+              </w:tc>
+            </w:tr>
+            <w:tr>
+              <w:tc>
+                <w:tcPr>
+                  <w:tcW w:type="dxa" w:w="1928"/>
+                  <w:tcMar>
+                    <w:top w:w="50" w:type="dxa"/>
+                    <w:bottom w:w="50" w:type="dxa"/>
+                    <w:left w:w="0" w:type="dxa"/>
+                    <w:right w:w="0" w:type="dxa"/>
+                  </w:tcMar>
+                </w:tcPr>
+                <w:p>
+                  <w:sdt>
+                    <w:sdtPr>
+                      <w:rPr>
+                        <w:rFonts w:ascii="Helvetica Neue" w:hAnsi="Helvetica Neue" w:cs="Helvetica Neue"/>
+                        <w:sz w:val="16"/>
+                        <w:szCs w:val="16"/>
+                        <w:color w:val="86868B"/>
+                        <w:b/>
+                        <w:caps/>
+                        <w:spacing w:val="14"/>
+                      </w:rPr>
+                      <w:alias w:val="FristLabel"/>
+                      <w:tag w:val="FristLabel"/>
+                      <w:id w:val="1011"/>
+                      <w:dataBinding w:prefixMappings="xmlns:ns0='http://kabuu/doc'" w:xpath="/ns0:doc[1]/ns0:FristLabel[1]" w:storeItemID="{6F1B2C3D-4E5A-4B6C-8D7E-9A0B1C2D3E4F}"/>
+                      <w:text/>
+                    </w:sdtPr>
+                    <w:sdtContent>
+                      <w:r>
+                        <w:rPr>
+                          <w:rFonts w:ascii="Helvetica Neue" w:hAnsi="Helvetica Neue" w:cs="Helvetica Neue"/>
+                          <w:sz w:val="16"/>
+                          <w:szCs w:val="16"/>
+                          <w:color w:val="86868B"/>
+                          <w:b/>
+                          <w:caps/>
+                          <w:spacing w:val="14"/>
+                        </w:rPr>
+                        <w:t xml:space="preserve">Fälligkeitsdatum</w:t>
+                      </w:r>
+                    </w:sdtContent>
+                  </w:sdt>
+                </w:p>
+              </w:tc>
+              <w:tc>
+                <w:tcPr>
+                  <w:tcW w:type="dxa" w:w="2268"/>
+                  <w:tcMar>
+                    <w:top w:w="50" w:type="dxa"/>
+                    <w:bottom w:w="50" w:type="dxa"/>
+                    <w:left w:w="0" w:type="dxa"/>
+                    <w:right w:w="0" w:type="dxa"/>
+                  </w:tcMar>
+                </w:tcPr>
+                <w:p>
+                  <w:pPr>
+                    <w:jc w:val="right"/>
+                  </w:pPr>
+                  <w:sdt>
+                    <w:sdtPr>
+                      <w:rPr>
+                        <w:rFonts w:ascii="Helvetica Neue" w:hAnsi="Helvetica Neue" w:cs="Helvetica Neue"/>
+                        <w:sz w:val="19"/>
+                        <w:szCs w:val="19"/>
+                        <w:color w:val="1D1D1F"/>
+                        <w:b/>
+                      </w:rPr>
+                      <w:alias w:val="FristWert"/>
+                      <w:tag w:val="FristWert"/>
+                      <w:id w:val="1012"/>
+                      <w:dataBinding w:prefixMappings="xmlns:ns0='http://kabuu/doc'" w:xpath="/ns0:doc[1]/ns0:FristWert[1]" w:storeItemID="{6F1B2C3D-4E5A-4B6C-8D7E-9A0B1C2D3E4F}"/>
+                      <w:text/>
+                    </w:sdtPr>
+                    <w:sdtContent>
+                      <w:r>
+                        <w:rPr>
+                          <w:rFonts w:ascii="Helvetica Neue" w:hAnsi="Helvetica Neue" w:cs="Helvetica Neue"/>
+                          <w:sz w:val="19"/>
+                          <w:szCs w:val="19"/>
+                          <w:color w:val="1D1D1F"/>
+                          <w:b/>
+                        </w:rPr>
+                        <w:t xml:space="preserve">08.07.2025</w:t>
+                      </w:r>
+                    </w:sdtContent>
+                  </w:sdt>
+                </w:p>
+              </w:tc>
+            </w:tr>
+          </w:tbl>
+          <w:p/>
         </w:tc>
       </w:tr>
     </w:tbl>
     <w:p>
       <w:pPr>
-        <w:spacing w:after="0" w:before="0"/>
-        <w:spacing w:line="200" w:lineRule="exact"/>
+        <w:spacing w:line="240" w:lineRule="exact"/>
       </w:pPr>
     </w:p>
     <w:p>
@@ -575,7 +762,10 @@
       </w:pPr>
       <w:r>
         <w:rPr>
+          <w:rFonts w:ascii="Helvetica Neue" w:hAnsi="Helvetica Neue" w:cs="Helvetica Neue"/>
           <w:rFonts w:ascii="Helvetica Neue" w:hAnsi="Helvetica Neue"/>
+          <w:b w:val="0"/>
+          <w:i w:val="0"/>
           <w:color w:val="1D1D1F"/>
           <w:sz w:val="21"/>
         </w:rPr>
@@ -586,737 +776,972 @@
       <w:pPr>
         <w:spacing w:after="200" w:line="300" w:lineRule="auto"/>
       </w:pPr>
-      <w:r>
-        <w:rPr>
-          <w:rFonts w:ascii="Helvetica Neue" w:hAnsi="Helvetica Neue"/>
-          <w:color w:val="1D1D1F"/>
-          <w:sz w:val="21"/>
-        </w:rPr>
-        <w:t>{{EINLEITUNGSTEXT – z. B. „gerne unterbreiten wir Ihnen folgendes Angebot.“ oder „wir erlauben uns, Ihnen folgende Leistungen in Rechnung zu stellen.“}}</w:t>
-      </w:r>
+      <w:sdt>
+        <w:sdtPr>
+          <w:rPr>
+            <w:rFonts w:ascii="Helvetica Neue" w:hAnsi="Helvetica Neue" w:cs="Helvetica Neue"/>
+            <w:sz w:val="21"/>
+            <w:szCs w:val="21"/>
+            <w:color w:val="1D1D1F"/>
+          </w:rPr>
+          <w:alias w:val="Einleitung"/>
+          <w:tag w:val="Einleitung"/>
+          <w:id w:val="1013"/>
+          <w:dataBinding w:prefixMappings="xmlns:ns0='http://kabuu/doc'" w:xpath="/ns0:doc[1]/ns0:Einleitung[1]" w:storeItemID="{6F1B2C3D-4E5A-4B6C-8D7E-9A0B1C2D3E4F}"/>
+          <w:text/>
+        </w:sdtPr>
+        <w:sdtContent>
+          <w:r>
+            <w:rPr>
+              <w:rFonts w:ascii="Helvetica Neue" w:hAnsi="Helvetica Neue" w:cs="Helvetica Neue"/>
+              <w:sz w:val="21"/>
+              <w:szCs w:val="21"/>
+              <w:color w:val="1D1D1F"/>
+            </w:rPr>
+            <w:t xml:space="preserve">gerne unterbreiten wir Ihnen folgende Leistungen.</w:t>
+          </w:r>
+        </w:sdtContent>
+      </w:sdt>
     </w:p>
+    <w:tbl>
+      <w:tblPr>
+        <w:tblW w:type="auto" w:w="0"/>
+        <w:jc w:val="center"/>
+        <w:tblLayout w:type="fixed"/>
+        <w:tblLook w:firstColumn="1" w:firstRow="1" w:lastColumn="0" w:lastRow="0" w:noHBand="0" w:noVBand="1" w:val="04A0"/>
+        <w:tblBorders>
+          <w:top w:val="none"/>
+          <w:left w:val="none"/>
+          <w:bottom w:val="none"/>
+          <w:right w:val="none"/>
+          <w:insideH w:val="none"/>
+          <w:insideV w:val="none"/>
+        </w:tblBorders>
+      </w:tblPr>
+      <w:tblGrid>
+        <w:gridCol w:w="1973"/>
+        <w:gridCol w:w="1973"/>
+        <w:gridCol w:w="1973"/>
+        <w:gridCol w:w="1973"/>
+        <w:gridCol w:w="1973"/>
+      </w:tblGrid>
+      <w:tr>
+        <w:tc>
+          <w:tcPr>
+            <w:tcW w:type="dxa" w:w="680"/>
+            <w:shd w:val="clear" w:color="auto" w:fill="000D6E"/>
+            <w:tcMar>
+              <w:top w:w="80" w:type="dxa"/>
+              <w:bottom w:w="80" w:type="dxa"/>
+              <w:left w:w="120" w:type="dxa"/>
+              <w:right w:w="120" w:type="dxa"/>
+            </w:tcMar>
+            <w:vAlign w:val="center"/>
+          </w:tcPr>
+          <w:p>
+            <w:pPr>
+              <w:jc w:val="left"/>
+            </w:pPr>
+            <w:r>
+              <w:rPr>
+                <w:rFonts w:ascii="Helvetica Neue" w:hAnsi="Helvetica Neue" w:cs="Helvetica Neue"/>
+                <w:rFonts w:ascii="Helvetica Neue" w:hAnsi="Helvetica Neue"/>
+                <w:b/>
+                <w:i w:val="0"/>
+                <w:caps/>
+                <w:color w:val="FFFFFF"/>
+                <w:sz w:val="15"/>
+                <w:spacing w:val="12"/>
+              </w:rPr>
+              <w:t>Pos.</w:t>
+            </w:r>
+          </w:p>
+        </w:tc>
+        <w:tc>
+          <w:tcPr>
+            <w:tcW w:type="dxa" w:w="4876"/>
+            <w:shd w:val="clear" w:color="auto" w:fill="000D6E"/>
+            <w:tcMar>
+              <w:top w:w="80" w:type="dxa"/>
+              <w:bottom w:w="80" w:type="dxa"/>
+              <w:left w:w="120" w:type="dxa"/>
+              <w:right w:w="120" w:type="dxa"/>
+            </w:tcMar>
+            <w:vAlign w:val="center"/>
+          </w:tcPr>
+          <w:p>
+            <w:pPr>
+              <w:jc w:val="left"/>
+            </w:pPr>
+            <w:r>
+              <w:rPr>
+                <w:rFonts w:ascii="Helvetica Neue" w:hAnsi="Helvetica Neue" w:cs="Helvetica Neue"/>
+                <w:rFonts w:ascii="Helvetica Neue" w:hAnsi="Helvetica Neue"/>
+                <w:b/>
+                <w:i w:val="0"/>
+                <w:caps/>
+                <w:color w:val="FFFFFF"/>
+                <w:sz w:val="15"/>
+                <w:spacing w:val="12"/>
+              </w:rPr>
+              <w:t>Leistung / Beschreibung</w:t>
+            </w:r>
+          </w:p>
+        </w:tc>
+        <w:tc>
+          <w:tcPr>
+            <w:tcW w:type="dxa" w:w="1587"/>
+            <w:shd w:val="clear" w:color="auto" w:fill="000D6E"/>
+            <w:tcMar>
+              <w:top w:w="80" w:type="dxa"/>
+              <w:bottom w:w="80" w:type="dxa"/>
+              <w:left w:w="120" w:type="dxa"/>
+              <w:right w:w="120" w:type="dxa"/>
+            </w:tcMar>
+            <w:vAlign w:val="center"/>
+          </w:tcPr>
+          <w:p>
+            <w:pPr>
+              <w:jc w:val="right"/>
+            </w:pPr>
+            <w:r>
+              <w:rPr>
+                <w:rFonts w:ascii="Helvetica Neue" w:hAnsi="Helvetica Neue" w:cs="Helvetica Neue"/>
+                <w:rFonts w:ascii="Helvetica Neue" w:hAnsi="Helvetica Neue"/>
+                <w:b/>
+                <w:i w:val="0"/>
+                <w:caps/>
+                <w:color w:val="FFFFFF"/>
+                <w:sz w:val="15"/>
+                <w:spacing w:val="12"/>
+              </w:rPr>
+              <w:t>Einzelpreis</w:t>
+            </w:r>
+          </w:p>
+        </w:tc>
+        <w:tc>
+          <w:tcPr>
+            <w:tcW w:type="dxa" w:w="1020"/>
+            <w:shd w:val="clear" w:color="auto" w:fill="000D6E"/>
+            <w:tcMar>
+              <w:top w:w="80" w:type="dxa"/>
+              <w:bottom w:w="80" w:type="dxa"/>
+              <w:left w:w="120" w:type="dxa"/>
+              <w:right w:w="120" w:type="dxa"/>
+            </w:tcMar>
+            <w:vAlign w:val="center"/>
+          </w:tcPr>
+          <w:p>
+            <w:pPr>
+              <w:jc w:val="right"/>
+            </w:pPr>
+            <w:r>
+              <w:rPr>
+                <w:rFonts w:ascii="Helvetica Neue" w:hAnsi="Helvetica Neue" w:cs="Helvetica Neue"/>
+                <w:rFonts w:ascii="Helvetica Neue" w:hAnsi="Helvetica Neue"/>
+                <w:b/>
+                <w:i w:val="0"/>
+                <w:caps/>
+                <w:color w:val="FFFFFF"/>
+                <w:sz w:val="15"/>
+                <w:spacing w:val="12"/>
+              </w:rPr>
+              <w:t>Menge</w:t>
+            </w:r>
+          </w:p>
+        </w:tc>
+        <w:tc>
+          <w:tcPr>
+            <w:tcW w:type="dxa" w:w="1701"/>
+            <w:shd w:val="clear" w:color="auto" w:fill="000D6E"/>
+            <w:tcMar>
+              <w:top w:w="80" w:type="dxa"/>
+              <w:bottom w:w="80" w:type="dxa"/>
+              <w:left w:w="120" w:type="dxa"/>
+              <w:right w:w="120" w:type="dxa"/>
+            </w:tcMar>
+            <w:vAlign w:val="center"/>
+          </w:tcPr>
+          <w:p>
+            <w:pPr>
+              <w:jc w:val="right"/>
+            </w:pPr>
+            <w:r>
+              <w:rPr>
+                <w:rFonts w:ascii="Helvetica Neue" w:hAnsi="Helvetica Neue" w:cs="Helvetica Neue"/>
+                <w:rFonts w:ascii="Helvetica Neue" w:hAnsi="Helvetica Neue"/>
+                <w:b/>
+                <w:i w:val="0"/>
+                <w:caps/>
+                <w:color w:val="FFFFFF"/>
+                <w:sz w:val="15"/>
+                <w:spacing w:val="12"/>
+              </w:rPr>
+              <w:t>Summe CHF</w:t>
+            </w:r>
+          </w:p>
+        </w:tc>
+      </w:tr>
+      <w:tr>
+        <w:tc>
+          <w:tcPr>
+            <w:tcW w:type="dxa" w:w="680"/>
+            <w:shd w:val="clear" w:color="auto" w:fill="FFFFFF"/>
+            <w:tcMar>
+              <w:top w:w="70" w:type="dxa"/>
+              <w:bottom w:w="70" w:type="dxa"/>
+              <w:left w:w="120" w:type="dxa"/>
+              <w:right w:w="120" w:type="dxa"/>
+            </w:tcMar>
+            <w:vAlign w:val="center"/>
+            <w:tcBorders>
+              <w:bottom w:val="single" w:sz="4" w:space="0" w:color="E5E5EA"/>
+            </w:tcBorders>
+          </w:tcPr>
+          <w:p>
+            <w:pPr>
+              <w:jc w:val="left"/>
+            </w:pPr>
+            <w:r>
+              <w:rPr>
+                <w:rFonts w:ascii="Helvetica Neue" w:hAnsi="Helvetica Neue" w:cs="Helvetica Neue"/>
+                <w:rFonts w:ascii="Helvetica Neue" w:hAnsi="Helvetica Neue"/>
+                <w:b/>
+                <w:i w:val="0"/>
+                <w:color w:val="86868B"/>
+                <w:sz w:val="19"/>
+              </w:rPr>
+              <w:t>01</w:t>
+            </w:r>
+          </w:p>
+        </w:tc>
+        <w:tc>
+          <w:tcPr>
+            <w:tcW w:type="dxa" w:w="4876"/>
+            <w:shd w:val="clear" w:color="auto" w:fill="FFFFFF"/>
+            <w:tcMar>
+              <w:top w:w="70" w:type="dxa"/>
+              <w:bottom w:w="70" w:type="dxa"/>
+              <w:left w:w="120" w:type="dxa"/>
+              <w:right w:w="120" w:type="dxa"/>
+            </w:tcMar>
+            <w:vAlign w:val="center"/>
+            <w:tcBorders>
+              <w:bottom w:val="single" w:sz="4" w:space="0" w:color="E5E5EA"/>
+            </w:tcBorders>
+          </w:tcPr>
+          <w:p>
+            <w:pPr>
+              <w:spacing w:after="20"/>
+            </w:pPr>
+            <w:sdt>
+              <w:sdtPr>
+                <w:rPr>
+                  <w:rFonts w:ascii="Helvetica Neue" w:hAnsi="Helvetica Neue" w:cs="Helvetica Neue"/>
+                  <w:sz w:val="20"/>
+                  <w:szCs w:val="20"/>
+                  <w:color w:val="1D1D1F"/>
+                  <w:b/>
+                </w:rPr>
+                <w:alias w:val="Leistung1"/>
+                <w:tag w:val="Leistung1"/>
+                <w:id w:val="1014"/>
+                <w:dataBinding w:prefixMappings="xmlns:ns0='http://kabuu/doc'" w:xpath="/ns0:doc[1]/ns0:Leistung1[1]" w:storeItemID="{6F1B2C3D-4E5A-4B6C-8D7E-9A0B1C2D3E4F}"/>
+                <w:text/>
+              </w:sdtPr>
+              <w:sdtContent>
+                <w:r>
+                  <w:rPr>
+                    <w:rFonts w:ascii="Helvetica Neue" w:hAnsi="Helvetica Neue" w:cs="Helvetica Neue"/>
+                    <w:sz w:val="20"/>
+                    <w:szCs w:val="20"/>
+                    <w:color w:val="1D1D1F"/>
+                    <w:b/>
+                  </w:rPr>
+                  <w:t xml:space="preserve">PQ-Schulung</w:t>
+                </w:r>
+              </w:sdtContent>
+            </w:sdt>
+          </w:p>
+          <w:p>
+            <w:pPr>
+              <w:spacing w:after="0"/>
+            </w:pPr>
+            <w:sdt>
+              <w:sdtPr>
+                <w:rPr>
+                  <w:rFonts w:ascii="Helvetica Neue" w:hAnsi="Helvetica Neue" w:cs="Helvetica Neue"/>
+                  <w:sz w:val="17"/>
+                  <w:szCs w:val="17"/>
+                  <w:color w:val="86868B"/>
+                </w:rPr>
+                <w:alias w:val="Detail1"/>
+                <w:tag w:val="Detail1"/>
+                <w:id w:val="1015"/>
+                <w:dataBinding w:prefixMappings="xmlns:ns0='http://kabuu/doc'" w:xpath="/ns0:doc[1]/ns0:Detail1[1]" w:storeItemID="{6F1B2C3D-4E5A-4B6C-8D7E-9A0B1C2D3E4F}"/>
+                <w:text/>
+              </w:sdtPr>
+              <w:sdtContent>
+                <w:r>
+                  <w:rPr>
+                    <w:rFonts w:ascii="Helvetica Neue" w:hAnsi="Helvetica Neue" w:cs="Helvetica Neue"/>
+                    <w:sz w:val="17"/>
+                    <w:szCs w:val="17"/>
+                    <w:color w:val="86868B"/>
+                  </w:rPr>
+                  <w:t xml:space="preserve">Theorie &amp; Praxis</w:t>
+                </w:r>
+              </w:sdtContent>
+            </w:sdt>
+          </w:p>
+        </w:tc>
+        <w:tc>
+          <w:tcPr>
+            <w:tcW w:type="dxa" w:w="1587"/>
+            <w:shd w:val="clear" w:color="auto" w:fill="FFFFFF"/>
+            <w:tcMar>
+              <w:top w:w="70" w:type="dxa"/>
+              <w:bottom w:w="70" w:type="dxa"/>
+              <w:left w:w="120" w:type="dxa"/>
+              <w:right w:w="120" w:type="dxa"/>
+            </w:tcMar>
+            <w:vAlign w:val="center"/>
+            <w:tcBorders>
+              <w:bottom w:val="single" w:sz="4" w:space="0" w:color="E5E5EA"/>
+            </w:tcBorders>
+          </w:tcPr>
+          <w:p>
+            <w:pPr>
+              <w:jc w:val="right"/>
+            </w:pPr>
+            <w:sdt>
+              <w:sdtPr>
+                <w:rPr>
+                  <w:rFonts w:ascii="Helvetica Neue" w:hAnsi="Helvetica Neue" w:cs="Helvetica Neue"/>
+                  <w:sz w:val="19"/>
+                  <w:szCs w:val="19"/>
+                  <w:color w:val="1D1D1F"/>
+                </w:rPr>
+                <w:alias w:val="Preis1"/>
+                <w:tag w:val="Preis1"/>
+                <w:id w:val="1016"/>
+                <w:dataBinding w:prefixMappings="xmlns:ns0='http://kabuu/doc'" w:xpath="/ns0:doc[1]/ns0:Preis1[1]" w:storeItemID="{6F1B2C3D-4E5A-4B6C-8D7E-9A0B1C2D3E4F}"/>
+                <w:text/>
+              </w:sdtPr>
+              <w:sdtContent>
+                <w:r>
+                  <w:rPr>
+                    <w:rFonts w:ascii="Helvetica Neue" w:hAnsi="Helvetica Neue" w:cs="Helvetica Neue"/>
+                    <w:sz w:val="19"/>
+                    <w:szCs w:val="19"/>
+                    <w:color w:val="1D1D1F"/>
+                  </w:rPr>
+                  <w:t xml:space="preserve">200.00</w:t>
+                </w:r>
+              </w:sdtContent>
+            </w:sdt>
+          </w:p>
+        </w:tc>
+        <w:tc>
+          <w:tcPr>
+            <w:tcW w:type="dxa" w:w="1020"/>
+            <w:shd w:val="clear" w:color="auto" w:fill="FFFFFF"/>
+            <w:tcMar>
+              <w:top w:w="70" w:type="dxa"/>
+              <w:bottom w:w="70" w:type="dxa"/>
+              <w:left w:w="120" w:type="dxa"/>
+              <w:right w:w="120" w:type="dxa"/>
+            </w:tcMar>
+            <w:vAlign w:val="center"/>
+            <w:tcBorders>
+              <w:bottom w:val="single" w:sz="4" w:space="0" w:color="E5E5EA"/>
+            </w:tcBorders>
+          </w:tcPr>
+          <w:p>
+            <w:pPr>
+              <w:jc w:val="right"/>
+            </w:pPr>
+            <w:sdt>
+              <w:sdtPr>
+                <w:rPr>
+                  <w:rFonts w:ascii="Helvetica Neue" w:hAnsi="Helvetica Neue" w:cs="Helvetica Neue"/>
+                  <w:sz w:val="19"/>
+                  <w:szCs w:val="19"/>
+                  <w:color w:val="1D1D1F"/>
+                </w:rPr>
+                <w:alias w:val="Menge1"/>
+                <w:tag w:val="Menge1"/>
+                <w:id w:val="1017"/>
+                <w:dataBinding w:prefixMappings="xmlns:ns0='http://kabuu/doc'" w:xpath="/ns0:doc[1]/ns0:Menge1[1]" w:storeItemID="{6F1B2C3D-4E5A-4B6C-8D7E-9A0B1C2D3E4F}"/>
+                <w:text/>
+              </w:sdtPr>
+              <w:sdtContent>
+                <w:r>
+                  <w:rPr>
+                    <w:rFonts w:ascii="Helvetica Neue" w:hAnsi="Helvetica Neue" w:cs="Helvetica Neue"/>
+                    <w:sz w:val="19"/>
+                    <w:szCs w:val="19"/>
+                    <w:color w:val="1D1D1F"/>
+                  </w:rPr>
+                  <w:t xml:space="preserve">4</w:t>
+                </w:r>
+              </w:sdtContent>
+            </w:sdt>
+          </w:p>
+        </w:tc>
+        <w:tc>
+          <w:tcPr>
+            <w:tcW w:type="dxa" w:w="1701"/>
+            <w:shd w:val="clear" w:color="auto" w:fill="FFFFFF"/>
+            <w:tcMar>
+              <w:top w:w="70" w:type="dxa"/>
+              <w:bottom w:w="70" w:type="dxa"/>
+              <w:left w:w="120" w:type="dxa"/>
+              <w:right w:w="120" w:type="dxa"/>
+            </w:tcMar>
+            <w:vAlign w:val="center"/>
+            <w:tcBorders>
+              <w:bottom w:val="single" w:sz="4" w:space="0" w:color="E5E5EA"/>
+            </w:tcBorders>
+          </w:tcPr>
+          <w:p>
+            <w:pPr>
+              <w:jc w:val="right"/>
+            </w:pPr>
+            <w:sdt>
+              <w:sdtPr>
+                <w:rPr>
+                  <w:rFonts w:ascii="Helvetica Neue" w:hAnsi="Helvetica Neue" w:cs="Helvetica Neue"/>
+                  <w:sz w:val="19"/>
+                  <w:szCs w:val="19"/>
+                  <w:color w:val="000D6E"/>
+                  <w:b/>
+                </w:rPr>
+                <w:alias w:val="Summe1"/>
+                <w:tag w:val="Summe1"/>
+                <w:id w:val="1018"/>
+                <w:dataBinding w:prefixMappings="xmlns:ns0='http://kabuu/doc'" w:xpath="/ns0:doc[1]/ns0:Summe1[1]" w:storeItemID="{6F1B2C3D-4E5A-4B6C-8D7E-9A0B1C2D3E4F}"/>
+                <w:text/>
+              </w:sdtPr>
+              <w:sdtContent>
+                <w:r>
+                  <w:rPr>
+                    <w:rFonts w:ascii="Helvetica Neue" w:hAnsi="Helvetica Neue" w:cs="Helvetica Neue"/>
+                    <w:sz w:val="19"/>
+                    <w:szCs w:val="19"/>
+                    <w:color w:val="000D6E"/>
+                    <w:b/>
+                  </w:rPr>
+                  <w:t xml:space="preserve">800.00</w:t>
+                </w:r>
+              </w:sdtContent>
+            </w:sdt>
+          </w:p>
+        </w:tc>
+      </w:tr>
+      <w:tr>
+        <w:tc>
+          <w:tcPr>
+            <w:tcW w:type="dxa" w:w="680"/>
+            <w:shd w:val="clear" w:color="auto" w:fill="F5F5F7"/>
+            <w:tcMar>
+              <w:top w:w="70" w:type="dxa"/>
+              <w:bottom w:w="70" w:type="dxa"/>
+              <w:left w:w="120" w:type="dxa"/>
+              <w:right w:w="120" w:type="dxa"/>
+            </w:tcMar>
+            <w:vAlign w:val="center"/>
+            <w:tcBorders>
+              <w:bottom w:val="single" w:sz="4" w:space="0" w:color="E5E5EA"/>
+            </w:tcBorders>
+          </w:tcPr>
+          <w:p>
+            <w:pPr>
+              <w:jc w:val="left"/>
+            </w:pPr>
+            <w:r>
+              <w:rPr>
+                <w:rFonts w:ascii="Helvetica Neue" w:hAnsi="Helvetica Neue" w:cs="Helvetica Neue"/>
+                <w:rFonts w:ascii="Helvetica Neue" w:hAnsi="Helvetica Neue"/>
+                <w:b/>
+                <w:i w:val="0"/>
+                <w:color w:val="86868B"/>
+                <w:sz w:val="19"/>
+              </w:rPr>
+              <w:t>02</w:t>
+            </w:r>
+          </w:p>
+        </w:tc>
+        <w:tc>
+          <w:tcPr>
+            <w:tcW w:type="dxa" w:w="4876"/>
+            <w:shd w:val="clear" w:color="auto" w:fill="F5F5F7"/>
+            <w:tcMar>
+              <w:top w:w="70" w:type="dxa"/>
+              <w:bottom w:w="70" w:type="dxa"/>
+              <w:left w:w="120" w:type="dxa"/>
+              <w:right w:w="120" w:type="dxa"/>
+            </w:tcMar>
+            <w:vAlign w:val="center"/>
+            <w:tcBorders>
+              <w:bottom w:val="single" w:sz="4" w:space="0" w:color="E5E5EA"/>
+            </w:tcBorders>
+          </w:tcPr>
+          <w:p>
+            <w:pPr>
+              <w:spacing w:after="20"/>
+            </w:pPr>
+            <w:sdt>
+              <w:sdtPr>
+                <w:rPr>
+                  <w:rFonts w:ascii="Helvetica Neue" w:hAnsi="Helvetica Neue" w:cs="Helvetica Neue"/>
+                  <w:sz w:val="20"/>
+                  <w:szCs w:val="20"/>
+                  <w:color w:val="1D1D1F"/>
+                  <w:b/>
+                </w:rPr>
+                <w:alias w:val="Leistung2"/>
+                <w:tag w:val="Leistung2"/>
+                <w:id w:val="1019"/>
+                <w:dataBinding w:prefixMappings="xmlns:ns0='http://kabuu/doc'" w:xpath="/ns0:doc[1]/ns0:Leistung2[1]" w:storeItemID="{6F1B2C3D-4E5A-4B6C-8D7E-9A0B1C2D3E4F}"/>
+                <w:text/>
+              </w:sdtPr>
+              <w:sdtContent>
+                <w:r>
+                  <w:rPr>
+                    <w:rFonts w:ascii="Helvetica Neue" w:hAnsi="Helvetica Neue" w:cs="Helvetica Neue"/>
+                    <w:sz w:val="20"/>
+                    <w:szCs w:val="20"/>
+                    <w:color w:val="1D1D1F"/>
+                    <w:b/>
+                  </w:rPr>
+                  <w:t xml:space="preserve">Geräteschulung</w:t>
+                </w:r>
+              </w:sdtContent>
+            </w:sdt>
+          </w:p>
+          <w:p>
+            <w:pPr>
+              <w:spacing w:after="0"/>
+            </w:pPr>
+            <w:sdt>
+              <w:sdtPr>
+                <w:rPr>
+                  <w:rFonts w:ascii="Helvetica Neue" w:hAnsi="Helvetica Neue" w:cs="Helvetica Neue"/>
+                  <w:sz w:val="17"/>
+                  <w:szCs w:val="17"/>
+                  <w:color w:val="86868B"/>
+                </w:rPr>
+                <w:alias w:val="Detail2"/>
+                <w:tag w:val="Detail2"/>
+                <w:id w:val="1020"/>
+                <w:dataBinding w:prefixMappings="xmlns:ns0='http://kabuu/doc'" w:xpath="/ns0:doc[1]/ns0:Detail2[1]" w:storeItemID="{6F1B2C3D-4E5A-4B6C-8D7E-9A0B1C2D3E4F}"/>
+                <w:text/>
+              </w:sdtPr>
+              <w:sdtContent>
+                <w:r>
+                  <w:rPr>
+                    <w:rFonts w:ascii="Helvetica Neue" w:hAnsi="Helvetica Neue" w:cs="Helvetica Neue"/>
+                    <w:sz w:val="17"/>
+                    <w:szCs w:val="17"/>
+                    <w:color w:val="86868B"/>
+                  </w:rPr>
+                  <w:t xml:space="preserve">Befähigte Personen Elektroprüfungen</w:t>
+                </w:r>
+              </w:sdtContent>
+            </w:sdt>
+          </w:p>
+        </w:tc>
+        <w:tc>
+          <w:tcPr>
+            <w:tcW w:type="dxa" w:w="1587"/>
+            <w:shd w:val="clear" w:color="auto" w:fill="F5F5F7"/>
+            <w:tcMar>
+              <w:top w:w="70" w:type="dxa"/>
+              <w:bottom w:w="70" w:type="dxa"/>
+              <w:left w:w="120" w:type="dxa"/>
+              <w:right w:w="120" w:type="dxa"/>
+            </w:tcMar>
+            <w:vAlign w:val="center"/>
+            <w:tcBorders>
+              <w:bottom w:val="single" w:sz="4" w:space="0" w:color="E5E5EA"/>
+            </w:tcBorders>
+          </w:tcPr>
+          <w:p>
+            <w:pPr>
+              <w:jc w:val="right"/>
+            </w:pPr>
+            <w:sdt>
+              <w:sdtPr>
+                <w:rPr>
+                  <w:rFonts w:ascii="Helvetica Neue" w:hAnsi="Helvetica Neue" w:cs="Helvetica Neue"/>
+                  <w:sz w:val="19"/>
+                  <w:szCs w:val="19"/>
+                  <w:color w:val="1D1D1F"/>
+                </w:rPr>
+                <w:alias w:val="Preis2"/>
+                <w:tag w:val="Preis2"/>
+                <w:id w:val="1021"/>
+                <w:dataBinding w:prefixMappings="xmlns:ns0='http://kabuu/doc'" w:xpath="/ns0:doc[1]/ns0:Preis2[1]" w:storeItemID="{6F1B2C3D-4E5A-4B6C-8D7E-9A0B1C2D3E4F}"/>
+                <w:text/>
+              </w:sdtPr>
+              <w:sdtContent>
+                <w:r>
+                  <w:rPr>
+                    <w:rFonts w:ascii="Helvetica Neue" w:hAnsi="Helvetica Neue" w:cs="Helvetica Neue"/>
+                    <w:sz w:val="19"/>
+                    <w:szCs w:val="19"/>
+                    <w:color w:val="1D1D1F"/>
+                  </w:rPr>
+                  <w:t xml:space="preserve">150.00</w:t>
+                </w:r>
+              </w:sdtContent>
+            </w:sdt>
+          </w:p>
+        </w:tc>
+        <w:tc>
+          <w:tcPr>
+            <w:tcW w:type="dxa" w:w="1020"/>
+            <w:shd w:val="clear" w:color="auto" w:fill="F5F5F7"/>
+            <w:tcMar>
+              <w:top w:w="70" w:type="dxa"/>
+              <w:bottom w:w="70" w:type="dxa"/>
+              <w:left w:w="120" w:type="dxa"/>
+              <w:right w:w="120" w:type="dxa"/>
+            </w:tcMar>
+            <w:vAlign w:val="center"/>
+            <w:tcBorders>
+              <w:bottom w:val="single" w:sz="4" w:space="0" w:color="E5E5EA"/>
+            </w:tcBorders>
+          </w:tcPr>
+          <w:p>
+            <w:pPr>
+              <w:jc w:val="right"/>
+            </w:pPr>
+            <w:sdt>
+              <w:sdtPr>
+                <w:rPr>
+                  <w:rFonts w:ascii="Helvetica Neue" w:hAnsi="Helvetica Neue" w:cs="Helvetica Neue"/>
+                  <w:sz w:val="19"/>
+                  <w:szCs w:val="19"/>
+                  <w:color w:val="1D1D1F"/>
+                </w:rPr>
+                <w:alias w:val="Menge2"/>
+                <w:tag w:val="Menge2"/>
+                <w:id w:val="1022"/>
+                <w:dataBinding w:prefixMappings="xmlns:ns0='http://kabuu/doc'" w:xpath="/ns0:doc[1]/ns0:Menge2[1]" w:storeItemID="{6F1B2C3D-4E5A-4B6C-8D7E-9A0B1C2D3E4F}"/>
+                <w:text/>
+              </w:sdtPr>
+              <w:sdtContent>
+                <w:r>
+                  <w:rPr>
+                    <w:rFonts w:ascii="Helvetica Neue" w:hAnsi="Helvetica Neue" w:cs="Helvetica Neue"/>
+                    <w:sz w:val="19"/>
+                    <w:szCs w:val="19"/>
+                    <w:color w:val="1D1D1F"/>
+                  </w:rPr>
+                  <w:t xml:space="preserve">1</w:t>
+                </w:r>
+              </w:sdtContent>
+            </w:sdt>
+          </w:p>
+        </w:tc>
+        <w:tc>
+          <w:tcPr>
+            <w:tcW w:type="dxa" w:w="1701"/>
+            <w:shd w:val="clear" w:color="auto" w:fill="F5F5F7"/>
+            <w:tcMar>
+              <w:top w:w="70" w:type="dxa"/>
+              <w:bottom w:w="70" w:type="dxa"/>
+              <w:left w:w="120" w:type="dxa"/>
+              <w:right w:w="120" w:type="dxa"/>
+            </w:tcMar>
+            <w:vAlign w:val="center"/>
+            <w:tcBorders>
+              <w:bottom w:val="single" w:sz="4" w:space="0" w:color="E5E5EA"/>
+            </w:tcBorders>
+          </w:tcPr>
+          <w:p>
+            <w:pPr>
+              <w:jc w:val="right"/>
+            </w:pPr>
+            <w:sdt>
+              <w:sdtPr>
+                <w:rPr>
+                  <w:rFonts w:ascii="Helvetica Neue" w:hAnsi="Helvetica Neue" w:cs="Helvetica Neue"/>
+                  <w:sz w:val="19"/>
+                  <w:szCs w:val="19"/>
+                  <w:color w:val="000D6E"/>
+                  <w:b/>
+                </w:rPr>
+                <w:alias w:val="Summe2"/>
+                <w:tag w:val="Summe2"/>
+                <w:id w:val="1023"/>
+                <w:dataBinding w:prefixMappings="xmlns:ns0='http://kabuu/doc'" w:xpath="/ns0:doc[1]/ns0:Summe2[1]" w:storeItemID="{6F1B2C3D-4E5A-4B6C-8D7E-9A0B1C2D3E4F}"/>
+                <w:text/>
+              </w:sdtPr>
+              <w:sdtContent>
+                <w:r>
+                  <w:rPr>
+                    <w:rFonts w:ascii="Helvetica Neue" w:hAnsi="Helvetica Neue" w:cs="Helvetica Neue"/>
+                    <w:sz w:val="19"/>
+                    <w:szCs w:val="19"/>
+                    <w:color w:val="000D6E"/>
+                    <w:b/>
+                  </w:rPr>
+                  <w:t xml:space="preserve">150.00</w:t>
+                </w:r>
+              </w:sdtContent>
+            </w:sdt>
+          </w:p>
+        </w:tc>
+      </w:tr>
+      <w:tr>
+        <w:tc>
+          <w:tcPr>
+            <w:tcW w:type="dxa" w:w="680"/>
+            <w:shd w:val="clear" w:color="auto" w:fill="FFFFFF"/>
+            <w:tcMar>
+              <w:top w:w="70" w:type="dxa"/>
+              <w:bottom w:w="70" w:type="dxa"/>
+              <w:left w:w="120" w:type="dxa"/>
+              <w:right w:w="120" w:type="dxa"/>
+            </w:tcMar>
+            <w:vAlign w:val="center"/>
+          </w:tcPr>
+          <w:p>
+            <w:pPr>
+              <w:jc w:val="left"/>
+            </w:pPr>
+            <w:r>
+              <w:rPr>
+                <w:rFonts w:ascii="Helvetica Neue" w:hAnsi="Helvetica Neue" w:cs="Helvetica Neue"/>
+                <w:rFonts w:ascii="Helvetica Neue" w:hAnsi="Helvetica Neue"/>
+                <w:b/>
+                <w:i w:val="0"/>
+                <w:color w:val="86868B"/>
+                <w:sz w:val="19"/>
+              </w:rPr>
+              <w:t>03</w:t>
+            </w:r>
+          </w:p>
+        </w:tc>
+        <w:tc>
+          <w:tcPr>
+            <w:tcW w:type="dxa" w:w="4876"/>
+            <w:shd w:val="clear" w:color="auto" w:fill="FFFFFF"/>
+            <w:tcMar>
+              <w:top w:w="70" w:type="dxa"/>
+              <w:bottom w:w="70" w:type="dxa"/>
+              <w:left w:w="120" w:type="dxa"/>
+              <w:right w:w="120" w:type="dxa"/>
+            </w:tcMar>
+            <w:vAlign w:val="center"/>
+          </w:tcPr>
+          <w:p>
+            <w:pPr>
+              <w:spacing w:after="20"/>
+            </w:pPr>
+            <w:sdt>
+              <w:sdtPr>
+                <w:rPr>
+                  <w:rFonts w:ascii="Helvetica Neue" w:hAnsi="Helvetica Neue" w:cs="Helvetica Neue"/>
+                  <w:sz w:val="20"/>
+                  <w:szCs w:val="20"/>
+                  <w:color w:val="1D1D1F"/>
+                  <w:b/>
+                </w:rPr>
+                <w:alias w:val="Leistung3"/>
+                <w:tag w:val="Leistung3"/>
+                <w:id w:val="1024"/>
+                <w:dataBinding w:prefixMappings="xmlns:ns0='http://kabuu/doc'" w:xpath="/ns0:doc[1]/ns0:Leistung3[1]" w:storeItemID="{6F1B2C3D-4E5A-4B6C-8D7E-9A0B1C2D3E4F}"/>
+                <w:text/>
+              </w:sdtPr>
+              <w:sdtContent>
+                <w:r>
+                  <w:rPr>
+                    <w:rFonts w:ascii="Helvetica Neue" w:hAnsi="Helvetica Neue" w:cs="Helvetica Neue"/>
+                    <w:sz w:val="20"/>
+                    <w:szCs w:val="20"/>
+                    <w:color w:val="1D1D1F"/>
+                    <w:b/>
+                  </w:rPr>
+                  <w:t xml:space="preserve">Dokumentation</w:t>
+                </w:r>
+              </w:sdtContent>
+            </w:sdt>
+          </w:p>
+          <w:p>
+            <w:pPr>
+              <w:spacing w:after="0"/>
+            </w:pPr>
+            <w:sdt>
+              <w:sdtPr>
+                <w:rPr>
+                  <w:rFonts w:ascii="Helvetica Neue" w:hAnsi="Helvetica Neue" w:cs="Helvetica Neue"/>
+                  <w:sz w:val="17"/>
+                  <w:szCs w:val="17"/>
+                  <w:color w:val="86868B"/>
+                </w:rPr>
+                <w:alias w:val="Detail3"/>
+                <w:tag w:val="Detail3"/>
+                <w:id w:val="1025"/>
+                <w:dataBinding w:prefixMappings="xmlns:ns0='http://kabuu/doc'" w:xpath="/ns0:doc[1]/ns0:Detail3[1]" w:storeItemID="{6F1B2C3D-4E5A-4B6C-8D7E-9A0B1C2D3E4F}"/>
+                <w:text/>
+              </w:sdtPr>
+              <w:sdtContent>
+                <w:r>
+                  <w:rPr>
+                    <w:rFonts w:ascii="Helvetica Neue" w:hAnsi="Helvetica Neue" w:cs="Helvetica Neue"/>
+                    <w:sz w:val="17"/>
+                    <w:szCs w:val="17"/>
+                    <w:color w:val="86868B"/>
+                  </w:rPr>
+                  <w:t xml:space="preserve">Anleitung + Dokumentation + Bilder</w:t>
+                </w:r>
+              </w:sdtContent>
+            </w:sdt>
+          </w:p>
+        </w:tc>
+        <w:tc>
+          <w:tcPr>
+            <w:tcW w:type="dxa" w:w="1587"/>
+            <w:shd w:val="clear" w:color="auto" w:fill="FFFFFF"/>
+            <w:tcMar>
+              <w:top w:w="70" w:type="dxa"/>
+              <w:bottom w:w="70" w:type="dxa"/>
+              <w:left w:w="120" w:type="dxa"/>
+              <w:right w:w="120" w:type="dxa"/>
+            </w:tcMar>
+            <w:vAlign w:val="center"/>
+          </w:tcPr>
+          <w:p>
+            <w:pPr>
+              <w:jc w:val="right"/>
+            </w:pPr>
+            <w:sdt>
+              <w:sdtPr>
+                <w:rPr>
+                  <w:rFonts w:ascii="Helvetica Neue" w:hAnsi="Helvetica Neue" w:cs="Helvetica Neue"/>
+                  <w:sz w:val="19"/>
+                  <w:szCs w:val="19"/>
+                  <w:color w:val="1D1D1F"/>
+                </w:rPr>
+                <w:alias w:val="Preis3"/>
+                <w:tag w:val="Preis3"/>
+                <w:id w:val="1026"/>
+                <w:dataBinding w:prefixMappings="xmlns:ns0='http://kabuu/doc'" w:xpath="/ns0:doc[1]/ns0:Preis3[1]" w:storeItemID="{6F1B2C3D-4E5A-4B6C-8D7E-9A0B1C2D3E4F}"/>
+                <w:text/>
+              </w:sdtPr>
+              <w:sdtContent>
+                <w:r>
+                  <w:rPr>
+                    <w:rFonts w:ascii="Helvetica Neue" w:hAnsi="Helvetica Neue" w:cs="Helvetica Neue"/>
+                    <w:sz w:val="19"/>
+                    <w:szCs w:val="19"/>
+                    <w:color w:val="1D1D1F"/>
+                  </w:rPr>
+                  <w:t xml:space="preserve">150.00</w:t>
+                </w:r>
+              </w:sdtContent>
+            </w:sdt>
+          </w:p>
+        </w:tc>
+        <w:tc>
+          <w:tcPr>
+            <w:tcW w:type="dxa" w:w="1020"/>
+            <w:shd w:val="clear" w:color="auto" w:fill="FFFFFF"/>
+            <w:tcMar>
+              <w:top w:w="70" w:type="dxa"/>
+              <w:bottom w:w="70" w:type="dxa"/>
+              <w:left w:w="120" w:type="dxa"/>
+              <w:right w:w="120" w:type="dxa"/>
+            </w:tcMar>
+            <w:vAlign w:val="center"/>
+          </w:tcPr>
+          <w:p>
+            <w:pPr>
+              <w:jc w:val="right"/>
+            </w:pPr>
+            <w:sdt>
+              <w:sdtPr>
+                <w:rPr>
+                  <w:rFonts w:ascii="Helvetica Neue" w:hAnsi="Helvetica Neue" w:cs="Helvetica Neue"/>
+                  <w:sz w:val="19"/>
+                  <w:szCs w:val="19"/>
+                  <w:color w:val="1D1D1F"/>
+                </w:rPr>
+                <w:alias w:val="Menge3"/>
+                <w:tag w:val="Menge3"/>
+                <w:id w:val="1027"/>
+                <w:dataBinding w:prefixMappings="xmlns:ns0='http://kabuu/doc'" w:xpath="/ns0:doc[1]/ns0:Menge3[1]" w:storeItemID="{6F1B2C3D-4E5A-4B6C-8D7E-9A0B1C2D3E4F}"/>
+                <w:text/>
+              </w:sdtPr>
+              <w:sdtContent>
+                <w:r>
+                  <w:rPr>
+                    <w:rFonts w:ascii="Helvetica Neue" w:hAnsi="Helvetica Neue" w:cs="Helvetica Neue"/>
+                    <w:sz w:val="19"/>
+                    <w:szCs w:val="19"/>
+                    <w:color w:val="1D1D1F"/>
+                  </w:rPr>
+                  <w:t xml:space="preserve">2</w:t>
+                </w:r>
+              </w:sdtContent>
+            </w:sdt>
+          </w:p>
+        </w:tc>
+        <w:tc>
+          <w:tcPr>
+            <w:tcW w:type="dxa" w:w="1701"/>
+            <w:shd w:val="clear" w:color="auto" w:fill="FFFFFF"/>
+            <w:tcMar>
+              <w:top w:w="70" w:type="dxa"/>
+              <w:bottom w:w="70" w:type="dxa"/>
+              <w:left w:w="120" w:type="dxa"/>
+              <w:right w:w="120" w:type="dxa"/>
+            </w:tcMar>
+            <w:vAlign w:val="center"/>
+          </w:tcPr>
+          <w:p>
+            <w:pPr>
+              <w:jc w:val="right"/>
+            </w:pPr>
+            <w:sdt>
+              <w:sdtPr>
+                <w:rPr>
+                  <w:rFonts w:ascii="Helvetica Neue" w:hAnsi="Helvetica Neue" w:cs="Helvetica Neue"/>
+                  <w:sz w:val="19"/>
+                  <w:szCs w:val="19"/>
+                  <w:color w:val="000D6E"/>
+                  <w:b/>
+                </w:rPr>
+                <w:alias w:val="Summe3"/>
+                <w:tag w:val="Summe3"/>
+                <w:id w:val="1028"/>
+                <w:dataBinding w:prefixMappings="xmlns:ns0='http://kabuu/doc'" w:xpath="/ns0:doc[1]/ns0:Summe3[1]" w:storeItemID="{6F1B2C3D-4E5A-4B6C-8D7E-9A0B1C2D3E4F}"/>
+                <w:text/>
+              </w:sdtPr>
+              <w:sdtContent>
+                <w:r>
+                  <w:rPr>
+                    <w:rFonts w:ascii="Helvetica Neue" w:hAnsi="Helvetica Neue" w:cs="Helvetica Neue"/>
+                    <w:sz w:val="19"/>
+                    <w:szCs w:val="19"/>
+                    <w:color w:val="000D6E"/>
+                    <w:b/>
+                  </w:rPr>
+                  <w:t xml:space="preserve">300.00</w:t>
+                </w:r>
+              </w:sdtContent>
+            </w:sdt>
+          </w:p>
+        </w:tc>
+      </w:tr>
+    </w:tbl>
     <w:p>
       <w:pPr>
-        <w:spacing w:after="0" w:before="0"/>
-      </w:pPr>
-      <w:r>
-        <w:drawing>
-          <wp:inline distT="0" distB="0" distL="0" distR="0">
-            <wp:extent cx="6264000" cy="2088000"/>
-            <wp:effectExtent l="0" t="0" r="0" b="0"/>
-            <wp:docPr id="103" name="Card103"/>
-            <wp:cNvGraphicFramePr/>
-            <a:graphic xmlns:a="http://schemas.openxmlformats.org/drawingml/2006/main">
-              <a:graphicData uri="http://schemas.microsoft.com/office/word/2010/wordprocessingShape">
-                <wps:wsp>
-                  <wps:cNvSpPr txBox="1"/>
-                  <wps:spPr>
-                    <a:xfrm>
-                      <a:off x="0" y="0"/>
-                      <a:ext cx="6264000" cy="2088000"/>
-                    </a:xfrm>
-                    <a:prstGeom prst="roundRect">
-                      <a:avLst>
-                        <a:gd name="adj" fmla="val 7000"/>
-                      </a:avLst>
-                    </a:prstGeom>
-                    <a:solidFill>
-                      <a:srgbClr val="FFFFFF"/>
-                    </a:solidFill>
-                    <a:ln w="9525">
-                      <a:solidFill>
-                        <a:srgbClr val="E5E5EA"/>
-                      </a:solidFill>
-                    </a:ln>
-                  </wps:spPr>
-                  <wps:txbx>
-                    <w:txbxContent>
-                      <w:tbl>
-                        <w:tblPr>
-                          <w:tblW w:w="5000" w:type="pct"/>
-                          <w:tblBorders>
-                            <w:top w:val="none"/>
-                            <w:left w:val="none"/>
-                            <w:bottom w:val="none"/>
-                            <w:right w:val="none"/>
-                            <w:insideH w:val="none"/>
-                            <w:insideV w:val="none"/>
-                          </w:tblBorders>
-                          <w:tblLayout w:type="autofit"/>
-                        </w:tblPr>
-                        <w:tr>
-                          <w:tc>
-                            <w:tcPr>
-                              <w:tcW w:w="360" w:type="pct"/>
-                              <w:tcBorders>
-                                <w:bottom w:val="single" w:sz="4" w:space="0" w:color="E5E5EA"/>
-                              </w:tcBorders>
-                              <w:vAlign w:val="center"/>
-                              <w:tcMar>
-                                <w:top w:w="90" w:type="dxa"/>
-                                <w:bottom w:w="90" w:type="dxa"/>
-                                <w:left w:w="40" w:type="dxa"/>
-                                <w:right w:w="40" w:type="dxa"/>
-                              </w:tcMar>
-                            </w:tcPr>
-                            <w:p>
-                              <w:pPr>
-                                <w:spacing w:before="0" w:after="0"/>
-                                <w:jc w:val="left"/>
-                              </w:pPr>
-                              <w:r>
-                                <w:rPr>
-                                  <w:rFonts w:ascii="Helvetica Neue" w:hAnsi="Helvetica Neue" w:cs="Helvetica Neue"/>
-                                  <w:sz w:val="15"/>
-                                  <w:szCs w:val="15"/>
-                                  <w:color w:val="86868B"/>
-                                  <w:b/>
-                                  <w:caps/>
-                                  <w:spacing w:val="14"/>
-                                </w:rPr>
-                                <w:t xml:space="preserve">Pos.</w:t>
-                              </w:r>
-                            </w:p>
-                          </w:tc>
-                          <w:tc>
-                            <w:tcPr>
-                              <w:tcW w:w="2350" w:type="pct"/>
-                              <w:tcBorders>
-                                <w:bottom w:val="single" w:sz="4" w:space="0" w:color="E5E5EA"/>
-                              </w:tcBorders>
-                              <w:vAlign w:val="center"/>
-                              <w:tcMar>
-                                <w:top w:w="90" w:type="dxa"/>
-                                <w:bottom w:w="90" w:type="dxa"/>
-                                <w:left w:w="40" w:type="dxa"/>
-                                <w:right w:w="40" w:type="dxa"/>
-                              </w:tcMar>
-                            </w:tcPr>
-                            <w:p>
-                              <w:pPr>
-                                <w:spacing w:before="0" w:after="0"/>
-                                <w:jc w:val="left"/>
-                              </w:pPr>
-                              <w:r>
-                                <w:rPr>
-                                  <w:rFonts w:ascii="Helvetica Neue" w:hAnsi="Helvetica Neue" w:cs="Helvetica Neue"/>
-                                  <w:sz w:val="15"/>
-                                  <w:szCs w:val="15"/>
-                                  <w:color w:val="86868B"/>
-                                  <w:b/>
-                                  <w:caps/>
-                                  <w:spacing w:val="14"/>
-                                </w:rPr>
-                                <w:t xml:space="preserve">Leistung / Beschreibung</w:t>
-                              </w:r>
-                            </w:p>
-                          </w:tc>
-                          <w:tc>
-                            <w:tcPr>
-                              <w:tcW w:w="900" w:type="pct"/>
-                              <w:tcBorders>
-                                <w:bottom w:val="single" w:sz="4" w:space="0" w:color="E5E5EA"/>
-                              </w:tcBorders>
-                              <w:vAlign w:val="center"/>
-                              <w:tcMar>
-                                <w:top w:w="90" w:type="dxa"/>
-                                <w:bottom w:w="90" w:type="dxa"/>
-                                <w:left w:w="40" w:type="dxa"/>
-                                <w:right w:w="40" w:type="dxa"/>
-                              </w:tcMar>
-                            </w:tcPr>
-                            <w:p>
-                              <w:pPr>
-                                <w:spacing w:before="0" w:after="0"/>
-                                <w:jc w:val="right"/>
-                              </w:pPr>
-                              <w:r>
-                                <w:rPr>
-                                  <w:rFonts w:ascii="Helvetica Neue" w:hAnsi="Helvetica Neue" w:cs="Helvetica Neue"/>
-                                  <w:sz w:val="15"/>
-                                  <w:szCs w:val="15"/>
-                                  <w:color w:val="86868B"/>
-                                  <w:b/>
-                                  <w:caps/>
-                                  <w:spacing w:val="14"/>
-                                </w:rPr>
-                                <w:t xml:space="preserve">Einzelpreis</w:t>
-                              </w:r>
-                            </w:p>
-                          </w:tc>
-                          <w:tc>
-                            <w:tcPr>
-                              <w:tcW w:w="480" w:type="pct"/>
-                              <w:tcBorders>
-                                <w:bottom w:val="single" w:sz="4" w:space="0" w:color="E5E5EA"/>
-                              </w:tcBorders>
-                              <w:vAlign w:val="center"/>
-                              <w:tcMar>
-                                <w:top w:w="90" w:type="dxa"/>
-                                <w:bottom w:w="90" w:type="dxa"/>
-                                <w:left w:w="40" w:type="dxa"/>
-                                <w:right w:w="40" w:type="dxa"/>
-                              </w:tcMar>
-                            </w:tcPr>
-                            <w:p>
-                              <w:pPr>
-                                <w:spacing w:before="0" w:after="0"/>
-                                <w:jc w:val="right"/>
-                              </w:pPr>
-                              <w:r>
-                                <w:rPr>
-                                  <w:rFonts w:ascii="Helvetica Neue" w:hAnsi="Helvetica Neue" w:cs="Helvetica Neue"/>
-                                  <w:sz w:val="15"/>
-                                  <w:szCs w:val="15"/>
-                                  <w:color w:val="86868B"/>
-                                  <w:b/>
-                                  <w:caps/>
-                                  <w:spacing w:val="14"/>
-                                </w:rPr>
-                                <w:t xml:space="preserve">Menge</w:t>
-                              </w:r>
-                            </w:p>
-                          </w:tc>
-                          <w:tc>
-                            <w:tcPr>
-                              <w:tcW w:w="910" w:type="pct"/>
-                              <w:tcBorders>
-                                <w:bottom w:val="single" w:sz="4" w:space="0" w:color="E5E5EA"/>
-                              </w:tcBorders>
-                              <w:vAlign w:val="center"/>
-                              <w:tcMar>
-                                <w:top w:w="90" w:type="dxa"/>
-                                <w:bottom w:w="90" w:type="dxa"/>
-                                <w:left w:w="40" w:type="dxa"/>
-                                <w:right w:w="40" w:type="dxa"/>
-                              </w:tcMar>
-                            </w:tcPr>
-                            <w:p>
-                              <w:pPr>
-                                <w:spacing w:before="0" w:after="0"/>
-                                <w:jc w:val="right"/>
-                              </w:pPr>
-                              <w:r>
-                                <w:rPr>
-                                  <w:rFonts w:ascii="Helvetica Neue" w:hAnsi="Helvetica Neue" w:cs="Helvetica Neue"/>
-                                  <w:sz w:val="15"/>
-                                  <w:szCs w:val="15"/>
-                                  <w:color w:val="86868B"/>
-                                  <w:b/>
-                                  <w:caps/>
-                                  <w:spacing w:val="14"/>
-                                </w:rPr>
-                                <w:t xml:space="preserve">Summe CHF</w:t>
-                              </w:r>
-                            </w:p>
-                          </w:tc>
-                        </w:tr>
-                        <w:tr>
-                          <w:tc>
-                            <w:tcPr>
-                              <w:tcW w:w="360" w:type="pct"/>
-                              <w:tcBorders>
-                                <w:bottom w:val="single" w:sz="4" w:space="0" w:color="E5E5EA"/>
-                              </w:tcBorders>
-                              <w:vAlign w:val="center"/>
-                              <w:tcMar>
-                                <w:top w:w="90" w:type="dxa"/>
-                                <w:bottom w:w="90" w:type="dxa"/>
-                                <w:left w:w="40" w:type="dxa"/>
-                                <w:right w:w="40" w:type="dxa"/>
-                              </w:tcMar>
-                            </w:tcPr>
-                            <w:p>
-                              <w:pPr>
-                                <w:spacing w:before="0" w:after="0"/>
-                                <w:jc w:val="left"/>
-                              </w:pPr>
-                              <w:r>
-                                <w:rPr>
-                                  <w:rFonts w:ascii="Helvetica Neue" w:hAnsi="Helvetica Neue" w:cs="Helvetica Neue"/>
-                                  <w:sz w:val="19"/>
-                                  <w:szCs w:val="19"/>
-                                  <w:color w:val="86868B"/>
-                                  <w:b/>
-                                </w:rPr>
-                                <w:t xml:space="preserve">01</w:t>
-                              </w:r>
-                            </w:p>
-                          </w:tc>
-                          <w:tc>
-                            <w:tcPr>
-                              <w:tcW w:w="2350" w:type="pct"/>
-                              <w:tcBorders>
-                                <w:bottom w:val="single" w:sz="4" w:space="0" w:color="E5E5EA"/>
-                              </w:tcBorders>
-                              <w:vAlign w:val="center"/>
-                              <w:tcMar>
-                                <w:top w:w="90" w:type="dxa"/>
-                                <w:bottom w:w="90" w:type="dxa"/>
-                                <w:left w:w="40" w:type="dxa"/>
-                                <w:right w:w="40" w:type="dxa"/>
-                              </w:tcMar>
-                            </w:tcPr>
-                            <w:p>
-                              <w:pPr>
-                                <w:spacing w:before="0" w:after="20"/>
-                              </w:pPr>
-                              <w:r>
-                                <w:rPr>
-                                  <w:rFonts w:ascii="Helvetica Neue" w:hAnsi="Helvetica Neue" w:cs="Helvetica Neue"/>
-                                  <w:sz w:val="20"/>
-                                  <w:szCs w:val="20"/>
-                                  <w:color w:val="1D1D1F"/>
-                                  <w:b/>
-                                </w:rPr>
-                                <w:t xml:space="preserve">{{Leistung 1}}</w:t>
-                              </w:r>
-                            </w:p>
-                            <w:p>
-                              <w:pPr>
-                                <w:spacing w:before="0" w:after="0"/>
-                              </w:pPr>
-                              <w:r>
-                                <w:rPr>
-                                  <w:rFonts w:ascii="Helvetica Neue" w:hAnsi="Helvetica Neue" w:cs="Helvetica Neue"/>
-                                  <w:sz w:val="17"/>
-                                  <w:szCs w:val="17"/>
-                                  <w:color w:val="86868B"/>
-                                </w:rPr>
-                                <w:t xml:space="preserve">{{Detail / Beschreibung}}</w:t>
-                              </w:r>
-                            </w:p>
-                          </w:tc>
-                          <w:tc>
-                            <w:tcPr>
-                              <w:tcW w:w="900" w:type="pct"/>
-                              <w:tcBorders>
-                                <w:bottom w:val="single" w:sz="4" w:space="0" w:color="E5E5EA"/>
-                              </w:tcBorders>
-                              <w:vAlign w:val="center"/>
-                              <w:tcMar>
-                                <w:top w:w="90" w:type="dxa"/>
-                                <w:bottom w:w="90" w:type="dxa"/>
-                                <w:left w:w="40" w:type="dxa"/>
-                                <w:right w:w="40" w:type="dxa"/>
-                              </w:tcMar>
-                            </w:tcPr>
-                            <w:p>
-                              <w:pPr>
-                                <w:spacing w:before="0" w:after="0"/>
-                                <w:jc w:val="right"/>
-                              </w:pPr>
-                              <w:r>
-                                <w:rPr>
-                                  <w:rFonts w:ascii="Helvetica Neue" w:hAnsi="Helvetica Neue" w:cs="Helvetica Neue"/>
-                                  <w:sz w:val="19"/>
-                                  <w:szCs w:val="19"/>
-                                  <w:color w:val="1D1D1F"/>
-                                </w:rPr>
-                                <w:t xml:space="preserve">0.00</w:t>
-                              </w:r>
-                            </w:p>
-                          </w:tc>
-                          <w:tc>
-                            <w:tcPr>
-                              <w:tcW w:w="480" w:type="pct"/>
-                              <w:tcBorders>
-                                <w:bottom w:val="single" w:sz="4" w:space="0" w:color="E5E5EA"/>
-                              </w:tcBorders>
-                              <w:vAlign w:val="center"/>
-                              <w:tcMar>
-                                <w:top w:w="90" w:type="dxa"/>
-                                <w:bottom w:w="90" w:type="dxa"/>
-                                <w:left w:w="40" w:type="dxa"/>
-                                <w:right w:w="40" w:type="dxa"/>
-                              </w:tcMar>
-                            </w:tcPr>
-                            <w:p>
-                              <w:pPr>
-                                <w:spacing w:before="0" w:after="0"/>
-                                <w:jc w:val="right"/>
-                              </w:pPr>
-                              <w:r>
-                                <w:rPr>
-                                  <w:rFonts w:ascii="Helvetica Neue" w:hAnsi="Helvetica Neue" w:cs="Helvetica Neue"/>
-                                  <w:sz w:val="19"/>
-                                  <w:szCs w:val="19"/>
-                                  <w:color w:val="1D1D1F"/>
-                                </w:rPr>
-                                <w:t xml:space="preserve">1</w:t>
-                              </w:r>
-                            </w:p>
-                          </w:tc>
-                          <w:tc>
-                            <w:tcPr>
-                              <w:tcW w:w="910" w:type="pct"/>
-                              <w:tcBorders>
-                                <w:bottom w:val="single" w:sz="4" w:space="0" w:color="E5E5EA"/>
-                              </w:tcBorders>
-                              <w:vAlign w:val="center"/>
-                              <w:tcMar>
-                                <w:top w:w="90" w:type="dxa"/>
-                                <w:bottom w:w="90" w:type="dxa"/>
-                                <w:left w:w="40" w:type="dxa"/>
-                                <w:right w:w="40" w:type="dxa"/>
-                              </w:tcMar>
-                            </w:tcPr>
-                            <w:p>
-                              <w:pPr>
-                                <w:spacing w:before="0" w:after="0"/>
-                                <w:jc w:val="right"/>
-                              </w:pPr>
-                              <w:r>
-                                <w:rPr>
-                                  <w:rFonts w:ascii="Helvetica Neue" w:hAnsi="Helvetica Neue" w:cs="Helvetica Neue"/>
-                                  <w:sz w:val="19"/>
-                                  <w:szCs w:val="19"/>
-                                  <w:color w:val="000D6E"/>
-                                  <w:b/>
-                                </w:rPr>
-                                <w:t xml:space="preserve">0.00</w:t>
-                              </w:r>
-                            </w:p>
-                          </w:tc>
-                        </w:tr>
-                        <w:tr>
-                          <w:tc>
-                            <w:tcPr>
-                              <w:tcW w:w="360" w:type="pct"/>
-                              <w:tcBorders>
-                                <w:bottom w:val="single" w:sz="4" w:space="0" w:color="E5E5EA"/>
-                              </w:tcBorders>
-                              <w:vAlign w:val="center"/>
-                              <w:tcMar>
-                                <w:top w:w="90" w:type="dxa"/>
-                                <w:bottom w:w="90" w:type="dxa"/>
-                                <w:left w:w="40" w:type="dxa"/>
-                                <w:right w:w="40" w:type="dxa"/>
-                              </w:tcMar>
-                            </w:tcPr>
-                            <w:p>
-                              <w:pPr>
-                                <w:spacing w:before="0" w:after="0"/>
-                                <w:jc w:val="left"/>
-                              </w:pPr>
-                              <w:r>
-                                <w:rPr>
-                                  <w:rFonts w:ascii="Helvetica Neue" w:hAnsi="Helvetica Neue" w:cs="Helvetica Neue"/>
-                                  <w:sz w:val="19"/>
-                                  <w:szCs w:val="19"/>
-                                  <w:color w:val="86868B"/>
-                                  <w:b/>
-                                </w:rPr>
-                                <w:t xml:space="preserve">02</w:t>
-                              </w:r>
-                            </w:p>
-                          </w:tc>
-                          <w:tc>
-                            <w:tcPr>
-                              <w:tcW w:w="2350" w:type="pct"/>
-                              <w:tcBorders>
-                                <w:bottom w:val="single" w:sz="4" w:space="0" w:color="E5E5EA"/>
-                              </w:tcBorders>
-                              <w:vAlign w:val="center"/>
-                              <w:tcMar>
-                                <w:top w:w="90" w:type="dxa"/>
-                                <w:bottom w:w="90" w:type="dxa"/>
-                                <w:left w:w="40" w:type="dxa"/>
-                                <w:right w:w="40" w:type="dxa"/>
-                              </w:tcMar>
-                            </w:tcPr>
-                            <w:p>
-                              <w:pPr>
-                                <w:spacing w:before="0" w:after="20"/>
-                              </w:pPr>
-                              <w:r>
-                                <w:rPr>
-                                  <w:rFonts w:ascii="Helvetica Neue" w:hAnsi="Helvetica Neue" w:cs="Helvetica Neue"/>
-                                  <w:sz w:val="20"/>
-                                  <w:szCs w:val="20"/>
-                                  <w:color w:val="1D1D1F"/>
-                                  <w:b/>
-                                </w:rPr>
-                                <w:t xml:space="preserve">{{Leistung 2}}</w:t>
-                              </w:r>
-                            </w:p>
-                            <w:p>
-                              <w:pPr>
-                                <w:spacing w:before="0" w:after="0"/>
-                              </w:pPr>
-                              <w:r>
-                                <w:rPr>
-                                  <w:rFonts w:ascii="Helvetica Neue" w:hAnsi="Helvetica Neue" w:cs="Helvetica Neue"/>
-                                  <w:sz w:val="17"/>
-                                  <w:szCs w:val="17"/>
-                                  <w:color w:val="86868B"/>
-                                </w:rPr>
-                                <w:t xml:space="preserve">{{Detail / Beschreibung}}</w:t>
-                              </w:r>
-                            </w:p>
-                          </w:tc>
-                          <w:tc>
-                            <w:tcPr>
-                              <w:tcW w:w="900" w:type="pct"/>
-                              <w:tcBorders>
-                                <w:bottom w:val="single" w:sz="4" w:space="0" w:color="E5E5EA"/>
-                              </w:tcBorders>
-                              <w:vAlign w:val="center"/>
-                              <w:tcMar>
-                                <w:top w:w="90" w:type="dxa"/>
-                                <w:bottom w:w="90" w:type="dxa"/>
-                                <w:left w:w="40" w:type="dxa"/>
-                                <w:right w:w="40" w:type="dxa"/>
-                              </w:tcMar>
-                            </w:tcPr>
-                            <w:p>
-                              <w:pPr>
-                                <w:spacing w:before="0" w:after="0"/>
-                                <w:jc w:val="right"/>
-                              </w:pPr>
-                              <w:r>
-                                <w:rPr>
-                                  <w:rFonts w:ascii="Helvetica Neue" w:hAnsi="Helvetica Neue" w:cs="Helvetica Neue"/>
-                                  <w:sz w:val="19"/>
-                                  <w:szCs w:val="19"/>
-                                  <w:color w:val="1D1D1F"/>
-                                </w:rPr>
-                                <w:t xml:space="preserve">0.00</w:t>
-                              </w:r>
-                            </w:p>
-                          </w:tc>
-                          <w:tc>
-                            <w:tcPr>
-                              <w:tcW w:w="480" w:type="pct"/>
-                              <w:tcBorders>
-                                <w:bottom w:val="single" w:sz="4" w:space="0" w:color="E5E5EA"/>
-                              </w:tcBorders>
-                              <w:vAlign w:val="center"/>
-                              <w:tcMar>
-                                <w:top w:w="90" w:type="dxa"/>
-                                <w:bottom w:w="90" w:type="dxa"/>
-                                <w:left w:w="40" w:type="dxa"/>
-                                <w:right w:w="40" w:type="dxa"/>
-                              </w:tcMar>
-                            </w:tcPr>
-                            <w:p>
-                              <w:pPr>
-                                <w:spacing w:before="0" w:after="0"/>
-                                <w:jc w:val="right"/>
-                              </w:pPr>
-                              <w:r>
-                                <w:rPr>
-                                  <w:rFonts w:ascii="Helvetica Neue" w:hAnsi="Helvetica Neue" w:cs="Helvetica Neue"/>
-                                  <w:sz w:val="19"/>
-                                  <w:szCs w:val="19"/>
-                                  <w:color w:val="1D1D1F"/>
-                                </w:rPr>
-                                <w:t xml:space="preserve">1</w:t>
-                              </w:r>
-                            </w:p>
-                          </w:tc>
-                          <w:tc>
-                            <w:tcPr>
-                              <w:tcW w:w="910" w:type="pct"/>
-                              <w:tcBorders>
-                                <w:bottom w:val="single" w:sz="4" w:space="0" w:color="E5E5EA"/>
-                              </w:tcBorders>
-                              <w:vAlign w:val="center"/>
-                              <w:tcMar>
-                                <w:top w:w="90" w:type="dxa"/>
-                                <w:bottom w:w="90" w:type="dxa"/>
-                                <w:left w:w="40" w:type="dxa"/>
-                                <w:right w:w="40" w:type="dxa"/>
-                              </w:tcMar>
-                            </w:tcPr>
-                            <w:p>
-                              <w:pPr>
-                                <w:spacing w:before="0" w:after="0"/>
-                                <w:jc w:val="right"/>
-                              </w:pPr>
-                              <w:r>
-                                <w:rPr>
-                                  <w:rFonts w:ascii="Helvetica Neue" w:hAnsi="Helvetica Neue" w:cs="Helvetica Neue"/>
-                                  <w:sz w:val="19"/>
-                                  <w:szCs w:val="19"/>
-                                  <w:color w:val="000D6E"/>
-                                  <w:b/>
-                                </w:rPr>
-                                <w:t xml:space="preserve">0.00</w:t>
-                              </w:r>
-                            </w:p>
-                          </w:tc>
-                        </w:tr>
-                        <w:tr>
-                          <w:tc>
-                            <w:tcPr>
-                              <w:tcW w:w="360" w:type="pct"/>
-                              <w:vAlign w:val="center"/>
-                              <w:tcMar>
-                                <w:top w:w="90" w:type="dxa"/>
-                                <w:bottom w:w="90" w:type="dxa"/>
-                                <w:left w:w="40" w:type="dxa"/>
-                                <w:right w:w="40" w:type="dxa"/>
-                              </w:tcMar>
-                            </w:tcPr>
-                            <w:p>
-                              <w:pPr>
-                                <w:spacing w:before="0" w:after="0"/>
-                                <w:jc w:val="left"/>
-                              </w:pPr>
-                              <w:r>
-                                <w:rPr>
-                                  <w:rFonts w:ascii="Helvetica Neue" w:hAnsi="Helvetica Neue" w:cs="Helvetica Neue"/>
-                                  <w:sz w:val="19"/>
-                                  <w:szCs w:val="19"/>
-                                  <w:color w:val="86868B"/>
-                                  <w:b/>
-                                </w:rPr>
-                                <w:t xml:space="preserve">03</w:t>
-                              </w:r>
-                            </w:p>
-                          </w:tc>
-                          <w:tc>
-                            <w:tcPr>
-                              <w:tcW w:w="2350" w:type="pct"/>
-                              <w:vAlign w:val="center"/>
-                              <w:tcMar>
-                                <w:top w:w="90" w:type="dxa"/>
-                                <w:bottom w:w="90" w:type="dxa"/>
-                                <w:left w:w="40" w:type="dxa"/>
-                                <w:right w:w="40" w:type="dxa"/>
-                              </w:tcMar>
-                            </w:tcPr>
-                            <w:p>
-                              <w:pPr>
-                                <w:spacing w:before="0" w:after="20"/>
-                              </w:pPr>
-                              <w:r>
-                                <w:rPr>
-                                  <w:rFonts w:ascii="Helvetica Neue" w:hAnsi="Helvetica Neue" w:cs="Helvetica Neue"/>
-                                  <w:sz w:val="20"/>
-                                  <w:szCs w:val="20"/>
-                                  <w:color w:val="1D1D1F"/>
-                                  <w:b/>
-                                </w:rPr>
-                                <w:t xml:space="preserve">{{Leistung 3}}</w:t>
-                              </w:r>
-                            </w:p>
-                            <w:p>
-                              <w:pPr>
-                                <w:spacing w:before="0" w:after="0"/>
-                              </w:pPr>
-                              <w:r>
-                                <w:rPr>
-                                  <w:rFonts w:ascii="Helvetica Neue" w:hAnsi="Helvetica Neue" w:cs="Helvetica Neue"/>
-                                  <w:sz w:val="17"/>
-                                  <w:szCs w:val="17"/>
-                                  <w:color w:val="86868B"/>
-                                </w:rPr>
-                                <w:t xml:space="preserve">{{Detail / Beschreibung}}</w:t>
-                              </w:r>
-                            </w:p>
-                          </w:tc>
-                          <w:tc>
-                            <w:tcPr>
-                              <w:tcW w:w="900" w:type="pct"/>
-                              <w:vAlign w:val="center"/>
-                              <w:tcMar>
-                                <w:top w:w="90" w:type="dxa"/>
-                                <w:bottom w:w="90" w:type="dxa"/>
-                                <w:left w:w="40" w:type="dxa"/>
-                                <w:right w:w="40" w:type="dxa"/>
-                              </w:tcMar>
-                            </w:tcPr>
-                            <w:p>
-                              <w:pPr>
-                                <w:spacing w:before="0" w:after="0"/>
-                                <w:jc w:val="right"/>
-                              </w:pPr>
-                              <w:r>
-                                <w:rPr>
-                                  <w:rFonts w:ascii="Helvetica Neue" w:hAnsi="Helvetica Neue" w:cs="Helvetica Neue"/>
-                                  <w:sz w:val="19"/>
-                                  <w:szCs w:val="19"/>
-                                  <w:color w:val="1D1D1F"/>
-                                </w:rPr>
-                                <w:t xml:space="preserve">0.00</w:t>
-                              </w:r>
-                            </w:p>
-                          </w:tc>
-                          <w:tc>
-                            <w:tcPr>
-                              <w:tcW w:w="480" w:type="pct"/>
-                              <w:vAlign w:val="center"/>
-                              <w:tcMar>
-                                <w:top w:w="90" w:type="dxa"/>
-                                <w:bottom w:w="90" w:type="dxa"/>
-                                <w:left w:w="40" w:type="dxa"/>
-                                <w:right w:w="40" w:type="dxa"/>
-                              </w:tcMar>
-                            </w:tcPr>
-                            <w:p>
-                              <w:pPr>
-                                <w:spacing w:before="0" w:after="0"/>
-                                <w:jc w:val="right"/>
-                              </w:pPr>
-                              <w:r>
-                                <w:rPr>
-                                  <w:rFonts w:ascii="Helvetica Neue" w:hAnsi="Helvetica Neue" w:cs="Helvetica Neue"/>
-                                  <w:sz w:val="19"/>
-                                  <w:szCs w:val="19"/>
-                                  <w:color w:val="1D1D1F"/>
-                                </w:rPr>
-                                <w:t xml:space="preserve">1</w:t>
-                              </w:r>
-                            </w:p>
-                          </w:tc>
-                          <w:tc>
-                            <w:tcPr>
-                              <w:tcW w:w="910" w:type="pct"/>
-                              <w:vAlign w:val="center"/>
-                              <w:tcMar>
-                                <w:top w:w="90" w:type="dxa"/>
-                                <w:bottom w:w="90" w:type="dxa"/>
-                                <w:left w:w="40" w:type="dxa"/>
-                                <w:right w:w="40" w:type="dxa"/>
-                              </w:tcMar>
-                            </w:tcPr>
-                            <w:p>
-                              <w:pPr>
-                                <w:spacing w:before="0" w:after="0"/>
-                                <w:jc w:val="right"/>
-                              </w:pPr>
-                              <w:r>
-                                <w:rPr>
-                                  <w:rFonts w:ascii="Helvetica Neue" w:hAnsi="Helvetica Neue" w:cs="Helvetica Neue"/>
-                                  <w:sz w:val="19"/>
-                                  <w:szCs w:val="19"/>
-                                  <w:color w:val="000D6E"/>
-                                  <w:b/>
-                                </w:rPr>
-                                <w:t xml:space="preserve">0.00</w:t>
-                              </w:r>
-                            </w:p>
-                          </w:tc>
-                        </w:tr>
-                      </w:tbl>
-                    </w:txbxContent>
-                  </wps:txbx>
-                  <wps:bodyPr rot="0" wrap="square" lIns="180000" tIns="144000" rIns="180000" bIns="144000" anchor="t">
-                    <a:spAutoFit/>
-                  </wps:bodyPr>
-                </wps:wsp>
-              </a:graphicData>
-            </a:graphic>
-          </wp:inline>
-        </w:drawing>
-      </w:r>
-    </w:p>
-    <w:p>
-      <w:pPr>
-        <w:spacing w:after="0" w:before="0"/>
-        <w:spacing w:line="160" w:lineRule="exact"/>
+        <w:spacing w:line="200" w:lineRule="exact"/>
       </w:pPr>
     </w:p>
     <w:tbl>
@@ -1340,291 +1765,346 @@
       <w:tr>
         <w:tc>
           <w:tcPr>
-            <w:tcW w:type="dxa" w:w="4876"/>
+            <w:tcW w:type="dxa" w:w="5443"/>
           </w:tcPr>
           <w:p/>
         </w:tc>
         <w:tc>
           <w:tcPr>
-            <w:tcW w:type="dxa" w:w="4989"/>
+            <w:tcW w:type="dxa" w:w="4422"/>
+            <w:vAlign w:val="top"/>
+          </w:tcPr>
+          <w:tbl>
+            <w:tblPr>
+              <w:tblW w:type="auto" w:w="0"/>
+              <w:tblLook w:firstColumn="1" w:firstRow="1" w:lastColumn="0" w:lastRow="0" w:noHBand="0" w:noVBand="1" w:val="04A0"/>
+              <w:tblBorders>
+                <w:top w:val="none"/>
+                <w:left w:val="none"/>
+                <w:bottom w:val="none"/>
+                <w:right w:val="none"/>
+                <w:insideH w:val="none"/>
+                <w:insideV w:val="none"/>
+              </w:tblBorders>
+            </w:tblPr>
+            <w:tblGrid>
+              <w:gridCol w:w="2211"/>
+              <w:gridCol w:w="2211"/>
+            </w:tblGrid>
+            <w:tr>
+              <w:tc>
+                <w:tcPr>
+                  <w:tcW w:type="dxa" w:w="2721"/>
+                  <w:shd w:val="clear" w:color="auto" w:fill="F5F5F7"/>
+                  <w:tcMar>
+                    <w:top w:w="60" w:type="dxa"/>
+                    <w:bottom w:w="60" w:type="dxa"/>
+                    <w:left w:w="120" w:type="dxa"/>
+                    <w:right w:w="120" w:type="dxa"/>
+                  </w:tcMar>
+                  <w:vAlign w:val="center"/>
+                </w:tcPr>
+                <w:p>
+                  <w:pPr>
+                    <w:jc w:val="left"/>
+                  </w:pPr>
+                  <w:r>
+                    <w:rPr>
+                      <w:rFonts w:ascii="Helvetica Neue" w:hAnsi="Helvetica Neue" w:cs="Helvetica Neue"/>
+                      <w:rFonts w:ascii="Helvetica Neue" w:hAnsi="Helvetica Neue"/>
+                      <w:b w:val="0"/>
+                      <w:i w:val="0"/>
+                      <w:color w:val="86868B"/>
+                      <w:sz w:val="18"/>
+                      <w:spacing w:val="0"/>
+                    </w:rPr>
+                    <w:t>Zwischensumme</w:t>
+                  </w:r>
+                </w:p>
+              </w:tc>
+              <w:tc>
+                <w:tcPr>
+                  <w:tcW w:type="dxa" w:w="1701"/>
+                  <w:shd w:val="clear" w:color="auto" w:fill="F5F5F7"/>
+                  <w:tcMar>
+                    <w:top w:w="60" w:type="dxa"/>
+                    <w:bottom w:w="60" w:type="dxa"/>
+                    <w:left w:w="120" w:type="dxa"/>
+                    <w:right w:w="120" w:type="dxa"/>
+                  </w:tcMar>
+                  <w:vAlign w:val="center"/>
+                </w:tcPr>
+                <w:p>
+                  <w:pPr>
+                    <w:jc w:val="right"/>
+                  </w:pPr>
+                  <w:sdt>
+                    <w:sdtPr>
+                      <w:rPr>
+                        <w:rFonts w:ascii="Helvetica Neue" w:hAnsi="Helvetica Neue" w:cs="Helvetica Neue"/>
+                        <w:sz w:val="19"/>
+                        <w:szCs w:val="19"/>
+                        <w:color w:val="1D1D1F"/>
+                        <w:b/>
+                      </w:rPr>
+                      <w:alias w:val="Zwischensumme"/>
+                      <w:tag w:val="Zwischensumme"/>
+                      <w:id w:val="1029"/>
+                      <w:dataBinding w:prefixMappings="xmlns:ns0='http://kabuu/doc'" w:xpath="/ns0:doc[1]/ns0:Zwischensumme[1]" w:storeItemID="{6F1B2C3D-4E5A-4B6C-8D7E-9A0B1C2D3E4F}"/>
+                      <w:text/>
+                    </w:sdtPr>
+                    <w:sdtContent>
+                      <w:r>
+                        <w:rPr>
+                          <w:rFonts w:ascii="Helvetica Neue" w:hAnsi="Helvetica Neue" w:cs="Helvetica Neue"/>
+                          <w:sz w:val="19"/>
+                          <w:szCs w:val="19"/>
+                          <w:color w:val="1D1D1F"/>
+                          <w:b/>
+                        </w:rPr>
+                        <w:t xml:space="preserve">1250.00</w:t>
+                      </w:r>
+                    </w:sdtContent>
+                  </w:sdt>
+                </w:p>
+              </w:tc>
+            </w:tr>
+            <w:tr>
+              <w:tc>
+                <w:tcPr>
+                  <w:tcW w:type="dxa" w:w="2721"/>
+                  <w:shd w:val="clear" w:color="auto" w:fill="F5F5F7"/>
+                  <w:tcMar>
+                    <w:top w:w="60" w:type="dxa"/>
+                    <w:bottom w:w="60" w:type="dxa"/>
+                    <w:left w:w="120" w:type="dxa"/>
+                    <w:right w:w="120" w:type="dxa"/>
+                  </w:tcMar>
+                  <w:vAlign w:val="center"/>
+                </w:tcPr>
+                <w:p>
+                  <w:pPr>
+                    <w:jc w:val="left"/>
+                  </w:pPr>
+                  <w:r>
+                    <w:rPr>
+                      <w:rFonts w:ascii="Helvetica Neue" w:hAnsi="Helvetica Neue" w:cs="Helvetica Neue"/>
+                      <w:rFonts w:ascii="Helvetica Neue" w:hAnsi="Helvetica Neue"/>
+                      <w:b w:val="0"/>
+                      <w:i w:val="0"/>
+                      <w:color w:val="86868B"/>
+                      <w:sz w:val="18"/>
+                      <w:spacing w:val="0"/>
+                    </w:rPr>
+                    <w:t>MWST (§19 UStG)</w:t>
+                  </w:r>
+                </w:p>
+              </w:tc>
+              <w:tc>
+                <w:tcPr>
+                  <w:tcW w:type="dxa" w:w="1701"/>
+                  <w:shd w:val="clear" w:color="auto" w:fill="F5F5F7"/>
+                  <w:tcMar>
+                    <w:top w:w="60" w:type="dxa"/>
+                    <w:bottom w:w="60" w:type="dxa"/>
+                    <w:left w:w="120" w:type="dxa"/>
+                    <w:right w:w="120" w:type="dxa"/>
+                  </w:tcMar>
+                  <w:vAlign w:val="center"/>
+                </w:tcPr>
+                <w:p>
+                  <w:pPr>
+                    <w:jc w:val="right"/>
+                  </w:pPr>
+                  <w:r>
+                    <w:rPr>
+                      <w:rFonts w:ascii="Helvetica Neue" w:hAnsi="Helvetica Neue" w:cs="Helvetica Neue"/>
+                      <w:rFonts w:ascii="Helvetica Neue" w:hAnsi="Helvetica Neue"/>
+                      <w:b/>
+                      <w:i w:val="0"/>
+                      <w:color w:val="1D1D1F"/>
+                      <w:sz w:val="19"/>
+                    </w:rPr>
+                    <w:t>0.00</w:t>
+                  </w:r>
+                </w:p>
+              </w:tc>
+            </w:tr>
+          </w:tbl>
+          <w:p/>
+          <w:p>
+            <w:pPr>
+              <w:spacing w:after="0"/>
+              <w:spacing w:line="100" w:lineRule="exact"/>
+            </w:pPr>
+          </w:p>
+          <w:tbl>
+            <w:tblPr>
+              <w:tblW w:type="auto" w:w="0"/>
+              <w:tblLook w:firstColumn="1" w:firstRow="1" w:lastColumn="0" w:lastRow="0" w:noHBand="0" w:noVBand="1" w:val="04A0"/>
+              <w:tblBorders>
+                <w:top w:val="none"/>
+                <w:left w:val="none"/>
+                <w:bottom w:val="none"/>
+                <w:right w:val="none"/>
+                <w:insideH w:val="none"/>
+                <w:insideV w:val="none"/>
+              </w:tblBorders>
+            </w:tblPr>
+            <w:tblGrid>
+              <w:gridCol w:w="2211"/>
+              <w:gridCol w:w="2211"/>
+            </w:tblGrid>
+            <w:tr>
+              <w:tc>
+                <w:tcPr>
+                  <w:tcW w:type="dxa" w:w="2721"/>
+                  <w:shd w:val="clear" w:color="auto" w:fill="000D6E"/>
+                  <w:tcMar>
+                    <w:top w:w="60" w:type="dxa"/>
+                    <w:bottom w:w="60" w:type="dxa"/>
+                    <w:left w:w="120" w:type="dxa"/>
+                    <w:right w:w="120" w:type="dxa"/>
+                  </w:tcMar>
+                  <w:vAlign w:val="center"/>
+                </w:tcPr>
+                <w:p>
+                  <w:pPr>
+                    <w:jc w:val="left"/>
+                  </w:pPr>
+                  <w:r>
+                    <w:rPr>
+                      <w:rFonts w:ascii="Helvetica Neue" w:hAnsi="Helvetica Neue" w:cs="Helvetica Neue"/>
+                      <w:rFonts w:ascii="Helvetica Neue" w:hAnsi="Helvetica Neue"/>
+                      <w:b/>
+                      <w:i w:val="0"/>
+                      <w:caps/>
+                      <w:color w:val="FFFFFF"/>
+                      <w:sz w:val="22"/>
+                      <w:spacing w:val="16"/>
+                    </w:rPr>
+                    <w:t>Gesamtbetrag</w:t>
+                  </w:r>
+                </w:p>
+              </w:tc>
+              <w:tc>
+                <w:tcPr>
+                  <w:tcW w:type="dxa" w:w="1701"/>
+                  <w:shd w:val="clear" w:color="auto" w:fill="000D6E"/>
+                  <w:tcMar>
+                    <w:top w:w="60" w:type="dxa"/>
+                    <w:bottom w:w="60" w:type="dxa"/>
+                    <w:left w:w="120" w:type="dxa"/>
+                    <w:right w:w="120" w:type="dxa"/>
+                  </w:tcMar>
+                  <w:vAlign w:val="center"/>
+                </w:tcPr>
+                <w:p>
+                  <w:pPr>
+                    <w:jc w:val="right"/>
+                  </w:pPr>
+                  <w:sdt>
+                    <w:sdtPr>
+                      <w:rPr>
+                        <w:rFonts w:ascii="Helvetica Neue" w:hAnsi="Helvetica Neue" w:cs="Helvetica Neue"/>
+                        <w:sz w:val="26"/>
+                        <w:szCs w:val="26"/>
+                        <w:color w:val="FFFFFF"/>
+                        <w:b/>
+                      </w:rPr>
+                      <w:alias w:val="Gesamtsumme"/>
+                      <w:tag w:val="Gesamtsumme"/>
+                      <w:id w:val="1030"/>
+                      <w:dataBinding w:prefixMappings="xmlns:ns0='http://kabuu/doc'" w:xpath="/ns0:doc[1]/ns0:Gesamtsumme[1]" w:storeItemID="{6F1B2C3D-4E5A-4B6C-8D7E-9A0B1C2D3E4F}"/>
+                      <w:text/>
+                    </w:sdtPr>
+                    <w:sdtContent>
+                      <w:r>
+                        <w:rPr>
+                          <w:rFonts w:ascii="Helvetica Neue" w:hAnsi="Helvetica Neue" w:cs="Helvetica Neue"/>
+                          <w:sz w:val="26"/>
+                          <w:szCs w:val="26"/>
+                          <w:color w:val="FFFFFF"/>
+                          <w:b/>
+                        </w:rPr>
+                        <w:t xml:space="preserve">1250.00</w:t>
+                      </w:r>
+                    </w:sdtContent>
+                  </w:sdt>
+                </w:p>
+              </w:tc>
+            </w:tr>
+          </w:tbl>
+          <w:p/>
+        </w:tc>
+      </w:tr>
+    </w:tbl>
+    <w:p>
+      <w:pPr>
+        <w:spacing w:line="200" w:lineRule="exact"/>
+      </w:pPr>
+    </w:p>
+    <w:tbl>
+      <w:tblPr>
+        <w:tblW w:type="auto" w:w="0"/>
+        <w:tblLayout w:type="fixed"/>
+        <w:tblLook w:firstColumn="1" w:firstRow="1" w:lastColumn="0" w:lastRow="0" w:noHBand="0" w:noVBand="1" w:val="04A0"/>
+        <w:tblBorders>
+          <w:top w:val="none"/>
+          <w:left w:val="none"/>
+          <w:bottom w:val="none"/>
+          <w:right w:val="none"/>
+          <w:insideH w:val="none"/>
+          <w:insideV w:val="none"/>
+        </w:tblBorders>
+      </w:tblPr>
+      <w:tblGrid>
+        <w:gridCol w:w="9866"/>
+      </w:tblGrid>
+      <w:tr>
+        <w:tc>
+          <w:tcPr>
+            <w:tcW w:type="dxa" w:w="9865"/>
+            <w:shd w:val="clear" w:color="auto" w:fill="F5F5F7"/>
+            <w:tcMar>
+              <w:top w:w="120" w:type="dxa"/>
+              <w:bottom w:w="120" w:type="dxa"/>
+              <w:left w:w="160" w:type="dxa"/>
+              <w:right w:w="160" w:type="dxa"/>
+            </w:tcMar>
+            <w:tcBorders>
+              <w:left w:val="single" w:sz="24" w:space="0" w:color="000D6E"/>
+            </w:tcBorders>
           </w:tcPr>
           <w:p>
             <w:r>
-              <w:drawing>
-                <wp:inline distT="0" distB="0" distL="0" distR="0">
-                  <wp:extent cx="3168000" cy="648000"/>
-                  <wp:effectExtent l="0" t="0" r="0" b="0"/>
-                  <wp:docPr id="104" name="Card104"/>
-                  <wp:cNvGraphicFramePr/>
-                  <a:graphic xmlns:a="http://schemas.openxmlformats.org/drawingml/2006/main">
-                    <a:graphicData uri="http://schemas.microsoft.com/office/word/2010/wordprocessingShape">
-                      <wps:wsp>
-                        <wps:cNvSpPr txBox="1"/>
-                        <wps:spPr>
-                          <a:xfrm>
-                            <a:off x="0" y="0"/>
-                            <a:ext cx="3168000" cy="648000"/>
-                          </a:xfrm>
-                          <a:prstGeom prst="roundRect">
-                            <a:avLst>
-                              <a:gd name="adj" fmla="val 12000"/>
-                            </a:avLst>
-                          </a:prstGeom>
-                          <a:solidFill>
-                            <a:srgbClr val="F5F5F7"/>
-                          </a:solidFill>
-                          <a:ln>
-                            <a:noFill/>
-                          </a:ln>
-                        </wps:spPr>
-                        <wps:txbx>
-                          <w:txbxContent>
-                            <w:tbl>
-                              <w:tblPr>
-                                <w:tblW w:w="5000" w:type="pct"/>
-                                <w:tblBorders>
-                                  <w:top w:val="none"/>
-                                  <w:left w:val="none"/>
-                                  <w:bottom w:val="none"/>
-                                  <w:right w:val="none"/>
-                                  <w:insideH w:val="none"/>
-                                  <w:insideV w:val="none"/>
-                                </w:tblBorders>
-                              </w:tblPr>
-                              <w:tr>
-                                <w:tc>
-                                  <w:tcPr>
-                                    <w:tcW w:w="3200" w:type="pct"/>
-                                    <w:vAlign w:val="center"/>
-                                    <w:tcMar>
-                                      <w:top w:w="60" w:type="dxa"/>
-                                      <w:bottom w:w="60" w:type="dxa"/>
-                                    </w:tcMar>
-                                  </w:tcPr>
-                                  <w:p>
-                                    <w:pPr>
-                                      <w:spacing w:before="0" w:after="0"/>
-                                      <w:jc w:val="right"/>
-                                    </w:pPr>
-                                    <w:r>
-                                      <w:rPr>
-                                        <w:rFonts w:ascii="Helvetica Neue" w:hAnsi="Helvetica Neue" w:cs="Helvetica Neue"/>
-                                        <w:sz w:val="19"/>
-                                        <w:szCs w:val="19"/>
-                                        <w:color w:val="86868B"/>
-                                        <w:spacing w:val="0"/>
-                                      </w:rPr>
-                                      <w:t xml:space="preserve">Zwischensumme</w:t>
-                                    </w:r>
-                                  </w:p>
-                                </w:tc>
-                                <w:tc>
-                                  <w:tcPr>
-                                    <w:tcW w:w="1800" w:type="pct"/>
-                                    <w:vAlign w:val="center"/>
-                                    <w:tcMar>
-                                      <w:top w:w="60" w:type="dxa"/>
-                                      <w:bottom w:w="60" w:type="dxa"/>
-                                    </w:tcMar>
-                                  </w:tcPr>
-                                  <w:p>
-                                    <w:pPr>
-                                      <w:spacing w:before="0" w:after="0"/>
-                                      <w:jc w:val="right"/>
-                                    </w:pPr>
-                                    <w:r>
-                                      <w:rPr>
-                                        <w:rFonts w:ascii="Helvetica Neue" w:hAnsi="Helvetica Neue" w:cs="Helvetica Neue"/>
-                                        <w:sz w:val="19"/>
-                                        <w:szCs w:val="19"/>
-                                        <w:color w:val="1D1D1F"/>
-                                        <w:b/>
-                                      </w:rPr>
-                                      <w:t xml:space="preserve">{{ZWISCHENSUMME}} CHF</w:t>
-                                    </w:r>
-                                  </w:p>
-                                </w:tc>
-                              </w:tr>
-                              <w:tr>
-                                <w:tc>
-                                  <w:tcPr>
-                                    <w:tcW w:w="3200" w:type="pct"/>
-                                    <w:vAlign w:val="center"/>
-                                    <w:tcMar>
-                                      <w:top w:w="60" w:type="dxa"/>
-                                      <w:bottom w:w="60" w:type="dxa"/>
-                                    </w:tcMar>
-                                  </w:tcPr>
-                                  <w:p>
-                                    <w:pPr>
-                                      <w:spacing w:before="0" w:after="0"/>
-                                      <w:jc w:val="right"/>
-                                    </w:pPr>
-                                    <w:r>
-                                      <w:rPr>
-                                        <w:rFonts w:ascii="Helvetica Neue" w:hAnsi="Helvetica Neue" w:cs="Helvetica Neue"/>
-                                        <w:sz w:val="19"/>
-                                        <w:szCs w:val="19"/>
-                                        <w:color w:val="86868B"/>
-                                        <w:spacing w:val="0"/>
-                                      </w:rPr>
-                                      <w:t xml:space="preserve">MWST (Kleinunternehmer §19)</w:t>
-                                    </w:r>
-                                  </w:p>
-                                </w:tc>
-                                <w:tc>
-                                  <w:tcPr>
-                                    <w:tcW w:w="1800" w:type="pct"/>
-                                    <w:vAlign w:val="center"/>
-                                    <w:tcMar>
-                                      <w:top w:w="60" w:type="dxa"/>
-                                      <w:bottom w:w="60" w:type="dxa"/>
-                                    </w:tcMar>
-                                  </w:tcPr>
-                                  <w:p>
-                                    <w:pPr>
-                                      <w:spacing w:before="0" w:after="0"/>
-                                      <w:jc w:val="right"/>
-                                    </w:pPr>
-                                    <w:r>
-                                      <w:rPr>
-                                        <w:rFonts w:ascii="Helvetica Neue" w:hAnsi="Helvetica Neue" w:cs="Helvetica Neue"/>
-                                        <w:sz w:val="19"/>
-                                        <w:szCs w:val="19"/>
-                                        <w:color w:val="1D1D1F"/>
-                                        <w:b/>
-                                      </w:rPr>
-                                      <w:t xml:space="preserve">0.00 CHF</w:t>
-                                    </w:r>
-                                  </w:p>
-                                </w:tc>
-                              </w:tr>
-                            </w:tbl>
-                          </w:txbxContent>
-                        </wps:txbx>
-                        <wps:bodyPr rot="0" wrap="square" lIns="180000" tIns="108000" rIns="180000" bIns="108000" anchor="t">
-                          <a:spAutoFit/>
-                        </wps:bodyPr>
-                      </wps:wsp>
-                    </a:graphicData>
-                  </a:graphic>
-                </wp:inline>
-              </w:drawing>
+              <w:rPr>
+                <w:rFonts w:ascii="Helvetica Neue" w:hAnsi="Helvetica Neue" w:cs="Helvetica Neue"/>
+                <w:rFonts w:ascii="Helvetica Neue" w:hAnsi="Helvetica Neue"/>
+                <w:b/>
+                <w:i w:val="0"/>
+                <w:caps/>
+                <w:color w:val="86868B"/>
+                <w:sz w:val="15"/>
+                <w:spacing w:val="24"/>
+              </w:rPr>
+              <w:t>Hinweis</w:t>
             </w:r>
           </w:p>
           <w:p>
             <w:pPr>
-              <w:spacing w:before="60"/>
+              <w:spacing w:before="40" w:line="288" w:lineRule="auto"/>
             </w:pPr>
             <w:r>
-              <w:drawing>
-                <wp:inline distT="0" distB="0" distL="0" distR="0">
-                  <wp:extent cx="3168000" cy="432000"/>
-                  <wp:effectExtent l="0" t="0" r="0" b="0"/>
-                  <wp:docPr id="105" name="Card105"/>
-                  <wp:cNvGraphicFramePr/>
-                  <a:graphic xmlns:a="http://schemas.openxmlformats.org/drawingml/2006/main">
-                    <a:graphicData uri="http://schemas.microsoft.com/office/word/2010/wordprocessingShape">
-                      <wps:wsp>
-                        <wps:cNvSpPr txBox="1"/>
-                        <wps:spPr>
-                          <a:xfrm>
-                            <a:off x="0" y="0"/>
-                            <a:ext cx="3168000" cy="432000"/>
-                          </a:xfrm>
-                          <a:prstGeom prst="roundRect">
-                            <a:avLst>
-                              <a:gd name="adj" fmla="val 16000"/>
-                            </a:avLst>
-                          </a:prstGeom>
-                          <a:solidFill>
-                            <a:srgbClr val="000D6E"/>
-                          </a:solidFill>
-                          <a:ln>
-                            <a:noFill/>
-                          </a:ln>
-                        </wps:spPr>
-                        <wps:txbx>
-                          <w:txbxContent>
-                            <w:tbl>
-                              <w:tblPr>
-                                <w:tblW w:w="5000" w:type="pct"/>
-                                <w:tblBorders>
-                                  <w:top w:val="none"/>
-                                  <w:left w:val="none"/>
-                                  <w:bottom w:val="none"/>
-                                  <w:right w:val="none"/>
-                                  <w:insideH w:val="none"/>
-                                  <w:insideV w:val="none"/>
-                                </w:tblBorders>
-                              </w:tblPr>
-                              <w:tr>
-                                <w:tc>
-                                  <w:tcPr>
-                                    <w:tcW w:w="3200" w:type="pct"/>
-                                    <w:vAlign w:val="center"/>
-                                    <w:tcMar>
-                                      <w:top w:w="60" w:type="dxa"/>
-                                      <w:bottom w:w="60" w:type="dxa"/>
-                                    </w:tcMar>
-                                  </w:tcPr>
-                                  <w:p>
-                                    <w:pPr>
-                                      <w:spacing w:before="0" w:after="0"/>
-                                      <w:jc w:val="right"/>
-                                    </w:pPr>
-                                    <w:r>
-                                      <w:rPr>
-                                        <w:rFonts w:ascii="Helvetica Neue" w:hAnsi="Helvetica Neue" w:cs="Helvetica Neue"/>
-                                        <w:sz w:val="22"/>
-                                        <w:szCs w:val="22"/>
-                                        <w:color w:val="FFFFFF"/>
-                                        <w:b/>
-                                        <w:caps/>
-                                        <w:spacing w:val="20"/>
-                                      </w:rPr>
-                                      <w:t xml:space="preserve">Gesamtbetrag</w:t>
-                                    </w:r>
-                                  </w:p>
-                                </w:tc>
-                                <w:tc>
-                                  <w:tcPr>
-                                    <w:tcW w:w="1800" w:type="pct"/>
-                                    <w:vAlign w:val="center"/>
-                                    <w:tcMar>
-                                      <w:top w:w="60" w:type="dxa"/>
-                                      <w:bottom w:w="60" w:type="dxa"/>
-                                    </w:tcMar>
-                                  </w:tcPr>
-                                  <w:p>
-                                    <w:pPr>
-                                      <w:spacing w:before="0" w:after="0"/>
-                                      <w:jc w:val="right"/>
-                                    </w:pPr>
-                                    <w:r>
-                                      <w:rPr>
-                                        <w:rFonts w:ascii="Helvetica Neue" w:hAnsi="Helvetica Neue" w:cs="Helvetica Neue"/>
-                                        <w:sz w:val="26"/>
-                                        <w:szCs w:val="26"/>
-                                        <w:color w:val="FFFFFF"/>
-                                        <w:b/>
-                                      </w:rPr>
-                                      <w:t xml:space="preserve">{{GESAMTSUMME}} CHF</w:t>
-                                    </w:r>
-                                  </w:p>
-                                </w:tc>
-                              </w:tr>
-                            </w:tbl>
-                          </w:txbxContent>
-                        </wps:txbx>
-                        <wps:bodyPr rot="0" wrap="square" lIns="180000" tIns="90000" rIns="180000" bIns="90000" anchor="t">
-                          <a:spAutoFit/>
-                        </wps:bodyPr>
-                      </wps:wsp>
-                    </a:graphicData>
-                  </a:graphic>
-                </wp:inline>
-              </w:drawing>
+              <w:rPr>
+                <w:rFonts w:ascii="Helvetica Neue" w:hAnsi="Helvetica Neue" w:cs="Helvetica Neue"/>
+                <w:rFonts w:ascii="Helvetica Neue" w:hAnsi="Helvetica Neue"/>
+                <w:b w:val="0"/>
+                <w:i/>
+                <w:color w:val="1D1D1F"/>
+                <w:sz w:val="19"/>
+              </w:rPr>
+              <w:t>Als Kleinunternehmer im Sinne von § 19 Abs. 1 UStG wird keine Umsatzsteuer berechnet.</w:t>
             </w:r>
           </w:p>
         </w:tc>
@@ -1632,188 +2112,171 @@
     </w:tbl>
     <w:p>
       <w:pPr>
-        <w:spacing w:after="0" w:before="0"/>
-        <w:spacing w:line="160" w:lineRule="exact"/>
-      </w:pPr>
-    </w:p>
-    <w:p>
-      <w:pPr>
-        <w:spacing w:after="0" w:before="0"/>
-      </w:pPr>
-      <w:r>
-        <w:drawing>
-          <wp:inline distT="0" distB="0" distL="0" distR="0">
-            <wp:extent cx="6264000" cy="576000"/>
-            <wp:effectExtent l="0" t="0" r="0" b="0"/>
-            <wp:docPr id="106" name="Card106"/>
-            <wp:cNvGraphicFramePr/>
-            <a:graphic xmlns:a="http://schemas.openxmlformats.org/drawingml/2006/main">
-              <a:graphicData uri="http://schemas.microsoft.com/office/word/2010/wordprocessingShape">
-                <wps:wsp>
-                  <wps:cNvSpPr txBox="1"/>
-                  <wps:spPr>
-                    <a:xfrm>
-                      <a:off x="0" y="0"/>
-                      <a:ext cx="6264000" cy="576000"/>
-                    </a:xfrm>
-                    <a:prstGeom prst="roundRect">
-                      <a:avLst>
-                        <a:gd name="adj" fmla="val 11000"/>
-                      </a:avLst>
-                    </a:prstGeom>
-                    <a:solidFill>
-                      <a:srgbClr val="F5F5F7"/>
-                    </a:solidFill>
-                    <a:ln>
-                      <a:noFill/>
-                    </a:ln>
-                  </wps:spPr>
-                  <wps:txbx>
-                    <w:txbxContent>
-                      <w:p>
-                        <w:pPr>
-                          <w:spacing w:before="0" w:after="40"/>
-                        </w:pPr>
-                        <w:r>
-                          <w:rPr>
-                            <w:rFonts w:ascii="Helvetica Neue" w:hAnsi="Helvetica Neue" w:cs="Helvetica Neue"/>
-                            <w:sz w:val="15"/>
-                            <w:szCs w:val="15"/>
-                            <w:color w:val="86868B"/>
-                            <w:b/>
-                            <w:caps/>
-                            <w:spacing w:val="24"/>
-                          </w:rPr>
-                          <w:t xml:space="preserve">Hinweis</w:t>
-                        </w:r>
-                      </w:p>
-                      <w:p>
-                        <w:pPr>
-                          <w:spacing w:before="0" w:after="0" w:line="288" w:lineRule="auto"/>
-                        </w:pPr>
-                        <w:r>
-                          <w:rPr>
-                            <w:rFonts w:ascii="Helvetica Neue" w:hAnsi="Helvetica Neue" w:cs="Helvetica Neue"/>
-                            <w:sz w:val="19"/>
-                            <w:szCs w:val="19"/>
-                            <w:color w:val="1D1D1F"/>
-                            <w:i/>
-                          </w:rPr>
-                          <w:t xml:space="preserve">Als Kleinunternehmer im Sinne von § 19 Abs. 1 UStG wird keine Umsatzsteuer berechnet.</w:t>
-                        </w:r>
-                      </w:p>
-                    </w:txbxContent>
-                  </wps:txbx>
-                  <wps:bodyPr rot="0" wrap="square" lIns="187200" tIns="144000" rIns="187200" bIns="144000" anchor="t">
-                    <a:spAutoFit/>
-                  </wps:bodyPr>
-                </wps:wsp>
-              </a:graphicData>
-            </a:graphic>
-          </wp:inline>
-        </w:drawing>
-      </w:r>
-    </w:p>
-    <w:p>
-      <w:pPr>
-        <w:spacing w:after="0" w:before="0"/>
         <w:spacing w:line="120" w:lineRule="exact"/>
       </w:pPr>
     </w:p>
+    <w:tbl>
+      <w:tblPr>
+        <w:tblW w:type="auto" w:w="0"/>
+        <w:tblLayout w:type="fixed"/>
+        <w:tblLook w:firstColumn="1" w:firstRow="1" w:lastColumn="0" w:lastRow="0" w:noHBand="0" w:noVBand="1" w:val="04A0"/>
+        <w:tblBorders>
+          <w:top w:val="none"/>
+          <w:left w:val="none"/>
+          <w:bottom w:val="none"/>
+          <w:right w:val="none"/>
+          <w:insideH w:val="none"/>
+          <w:insideV w:val="none"/>
+        </w:tblBorders>
+      </w:tblPr>
+      <w:tblGrid>
+        <w:gridCol w:w="9866"/>
+      </w:tblGrid>
+      <w:tr>
+        <w:tc>
+          <w:tcPr>
+            <w:tcW w:type="dxa" w:w="9865"/>
+            <w:shd w:val="clear" w:color="auto" w:fill="F5F5F7"/>
+            <w:tcMar>
+              <w:top w:w="120" w:type="dxa"/>
+              <w:bottom w:w="120" w:type="dxa"/>
+              <w:left w:w="160" w:type="dxa"/>
+              <w:right w:w="160" w:type="dxa"/>
+            </w:tcMar>
+            <w:tcBorders>
+              <w:left w:val="single" w:sz="24" w:space="0" w:color="0A66FF"/>
+            </w:tcBorders>
+          </w:tcPr>
+          <w:p>
+            <w:r>
+              <w:rPr>
+                <w:rFonts w:ascii="Helvetica Neue" w:hAnsi="Helvetica Neue" w:cs="Helvetica Neue"/>
+                <w:rFonts w:ascii="Helvetica Neue" w:hAnsi="Helvetica Neue"/>
+                <w:b/>
+                <w:i w:val="0"/>
+                <w:caps/>
+                <w:color w:val="0A66FF"/>
+                <w:sz w:val="15"/>
+                <w:spacing w:val="24"/>
+              </w:rPr>
+              <w:t>Zahlungsbedingungen</w:t>
+            </w:r>
+          </w:p>
+          <w:p>
+            <w:pPr>
+              <w:spacing w:before="60" w:line="300" w:lineRule="auto"/>
+            </w:pPr>
+            <w:r>
+              <w:rPr>
+                <w:rFonts w:ascii="Helvetica Neue" w:hAnsi="Helvetica Neue" w:cs="Helvetica Neue"/>
+                <w:rFonts w:ascii="Helvetica Neue" w:hAnsi="Helvetica Neue"/>
+                <w:b w:val="0"/>
+                <w:i w:val="0"/>
+                <w:color w:val="1D1D1F"/>
+                <w:sz w:val="19"/>
+              </w:rPr>
+              <w:t xml:space="preserve">Zahlbar innert </w:t>
+            </w:r>
+            <w:sdt>
+              <w:sdtPr>
+                <w:rPr>
+                  <w:rFonts w:ascii="Helvetica Neue" w:hAnsi="Helvetica Neue" w:cs="Helvetica Neue"/>
+                  <w:sz w:val="19"/>
+                  <w:szCs w:val="19"/>
+                  <w:color w:val="1D1D1F"/>
+                  <w:b/>
+                </w:rPr>
+                <w:alias w:val="Zahlungsfrist"/>
+                <w:tag w:val="Zahlungsfrist"/>
+                <w:id w:val="1031"/>
+                <w:dataBinding w:prefixMappings="xmlns:ns0='http://kabuu/doc'" w:xpath="/ns0:doc[1]/ns0:Zahlungsfrist[1]" w:storeItemID="{6F1B2C3D-4E5A-4B6C-8D7E-9A0B1C2D3E4F}"/>
+                <w:text/>
+              </w:sdtPr>
+              <w:sdtContent>
+                <w:r>
+                  <w:rPr>
+                    <w:rFonts w:ascii="Helvetica Neue" w:hAnsi="Helvetica Neue" w:cs="Helvetica Neue"/>
+                    <w:sz w:val="19"/>
+                    <w:szCs w:val="19"/>
+                    <w:color w:val="1D1D1F"/>
+                    <w:b/>
+                  </w:rPr>
+                  <w:t xml:space="preserve">14</w:t>
+                </w:r>
+              </w:sdtContent>
+            </w:sdt>
+            <w:r>
+              <w:rPr>
+                <w:rFonts w:ascii="Helvetica Neue" w:hAnsi="Helvetica Neue" w:cs="Helvetica Neue"/>
+                <w:rFonts w:ascii="Helvetica Neue" w:hAnsi="Helvetica Neue"/>
+                <w:b w:val="0"/>
+                <w:i w:val="0"/>
+                <w:color w:val="1D1D1F"/>
+                <w:sz w:val="19"/>
+              </w:rPr>
+              <w:t xml:space="preserve"> Tagen netto, ohne Abzug, auf das Konto bei der Migros Bank AG.</w:t>
+            </w:r>
+          </w:p>
+          <w:p>
+            <w:pPr>
+              <w:spacing w:before="40" w:line="300" w:lineRule="auto"/>
+            </w:pPr>
+            <w:r>
+              <w:rPr>
+                <w:rFonts w:ascii="Helvetica Neue" w:hAnsi="Helvetica Neue" w:cs="Helvetica Neue"/>
+                <w:rFonts w:ascii="Helvetica Neue" w:hAnsi="Helvetica Neue"/>
+                <w:b w:val="0"/>
+                <w:i w:val="0"/>
+                <w:color w:val="86868B"/>
+                <w:sz w:val="19"/>
+              </w:rPr>
+              <w:t xml:space="preserve">Bitte bei der Zahlung die Dokument-Nr. </w:t>
+            </w:r>
+            <w:sdt>
+              <w:sdtPr>
+                <w:rPr>
+                  <w:rFonts w:ascii="Helvetica Neue" w:hAnsi="Helvetica Neue" w:cs="Helvetica Neue"/>
+                  <w:sz w:val="19"/>
+                  <w:szCs w:val="19"/>
+                  <w:color w:val="86868B"/>
+                  <w:b/>
+                </w:rPr>
+                <w:alias w:val="DokumentNr"/>
+                <w:tag w:val="DokumentNr"/>
+                <w:id w:val="1032"/>
+                <w:dataBinding w:prefixMappings="xmlns:ns0='http://kabuu/doc'" w:xpath="/ns0:doc[1]/ns0:DokumentNr[1]" w:storeItemID="{6F1B2C3D-4E5A-4B6C-8D7E-9A0B1C2D3E4F}"/>
+                <w:text/>
+              </w:sdtPr>
+              <w:sdtContent>
+                <w:r>
+                  <w:rPr>
+                    <w:rFonts w:ascii="Helvetica Neue" w:hAnsi="Helvetica Neue" w:cs="Helvetica Neue"/>
+                    <w:sz w:val="19"/>
+                    <w:szCs w:val="19"/>
+                    <w:color w:val="86868B"/>
+                    <w:b/>
+                  </w:rPr>
+                  <w:t xml:space="preserve">0011</w:t>
+                </w:r>
+              </w:sdtContent>
+            </w:sdt>
+            <w:r>
+              <w:rPr>
+                <w:rFonts w:ascii="Helvetica Neue" w:hAnsi="Helvetica Neue" w:cs="Helvetica Neue"/>
+                <w:rFonts w:ascii="Helvetica Neue" w:hAnsi="Helvetica Neue"/>
+                <w:b w:val="0"/>
+                <w:i w:val="0"/>
+                <w:color w:val="86868B"/>
+                <w:sz w:val="19"/>
+              </w:rPr>
+              <w:t xml:space="preserve"> angeben.</w:t>
+            </w:r>
+          </w:p>
+        </w:tc>
+      </w:tr>
+    </w:tbl>
     <w:p>
       <w:pPr>
-        <w:spacing w:after="0" w:before="0"/>
-      </w:pPr>
-      <w:r>
-        <w:drawing>
-          <wp:inline distT="0" distB="0" distL="0" distR="0">
-            <wp:extent cx="6264000" cy="792000"/>
-            <wp:effectExtent l="0" t="0" r="0" b="0"/>
-            <wp:docPr id="107" name="Card107"/>
-            <wp:cNvGraphicFramePr/>
-            <a:graphic xmlns:a="http://schemas.openxmlformats.org/drawingml/2006/main">
-              <a:graphicData uri="http://schemas.microsoft.com/office/word/2010/wordprocessingShape">
-                <wps:wsp>
-                  <wps:cNvSpPr txBox="1"/>
-                  <wps:spPr>
-                    <a:xfrm>
-                      <a:off x="0" y="0"/>
-                      <a:ext cx="6264000" cy="792000"/>
-                    </a:xfrm>
-                    <a:prstGeom prst="roundRect">
-                      <a:avLst>
-                        <a:gd name="adj" fmla="val 10000"/>
-                      </a:avLst>
-                    </a:prstGeom>
-                    <a:solidFill>
-                      <a:srgbClr val="F5F5F7"/>
-                    </a:solidFill>
-                    <a:ln>
-                      <a:noFill/>
-                    </a:ln>
-                  </wps:spPr>
-                  <wps:txbx>
-                    <w:txbxContent>
-                      <w:p>
-                        <w:pPr>
-                          <w:spacing w:before="0" w:after="60"/>
-                        </w:pPr>
-                        <w:r>
-                          <w:rPr>
-                            <w:rFonts w:ascii="Helvetica Neue" w:hAnsi="Helvetica Neue" w:cs="Helvetica Neue"/>
-                            <w:sz w:val="15"/>
-                            <w:szCs w:val="15"/>
-                            <w:color w:val="0A66FF"/>
-                            <w:b/>
-                            <w:caps/>
-                            <w:spacing w:val="24"/>
-                          </w:rPr>
-                          <w:t xml:space="preserve">Zahlungsbedingungen</w:t>
-                        </w:r>
-                      </w:p>
-                      <w:p>
-                        <w:pPr>
-                          <w:spacing w:before="0" w:after="40" w:line="300" w:lineRule="auto"/>
-                        </w:pPr>
-                        <w:r>
-                          <w:rPr>
-                            <w:rFonts w:ascii="Helvetica Neue" w:hAnsi="Helvetica Neue" w:cs="Helvetica Neue"/>
-                            <w:sz w:val="19"/>
-                            <w:szCs w:val="19"/>
-                            <w:color w:val="1D1D1F"/>
-                          </w:rPr>
-                          <w:t xml:space="preserve">Zahlbar innert {{ZAHLUNGSFRIST}} Tagen netto, ohne Abzug, auf das Konto bei der Migros Bank AG.</w:t>
-                        </w:r>
-                      </w:p>
-                      <w:p>
-                        <w:pPr>
-                          <w:spacing w:before="0" w:after="0" w:line="300" w:lineRule="auto"/>
-                        </w:pPr>
-                        <w:r>
-                          <w:rPr>
-                            <w:rFonts w:ascii="Helvetica Neue" w:hAnsi="Helvetica Neue" w:cs="Helvetica Neue"/>
-                            <w:sz w:val="19"/>
-                            <w:szCs w:val="19"/>
-                            <w:color w:val="86868B"/>
-                          </w:rPr>
-                          <w:t xml:space="preserve">Bitte bei der Zahlung die Dokument-Nr. {{DOKUMENT_NR}} angeben.</w:t>
-                        </w:r>
-                      </w:p>
-                    </w:txbxContent>
-                  </wps:txbx>
-                  <wps:bodyPr rot="0" wrap="square" lIns="187200" tIns="158400" rIns="187200" bIns="158400" anchor="t">
-                    <a:spAutoFit/>
-                  </wps:bodyPr>
-                </wps:wsp>
-              </a:graphicData>
-            </a:graphic>
-          </wp:inline>
-        </w:drawing>
-      </w:r>
-    </w:p>
-    <w:p>
-      <w:pPr>
-        <w:spacing w:after="0" w:before="0"/>
         <w:spacing w:line="200" w:lineRule="exact"/>
       </w:pPr>
     </w:p>
@@ -1823,7 +2286,10 @@
       </w:pPr>
       <w:r>
         <w:rPr>
+          <w:rFonts w:ascii="Helvetica Neue" w:hAnsi="Helvetica Neue" w:cs="Helvetica Neue"/>
           <w:rFonts w:ascii="Helvetica Neue" w:hAnsi="Helvetica Neue"/>
+          <w:b w:val="0"/>
+          <w:i w:val="0"/>
           <w:color w:val="1D1D1F"/>
           <w:sz w:val="21"/>
         </w:rPr>
@@ -1836,7 +2302,10 @@
       </w:pPr>
       <w:r>
         <w:rPr>
+          <w:rFonts w:ascii="Helvetica Neue" w:hAnsi="Helvetica Neue" w:cs="Helvetica Neue"/>
           <w:rFonts w:ascii="Helvetica Neue" w:hAnsi="Helvetica Neue"/>
+          <w:b w:val="0"/>
+          <w:i w:val="0"/>
           <w:color w:val="1D1D1F"/>
           <w:sz w:val="21"/>
         </w:rPr>
@@ -1849,8 +2318,10 @@
       </w:pPr>
       <w:r>
         <w:rPr>
+          <w:rFonts w:ascii="Helvetica Neue" w:hAnsi="Helvetica Neue" w:cs="Helvetica Neue"/>
           <w:rFonts w:ascii="Helvetica Neue" w:hAnsi="Helvetica Neue"/>
           <w:b/>
+          <w:i w:val="0"/>
           <w:color w:val="000D6E"/>
           <w:sz w:val="22"/>
         </w:rPr>
@@ -1860,7 +2331,10 @@
     <w:p>
       <w:r>
         <w:rPr>
+          <w:rFonts w:ascii="Helvetica Neue" w:hAnsi="Helvetica Neue" w:cs="Helvetica Neue"/>
           <w:rFonts w:ascii="Helvetica Neue" w:hAnsi="Helvetica Neue"/>
+          <w:b w:val="0"/>
+          <w:i w:val="0"/>
           <w:color w:val="86868B"/>
           <w:sz w:val="18"/>
         </w:rPr>
@@ -1878,12 +2352,14 @@
       </w:pPr>
       <w:r>
         <w:rPr>
+          <w:rFonts w:ascii="Helvetica Neue" w:hAnsi="Helvetica Neue" w:cs="Helvetica Neue"/>
           <w:rFonts w:ascii="Helvetica Neue" w:hAnsi="Helvetica Neue"/>
           <w:b/>
+          <w:i w:val="0"/>
           <w:color w:val="1D1D1F"/>
           <w:sz w:val="36"/>
         </w:rPr>
-        <w:t>Ausfüllhilfe</w:t>
+        <w:t>So funktioniert die Vorlage</w:t>
       </w:r>
     </w:p>
     <w:p>
@@ -1892,23 +2368,27 @@
       </w:pPr>
       <w:r>
         <w:rPr>
+          <w:rFonts w:ascii="Helvetica Neue" w:hAnsi="Helvetica Neue" w:cs="Helvetica Neue"/>
           <w:rFonts w:ascii="Helvetica Neue" w:hAnsi="Helvetica Neue"/>
+          <w:b w:val="0"/>
+          <w:i w:val="0"/>
           <w:color w:val="86868B"/>
           <w:sz w:val="20"/>
         </w:rPr>
-        <w:t>Ersetze in Word die {{Platzhalter}} – fertig.</w:t>
+        <w:t>Alle blauen Felder sind verknüpfte Inhaltssteuerelemente. Felder mit gleichem Namen sind miteinander verbunden – tippst du z. B. die Dokument-Nr. einmal, aktualisiert sie sich automatisch überall (Infobox + Zahlungshinweis).</w:t>
       </w:r>
     </w:p>
     <w:tbl>
       <w:tblPr>
         <w:tblW w:type="auto" w:w="0"/>
+        <w:tblLayout w:type="fixed"/>
         <w:tblLook w:firstColumn="1" w:firstRow="1" w:lastColumn="0" w:lastRow="0" w:noHBand="0" w:noVBand="1" w:val="04A0"/>
         <w:tblBorders>
           <w:top w:val="none"/>
           <w:left w:val="none"/>
           <w:bottom w:val="none"/>
           <w:right w:val="none"/>
-          <w:insideH w:val="single" w:sz="4" w:color="E5E5EA"/>
+          <w:insideH w:val="none"/>
           <w:insideV w:val="none"/>
         </w:tblBorders>
       </w:tblPr>
@@ -1919,419 +2399,350 @@
       <w:tr>
         <w:tc>
           <w:tcPr>
-            <w:tcW w:type="dxa" w:w="3288"/>
+            <w:tcW w:type="dxa" w:w="680"/>
+            <w:shd w:val="clear" w:color="auto" w:fill="000D6E"/>
+            <w:vAlign w:val="center"/>
+            <w:tcMar>
+              <w:top w:w="40" w:type="dxa"/>
+              <w:bottom w:w="40" w:type="dxa"/>
+              <w:left w:w="120" w:type="dxa"/>
+              <w:right w:w="120" w:type="dxa"/>
+            </w:tcMar>
+          </w:tcPr>
+          <w:p>
+            <w:pPr>
+              <w:jc w:val="center"/>
+            </w:pPr>
+            <w:r>
+              <w:rPr>
+                <w:rFonts w:ascii="Helvetica Neue" w:hAnsi="Helvetica Neue" w:cs="Helvetica Neue"/>
+                <w:rFonts w:ascii="Helvetica Neue" w:hAnsi="Helvetica Neue"/>
+                <w:b/>
+                <w:i w:val="0"/>
+                <w:color w:val="FFFFFF"/>
+                <w:sz w:val="22"/>
+              </w:rPr>
+              <w:t>1</w:t>
+            </w:r>
+          </w:p>
+        </w:tc>
+        <w:tc>
+          <w:tcPr>
+            <w:tcW w:type="dxa" w:w="9184"/>
             <w:tcMar>
               <w:top w:w="60" w:type="dxa"/>
               <w:bottom w:w="60" w:type="dxa"/>
+              <w:left w:w="160" w:type="dxa"/>
+              <w:right w:w="120" w:type="dxa"/>
             </w:tcMar>
           </w:tcPr>
           <w:p>
             <w:r>
               <w:rPr>
-                <w:rFonts w:ascii="Consolas" w:hAnsi="Consolas"/>
+                <w:rFonts w:ascii="Helvetica Neue" w:hAnsi="Helvetica Neue" w:cs="Helvetica Neue"/>
+                <w:rFonts w:ascii="Helvetica Neue" w:hAnsi="Helvetica Neue"/>
                 <w:b/>
-                <w:color w:val="0A66FF"/>
-                <w:sz w:val="18"/>
+                <w:i w:val="0"/>
+                <w:color w:val="1D1D1F"/>
+                <w:sz w:val="21"/>
               </w:rPr>
-              <w:t>{{DOKUMENTTYP}}</w:t>
+              <w:t xml:space="preserve">Feld anklicken  </w:t>
+            </w:r>
+            <w:r>
+              <w:rPr>
+                <w:rFonts w:ascii="Helvetica Neue" w:hAnsi="Helvetica Neue" w:cs="Helvetica Neue"/>
+                <w:rFonts w:ascii="Helvetica Neue" w:hAnsi="Helvetica Neue"/>
+                <w:b w:val="0"/>
+                <w:i w:val="0"/>
+                <w:color w:val="86868B"/>
+                <w:sz w:val="20"/>
+              </w:rPr>
+              <w:t>Einfach in das blau hinterlegte Feld klicken und überschreiben.</w:t>
+            </w:r>
+          </w:p>
+        </w:tc>
+      </w:tr>
+    </w:tbl>
+    <w:p>
+      <w:pPr>
+        <w:spacing w:line="80" w:lineRule="exact"/>
+      </w:pPr>
+    </w:p>
+    <w:tbl>
+      <w:tblPr>
+        <w:tblW w:type="auto" w:w="0"/>
+        <w:tblLayout w:type="fixed"/>
+        <w:tblLook w:firstColumn="1" w:firstRow="1" w:lastColumn="0" w:lastRow="0" w:noHBand="0" w:noVBand="1" w:val="04A0"/>
+        <w:tblBorders>
+          <w:top w:val="none"/>
+          <w:left w:val="none"/>
+          <w:bottom w:val="none"/>
+          <w:right w:val="none"/>
+          <w:insideH w:val="none"/>
+          <w:insideV w:val="none"/>
+        </w:tblBorders>
+      </w:tblPr>
+      <w:tblGrid>
+        <w:gridCol w:w="4933"/>
+        <w:gridCol w:w="4933"/>
+      </w:tblGrid>
+      <w:tr>
+        <w:tc>
+          <w:tcPr>
+            <w:tcW w:type="dxa" w:w="680"/>
+            <w:shd w:val="clear" w:color="auto" w:fill="000D6E"/>
+            <w:vAlign w:val="center"/>
+            <w:tcMar>
+              <w:top w:w="40" w:type="dxa"/>
+              <w:bottom w:w="40" w:type="dxa"/>
+              <w:left w:w="120" w:type="dxa"/>
+              <w:right w:w="120" w:type="dxa"/>
+            </w:tcMar>
+          </w:tcPr>
+          <w:p>
+            <w:pPr>
+              <w:jc w:val="center"/>
+            </w:pPr>
+            <w:r>
+              <w:rPr>
+                <w:rFonts w:ascii="Helvetica Neue" w:hAnsi="Helvetica Neue" w:cs="Helvetica Neue"/>
+                <w:rFonts w:ascii="Helvetica Neue" w:hAnsi="Helvetica Neue"/>
+                <w:b/>
+                <w:i w:val="0"/>
+                <w:color w:val="FFFFFF"/>
+                <w:sz w:val="22"/>
+              </w:rPr>
+              <w:t>2</w:t>
             </w:r>
           </w:p>
         </w:tc>
         <w:tc>
           <w:tcPr>
-            <w:tcW w:type="dxa" w:w="6576"/>
+            <w:tcW w:type="dxa" w:w="9184"/>
             <w:tcMar>
               <w:top w:w="60" w:type="dxa"/>
               <w:bottom w:w="60" w:type="dxa"/>
+              <w:left w:w="160" w:type="dxa"/>
+              <w:right w:w="120" w:type="dxa"/>
             </w:tcMar>
           </w:tcPr>
           <w:p>
             <w:r>
               <w:rPr>
+                <w:rFonts w:ascii="Helvetica Neue" w:hAnsi="Helvetica Neue" w:cs="Helvetica Neue"/>
                 <w:rFonts w:ascii="Helvetica Neue" w:hAnsi="Helvetica Neue"/>
+                <w:b/>
+                <w:i w:val="0"/>
                 <w:color w:val="1D1D1F"/>
-                <w:sz w:val="19"/>
+                <w:sz w:val="21"/>
               </w:rPr>
-              <w:t>ANGEBOT oder RECHNUNG (Pill-Badge oben)</w:t>
+              <w:t xml:space="preserve">Verknüpfung  </w:t>
+            </w:r>
+            <w:r>
+              <w:rPr>
+                <w:rFonts w:ascii="Helvetica Neue" w:hAnsi="Helvetica Neue" w:cs="Helvetica Neue"/>
+                <w:rFonts w:ascii="Helvetica Neue" w:hAnsi="Helvetica Neue"/>
+                <w:b w:val="0"/>
+                <w:i w:val="0"/>
+                <w:color w:val="86868B"/>
+                <w:sz w:val="20"/>
+              </w:rPr>
+              <w:t>Gleichnamige Felder (z. B. Dokument-Nr.) werden automatisch synchron gehalten.</w:t>
             </w:r>
           </w:p>
         </w:tc>
       </w:tr>
+    </w:tbl>
+    <w:p>
+      <w:pPr>
+        <w:spacing w:line="80" w:lineRule="exact"/>
+      </w:pPr>
+    </w:p>
+    <w:tbl>
+      <w:tblPr>
+        <w:tblW w:type="auto" w:w="0"/>
+        <w:tblLayout w:type="fixed"/>
+        <w:tblLook w:firstColumn="1" w:firstRow="1" w:lastColumn="0" w:lastRow="0" w:noHBand="0" w:noVBand="1" w:val="04A0"/>
+        <w:tblBorders>
+          <w:top w:val="none"/>
+          <w:left w:val="none"/>
+          <w:bottom w:val="none"/>
+          <w:right w:val="none"/>
+          <w:insideH w:val="none"/>
+          <w:insideV w:val="none"/>
+        </w:tblBorders>
+      </w:tblPr>
+      <w:tblGrid>
+        <w:gridCol w:w="4933"/>
+        <w:gridCol w:w="4933"/>
+      </w:tblGrid>
       <w:tr>
         <w:tc>
           <w:tcPr>
-            <w:tcW w:type="dxa" w:w="3288"/>
+            <w:tcW w:type="dxa" w:w="680"/>
+            <w:shd w:val="clear" w:color="auto" w:fill="000D6E"/>
+            <w:vAlign w:val="center"/>
+            <w:tcMar>
+              <w:top w:w="40" w:type="dxa"/>
+              <w:bottom w:w="40" w:type="dxa"/>
+              <w:left w:w="120" w:type="dxa"/>
+              <w:right w:w="120" w:type="dxa"/>
+            </w:tcMar>
+          </w:tcPr>
+          <w:p>
+            <w:pPr>
+              <w:jc w:val="center"/>
+            </w:pPr>
+            <w:r>
+              <w:rPr>
+                <w:rFonts w:ascii="Helvetica Neue" w:hAnsi="Helvetica Neue" w:cs="Helvetica Neue"/>
+                <w:rFonts w:ascii="Helvetica Neue" w:hAnsi="Helvetica Neue"/>
+                <w:b/>
+                <w:i w:val="0"/>
+                <w:color w:val="FFFFFF"/>
+                <w:sz w:val="22"/>
+              </w:rPr>
+              <w:t>3</w:t>
+            </w:r>
+          </w:p>
+        </w:tc>
+        <w:tc>
+          <w:tcPr>
+            <w:tcW w:type="dxa" w:w="9184"/>
             <w:tcMar>
               <w:top w:w="60" w:type="dxa"/>
               <w:bottom w:w="60" w:type="dxa"/>
+              <w:left w:w="160" w:type="dxa"/>
+              <w:right w:w="120" w:type="dxa"/>
             </w:tcMar>
           </w:tcPr>
           <w:p>
             <w:r>
               <w:rPr>
-                <w:rFonts w:ascii="Consolas" w:hAnsi="Consolas"/>
+                <w:rFonts w:ascii="Helvetica Neue" w:hAnsi="Helvetica Neue" w:cs="Helvetica Neue"/>
+                <w:rFonts w:ascii="Helvetica Neue" w:hAnsi="Helvetica Neue"/>
                 <w:b/>
-                <w:color w:val="0A66FF"/>
-                <w:sz w:val="18"/>
+                <w:i w:val="0"/>
+                <w:color w:val="1D1D1F"/>
+                <w:sz w:val="21"/>
               </w:rPr>
-              <w:t>{{BETREFF}}</w:t>
+              <w:t xml:space="preserve">Dokumenttyp  </w:t>
+            </w:r>
+            <w:r>
+              <w:rPr>
+                <w:rFonts w:ascii="Helvetica Neue" w:hAnsi="Helvetica Neue" w:cs="Helvetica Neue"/>
+                <w:rFonts w:ascii="Helvetica Neue" w:hAnsi="Helvetica Neue"/>
+                <w:b w:val="0"/>
+                <w:i w:val="0"/>
+                <w:color w:val="86868B"/>
+                <w:sz w:val="20"/>
+              </w:rPr>
+              <w:t>Chip oben auf ANGEBOT oder RECHNUNG ändern.</w:t>
+            </w:r>
+          </w:p>
+        </w:tc>
+      </w:tr>
+    </w:tbl>
+    <w:p>
+      <w:pPr>
+        <w:spacing w:line="80" w:lineRule="exact"/>
+      </w:pPr>
+    </w:p>
+    <w:tbl>
+      <w:tblPr>
+        <w:tblW w:type="auto" w:w="0"/>
+        <w:tblLayout w:type="fixed"/>
+        <w:tblLook w:firstColumn="1" w:firstRow="1" w:lastColumn="0" w:lastRow="0" w:noHBand="0" w:noVBand="1" w:val="04A0"/>
+        <w:tblBorders>
+          <w:top w:val="none"/>
+          <w:left w:val="none"/>
+          <w:bottom w:val="none"/>
+          <w:right w:val="none"/>
+          <w:insideH w:val="none"/>
+          <w:insideV w:val="none"/>
+        </w:tblBorders>
+      </w:tblPr>
+      <w:tblGrid>
+        <w:gridCol w:w="4933"/>
+        <w:gridCol w:w="4933"/>
+      </w:tblGrid>
+      <w:tr>
+        <w:tc>
+          <w:tcPr>
+            <w:tcW w:type="dxa" w:w="680"/>
+            <w:shd w:val="clear" w:color="auto" w:fill="000D6E"/>
+            <w:vAlign w:val="center"/>
+            <w:tcMar>
+              <w:top w:w="40" w:type="dxa"/>
+              <w:bottom w:w="40" w:type="dxa"/>
+              <w:left w:w="120" w:type="dxa"/>
+              <w:right w:w="120" w:type="dxa"/>
+            </w:tcMar>
+          </w:tcPr>
+          <w:p>
+            <w:pPr>
+              <w:jc w:val="center"/>
+            </w:pPr>
+            <w:r>
+              <w:rPr>
+                <w:rFonts w:ascii="Helvetica Neue" w:hAnsi="Helvetica Neue" w:cs="Helvetica Neue"/>
+                <w:rFonts w:ascii="Helvetica Neue" w:hAnsi="Helvetica Neue"/>
+                <w:b/>
+                <w:i w:val="0"/>
+                <w:color w:val="FFFFFF"/>
+                <w:sz w:val="22"/>
+              </w:rPr>
+              <w:t>4</w:t>
             </w:r>
           </w:p>
         </w:tc>
         <w:tc>
           <w:tcPr>
-            <w:tcW w:type="dxa" w:w="6576"/>
+            <w:tcW w:type="dxa" w:w="9184"/>
             <w:tcMar>
               <w:top w:w="60" w:type="dxa"/>
               <w:bottom w:w="60" w:type="dxa"/>
+              <w:left w:w="160" w:type="dxa"/>
+              <w:right w:w="120" w:type="dxa"/>
             </w:tcMar>
           </w:tcPr>
           <w:p>
             <w:r>
               <w:rPr>
+                <w:rFonts w:ascii="Helvetica Neue" w:hAnsi="Helvetica Neue" w:cs="Helvetica Neue"/>
                 <w:rFonts w:ascii="Helvetica Neue" w:hAnsi="Helvetica Neue"/>
+                <w:b/>
+                <w:i w:val="0"/>
                 <w:color w:val="1D1D1F"/>
-                <w:sz w:val="19"/>
+                <w:sz w:val="21"/>
               </w:rPr>
-              <w:t>Grosser Titel, z. B. „Power-Quality-Schulung“</w:t>
+              <w:t xml:space="preserve">Felder anzeigen  </w:t>
             </w:r>
-          </w:p>
-        </w:tc>
-      </w:tr>
-      <w:tr>
-        <w:tc>
-          <w:tcPr>
-            <w:tcW w:type="dxa" w:w="3288"/>
-            <w:tcMar>
-              <w:top w:w="60" w:type="dxa"/>
-              <w:bottom w:w="60" w:type="dxa"/>
-            </w:tcMar>
-          </w:tcPr>
-          <w:p>
             <w:r>
               <w:rPr>
-                <w:rFonts w:ascii="Consolas" w:hAnsi="Consolas"/>
-                <w:b/>
-                <w:color w:val="0A66FF"/>
-                <w:sz w:val="18"/>
+                <w:rFonts w:ascii="Helvetica Neue" w:hAnsi="Helvetica Neue" w:cs="Helvetica Neue"/>
+                <w:rFonts w:ascii="Helvetica Neue" w:hAnsi="Helvetica Neue"/>
+                <w:b w:val="0"/>
+                <w:i w:val="0"/>
+                <w:color w:val="86868B"/>
+                <w:sz w:val="20"/>
               </w:rPr>
-              <w:t>{{DOKUMENT_NR}}</w:t>
-            </w:r>
-          </w:p>
-        </w:tc>
-        <w:tc>
-          <w:tcPr>
-            <w:tcW w:type="dxa" w:w="6576"/>
-            <w:tcMar>
-              <w:top w:w="60" w:type="dxa"/>
-              <w:bottom w:w="60" w:type="dxa"/>
-            </w:tcMar>
-          </w:tcPr>
-          <w:p>
-            <w:r>
-              <w:rPr>
-                <w:rFonts w:ascii="Helvetica Neue" w:hAnsi="Helvetica Neue"/>
-                <w:color w:val="1D1D1F"/>
-                <w:sz w:val="19"/>
-              </w:rPr>
-              <w:t>Fortlaufende Nummer, z. B. 0011</w:t>
-            </w:r>
-          </w:p>
-        </w:tc>
-      </w:tr>
-      <w:tr>
-        <w:tc>
-          <w:tcPr>
-            <w:tcW w:type="dxa" w:w="3288"/>
-            <w:tcMar>
-              <w:top w:w="60" w:type="dxa"/>
-              <w:bottom w:w="60" w:type="dxa"/>
-            </w:tcMar>
-          </w:tcPr>
-          <w:p>
-            <w:r>
-              <w:rPr>
-                <w:rFonts w:ascii="Consolas" w:hAnsi="Consolas"/>
-                <w:b/>
-                <w:color w:val="0A66FF"/>
-                <w:sz w:val="18"/>
-              </w:rPr>
-              <w:t>{{DATUM}}</w:t>
-            </w:r>
-          </w:p>
-        </w:tc>
-        <w:tc>
-          <w:tcPr>
-            <w:tcW w:type="dxa" w:w="6576"/>
-            <w:tcMar>
-              <w:top w:w="60" w:type="dxa"/>
-              <w:bottom w:w="60" w:type="dxa"/>
-            </w:tcMar>
-          </w:tcPr>
-          <w:p>
-            <w:r>
-              <w:rPr>
-                <w:rFonts w:ascii="Helvetica Neue" w:hAnsi="Helvetica Neue"/>
-                <w:color w:val="1D1D1F"/>
-                <w:sz w:val="19"/>
-              </w:rPr>
-              <w:t>Angebots- bzw. Rechnungsdatum</w:t>
-            </w:r>
-          </w:p>
-        </w:tc>
-      </w:tr>
-      <w:tr>
-        <w:tc>
-          <w:tcPr>
-            <w:tcW w:type="dxa" w:w="3288"/>
-            <w:tcMar>
-              <w:top w:w="60" w:type="dxa"/>
-              <w:bottom w:w="60" w:type="dxa"/>
-            </w:tcMar>
-          </w:tcPr>
-          <w:p>
-            <w:r>
-              <w:rPr>
-                <w:rFonts w:ascii="Consolas" w:hAnsi="Consolas"/>
-                <w:b/>
-                <w:color w:val="0A66FF"/>
-                <w:sz w:val="18"/>
-              </w:rPr>
-              <w:t>{{FRIST_LABEL}} / {{FRIST_WERT}}</w:t>
-            </w:r>
-          </w:p>
-        </w:tc>
-        <w:tc>
-          <w:tcPr>
-            <w:tcW w:type="dxa" w:w="6576"/>
-            <w:tcMar>
-              <w:top w:w="60" w:type="dxa"/>
-              <w:bottom w:w="60" w:type="dxa"/>
-            </w:tcMar>
-          </w:tcPr>
-          <w:p>
-            <w:r>
-              <w:rPr>
-                <w:rFonts w:ascii="Helvetica Neue" w:hAnsi="Helvetica Neue"/>
-                <w:color w:val="1D1D1F"/>
-                <w:sz w:val="19"/>
-              </w:rPr>
-              <w:t>„Gültig bis“ bzw. „Fälligkeitsdatum“ + Datum</w:t>
-            </w:r>
-          </w:p>
-        </w:tc>
-      </w:tr>
-      <w:tr>
-        <w:tc>
-          <w:tcPr>
-            <w:tcW w:type="dxa" w:w="3288"/>
-            <w:tcMar>
-              <w:top w:w="60" w:type="dxa"/>
-              <w:bottom w:w="60" w:type="dxa"/>
-            </w:tcMar>
-          </w:tcPr>
-          <w:p>
-            <w:r>
-              <w:rPr>
-                <w:rFonts w:ascii="Consolas" w:hAnsi="Consolas"/>
-                <w:b/>
-                <w:color w:val="0A66FF"/>
-                <w:sz w:val="18"/>
-              </w:rPr>
-              <w:t>{{KUNDENNUMMER}}</w:t>
-            </w:r>
-          </w:p>
-        </w:tc>
-        <w:tc>
-          <w:tcPr>
-            <w:tcW w:type="dxa" w:w="6576"/>
-            <w:tcMar>
-              <w:top w:w="60" w:type="dxa"/>
-              <w:bottom w:w="60" w:type="dxa"/>
-            </w:tcMar>
-          </w:tcPr>
-          <w:p>
-            <w:r>
-              <w:rPr>
-                <w:rFonts w:ascii="Helvetica Neue" w:hAnsi="Helvetica Neue"/>
-                <w:color w:val="1D1D1F"/>
-                <w:sz w:val="19"/>
-              </w:rPr>
-              <w:t>Kundennummer</w:t>
-            </w:r>
-          </w:p>
-        </w:tc>
-      </w:tr>
-      <w:tr>
-        <w:tc>
-          <w:tcPr>
-            <w:tcW w:type="dxa" w:w="3288"/>
-            <w:tcMar>
-              <w:top w:w="60" w:type="dxa"/>
-              <w:bottom w:w="60" w:type="dxa"/>
-            </w:tcMar>
-          </w:tcPr>
-          <w:p>
-            <w:r>
-              <w:rPr>
-                <w:rFonts w:ascii="Consolas" w:hAnsi="Consolas"/>
-                <w:b/>
-                <w:color w:val="0A66FF"/>
-                <w:sz w:val="18"/>
-              </w:rPr>
-              <w:t>{{KUNDE_*}}</w:t>
-            </w:r>
-          </w:p>
-        </w:tc>
-        <w:tc>
-          <w:tcPr>
-            <w:tcW w:type="dxa" w:w="6576"/>
-            <w:tcMar>
-              <w:top w:w="60" w:type="dxa"/>
-              <w:bottom w:w="60" w:type="dxa"/>
-            </w:tcMar>
-          </w:tcPr>
-          <w:p>
-            <w:r>
-              <w:rPr>
-                <w:rFonts w:ascii="Helvetica Neue" w:hAnsi="Helvetica Neue"/>
-                <w:color w:val="1D1D1F"/>
-                <w:sz w:val="19"/>
-              </w:rPr>
-              <w:t>Empfängerangaben (Firma, Ansprechpartner, Adresse, Land)</w:t>
-            </w:r>
-          </w:p>
-        </w:tc>
-      </w:tr>
-      <w:tr>
-        <w:tc>
-          <w:tcPr>
-            <w:tcW w:type="dxa" w:w="3288"/>
-            <w:tcMar>
-              <w:top w:w="60" w:type="dxa"/>
-              <w:bottom w:w="60" w:type="dxa"/>
-            </w:tcMar>
-          </w:tcPr>
-          <w:p>
-            <w:r>
-              <w:rPr>
-                <w:rFonts w:ascii="Consolas" w:hAnsi="Consolas"/>
-                <w:b/>
-                <w:color w:val="0A66FF"/>
-                <w:sz w:val="18"/>
-              </w:rPr>
-              <w:t>{{Leistung 1–3}}</w:t>
-            </w:r>
-          </w:p>
-        </w:tc>
-        <w:tc>
-          <w:tcPr>
-            <w:tcW w:type="dxa" w:w="6576"/>
-            <w:tcMar>
-              <w:top w:w="60" w:type="dxa"/>
-              <w:bottom w:w="60" w:type="dxa"/>
-            </w:tcMar>
-          </w:tcPr>
-          <w:p>
-            <w:r>
-              <w:rPr>
-                <w:rFonts w:ascii="Helvetica Neue" w:hAnsi="Helvetica Neue"/>
-                <w:color w:val="1D1D1F"/>
-                <w:sz w:val="19"/>
-              </w:rPr>
-              <w:t>Positionen inkl. Detailzeile, Einzelpreis, Menge, Summe</w:t>
-            </w:r>
-          </w:p>
-        </w:tc>
-      </w:tr>
-      <w:tr>
-        <w:tc>
-          <w:tcPr>
-            <w:tcW w:type="dxa" w:w="3288"/>
-            <w:tcMar>
-              <w:top w:w="60" w:type="dxa"/>
-              <w:bottom w:w="60" w:type="dxa"/>
-            </w:tcMar>
-          </w:tcPr>
-          <w:p>
-            <w:r>
-              <w:rPr>
-                <w:rFonts w:ascii="Consolas" w:hAnsi="Consolas"/>
-                <w:b/>
-                <w:color w:val="0A66FF"/>
-                <w:sz w:val="18"/>
-              </w:rPr>
-              <w:t>{{ZWISCHENSUMME}} / {{GESAMTSUMME}}</w:t>
-            </w:r>
-          </w:p>
-        </w:tc>
-        <w:tc>
-          <w:tcPr>
-            <w:tcW w:type="dxa" w:w="6576"/>
-            <w:tcMar>
-              <w:top w:w="60" w:type="dxa"/>
-              <w:bottom w:w="60" w:type="dxa"/>
-            </w:tcMar>
-          </w:tcPr>
-          <w:p>
-            <w:r>
-              <w:rPr>
-                <w:rFonts w:ascii="Helvetica Neue" w:hAnsi="Helvetica Neue"/>
-                <w:color w:val="1D1D1F"/>
-                <w:sz w:val="19"/>
-              </w:rPr>
-              <w:t>Beträge in CHF</w:t>
-            </w:r>
-          </w:p>
-        </w:tc>
-      </w:tr>
-      <w:tr>
-        <w:tc>
-          <w:tcPr>
-            <w:tcW w:type="dxa" w:w="3288"/>
-            <w:tcMar>
-              <w:top w:w="60" w:type="dxa"/>
-              <w:bottom w:w="60" w:type="dxa"/>
-            </w:tcMar>
-          </w:tcPr>
-          <w:p>
-            <w:r>
-              <w:rPr>
-                <w:rFonts w:ascii="Consolas" w:hAnsi="Consolas"/>
-                <w:b/>
-                <w:color w:val="0A66FF"/>
-                <w:sz w:val="18"/>
-              </w:rPr>
-              <w:t>{{ZAHLUNGSFRIST}}</w:t>
-            </w:r>
-          </w:p>
-        </w:tc>
-        <w:tc>
-          <w:tcPr>
-            <w:tcW w:type="dxa" w:w="6576"/>
-            <w:tcMar>
-              <w:top w:w="60" w:type="dxa"/>
-              <w:bottom w:w="60" w:type="dxa"/>
-            </w:tcMar>
-          </w:tcPr>
-          <w:p>
-            <w:r>
-              <w:rPr>
-                <w:rFonts w:ascii="Helvetica Neue" w:hAnsi="Helvetica Neue"/>
-                <w:color w:val="1D1D1F"/>
-                <w:sz w:val="19"/>
-              </w:rPr>
-              <w:t>z. B. 14</w:t>
+              <w:t>Word › Entwicklertools, um alle Steuerelemente zu sehen/benennen.</w:t>
             </w:r>
           </w:p>
         </w:tc>
       </w:tr>
     </w:tbl>
+    <w:p>
+      <w:pPr>
+        <w:spacing w:line="80" w:lineRule="exact"/>
+      </w:pPr>
+    </w:p>
     <w:sectPr>
       <w:headerReference w:type="default" r:id="rId9"/>
       <w:footerReference w:type="default" r:id="rId10"/>
       <w:pgSz w:w="11906" w:h="16838"/>
-      <w:pgMar w:top="1928" w:right="1020" w:bottom="1361" w:left="1020" w:header="624" w:footer="510" w:gutter="0"/>
+      <w:pgMar w:top="1928" w:right="1020" w:bottom="1361" w:left="1020" w:header="567" w:footer="510" w:gutter="0"/>
       <w:cols w:space="720"/>
       <w:docGrid w:linePitch="360"/>
     </w:sectPr>
@@ -2343,13 +2754,23 @@
 <w:ftr xmlns:m="http://schemas.openxmlformats.org/officeDocument/2006/math" xmlns:mc="http://schemas.openxmlformats.org/markup-compatibility/2006" xmlns:mo="http://schemas.microsoft.com/office/mac/office/2008/main" xmlns:mv="urn:schemas-microsoft-com:mac:vml" xmlns:o="urn:schemas-microsoft-com:office:office" xmlns:r="http://schemas.openxmlformats.org/officeDocument/2006/relationships" xmlns:v="urn:schemas-microsoft-com:vml" xmlns:w10="urn:schemas-microsoft-com:office:word" xmlns:w14="http://schemas.microsoft.com/office/word/2010/wordml" xmlns:w="http://schemas.openxmlformats.org/wordprocessingml/2006/main" xmlns:wne="http://schemas.microsoft.com/office/word/2006/wordml" xmlns:wp14="http://schemas.microsoft.com/office/word/2010/wordprocessingDrawing" xmlns:wp="http://schemas.openxmlformats.org/drawingml/2006/wordprocessingDrawing" xmlns:wpc="http://schemas.microsoft.com/office/word/2010/wordprocessingCanvas" xmlns:wpg="http://schemas.microsoft.com/office/word/2010/wordprocessingGroup" xmlns:wpi="http://schemas.microsoft.com/office/word/2010/wordprocessingInk" xmlns:wps="http://schemas.microsoft.com/office/word/2010/wordprocessingShape" mc:Ignorable="w14 wp14">
   <w:p>
     <w:pPr>
+      <w:spacing w:after="60"/>
+      <w:pBdr>
+        <w:top w:val="single" w:sz="6" w:space="2" w:color="E5E5EA"/>
+      </w:pBdr>
+    </w:pPr>
+  </w:p>
+  <w:p>
+    <w:pPr>
       <w:spacing w:after="20"/>
       <w:jc w:val="center"/>
     </w:pPr>
     <w:r>
       <w:rPr>
+        <w:rFonts w:ascii="Helvetica Neue" w:hAnsi="Helvetica Neue" w:cs="Helvetica Neue"/>
         <w:rFonts w:ascii="Helvetica Neue" w:hAnsi="Helvetica Neue"/>
         <w:b/>
+        <w:i w:val="0"/>
         <w:color w:val="1D1D1F"/>
         <w:sz w:val="15"/>
       </w:rPr>
@@ -2357,8 +2778,10 @@
     </w:r>
     <w:r>
       <w:rPr>
+        <w:rFonts w:ascii="Helvetica Neue" w:hAnsi="Helvetica Neue" w:cs="Helvetica Neue"/>
         <w:rFonts w:ascii="Helvetica Neue" w:hAnsi="Helvetica Neue"/>
         <w:b w:val="0"/>
+        <w:i w:val="0"/>
         <w:color w:val="86868B"/>
         <w:sz w:val="15"/>
       </w:rPr>
@@ -2372,8 +2795,10 @@
     </w:pPr>
     <w:r>
       <w:rPr>
+        <w:rFonts w:ascii="Helvetica Neue" w:hAnsi="Helvetica Neue" w:cs="Helvetica Neue"/>
         <w:rFonts w:ascii="Helvetica Neue" w:hAnsi="Helvetica Neue"/>
         <w:b w:val="0"/>
+        <w:i w:val="0"/>
         <w:color w:val="86868B"/>
         <w:sz w:val="15"/>
       </w:rPr>
@@ -2382,12 +2807,15 @@
   </w:p>
   <w:p>
     <w:pPr>
+      <w:spacing w:after="0"/>
       <w:jc w:val="center"/>
     </w:pPr>
     <w:r>
       <w:rPr>
+        <w:rFonts w:ascii="Helvetica Neue" w:hAnsi="Helvetica Neue" w:cs="Helvetica Neue"/>
         <w:rFonts w:ascii="Helvetica Neue" w:hAnsi="Helvetica Neue"/>
         <w:b w:val="0"/>
+        <w:i w:val="0"/>
         <w:color w:val="1D1D1F"/>
         <w:sz w:val="15"/>
       </w:rPr>
@@ -2400,15 +2828,21 @@
     </w:pPr>
     <w:r>
       <w:rPr>
+        <w:rFonts w:ascii="Helvetica Neue" w:hAnsi="Helvetica Neue" w:cs="Helvetica Neue"/>
         <w:rFonts w:ascii="Helvetica Neue" w:hAnsi="Helvetica Neue"/>
         <w:b w:val="0"/>
+        <w:i w:val="0"/>
         <w:color w:val="86868B"/>
         <w:sz w:val="15"/>
       </w:rPr>
+      <w:t xml:space="preserve">Seite </w:t>
     </w:r>
     <w:r>
       <w:rPr>
+        <w:rFonts w:ascii="Helvetica Neue" w:hAnsi="Helvetica Neue" w:cs="Helvetica Neue"/>
         <w:rFonts w:ascii="Helvetica Neue" w:hAnsi="Helvetica Neue"/>
+        <w:b w:val="0"/>
+        <w:i w:val="0"/>
         <w:color w:val="86868B"/>
         <w:sz w:val="15"/>
       </w:rPr>
@@ -2416,7 +2850,10 @@
     </w:r>
     <w:r>
       <w:rPr>
+        <w:rFonts w:ascii="Helvetica Neue" w:hAnsi="Helvetica Neue" w:cs="Helvetica Neue"/>
         <w:rFonts w:ascii="Helvetica Neue" w:hAnsi="Helvetica Neue"/>
+        <w:b w:val="0"/>
+        <w:i w:val="0"/>
         <w:color w:val="86868B"/>
         <w:sz w:val="15"/>
       </w:rPr>
@@ -2424,7 +2861,10 @@
     </w:r>
     <w:r>
       <w:rPr>
+        <w:rFonts w:ascii="Helvetica Neue" w:hAnsi="Helvetica Neue" w:cs="Helvetica Neue"/>
         <w:rFonts w:ascii="Helvetica Neue" w:hAnsi="Helvetica Neue"/>
+        <w:b w:val="0"/>
+        <w:i w:val="0"/>
         <w:color w:val="86868B"/>
         <w:sz w:val="15"/>
       </w:rPr>
@@ -2432,7 +2872,10 @@
     </w:r>
     <w:r>
       <w:rPr>
+        <w:rFonts w:ascii="Helvetica Neue" w:hAnsi="Helvetica Neue" w:cs="Helvetica Neue"/>
         <w:rFonts w:ascii="Helvetica Neue" w:hAnsi="Helvetica Neue"/>
+        <w:b w:val="0"/>
+        <w:i w:val="0"/>
         <w:color w:val="86868B"/>
         <w:sz w:val="15"/>
       </w:rPr>
@@ -2440,7 +2883,10 @@
     </w:r>
     <w:r>
       <w:rPr>
+        <w:rFonts w:ascii="Helvetica Neue" w:hAnsi="Helvetica Neue" w:cs="Helvetica Neue"/>
         <w:rFonts w:ascii="Helvetica Neue" w:hAnsi="Helvetica Neue"/>
+        <w:b w:val="0"/>
+        <w:i w:val="0"/>
         <w:color w:val="86868B"/>
         <w:sz w:val="15"/>
       </w:rPr>
@@ -2448,8 +2894,10 @@
     </w:r>
     <w:r>
       <w:rPr>
+        <w:rFonts w:ascii="Helvetica Neue" w:hAnsi="Helvetica Neue" w:cs="Helvetica Neue"/>
         <w:rFonts w:ascii="Helvetica Neue" w:hAnsi="Helvetica Neue"/>
         <w:b w:val="0"/>
+        <w:i w:val="0"/>
         <w:color w:val="86868B"/>
         <w:sz w:val="15"/>
       </w:rPr>
@@ -2457,7 +2905,10 @@
     </w:r>
     <w:r>
       <w:rPr>
+        <w:rFonts w:ascii="Helvetica Neue" w:hAnsi="Helvetica Neue" w:cs="Helvetica Neue"/>
         <w:rFonts w:ascii="Helvetica Neue" w:hAnsi="Helvetica Neue"/>
+        <w:b w:val="0"/>
+        <w:i w:val="0"/>
         <w:color w:val="86868B"/>
         <w:sz w:val="15"/>
       </w:rPr>
@@ -2465,7 +2916,10 @@
     </w:r>
     <w:r>
       <w:rPr>
+        <w:rFonts w:ascii="Helvetica Neue" w:hAnsi="Helvetica Neue" w:cs="Helvetica Neue"/>
         <w:rFonts w:ascii="Helvetica Neue" w:hAnsi="Helvetica Neue"/>
+        <w:b w:val="0"/>
+        <w:i w:val="0"/>
         <w:color w:val="86868B"/>
         <w:sz w:val="15"/>
       </w:rPr>
@@ -2473,7 +2927,10 @@
     </w:r>
     <w:r>
       <w:rPr>
+        <w:rFonts w:ascii="Helvetica Neue" w:hAnsi="Helvetica Neue" w:cs="Helvetica Neue"/>
         <w:rFonts w:ascii="Helvetica Neue" w:hAnsi="Helvetica Neue"/>
+        <w:b w:val="0"/>
+        <w:i w:val="0"/>
         <w:color w:val="86868B"/>
         <w:sz w:val="15"/>
       </w:rPr>
@@ -2481,7 +2938,10 @@
     </w:r>
     <w:r>
       <w:rPr>
+        <w:rFonts w:ascii="Helvetica Neue" w:hAnsi="Helvetica Neue" w:cs="Helvetica Neue"/>
         <w:rFonts w:ascii="Helvetica Neue" w:hAnsi="Helvetica Neue"/>
+        <w:b w:val="0"/>
+        <w:i w:val="0"/>
         <w:color w:val="86868B"/>
         <w:sz w:val="15"/>
       </w:rPr>
@@ -2489,7 +2949,10 @@
     </w:r>
     <w:r>
       <w:rPr>
+        <w:rFonts w:ascii="Helvetica Neue" w:hAnsi="Helvetica Neue" w:cs="Helvetica Neue"/>
         <w:rFonts w:ascii="Helvetica Neue" w:hAnsi="Helvetica Neue"/>
+        <w:b w:val="0"/>
+        <w:i w:val="0"/>
         <w:color w:val="86868B"/>
         <w:sz w:val="15"/>
       </w:rPr>
@@ -2522,13 +2985,13 @@
     <w:tr>
       <w:tc>
         <w:tcPr>
-          <w:tcW w:type="dxa" w:w="5102"/>
+          <w:tcW w:type="dxa" w:w="3969"/>
         </w:tcPr>
         <w:p>
           <w:r>
             <w:drawing>
               <wp:inline xmlns:a="http://schemas.openxmlformats.org/drawingml/2006/main" xmlns:pic="http://schemas.openxmlformats.org/drawingml/2006/picture">
-                <wp:extent cx="1080000" cy="1080000"/>
+                <wp:extent cx="612000" cy="603578"/>
                 <wp:docPr id="1" name="Picture 1"/>
                 <wp:cNvGraphicFramePr>
                   <a:graphicFrameLocks noChangeAspect="1"/>
@@ -2537,7 +3000,7 @@
                   <a:graphicData uri="http://schemas.openxmlformats.org/drawingml/2006/picture">
                     <pic:pic>
                       <pic:nvPicPr>
-                        <pic:cNvPr id="0" name="logo.png"/>
+                        <pic:cNvPr id="0" name="logo3d_orb.png"/>
                         <pic:cNvPicPr/>
                       </pic:nvPicPr>
                       <pic:blipFill>
@@ -2549,7 +3012,7 @@
                       <pic:spPr>
                         <a:xfrm>
                           <a:off x="0" y="0"/>
-                          <a:ext cx="1080000" cy="1080000"/>
+                          <a:ext cx="612000" cy="603578"/>
                         </a:xfrm>
                         <a:prstGeom prst="rect"/>
                       </pic:spPr>
@@ -2563,7 +3026,7 @@
       </w:tc>
       <w:tc>
         <w:tcPr>
-          <w:tcW w:type="dxa" w:w="4762"/>
+          <w:tcW w:type="dxa" w:w="5896"/>
           <w:vAlign w:val="center"/>
         </w:tcPr>
         <w:p>
@@ -2572,11 +3035,13 @@
           </w:pPr>
           <w:r>
             <w:rPr>
+              <w:rFonts w:ascii="Helvetica Neue" w:hAnsi="Helvetica Neue" w:cs="Helvetica Neue"/>
               <w:rFonts w:ascii="Helvetica Neue" w:hAnsi="Helvetica Neue"/>
               <w:b/>
+              <w:i w:val="0"/>
               <w:color w:val="000D6E"/>
-              <w:sz w:val="22"/>
-              <w:spacing w:val="36"/>
+              <w:sz w:val="24"/>
+              <w:spacing w:val="40"/>
             </w:rPr>
             <w:t>KABUU ENGINEERING</w:t>
           </w:r>
@@ -2588,7 +3053,10 @@
           </w:pPr>
           <w:r>
             <w:rPr>
+              <w:rFonts w:ascii="Helvetica Neue" w:hAnsi="Helvetica Neue" w:cs="Helvetica Neue"/>
               <w:rFonts w:ascii="Helvetica Neue" w:hAnsi="Helvetica Neue"/>
+              <w:b w:val="0"/>
+              <w:i w:val="0"/>
               <w:color w:val="86868B"/>
               <w:sz w:val="15"/>
             </w:rPr>
@@ -2602,7 +3070,7 @@
     <w:pPr>
       <w:spacing w:before="120"/>
       <w:pBdr>
-        <w:bottom w:val="single" w:sz="4" w:space="0" w:color="E5E5EA"/>
+        <w:bottom w:val="single" w:sz="6" w:space="0" w:color="000D6E"/>
       </w:pBdr>
     </w:pPr>
   </w:p>
@@ -26792,10 +27260,54 @@
 <b:Sources xmlns:b="http://schemas.openxmlformats.org/officeDocument/2006/bibliography" xmlns="http://schemas.openxmlformats.org/officeDocument/2006/bibliography" SelectedStyle="/APA.XSL" StyleName="APA"/>
 </file>
 
+<file path=customXml/item2.xml><?xml version="1.0" encoding="utf-8"?>
+<doc xmlns="http://kabuu/doc">
+  <Betreff>Power-Quality-Schulung</Betreff>
+  <Dokumenttyp>RECHNUNG</Dokumenttyp>
+  <DokumentNr>0011</DokumentNr>
+  <Datum>24.06.2025</Datum>
+  <Kundennummer>011</Kundennummer>
+  <FristLabel>Fälligkeitsdatum</FristLabel>
+  <FristWert>08.07.2025</FristWert>
+  <KundeFirma>Musterfirma AG</KundeFirma>
+  <KundeAnsprech>Herr Max Muster</KundeAnsprech>
+  <KundeStrasse>Musterstrasse 1</KundeStrasse>
+  <KundePlzOrt>8000 Zürich</KundePlzOrt>
+  <KundeLand>Schweiz</KundeLand>
+  <Einleitung>gerne unterbreiten wir Ihnen folgende Leistungen.</Einleitung>
+  <Leistung1>PQ-Schulung</Leistung1>
+  <Detail1>Theorie &amp; Praxis</Detail1>
+  <Preis1>200.00</Preis1>
+  <Menge1>4</Menge1>
+  <Summe1>800.00</Summe1>
+  <Leistung2>Geräteschulung</Leistung2>
+  <Detail2>Befähigte Personen Elektroprüfungen</Detail2>
+  <Preis2>150.00</Preis2>
+  <Menge2>1</Menge2>
+  <Summe2>150.00</Summe2>
+  <Leistung3>Dokumentation</Leistung3>
+  <Detail3>Anleitung + Dokumentation + Bilder</Detail3>
+  <Preis3>150.00</Preis3>
+  <Menge3>2</Menge3>
+  <Summe3>300.00</Summe3>
+  <Zwischensumme>1250.00</Zwischensumme>
+  <Gesamtsumme>1250.00</Gesamtsumme>
+  <Zahlungsfrist>14</Zahlungsfrist>
+</doc>
+</file>
+
 <file path=customXml/itemProps1.xml><?xml version="1.0" encoding="utf-8"?>
 <ds:datastoreItem xmlns:ds="http://schemas.openxmlformats.org/officeDocument/2006/customXml" ds:itemID="{EF278816-EC6F-A645-907D-7F25AECB1D4A}">
   <ds:schemaRefs>
     <ds:schemaRef ds:uri="http://schemas.openxmlformats.org/officeDocument/2006/bibliography"/>
   </ds:schemaRefs>
 </ds:datastoreItem>
+</file>
+
+<file path=customXml/itemProps2.xml><?xml version="1.0" encoding="utf-8"?>
+<ds:datastoreItem xmlns:ds="http://schemas.openxmlformats.org/officeDocument/2006/customXml" ds:itemID="{6F1B2C3D-4E5A-4B6C-8D7E-9A0B1C2D3E4F}">
+  <ds:schemaRefs>
+    <ds:schemaRef ds:uri="http://kabuu/doc"/>
+  </ds:schemaRefs>
+</ds:datastoreItem>
 </file>
</xml_diff>